<commit_message>
Expand exam solutions with practical how-to steps
Co-authored-by: arena-agent <297053741+arena-agent@users.noreply.github.com>
</commit_message>
<xml_diff>
--- a/solutions/Полное_пошаговое_решение_КИМ_09.02.07-5-2027.docx
+++ b/solutions/Полное_пошаговое_решение_КИМ_09.02.07-5-2027.docx
@@ -56,7 +56,7 @@
     </w:p>
     <w:p>
       <w:r>
-        <w:t>Сначала приведены пошаговые действия и контрольные ответы по каждому заданию. В приложениях включены полные текстовые листинги ключевых исходников: ER-описание, DDL, загрузчик БД, запрос, приложение, тесты, Postman-коллекция, генератор документации и очистка данных. Готовые бинарные файлы лежат рядом в каталогах solutions/task1_er … task7_analysis.</w:t>
+        <w:t>Каждая глава содержит решение, а затем отдельный раздел «Как выполнить на практике»: что открыть, какую команду запустить, что ввести/проверить и какой результат должен получиться. В примерах есть копируемые команды, SQL, запросы API и формулы Excel. Приложения содержат полные текстовые листинги исходников; готовые PDF/XLSX/DOCX/SQLite лежат рядом в каталогах solutions/task1_er … task7_analysis.</w:t>
       </w:r>
     </w:p>
     <w:p>
@@ -640,6 +640,141 @@
       </w:r>
     </w:p>
     <w:p>
+      <w:pPr>
+        <w:pStyle w:val="Heading2"/>
+      </w:pPr>
+      <w:r>
+        <w:t>Как выполнить на практике</w:t>
+      </w:r>
+    </w:p>
+    <w:p>
+      <w:pPr>
+        <w:spacing w:after="80"/>
+      </w:pPr>
+      <w:r>
+        <w:t>Действие 1. Откройте Заказ покупателя.xlsx и Заказ на производство.xlsx; для справочников откройте Заказчики.json, Товары.json, Материалы.json, Спецификация.xlsx и Цены.xlsx. Выпишите поля шапки отдельно от повторяющихся строк документа: у покупательского заказа есть один заказчик и несколько строк товара; у спецификации каждому изделию соответствует несколько ресурсов.</w:t>
+      </w:r>
+    </w:p>
+    <w:p>
+      <w:pPr>
+        <w:spacing w:after="80"/>
+      </w:pPr>
+      <w:r>
+        <w:t>Действие 2. Нарисуйте десять таблиц, перечисленных в таблице «Сущности модели». В каждой таблице подчеркните PK, у каждой связи отметьте FK. Не переносите ФИО/адрес заказчика в каждую строку заказа: храните эти поля один раз в customers, а в customer_orders оставьте только customer_id.</w:t>
+      </w:r>
+    </w:p>
+    <w:p>
+      <w:pPr>
+        <w:spacing w:after="80"/>
+      </w:pPr>
+      <w:r>
+        <w:t>Действие 3. Соедините таблицы так: customers 1:N customer_orders; customer_orders 1:N order_items; products 1:N order_items. Между products и resources получится M:N, поэтому вставьте связующую product_specification и положите в неё quantity_per_product — норму на одну единицу продукции.</w:t>
+      </w:r>
+    </w:p>
+    <w:p>
+      <w:pPr>
+        <w:spacing w:after="80"/>
+      </w:pPr>
+      <w:r>
+        <w:t>Действие 4. Материалы и операции поместите в resources, а различайте их значением resource_type. В prices и discounts нарисуйте два возможных nullable FK (product_id, resource_id) и подпишите правило: заполнен ровно один. В производственном документе отделите шапку production_orders от строк production_order_items.</w:t>
+      </w:r>
+    </w:p>
+    <w:p>
+      <w:pPr>
+        <w:spacing w:after="80"/>
+      </w:pPr>
+      <w:r>
+        <w:t>Действие 5. Проверьте 3НФ на каждом поле: значение должно описывать ключ, весь ключ и только ключ. Если название ресурса повторяется в строках BOM — удалите повтор и оставьте resource_id; если заказчик повторяется в заказах — вынесите его в customers. Затем сохраните редактируемую модель в ER-модель.mmd.</w:t>
+      </w:r>
+    </w:p>
+    <w:p>
+      <w:pPr>
+        <w:spacing w:after="80"/>
+      </w:pPr>
+      <w:r>
+        <w:t>Действие 6. Чтобы получить сдаваемый PDF, запустите генератор из корня репозитория. Если меняете состав таблиц, обновите и список сущностей в generate_diagram.py, потому что генератор рисует PDF по этому списку, а не компилирует Mermaid автоматически.</w:t>
+      </w:r>
+    </w:p>
+    <w:p>
+      <w:pPr>
+        <w:spacing w:before="40" w:after="20"/>
+      </w:pPr>
+      <w:r>
+        <w:rPr>
+          <w:b/>
+        </w:rPr>
+        <w:t>Готовые объявления связей для блока erDiagram в ER-модели:</w:t>
+      </w:r>
+    </w:p>
+    <w:p>
+      <w:pPr>
+        <w:spacing w:before="20" w:after="40" w:line="164" w:lineRule="exact"/>
+        <w:ind w:left="144" w:right="144"/>
+        <w:shd w:fill="F2F5F9"/>
+      </w:pPr>
+      <w:r>
+        <w:rPr>
+          <w:rFonts w:ascii="Consolas" w:hAnsi="Consolas"/>
+          <w:color w:val="243247"/>
+          <w:sz w:val="14"/>
+        </w:rPr>
+        <w:t>erDiagram</w:t>
+        <w:br/>
+        <w:t xml:space="preserve">    CUSTOMERS ||--o{ CUSTOMER_ORDERS : оформляет</w:t>
+        <w:br/>
+        <w:t xml:space="preserve">    CUSTOMER_ORDERS ||--|{ ORDER_ITEMS : содержит</w:t>
+        <w:br/>
+        <w:t xml:space="preserve">    PRODUCTS ||--o{ ORDER_ITEMS : заказан</w:t>
+        <w:br/>
+        <w:t xml:space="preserve">    PRODUCTS ||--o{ PRODUCT_SPECIFICATION : состоит_из</w:t>
+        <w:br/>
+        <w:t xml:space="preserve">    RESOURCES ||--o{ PRODUCT_SPECIFICATION : входит_в</w:t>
+        <w:br/>
+        <w:t xml:space="preserve">    PRODUCTS o|--o{ PRICES : цена_товара</w:t>
+        <w:br/>
+        <w:t xml:space="preserve">    RESOURCES o|--o{ PRICES : цена_ресурса</w:t>
+        <w:br/>
+        <w:t xml:space="preserve">    PRODUCTS o|--o{ DISCOUNTS : скидка_товара</w:t>
+        <w:br/>
+        <w:t xml:space="preserve">    RESOURCES o|--o{ DISCOUNTS : скидка_ресурса</w:t>
+        <w:br/>
+        <w:t xml:space="preserve">    PRODUCTION_ORDERS ||--|{ PRODUCTION_ORDER_ITEMS : содержит</w:t>
+        <w:br/>
+        <w:t xml:space="preserve">    PRODUCTS ||--o{ PRODUCTION_ORDER_ITEMS : выпускается</w:t>
+      </w:r>
+    </w:p>
+    <w:p>
+      <w:pPr>
+        <w:spacing w:before="40" w:after="20"/>
+      </w:pPr>
+      <w:r>
+        <w:rPr>
+          <w:b/>
+        </w:rPr>
+        <w:t>Команда построения ER_диаграмма.pdf:</w:t>
+      </w:r>
+    </w:p>
+    <w:p>
+      <w:pPr>
+        <w:spacing w:before="20" w:after="40" w:line="164" w:lineRule="exact"/>
+        <w:ind w:left="144" w:right="144"/>
+        <w:shd w:fill="F2F5F9"/>
+      </w:pPr>
+      <w:r>
+        <w:rPr>
+          <w:rFonts w:ascii="Consolas" w:hAnsi="Consolas"/>
+          <w:color w:val="243247"/>
+          <w:sz w:val="14"/>
+        </w:rPr>
+        <w:t>python3 solutions/task1_er/generate_diagram.py</w:t>
+      </w:r>
+    </w:p>
+    <w:p>
+      <w:r>
+        <w:t>Результат: solutions/task1_er/ER_диаграмма.pdf и редактируемый solutions/task1_er/ER-модель.mmd. На диаграмме должны быть видны имена таблиц, атрибуты, PK/FK и все кардинальности.</w:t>
+      </w:r>
+    </w:p>
+    <w:p>
       <w:r>
         <w:br w:type="page"/>
       </w:r>
@@ -999,6 +1134,124 @@
     <w:p>
       <w:r>
         <w:t>Проблемы исходника обработаны прозрачно: product_id 398/881/942 отсутствуют в справочнике; product_id 887 повторяется; resource_id 456 повторяется; повторяются ID строк заказа 31/81 и скидки 15. Строки не удалены. Неоднозначная ссылка на товар 887 назначена первой записи, потому что JSON не позволяет определить вариант.</w:t>
+      </w:r>
+    </w:p>
+    <w:p>
+      <w:pPr>
+        <w:pStyle w:val="Heading2"/>
+      </w:pPr>
+      <w:r>
+        <w:t>Как выполнить на практике</w:t>
+      </w:r>
+    </w:p>
+    <w:p>
+      <w:pPr>
+        <w:spacing w:after="80"/>
+      </w:pPr>
+      <w:r>
+        <w:t>Действие 1. Положите исходные JSON в корень репозитория (в данном наборе они уже там). Откройте schema.sql: сначала выполняются CREATE TABLE, затем индексы. Внешние ключи включаются через PRAGMA foreign_keys=ON; NOT NULL запрещает пустые обязательные поля; CHECK ограничивает количество положительным числом, тип ресурса — заданными вариантами.</w:t>
+      </w:r>
+    </w:p>
+    <w:p>
+      <w:pPr>
+        <w:spacing w:after="80"/>
+      </w:pPr>
+      <w:r>
+        <w:t>Действие 2. Из корня проекта запустите seed.py с явными путями. Скрипт проверит наличие восьми JSON, прочитает их как UTF-8, выполнит schema.sql, очистит дочерние таблицы перед повторной загрузкой и вставит данные транзакционно.</w:t>
+      </w:r>
+    </w:p>
+    <w:p>
+      <w:pPr>
+        <w:spacing w:after="80"/>
+      </w:pPr>
+      <w:r>
+        <w:t>Действие 3. Посмотрите на функцию, сопоставляющую поля: customer_id приводится к str, потому что это текстовый идентификатор; адрес читается сначала из исходного ключа addres, а при его отсутствии — из address. Для товара и ресурса создаются карты source ID -&gt; внутренний PK, чтобы ссылки можно было восстановить.</w:t>
+      </w:r>
+    </w:p>
+    <w:p>
+      <w:pPr>
+        <w:spacing w:after="80"/>
+      </w:pPr>
+      <w:r>
+        <w:t>Действие 4. До вставки проверьте конфликтные ключи в напечатанных предупреждениях. В этих JSON товары 398/881/942 отсутствуют в справочнике, source product_id=887 и resource_id=456 повторяются, а ID строк заказа 31/81 и скидки 15 не уникальны. Не выключайте FK и не удаляйте записи: импортёр добавляет помеченные заглушки или surrogate PK и сохраняет исходный номер в source_*_id.</w:t>
+      </w:r>
+    </w:p>
+    <w:p>
+      <w:pPr>
+        <w:spacing w:after="80"/>
+      </w:pPr>
+      <w:r>
+        <w:t>Действие 5. После импорта выполните PRAGMA foreign_key_check и сравните количество строк с контрольной таблицей ниже. Если есть нарушение FK, не переходите к заданию 3: сначала исправьте карту ID/ссылку и повторите импорт.</w:t>
+      </w:r>
+    </w:p>
+    <w:p>
+      <w:pPr>
+        <w:spacing w:before="40" w:after="20"/>
+      </w:pPr>
+      <w:r>
+        <w:rPr>
+          <w:b/>
+        </w:rPr>
+        <w:t>Создать/перезагрузить базу в указанном месте:</w:t>
+      </w:r>
+    </w:p>
+    <w:p>
+      <w:pPr>
+        <w:spacing w:before="20" w:after="40" w:line="164" w:lineRule="exact"/>
+        <w:ind w:left="144" w:right="144"/>
+        <w:shd w:fill="F2F5F9"/>
+      </w:pPr>
+      <w:r>
+        <w:rPr>
+          <w:rFonts w:ascii="Consolas" w:hAnsi="Consolas"/>
+          <w:color w:val="243247"/>
+          <w:sz w:val="14"/>
+        </w:rPr>
+        <w:t>python3 solutions/task2_database/seed.py --data-dir . --db-path solutions/task2_database/manufacturing.sqlite3</w:t>
+      </w:r>
+    </w:p>
+    <w:p>
+      <w:pPr>
+        <w:spacing w:before="40" w:after="20"/>
+      </w:pPr>
+      <w:r>
+        <w:rPr>
+          <w:b/>
+        </w:rPr>
+        <w:t>Проверить внешние ключи и число записей из Python:</w:t>
+      </w:r>
+    </w:p>
+    <w:p>
+      <w:pPr>
+        <w:spacing w:before="20" w:after="40" w:line="164" w:lineRule="exact"/>
+        <w:ind w:left="144" w:right="144"/>
+        <w:shd w:fill="F2F5F9"/>
+      </w:pPr>
+      <w:r>
+        <w:rPr>
+          <w:rFonts w:ascii="Consolas" w:hAnsi="Consolas"/>
+          <w:color w:val="243247"/>
+          <w:sz w:val="14"/>
+        </w:rPr>
+        <w:t>import sqlite3</w:t>
+        <w:br/>
+        <w:br/>
+        <w:t>db = sqlite3.connect('solutions/task2_database/manufacturing.sqlite3')</w:t>
+        <w:br/>
+        <w:t>print('foreign_key_check =', db.execute('PRAGMA foreign_key_check').fetchall())</w:t>
+        <w:br/>
+        <w:t>for table in ('customers','products','resources','product_specification',</w:t>
+        <w:br/>
+        <w:t xml:space="preserve">              'customer_orders','order_items','prices','discounts'):</w:t>
+        <w:br/>
+        <w:t xml:space="preserve">    print(table, db.execute(f'SELECT COUNT(*) FROM {table}').fetchone()[0])</w:t>
+        <w:br/>
+        <w:t>db.close()</w:t>
+      </w:r>
+    </w:p>
+    <w:p>
+      <w:r>
+        <w:t>Успешная проверка выводит пустой список foreign_key_check и количества: customers 6, products 132, resources 103, product_specification 74, customer_orders 70, order_items 70, prices 60, discounts 51. В order_items цена из исходника не передавалась, поэтому unit_price_at_order = NULL, а discount_per_unit = 0.</w:t>
       </w:r>
     </w:p>
     <w:p>
@@ -1677,6 +1930,162 @@
       </w:r>
     </w:p>
     <w:p>
+      <w:pPr>
+        <w:pStyle w:val="Heading2"/>
+      </w:pPr>
+      <w:r>
+        <w:t>Как выполнить на практике</w:t>
+      </w:r>
+    </w:p>
+    <w:p>
+      <w:pPr>
+        <w:spacing w:after="80"/>
+      </w:pPr>
+      <w:r>
+        <w:t>Действие 1. Сначала выберите номер заказа в customer_orders. Для каждой его строки возьмите oi.quantity; по oi.product_id найдите все строки product_specification; для каждой строки спецификации получите resource_id, норму quantity_per_product и цену unit_price ресурса. Тип ресурса не фильтруйте: в сумму входят и материалы, и операции.</w:t>
+      </w:r>
+    </w:p>
+    <w:p>
+      <w:pPr>
+        <w:spacing w:after="80"/>
+      </w:pPr>
+      <w:r>
+        <w:t>Действие 2. Для одной позиции заказа вычислите стоимость каждого компонента по формуле количество заказа × норма ресурса на изделие × цена ресурса. Сложите все компоненты всех товарных строк, округлите итог один раз до двух знаков. Не прибавляйте цену продажи готового товара и не вычитайте покупательскую скидку — это производственная себестоимость.</w:t>
+      </w:r>
+    </w:p>
+    <w:p>
+      <w:pPr>
+        <w:spacing w:after="80"/>
+      </w:pPr>
+      <w:r>
+        <w:t>Действие 3. Выполните первый запрос из order_cost.sql как параметризованный SQL. Значение передавайте словарём, а не склеивайте в текст SQL: это исключает ошибки кавычек и SQL-инъекции. Если запрос вернул NULL или priced_positions меньше required_cost_positions, проверьте BOM/цену; не сдавайте частичную сумму.</w:t>
+      </w:r>
+    </w:p>
+    <w:p>
+      <w:pPr>
+        <w:spacing w:after="80"/>
+      </w:pPr>
+      <w:r>
+        <w:t>Действие 4. Чтобы объяснить результат, выполните второй SELECT из того же файла: он выводит по каждой паре заказ–ресурс норму, цену и component_total. Для заказа №1 сверка идёт по восьми строкам расчёта из таблицы ниже.</w:t>
+      </w:r>
+    </w:p>
+    <w:p>
+      <w:pPr>
+        <w:spacing w:before="40" w:after="20"/>
+      </w:pPr>
+      <w:r>
+        <w:rPr>
+          <w:b/>
+        </w:rPr>
+        <w:t>Запустить итоговый параметризованный запрос для заказа №1:</w:t>
+      </w:r>
+    </w:p>
+    <w:p>
+      <w:pPr>
+        <w:spacing w:before="20" w:after="40" w:line="164" w:lineRule="exact"/>
+        <w:ind w:left="144" w:right="144"/>
+        <w:shd w:fill="F2F5F9"/>
+      </w:pPr>
+      <w:r>
+        <w:rPr>
+          <w:rFonts w:ascii="Consolas" w:hAnsi="Consolas"/>
+          <w:color w:val="243247"/>
+          <w:sz w:val="14"/>
+        </w:rPr>
+        <w:t>from pathlib import Path</w:t>
+        <w:br/>
+        <w:t>import sqlite3</w:t>
+        <w:br/>
+        <w:br/>
+        <w:t>path = Path('solutions/task3_query/order_cost.sql')</w:t>
+        <w:br/>
+        <w:t>text = path.read_text(encoding='utf-8')</w:t>
+        <w:br/>
+        <w:t>total_sql = text.split('-- Детализация того же расчёта:', 1)[0]</w:t>
+        <w:br/>
+        <w:t>db = sqlite3.connect('solutions/task2_database/manufacturing.sqlite3')</w:t>
+        <w:br/>
+        <w:t>print(db.execute(total_sql, {'order_id': 1}).fetchone())</w:t>
+        <w:br/>
+        <w:t># Ожидается: (1, 11448.12, 8, 8)</w:t>
+      </w:r>
+    </w:p>
+    <w:p>
+      <w:pPr>
+        <w:spacing w:before="40" w:after="20"/>
+      </w:pPr>
+      <w:r>
+        <w:rPr>
+          <w:b/>
+        </w:rPr>
+        <w:t>Вывести построчную расшифровку по каждому ресурсу (самостоятельный запуск):</w:t>
+      </w:r>
+    </w:p>
+    <w:p>
+      <w:pPr>
+        <w:spacing w:before="20" w:after="40" w:line="164" w:lineRule="exact"/>
+        <w:ind w:left="144" w:right="144"/>
+        <w:shd w:fill="F2F5F9"/>
+      </w:pPr>
+      <w:r>
+        <w:rPr>
+          <w:rFonts w:ascii="Consolas" w:hAnsi="Consolas"/>
+          <w:color w:val="243247"/>
+          <w:sz w:val="14"/>
+        </w:rPr>
+        <w:t>from pathlib import Path</w:t>
+        <w:br/>
+        <w:t>import sqlite3</w:t>
+        <w:br/>
+        <w:t>text = Path('solutions/task3_query/order_cost.sql').read_text(encoding='utf-8')</w:t>
+        <w:br/>
+        <w:t>detail_sql = text.split('-- Детализация того же расчёта:', 1)[1]</w:t>
+        <w:br/>
+        <w:t>detail_sql = detail_sql[detail_sql.index('SELECT'):]</w:t>
+        <w:br/>
+        <w:t>with sqlite3.connect('solutions/task2_database/manufacturing.sqlite3') as db:</w:t>
+        <w:br/>
+        <w:t xml:space="preserve">    for row in db.execute(detail_sql, {'order_id': 1}):</w:t>
+        <w:br/>
+        <w:t xml:space="preserve">        print(row)</w:t>
+        <w:br/>
+        <w:t># В каждой строке: order_id, товар, ресурс, норма, цена и сумма компонента.</w:t>
+      </w:r>
+    </w:p>
+    <w:p>
+      <w:pPr>
+        <w:spacing w:before="40" w:after="20"/>
+      </w:pPr>
+      <w:r>
+        <w:rPr>
+          <w:b/>
+        </w:rPr>
+        <w:t>Расчёт для одной строки (пример: евровинт):</w:t>
+      </w:r>
+    </w:p>
+    <w:p>
+      <w:pPr>
+        <w:spacing w:before="20" w:after="40" w:line="164" w:lineRule="exact"/>
+        <w:ind w:left="144" w:right="144"/>
+        <w:shd w:fill="F2F5F9"/>
+      </w:pPr>
+      <w:r>
+        <w:rPr>
+          <w:rFonts w:ascii="Consolas" w:hAnsi="Consolas"/>
+          <w:color w:val="243247"/>
+          <w:sz w:val="14"/>
+        </w:rPr>
+        <w:t>2 шт. × 0,012 на изделие × 432,083333 руб. = 10,37 руб.</w:t>
+        <w:br/>
+        <w:t>Итог по восьми компонентам = 11 448,12 руб.</w:t>
+      </w:r>
+    </w:p>
+    <w:p>
+      <w:r>
+        <w:t>Для заказа покупателя №1 контрольная строка запроса: (order_id=1, total_manufacturing_cost=11448.12, required_cost_positions=8, priced_positions=8). В машинное поле ответа вводите 11448,12.</w:t>
+      </w:r>
+    </w:p>
+    <w:p>
       <w:r>
         <w:br w:type="page"/>
       </w:r>
@@ -1912,6 +2321,145 @@
     <w:p>
       <w:r>
         <w:t>Демо-логины в учебной БД: admin / Admin123!; user / User123!. Пароли PBKDF2-хешируются с солью.</w:t>
+      </w:r>
+    </w:p>
+    <w:p>
+      <w:pPr>
+        <w:pStyle w:val="Heading2"/>
+      </w:pPr>
+      <w:r>
+        <w:t>Как выполнить на практике</w:t>
+      </w:r>
+    </w:p>
+    <w:p>
+      <w:pPr>
+        <w:spacing w:after="80"/>
+      </w:pPr>
+      <w:r>
+        <w:t>Действие 1. Запустите приложение из корня репозитория; оно само создаст exam_app.sqlite3, таблицы users/notes и две демонстрационные учётные записи. Откройте страницу /login в браузере. Для изолированного теста укажите EXAM_DB_PATH=/tmp/exam_auth_test.sqlite3, чтобы не менять обычную демонстрационную базу.</w:t>
+      </w:r>
+    </w:p>
+    <w:p>
+      <w:pPr>
+        <w:spacing w:after="80"/>
+      </w:pPr>
+      <w:r>
+        <w:t>Действие 2. На странице заполните оба обязательных поля и соберите изображение: элементы 3×3 переставляются перетаскиванием или кликами по двум фрагментам. Затем войдите как admin / Admin123! либо user / User123!. Капча имеет случайное начальное расположение и одноразовый серверный challenge; готовый порядок из браузера принимается только если совпал с 0…8.</w:t>
+      </w:r>
+    </w:p>
+    <w:p>
+      <w:pPr>
+        <w:spacing w:after="80"/>
+      </w:pPr>
+      <w:r>
+        <w:t>Действие 3. Проверьте отрицательный сценарий: три раза подряд введите неправильный пароль, каждый раз решив новый пазл правильно. После третьей попытки должна появиться фраза «Вы заблокированы. Обратитесь к администратору». Та же серия ошибок учитывает неверную капчу. Успешный вход сбрасывает failed_attempts.</w:t>
+      </w:r>
+    </w:p>
+    <w:p>
+      <w:pPr>
+        <w:spacing w:after="80"/>
+      </w:pPr>
+      <w:r>
+        <w:t>Действие 4. Для проверки администрирования войдите под admin, откройте «Управление пользователями», добавьте логин с паролем и ролью. Повторите добавление того же логина — приложение должно показать сообщение о дубликате. В таблице пользователей поменяйте роль/пароль или снимите is_blocked; при разблокировке счётчик ошибок сбрасывается.</w:t>
+      </w:r>
+    </w:p>
+    <w:p>
+      <w:pPr>
+        <w:spacing w:after="80"/>
+      </w:pPr>
+      <w:r>
+        <w:t>Действие 5. Для самопроверки выйдите из браузерного сценария и запустите unittest. Тесты запускают сервер на временном порту и отдельной временной БД, поэтому демо-базу не портят.</w:t>
+      </w:r>
+    </w:p>
+    <w:p>
+      <w:pPr>
+        <w:spacing w:before="40" w:after="20"/>
+      </w:pPr>
+      <w:r>
+        <w:rPr>
+          <w:b/>
+        </w:rPr>
+        <w:t>Запуск и адрес страницы входа:</w:t>
+      </w:r>
+    </w:p>
+    <w:p>
+      <w:pPr>
+        <w:spacing w:before="20" w:after="40" w:line="164" w:lineRule="exact"/>
+        <w:ind w:left="144" w:right="144"/>
+        <w:shd w:fill="F2F5F9"/>
+      </w:pPr>
+      <w:r>
+        <w:rPr>
+          <w:rFonts w:ascii="Consolas" w:hAnsi="Consolas"/>
+          <w:color w:val="243247"/>
+          <w:sz w:val="14"/>
+        </w:rPr>
+        <w:t>python3 solutions/task4_auth_api/app.py</w:t>
+        <w:br/>
+        <w:t># открыть в браузере: http://127.0.0.1:8000/login</w:t>
+        <w:br/>
+        <w:t># тестовые пары: admin / Admin123!; user / User123!</w:t>
+      </w:r>
+    </w:p>
+    <w:p>
+      <w:pPr>
+        <w:spacing w:before="40" w:after="20"/>
+      </w:pPr>
+      <w:r>
+        <w:rPr>
+          <w:b/>
+        </w:rPr>
+        <w:t>Чтобы тестировать блокировку в отдельной БД и не портить демо-вход:</w:t>
+      </w:r>
+    </w:p>
+    <w:p>
+      <w:pPr>
+        <w:spacing w:before="20" w:after="40" w:line="164" w:lineRule="exact"/>
+        <w:ind w:left="144" w:right="144"/>
+        <w:shd w:fill="F2F5F9"/>
+      </w:pPr>
+      <w:r>
+        <w:rPr>
+          <w:rFonts w:ascii="Consolas" w:hAnsi="Consolas"/>
+          <w:color w:val="243247"/>
+          <w:sz w:val="14"/>
+        </w:rPr>
+        <w:t>rm -f /tmp/exam_auth_test.sqlite3</w:t>
+        <w:br/>
+        <w:t>EXAM_DB_PATH=/tmp/exam_auth_test.sqlite3 APP_PORT=8001 python3 solutions/task4_auth_api/app.py</w:t>
+        <w:br/>
+        <w:t># открыть http://127.0.0.1:8001/login</w:t>
+      </w:r>
+    </w:p>
+    <w:p>
+      <w:pPr>
+        <w:spacing w:before="40" w:after="20"/>
+      </w:pPr>
+      <w:r>
+        <w:rPr>
+          <w:b/>
+        </w:rPr>
+        <w:t>Проверить все сценарии задания 4–5:</w:t>
+      </w:r>
+    </w:p>
+    <w:p>
+      <w:pPr>
+        <w:spacing w:before="20" w:after="40" w:line="164" w:lineRule="exact"/>
+        <w:ind w:left="144" w:right="144"/>
+        <w:shd w:fill="F2F5F9"/>
+      </w:pPr>
+      <w:r>
+        <w:rPr>
+          <w:rFonts w:ascii="Consolas" w:hAnsi="Consolas"/>
+          <w:color w:val="243247"/>
+          <w:sz w:val="14"/>
+        </w:rPr>
+        <w:t>python3 -m unittest discover -s solutions/task4_auth_api/tests -v</w:t>
+      </w:r>
+    </w:p>
+    <w:p>
+      <w:r>
+        <w:t>Успешный вход показывает «Вы успешно авторизовались». Пользователь видит свой рабочий стол; маршрут /admin/users для роли Пользователь закрыт ответом 403. Пароль в SQLite хранится как PBKDF2-HMAC-SHA256 с солью, cookie сессии помечена HttpOnly и SameSite.</w:t>
       </w:r>
     </w:p>
     <w:p>
@@ -2237,6 +2785,147 @@
       </w:r>
     </w:p>
     <w:p>
+      <w:pPr>
+        <w:pStyle w:val="Heading2"/>
+      </w:pPr>
+      <w:r>
+        <w:t>Как выполнить на практике</w:t>
+      </w:r>
+    </w:p>
+    <w:p>
+      <w:pPr>
+        <w:spacing w:after="80"/>
+      </w:pPr>
+      <w:r>
+        <w:t>Действие 1. При старте приложения задание 4 создаёт общую БД, таблицу notes и пять тестовых заметок. Основной маршрут — GET /notes, второй адрес — GET /api/notes. Клиент получает JSON; таблицу notes соединяйте с users по notes.user_id = users.id.</w:t>
+      </w:r>
+    </w:p>
+    <w:p>
+      <w:pPr>
+        <w:spacing w:after="80"/>
+      </w:pPr>
+      <w:r>
+        <w:t>Действие 2. Отправьте запрос без фильтров, затем с limit=2. Для каждого ответа проверьте преобразование: title_user = title + пробел-дефис-пробел + login; content не меняйте; дату YYYY-MM-DD преобразуйте в DD.MM.YYYY. Параметр limit допустим от 1 до 1000, user_id — положительное целое; неизвестный, повторный или неправильный параметр — 400.</w:t>
+      </w:r>
+    </w:p>
+    <w:p>
+      <w:pPr>
+        <w:spacing w:after="80"/>
+      </w:pPr>
+      <w:r>
+        <w:t>Действие 3. Повторите GET с несуществующим user_id: это не ошибка сервера, а 200 и пустой массив []. Отправьте POST /notes: ожидаются 405 и заголовок Allow: GET. Все три маршрута ошибок/успеха должны иметь application/json и тело, пригодное для json.loads.</w:t>
+      </w:r>
+    </w:p>
+    <w:p>
+      <w:pPr>
+        <w:spacing w:after="80"/>
+      </w:pPr>
+      <w:r>
+        <w:t>Действие 4. Импортируйте в Postman оба файла из task5_api: коллекцию и environment. Обычные проверки 200/400 направьте на порт 8000. Для 500 запустите отдельный процесс с двумя тестовыми флагами и портом 8001, затем запустите третий запрос коллекции.</w:t>
+      </w:r>
+    </w:p>
+    <w:p>
+      <w:pPr>
+        <w:spacing w:before="40" w:after="20"/>
+      </w:pPr>
+      <w:r>
+        <w:rPr>
+          <w:b/>
+        </w:rPr>
+        <w:t>Проверить обычный JSON-ответ и обработку неверного параметра:</w:t>
+      </w:r>
+    </w:p>
+    <w:p>
+      <w:pPr>
+        <w:spacing w:before="20" w:after="40" w:line="164" w:lineRule="exact"/>
+        <w:ind w:left="144" w:right="144"/>
+        <w:shd w:fill="F2F5F9"/>
+      </w:pPr>
+      <w:r>
+        <w:rPr>
+          <w:rFonts w:ascii="Consolas" w:hAnsi="Consolas"/>
+          <w:color w:val="243247"/>
+          <w:sz w:val="14"/>
+        </w:rPr>
+        <w:t>curl -i 'http://127.0.0.1:8000/notes?limit=2'</w:t>
+        <w:br/>
+        <w:t>curl -i 'http://127.0.0.1:8000/notes?limit=abc'</w:t>
+      </w:r>
+    </w:p>
+    <w:p>
+      <w:pPr>
+        <w:spacing w:before="40" w:after="20"/>
+      </w:pPr>
+      <w:r>
+        <w:rPr>
+          <w:b/>
+        </w:rPr>
+        <w:t>Тестовый сервер для проверки ответа 500 (Linux/macOS):</w:t>
+      </w:r>
+    </w:p>
+    <w:p>
+      <w:pPr>
+        <w:spacing w:before="20" w:after="40" w:line="164" w:lineRule="exact"/>
+        <w:ind w:left="144" w:right="144"/>
+        <w:shd w:fill="F2F5F9"/>
+      </w:pPr>
+      <w:r>
+        <w:rPr>
+          <w:rFonts w:ascii="Consolas" w:hAnsi="Consolas"/>
+          <w:color w:val="243247"/>
+          <w:sz w:val="14"/>
+        </w:rPr>
+        <w:t>EXAM_TEST_MODE=1 EXAM_FORCE_DB_ERROR=1 APP_PORT=8001 \</w:t>
+        <w:br/>
+        <w:t>EXAM_DB_PATH=/tmp/exam_api_fault.sqlite3 \</w:t>
+        <w:br/>
+        <w:t>python3 solutions/task4_auth_api/app.py</w:t>
+        <w:br/>
+        <w:t># затем: curl -i 'http://127.0.0.1:8001/notes'</w:t>
+      </w:r>
+    </w:p>
+    <w:p>
+      <w:pPr>
+        <w:spacing w:before="40" w:after="20"/>
+      </w:pPr>
+      <w:r>
+        <w:rPr>
+          <w:b/>
+        </w:rPr>
+        <w:t>Форма одного объекта, которую должен проверить клиент:</w:t>
+      </w:r>
+    </w:p>
+    <w:p>
+      <w:pPr>
+        <w:spacing w:before="20" w:after="40" w:line="164" w:lineRule="exact"/>
+        <w:ind w:left="144" w:right="144"/>
+        <w:shd w:fill="F2F5F9"/>
+      </w:pPr>
+      <w:r>
+        <w:rPr>
+          <w:rFonts w:ascii="Consolas" w:hAnsi="Consolas"/>
+          <w:color w:val="243247"/>
+          <w:sz w:val="14"/>
+        </w:rPr>
+        <w:t>{</w:t>
+        <w:br/>
+        <w:t xml:space="preserve">  "id": 5,</w:t>
+        <w:br/>
+        <w:t xml:space="preserve">  "title_user": "Итоги - admin",</w:t>
+        <w:br/>
+        <w:t xml:space="preserve">  "content": "Сохранить результаты тестирования.",</w:t>
+        <w:br/>
+        <w:t xml:space="preserve">  "formatted_date": "05.10.2026"</w:t>
+        <w:br/>
+        <w:t>}</w:t>
+      </w:r>
+    </w:p>
+    <w:p>
+      <w:r>
+        <w:t>Ожидайте: GET /notes — 200 и JSON-массив; limit=abc — 400 и {"error": ...}; пустая выборка — 200 и []; включённый тестовый сбой на 8001 — 500 и JSON с полем error; POST /notes — 405, Allow: GET.</w:t>
+      </w:r>
+    </w:p>
+    <w:p>
       <w:r>
         <w:br w:type="page"/>
       </w:r>
@@ -2288,6 +2977,113 @@
     <w:p>
       <w:r>
         <w:t>Заполненный шаблон: task6_docs/API_документация.docx. В отчёте описаны параметры limit и user_id, поля объекта ответа и примеры для HTTP 200/400/500.</w:t>
+      </w:r>
+    </w:p>
+    <w:p>
+      <w:pPr>
+        <w:pStyle w:val="Heading2"/>
+      </w:pPr>
+      <w:r>
+        <w:t>Как выполнить на практике</w:t>
+      </w:r>
+    </w:p>
+    <w:p>
+      <w:pPr>
+        <w:spacing w:after="80"/>
+      </w:pPr>
+      <w:r>
+        <w:t>Действие 1. Сначала откройте Прил_6_ОЗ_КИМ_09.02.07-5-2027.docx и посмотрите таблицы шаблона. В первой таблице замените значения базового URL и строки метода; в её колонках укажите название метода, query-параметры, назначение, поля/формат ответа. Во второй таблице перечислите коды ответа и поведение для каждого.</w:t>
+      </w:r>
+    </w:p>
+    <w:p>
+      <w:pPr>
+        <w:spacing w:after="80"/>
+      </w:pPr>
+      <w:r>
+        <w:t>Действие 2. Для этого решения внесите GET /notes и алиас GET /api/notes; распишите limit и user_id с границами; укажите точное правило title_user, неизменяемый content и дату ДД.ММ.ГГГГ. Отдельными строками добавьте 200, 400, 500 и 405 (Allow: GET), включая кейс 200 + [] для пустого результата.</w:t>
+      </w:r>
+    </w:p>
+    <w:p>
+      <w:pPr>
+        <w:spacing w:after="80"/>
+      </w:pPr>
+      <w:r>
+        <w:t>Действие 3. Добавьте примеры запроса и тела ответа: один успешный массив, один ответ 400, один ответ 500. В примерах используйте те же имена полей и формат даты, что реально выдаёт app.py. Не придумывайте методы, которых приложение не реализует.</w:t>
+      </w:r>
+    </w:p>
+    <w:p>
+      <w:pPr>
+        <w:spacing w:after="80"/>
+      </w:pPr>
+      <w:r>
+        <w:t>Действие 4. Для воспроизводимого заполнения из корня запустите build_docx.py: он открывает исходный шаблон, заполняет таблицы 0 и 1, добавляет примеры и сохраняет итог в task6_docs/API_документация.docx. Откройте итоговый DOCX и визуально проверьте, что таблицы не обрезаны.</w:t>
+      </w:r>
+    </w:p>
+    <w:p>
+      <w:pPr>
+        <w:spacing w:before="40" w:after="20"/>
+      </w:pPr>
+      <w:r>
+        <w:rPr>
+          <w:b/>
+        </w:rPr>
+        <w:t>Пересобрать заполненную проектную документацию:</w:t>
+      </w:r>
+    </w:p>
+    <w:p>
+      <w:pPr>
+        <w:spacing w:before="20" w:after="40" w:line="164" w:lineRule="exact"/>
+        <w:ind w:left="144" w:right="144"/>
+        <w:shd w:fill="F2F5F9"/>
+      </w:pPr>
+      <w:r>
+        <w:rPr>
+          <w:rFonts w:ascii="Consolas" w:hAnsi="Consolas"/>
+          <w:color w:val="243247"/>
+          <w:sz w:val="14"/>
+        </w:rPr>
+        <w:t>python3 solutions/task6_docs/build_docx.py</w:t>
+      </w:r>
+    </w:p>
+    <w:p>
+      <w:pPr>
+        <w:spacing w:before="40" w:after="20"/>
+      </w:pPr>
+      <w:r>
+        <w:rPr>
+          <w:b/>
+        </w:rPr>
+        <w:t>Проверочный пример успешного запроса:</w:t>
+      </w:r>
+    </w:p>
+    <w:p>
+      <w:pPr>
+        <w:spacing w:before="20" w:after="40" w:line="164" w:lineRule="exact"/>
+        <w:ind w:left="144" w:right="144"/>
+        <w:shd w:fill="F2F5F9"/>
+      </w:pPr>
+      <w:r>
+        <w:rPr>
+          <w:rFonts w:ascii="Consolas" w:hAnsi="Consolas"/>
+          <w:color w:val="243247"/>
+          <w:sz w:val="14"/>
+        </w:rPr>
+        <w:t>GET http://127.0.0.1:8000/notes?limit=2</w:t>
+        <w:br/>
+        <w:t>Accept: application/json</w:t>
+        <w:br/>
+        <w:br/>
+        <w:t>HTTP/1.1 200 OK</w:t>
+        <w:br/>
+        <w:t>Content-Type: application/json; charset=utf-8</w:t>
+        <w:br/>
+        <w:br/>
+        <w:t>[{"id":5,"title_user":"Итоги - admin","content":"Сохранить результаты тестирования.","formatted_date":"05.10.2026"}]</w:t>
+      </w:r>
+    </w:p>
+    <w:p>
+      <w:r>
+        <w:t>Итоговый файл — solutions/task6_docs/API_документация.docx. Сверьте каждое указанное поле с ответом GET /notes и каждую ветку статуса с тестами test_app.py.</w:t>
       </w:r>
     </w:p>
     <w:p>
@@ -3202,6 +3998,133 @@
       </w:r>
     </w:p>
     <w:p>
+      <w:pPr>
+        <w:pStyle w:val="Heading2"/>
+      </w:pPr>
+      <w:r>
+        <w:t>Как выполнить на практике</w:t>
+      </w:r>
+    </w:p>
+    <w:p>
+      <w:pPr>
+        <w:spacing w:after="80"/>
+      </w:pPr>
+      <w:r>
+        <w:t>Действие 1. Сделайте рабочую копию dataset_2026.xlsx и проверьте заголовки A:H: transaction_id, date, product, category, quantity, price, shop, manager. В исходнике 30 записей и три пустых дополнительных столбца; очищенный файл должен сохранить все 30 записей в том же порядке. Удаляйте только полное совпадение всех полей — здесь полных дубликатов нет.</w:t>
+      </w:r>
+    </w:p>
+    <w:p>
+      <w:pPr>
+        <w:spacing w:after="80"/>
+      </w:pPr>
+      <w:r>
+        <w:t>Действие 2. Очистите ID от пробелов/регистра и приведите к TXN-0001. Нормализуйте товар: trim пробелов, единый регистр и исправление Dison -&gt; Dyson. Количество очистите от суффикса «шт.», цену — от «руб.», затем преобразуйте обе колонки в числа. Дату задайте датой Excel и проверьте, что все годы — 2026.</w:t>
+      </w:r>
+    </w:p>
+    <w:p>
+      <w:pPr>
+        <w:spacing w:after="80"/>
+      </w:pPr>
+      <w:r>
+        <w:t>Действие 3. Пересчитайте категорию по названию товара, а не по грязному значению источника: пылесосы, телевизоры, стиральные машины, холодильники; утюг/чайник/микроволновая печь — «Мелкая бытовая техника». Это исправляет категории, случайно назначенные не тому товару, латинские буквы-двойники и пропуск. Нормализуйте пробелы в shop и единый формат инициалов manager.</w:t>
+      </w:r>
+    </w:p>
+    <w:p>
+      <w:pPr>
+        <w:spacing w:after="80"/>
+      </w:pPr>
+      <w:r>
+        <w:t>Действие 4. Добавьте столбец revenue и для каждой строки вычислите quantity × price. Создайте таблицу из 12 календарных месяцев именно датами первого числа месяца, просуммируйте revenue по границам месяца; не фильтруйте категории, магазины и менеджеров.</w:t>
+      </w:r>
+    </w:p>
+    <w:p>
+      <w:pPr>
+        <w:spacing w:after="80"/>
+      </w:pPr>
+      <w:r>
+        <w:t>Действие 5. Посчитайте годовой итог, долю месяца от годового итога, среднее 12 месячных значений, максимум/минимум и изменение к предыдущему месяцу. Постройте линейный график с X = январь…декабрь и Y = выручка; добавьте вторую серию с одинаковым средним значением для каждого из 12 месяцев и задайте ей горизонтальный пунктир.</w:t>
+      </w:r>
+    </w:p>
+    <w:p>
+      <w:pPr>
+        <w:spacing w:after="80"/>
+      </w:pPr>
+      <w:r>
+        <w:t>Действие 6. Проще воспроизвести всё без ручной порчи числовых форматов командой clean_data.py. Откройте созданные clean_dataset_2026.xlsx и analysis_2026.xlsx, проверьте листы Данные, Месячная выручка, Итоги и Журнал очистки. После очистки запустите Analytics_autotest на вкладке «Очистка данных», если приложение доступно; приложение в приложенных материалах отсутствует, поэтому его контрольный код нельзя заменить SHA-256.</w:t>
+      </w:r>
+    </w:p>
+    <w:p>
+      <w:pPr>
+        <w:spacing w:before="40" w:after="20"/>
+      </w:pPr>
+      <w:r>
+        <w:rPr>
+          <w:b/>
+        </w:rPr>
+        <w:t>Формулы для ручного расчёта в русской версии Excel (если лист Данные уже очищен):</w:t>
+      </w:r>
+    </w:p>
+    <w:p>
+      <w:pPr>
+        <w:spacing w:before="20" w:after="40" w:line="164" w:lineRule="exact"/>
+        <w:ind w:left="144" w:right="144"/>
+        <w:shd w:fill="F2F5F9"/>
+      </w:pPr>
+      <w:r>
+        <w:rPr>
+          <w:rFonts w:ascii="Consolas" w:hAnsi="Consolas"/>
+          <w:color w:val="243247"/>
+          <w:sz w:val="14"/>
+        </w:rPr>
+        <w:t>I2: =E2*F2</w:t>
+        <w:br/>
+        <w:t>B2: =СУММЕСЛИМН(Данные!$I$2:$I$31;Данные!$B$2:$B$31;"&gt;="&amp;A2;Данные!$B$2:$B$31;"&lt;"&amp;ДАТА(ГОД(A2);МЕСЯЦ(A2)+1;1))</w:t>
+        <w:br/>
+        <w:t>B14: =СУММ(B2:B13)</w:t>
+        <w:br/>
+        <w:t>C2: =B2/$B$14*100</w:t>
+        <w:br/>
+        <w:t>D3: =B3-B2</w:t>
+        <w:br/>
+        <w:t>E3: =D3/B2*100</w:t>
+        <w:br/>
+        <w:t>F2: =СРЗНАЧ($B$2:$B$13)</w:t>
+        <w:br/>
+        <w:t># A2:A13 — даты 01.01.2026 ... 01.12.2026. Протяните формулы вниз; B14 — годовой итог.</w:t>
+      </w:r>
+    </w:p>
+    <w:p>
+      <w:pPr>
+        <w:spacing w:before="40" w:after="20"/>
+      </w:pPr>
+      <w:r>
+        <w:rPr>
+          <w:b/>
+        </w:rPr>
+        <w:t>Автоматически очистить и построить две итоговые книги:</w:t>
+      </w:r>
+    </w:p>
+    <w:p>
+      <w:pPr>
+        <w:spacing w:before="20" w:after="40" w:line="164" w:lineRule="exact"/>
+        <w:ind w:left="144" w:right="144"/>
+        <w:shd w:fill="F2F5F9"/>
+      </w:pPr>
+      <w:r>
+        <w:rPr>
+          <w:rFonts w:ascii="Consolas" w:hAnsi="Consolas"/>
+          <w:color w:val="243247"/>
+          <w:sz w:val="14"/>
+        </w:rPr>
+        <w:t>python3 solutions/task7_analysis/clean_data.py</w:t>
+      </w:r>
+    </w:p>
+    <w:p>
+      <w:r>
+        <w:t>После выполнения: 30 строк, удалено 0, полных дубликатов 0; годовая выручка 7759680, средняя месячная 646640; максимум — ноябрь 1794540, минимум — сентябрь 127949. TXN-0001 (утюг Philips, 897270 руб./шт.) отмечен как ценовой выброс, но не заменён без правила из исходного ТЗ.</w:t>
+      </w:r>
+    </w:p>
+    <w:p>
       <w:r>
         <w:br w:type="page"/>
       </w:r>
@@ -3459,7 +4382,453 @@
         <w:pStyle w:val="Heading1"/>
       </w:pPr>
       <w:r>
-        <w:t>Приложение B. SQL-схема</w:t>
+        <w:t>Приложение B. Генератор PDF ER-диаграммы</w:t>
+      </w:r>
+    </w:p>
+    <w:p>
+      <w:r>
+        <w:t>Файл: solutions/task1_er/generate_diagram.py</w:t>
+      </w:r>
+    </w:p>
+    <w:p>
+      <w:pPr>
+        <w:spacing w:before="20" w:after="40" w:line="164" w:lineRule="exact"/>
+        <w:ind w:left="144" w:right="144"/>
+        <w:shd w:fill="F2F5F9"/>
+      </w:pPr>
+      <w:r>
+        <w:rPr>
+          <w:rFonts w:ascii="Consolas" w:hAnsi="Consolas"/>
+          <w:color w:val="243247"/>
+          <w:sz w:val="14"/>
+        </w:rPr>
+        <w:t>#!/usr/bin/env python3</w:t>
+        <w:br/>
+        <w:t>"""Генератор PDF ER-диаграммы (нужен reportlab)."""</w:t>
+        <w:br/>
+        <w:t>from pathlib import Path</w:t>
+        <w:br/>
+        <w:t>from math import hypot</w:t>
+        <w:br/>
+        <w:br/>
+        <w:t>from reportlab.lib.colors import HexColor, white</w:t>
+        <w:br/>
+        <w:t>from reportlab.lib.pagesizes import landscape, A3</w:t>
+        <w:br/>
+        <w:t>from reportlab.pdfbase import pdfmetrics</w:t>
+        <w:br/>
+        <w:t>from reportlab.pdfbase.ttfonts import TTFont</w:t>
+        <w:br/>
+        <w:t>from reportlab.pdfgen import canvas</w:t>
+        <w:br/>
+        <w:br/>
+        <w:t>HERE = Path(__file__).resolve().parent</w:t>
+        <w:br/>
+        <w:t>OUTPUT = HERE / "ER_диаграмма.pdf"</w:t>
+        <w:br/>
+        <w:t>FONT = Path("/usr/share/fonts/truetype/dejavu/DejaVuSans.ttf")</w:t>
+        <w:br/>
+        <w:t>FONT_BOLD = Path("/usr/share/fonts/truetype/dejavu/DejaVuSans-Bold.ttf")</w:t>
+        <w:br/>
+        <w:t>pdfmetrics.registerFont(TTFont("DejaVu", str(FONT)))</w:t>
+        <w:br/>
+        <w:t>pdfmetrics.registerFont(TTFont("DejaVu-Bold", str(FONT_BOLD)))</w:t>
+        <w:br/>
+        <w:br/>
+        <w:t>PAGE_W, PAGE_H = landscape(A3)</w:t>
+        <w:br/>
+        <w:t>NAVY = HexColor("#172B4D")</w:t>
+        <w:br/>
+        <w:t>BLUE = HexColor("#4058D6")</w:t>
+        <w:br/>
+        <w:t>MINT = HexColor("#DDF4EE")</w:t>
+        <w:br/>
+        <w:t>PALE = HexColor("#F2F5FB")</w:t>
+        <w:br/>
+        <w:t>MUTED = HexColor("#52627A")</w:t>
+        <w:br/>
+        <w:t>EDGE = HexColor("#58708E")</w:t>
+        <w:br/>
+        <w:br/>
+        <w:t>entities = [</w:t>
+        <w:br/>
+        <w:t xml:space="preserve">    {"key":"customers", "ru":"Заказчики", "row":0, "col":0,</w:t>
+        <w:br/>
+        <w:t xml:space="preserve">     "fields":[("PK", "customer_id TEXT"), ("", "name"), ("", "inn"), ("", "address"), ("", "phone"), ("", "party_type")]},</w:t>
+        <w:br/>
+        <w:t xml:space="preserve">    {"key":"customer_orders", "ru":"Заказы покупателей", "row":0, "col":1,</w:t>
+        <w:br/>
+        <w:t xml:space="preserve">     "fields":[("PK", "order_id"), ("FK", "customer_id"), ("", "order_date"), ("", "status")]},</w:t>
+        <w:br/>
+        <w:t xml:space="preserve">    {"key":"order_items", "ru":"Позиции заказа", "row":0, "col":2,</w:t>
+        <w:br/>
+        <w:t xml:space="preserve">     "fields":[("PK", "order_item_id"), ("", "source_order_item_id"), ("FK", "order_id"), ("FK", "product_id"), ("", "quantity &gt; 0"), ("", "unit_price_at_order, discount_per_unit")]},</w:t>
+        <w:br/>
+        <w:t xml:space="preserve">    {"key":"products", "ru":"Товары", "row":0, "col":3,</w:t>
+        <w:br/>
+        <w:t xml:space="preserve">     "fields":[("PK", "product_id"), ("", "source_product_id"), ("", "name"), ("", "category"), ("", "is_placeholder")]},</w:t>
+        <w:br/>
+        <w:t xml:space="preserve">    {"key":"resources", "ru":"Материалы и операции", "row":0, "col":4,</w:t>
+      </w:r>
+    </w:p>
+    <w:p>
+      <w:r>
+        <w:br w:type="page"/>
+      </w:r>
+    </w:p>
+    <w:p>
+      <w:pPr>
+        <w:spacing w:before="20" w:after="40" w:line="164" w:lineRule="exact"/>
+        <w:ind w:left="144" w:right="144"/>
+        <w:shd w:fill="F2F5F9"/>
+      </w:pPr>
+      <w:r>
+        <w:rPr>
+          <w:rFonts w:ascii="Consolas" w:hAnsi="Consolas"/>
+          <w:color w:val="243247"/>
+          <w:sz w:val="14"/>
+        </w:rPr>
+        <w:t xml:space="preserve">     "fields":[("PK", "resource_id"), ("", "source_resource_id"), ("", "name"), ("", "resource_type")]},</w:t>
+        <w:br/>
+        <w:t xml:space="preserve">    {"key":"production_orders", "ru":"Заказы на производство", "row":1, "col":0,</w:t>
+        <w:br/>
+        <w:t xml:space="preserve">     "fields":[("PK", "production_order_id"), ("", "order_number"), ("", "launch_date"), ("", "department")]},</w:t>
+        <w:br/>
+        <w:t xml:space="preserve">    {"key":"production_order_items", "ru":"Выпускаемая продукция", "row":1, "col":1,</w:t>
+        <w:br/>
+        <w:t xml:space="preserve">     "fields":[("PK", "production_order_item_id"), ("FK", "production_order_id"), ("FK", "product_id"), ("", "quantity, unit")]},</w:t>
+        <w:br/>
+        <w:t xml:space="preserve">    {"key":"product_specification", "ru":"Спецификация / BOM", "row":1, "col":2,</w:t>
+        <w:br/>
+        <w:t xml:space="preserve">     "fields":[("PK", "specification_id"), ("FK", "product_id"), ("FK", "resource_id"), ("", "quantity_per_product")]},</w:t>
+        <w:br/>
+        <w:t xml:space="preserve">    {"key":"prices", "ru":"Цены", "row":1, "col":3,</w:t>
+        <w:br/>
+        <w:t xml:space="preserve">     "fields":[("PK", "price_id"), ("FK*", "product_id NULL"), ("FK*", "resource_id NULL"), ("", "unit_price &gt;= 0")]},</w:t>
+        <w:br/>
+        <w:t xml:space="preserve">    {"key":"discounts", "ru":"Скидки", "row":1, "col":4,</w:t>
+        <w:br/>
+        <w:t xml:space="preserve">     "fields":[("PK", "discount_id"), ("", "source_discount_id"), ("FK*", "product_id NULL"), ("FK*", "resource_id NULL"), ("", "discount_percent")]},</w:t>
+        <w:br/>
+        <w:t>]</w:t>
+        <w:br/>
+        <w:br/>
+        <w:t>MARGIN_X = 26</w:t>
+        <w:br/>
+        <w:t>GAP_X = 12</w:t>
+        <w:br/>
+        <w:t>CARD_W = (PAGE_W - 2*MARGIN_X - 4*GAP_X) / 5</w:t>
+        <w:br/>
+        <w:t>CARD_H = 160</w:t>
+        <w:br/>
+        <w:t>ROW_Y = {0: 590, 1: 333}</w:t>
+        <w:br/>
+        <w:br/>
+        <w:br/>
+        <w:t>def wrap_text(text: str, font_name: str, size: float, max_width: float) -&gt; list[str]:</w:t>
+        <w:br/>
+        <w:t xml:space="preserve">    words = text.split()</w:t>
+        <w:br/>
+        <w:t xml:space="preserve">    lines, current = [], ""</w:t>
+        <w:br/>
+        <w:t xml:space="preserve">    for word in words:</w:t>
+        <w:br/>
+        <w:t xml:space="preserve">        candidate = f"{current} {word}".strip()</w:t>
+        <w:br/>
+        <w:t xml:space="preserve">        if current and pdfmetrics.stringWidth(candidate, font_name, size) &gt; max_width:</w:t>
+        <w:br/>
+        <w:t xml:space="preserve">            lines.append(current)</w:t>
+        <w:br/>
+        <w:t xml:space="preserve">            current = word</w:t>
+        <w:br/>
+        <w:t xml:space="preserve">        else:</w:t>
+        <w:br/>
+        <w:t xml:space="preserve">            current = candidate</w:t>
+        <w:br/>
+        <w:t xml:space="preserve">    if current:</w:t>
+        <w:br/>
+        <w:t xml:space="preserve">        lines.append(current)</w:t>
+        <w:br/>
+        <w:t xml:space="preserve">    return lines</w:t>
+        <w:br/>
+        <w:br/>
+        <w:br/>
+        <w:t>def draw_card(c: canvas.Canvas, entity: dict) -&gt; dict:</w:t>
+      </w:r>
+    </w:p>
+    <w:p>
+      <w:r>
+        <w:br w:type="page"/>
+      </w:r>
+    </w:p>
+    <w:p>
+      <w:pPr>
+        <w:spacing w:before="20" w:after="40" w:line="164" w:lineRule="exact"/>
+        <w:ind w:left="144" w:right="144"/>
+        <w:shd w:fill="F2F5F9"/>
+      </w:pPr>
+      <w:r>
+        <w:rPr>
+          <w:rFonts w:ascii="Consolas" w:hAnsi="Consolas"/>
+          <w:color w:val="243247"/>
+          <w:sz w:val="14"/>
+        </w:rPr>
+        <w:t xml:space="preserve">    x = MARGIN_X + entity["col"] * (CARD_W + GAP_X)</w:t>
+        <w:br/>
+        <w:t xml:space="preserve">    y = ROW_Y[entity["row"]]</w:t>
+        <w:br/>
+        <w:t xml:space="preserve">    c.setFillColor(white)</w:t>
+        <w:br/>
+        <w:t xml:space="preserve">    c.setStrokeColor(HexColor("#C9D3E2"))</w:t>
+        <w:br/>
+        <w:t xml:space="preserve">    c.setLineWidth(1.0)</w:t>
+        <w:br/>
+        <w:t xml:space="preserve">    c.roundRect(x, y, CARD_W, CARD_H, 9, fill=1, stroke=1)</w:t>
+        <w:br/>
+        <w:t xml:space="preserve">    c.setFillColor(NAVY if entity["row"] == 0 else HexColor("#234E63"))</w:t>
+        <w:br/>
+        <w:t xml:space="preserve">    c.roundRect(x, y + CARD_H - 35, CARD_W, 35, 9, fill=1, stroke=0)</w:t>
+        <w:br/>
+        <w:t xml:space="preserve">    c.rect(x, y + CARD_H - 35, CARD_W, 9, fill=1, stroke=0)</w:t>
+        <w:br/>
+        <w:t xml:space="preserve">    c.setFillColor(white)</w:t>
+        <w:br/>
+        <w:t xml:space="preserve">    c.setFont("DejaVu-Bold", 9.5)</w:t>
+        <w:br/>
+        <w:t xml:space="preserve">    c.drawString(x + 9, y + CARD_H - 15, entity["key"])</w:t>
+        <w:br/>
+        <w:t xml:space="preserve">    c.setFont("DejaVu", 7.5)</w:t>
+        <w:br/>
+        <w:t xml:space="preserve">    c.drawString(x + 9, y + CARD_H - 28, entity["ru"])</w:t>
+        <w:br/>
+        <w:t xml:space="preserve">    line_y = y + CARD_H - 49</w:t>
+        <w:br/>
+        <w:t xml:space="preserve">    for tag, value in entity["fields"]:</w:t>
+        <w:br/>
+        <w:t xml:space="preserve">        prefix = (tag + "  ") if tag else ""</w:t>
+        <w:br/>
+        <w:t xml:space="preserve">        color = BLUE if tag.startswith("PK") else (HexColor("#17735F") if tag.startswith("FK") else NAVY)</w:t>
+        <w:br/>
+        <w:t xml:space="preserve">        c.setFillColor(color)</w:t>
+        <w:br/>
+        <w:t xml:space="preserve">        c.setFont("DejaVu-Bold" if tag else "DejaVu", 7.8)</w:t>
+        <w:br/>
+        <w:t xml:space="preserve">        for line in wrap_text(prefix + value, "DejaVu-Bold" if tag else "DejaVu", 7.8, CARD_W - 17):</w:t>
+        <w:br/>
+        <w:t xml:space="preserve">            c.drawString(x + 9, line_y, line)</w:t>
+        <w:br/>
+        <w:t xml:space="preserve">            line_y -= 11.7</w:t>
+        <w:br/>
+        <w:t xml:space="preserve">    return {"x":x, "y":y, "w":CARD_W, "h":CARD_H, "cx":x+CARD_W/2, "cy":y+CARD_H/2}</w:t>
+        <w:br/>
+        <w:br/>
+        <w:br/>
+        <w:t>def connect(c: canvas.Canvas, start: tuple[float,float], end: tuple[float,float], label: str,</w:t>
+        <w:br/>
+        <w:t xml:space="preserve">            dashed: bool=False, label_offset: tuple[float,float]=(0,6)) -&gt; None:</w:t>
+        <w:br/>
+        <w:t xml:space="preserve">    x1,y1=start; x2,y2=end</w:t>
+        <w:br/>
+        <w:t xml:space="preserve">    c.saveState()</w:t>
+        <w:br/>
+        <w:t xml:space="preserve">    c.setStrokeColor(EDGE)</w:t>
+        <w:br/>
+        <w:t xml:space="preserve">    c.setFillColor(EDGE)</w:t>
+        <w:br/>
+        <w:t xml:space="preserve">    c.setLineWidth(1.1)</w:t>
+        <w:br/>
+        <w:t xml:space="preserve">    if dashed:</w:t>
+        <w:br/>
+        <w:t xml:space="preserve">        c.setDash(3, 2)</w:t>
+        <w:br/>
+        <w:t xml:space="preserve">    c.line(x1,y1,x2,y2)</w:t>
+      </w:r>
+    </w:p>
+    <w:p>
+      <w:r>
+        <w:br w:type="page"/>
+      </w:r>
+    </w:p>
+    <w:p>
+      <w:pPr>
+        <w:spacing w:before="20" w:after="40" w:line="164" w:lineRule="exact"/>
+        <w:ind w:left="144" w:right="144"/>
+        <w:shd w:fill="F2F5F9"/>
+      </w:pPr>
+      <w:r>
+        <w:rPr>
+          <w:rFonts w:ascii="Consolas" w:hAnsi="Consolas"/>
+          <w:color w:val="243247"/>
+          <w:sz w:val="14"/>
+        </w:rPr>
+        <w:t xml:space="preserve">    length = hypot(x2-x1,y2-y1) or 1</w:t>
+        <w:br/>
+        <w:t xml:space="preserve">    ux,uy=(x2-x1)/length,(y2-y1)/length</w:t>
+        <w:br/>
+        <w:t xml:space="preserve">    size=5</w:t>
+        <w:br/>
+        <w:t xml:space="preserve">    bx,by=x2-ux*size,y2-uy*size</w:t>
+        <w:br/>
+        <w:t xml:space="preserve">    px,py=-uy*size*.55,ux*size*.55</w:t>
+        <w:br/>
+        <w:t xml:space="preserve">    path=c.beginPath(); path.moveTo(x2,y2); path.lineTo(bx+px,by+py); path.lineTo(bx-px,by-py); path.close()</w:t>
+        <w:br/>
+        <w:t xml:space="preserve">    c.drawPath(path,fill=1,stroke=0)</w:t>
+        <w:br/>
+        <w:t xml:space="preserve">    c.setDash()</w:t>
+        <w:br/>
+        <w:t xml:space="preserve">    mx,my=(x1+x2)/2+label_offset[0],(y1+y2)/2+label_offset[1]</w:t>
+        <w:br/>
+        <w:t xml:space="preserve">    text_w=pdfmetrics.stringWidth(label,"DejaVu-Bold",7.1)</w:t>
+        <w:br/>
+        <w:t xml:space="preserve">    c.setFillColor(white)</w:t>
+        <w:br/>
+        <w:t xml:space="preserve">    c.roundRect(mx-text_w/2-3,my-2,text_w+6,11,3,fill=1,stroke=0)</w:t>
+        <w:br/>
+        <w:t xml:space="preserve">    c.setFillColor(BLUE)</w:t>
+        <w:br/>
+        <w:t xml:space="preserve">    c.setFont("DejaVu-Bold",7.1)</w:t>
+        <w:br/>
+        <w:t xml:space="preserve">    c.drawCentredString(mx,my,label)</w:t>
+        <w:br/>
+        <w:t xml:space="preserve">    c.restoreState()</w:t>
+        <w:br/>
+        <w:br/>
+        <w:br/>
+        <w:t>def main() -&gt; None:</w:t>
+        <w:br/>
+        <w:t xml:space="preserve">    c = canvas.Canvas(str(OUTPUT), pagesize=(PAGE_W,PAGE_H))</w:t>
+        <w:br/>
+        <w:t xml:space="preserve">    c.setTitle("ER-диаграмма — экзамен 09.02.07")</w:t>
+        <w:br/>
+        <w:t xml:space="preserve">    c.setAuthor("Экзаменационные материалы")</w:t>
+        <w:br/>
+        <w:t xml:space="preserve">    c.setFillColor(NAVY); c.setFont("DejaVu-Bold",18)</w:t>
+        <w:br/>
+        <w:t xml:space="preserve">    c.drawString(26,PAGE_H-31,"Задание 1. ER-диаграмма информационной системы производства")</w:t>
+        <w:br/>
+        <w:t xml:space="preserve">    c.setFillColor(MUTED); c.setFont("DejaVu",9)</w:t>
+        <w:br/>
+        <w:t xml:space="preserve">    c.drawString(26,PAGE_H-49,"Логическая модель в третьей нормальной форме; PK — первичный ключ, FK — внешний ключ, FK* — один из двух взаимоисключающих FK.")</w:t>
+        <w:br/>
+        <w:br/>
+        <w:t xml:space="preserve">    boxes={entity["key"]:draw_card(c,entity) for entity in entities}</w:t>
+        <w:br/>
+        <w:t xml:space="preserve">    b=boxes</w:t>
+        <w:br/>
+        <w:t xml:space="preserve">    # Основной контур клиентского заказа.</w:t>
+        <w:br/>
+        <w:t xml:space="preserve">    connect(c,(b["customers"]["x"]+b["customers"]["w"],b["customers"]["cy"]+18),(b["customer_orders"]["x"],b["customer_orders"]["cy"]+18),"1 : N")</w:t>
+        <w:br/>
+        <w:t xml:space="preserve">    connect(c,(b["customer_orders"]["x"]+b["customer_orders"]["w"],b["customer_orders"]["cy"]+18),(b["order_items"]["x"],b["order_items"]["cy"]+18),"1 : N")</w:t>
+        <w:br/>
+        <w:t xml:space="preserve">    connect(c,(b["products"]["x"],b["products"]["cy"]-18),(b["order_items"]["x"]+b["order_items"]["w"],b["order_items"]["cy"]-18),"1 : N",label_offset=(0,-11))</w:t>
+        <w:br/>
+        <w:t xml:space="preserve">    # Состав изделия: связь M:N через таблицу спецификации.</w:t>
+        <w:br/>
+        <w:t xml:space="preserve">    connect(c,(b["products"]["cx"],b["products"]["y"]),(b["product_specification"]["x"]+b["product_specification"]["w"],b["product_specification"]["y"]+b["product_specification"]["h"]),"1 : N")</w:t>
+        <w:br/>
+        <w:t xml:space="preserve">    connect(c,(b["resources"]["cx"],b["resources"]["y"]),(b["product_specification"]["x"]+b["product_specification"]["w"]-24,b["product_specification"]["y"]+b["product_specification"]["h"]),"1 : N",label_offset=(0,-10))</w:t>
+      </w:r>
+    </w:p>
+    <w:p>
+      <w:r>
+        <w:br w:type="page"/>
+      </w:r>
+    </w:p>
+    <w:p>
+      <w:pPr>
+        <w:spacing w:before="20" w:after="40" w:line="164" w:lineRule="exact"/>
+        <w:ind w:left="144" w:right="144"/>
+        <w:shd w:fill="F2F5F9"/>
+      </w:pPr>
+      <w:r>
+        <w:rPr>
+          <w:rFonts w:ascii="Consolas" w:hAnsi="Consolas"/>
+          <w:color w:val="243247"/>
+          <w:sz w:val="14"/>
+        </w:rPr>
+        <w:t xml:space="preserve">    # Цены и скидки опционально относятся либо к товару, либо к ресурсу.</w:t>
+        <w:br/>
+        <w:t xml:space="preserve">    connect(c,(b["products"]["cx"],b["products"]["y"]),(b["prices"]["cx"],b["prices"]["y"]+b["prices"]["h"]),"1 : 0..N",True)</w:t>
+        <w:br/>
+        <w:t xml:space="preserve">    connect(c,(b["resources"]["x"]+b["resources"]["w"]-22,b["resources"]["y"]),(b["prices"]["x"]+b["prices"]["w"],b["prices"]["y"]+b["prices"]["h"]-25),"1 : 0..N",True,(4,-6))</w:t>
+        <w:br/>
+        <w:t xml:space="preserve">    connect(c,(b["products"]["x"]+b["products"]["w"],b["products"]["y"]+20),(b["discounts"]["x"],b["discounts"]["y"]+b["discounts"]["h"]-20),"1 : 0..N",True,(0,9))</w:t>
+        <w:br/>
+        <w:t xml:space="preserve">    connect(c,(b["resources"]["cx"],b["resources"]["y"]),(b["discounts"]["cx"],b["discounts"]["y"]+b["discounts"]["h"]),"1 : 0..N",True,(0,-9))</w:t>
+        <w:br/>
+        <w:t xml:space="preserve">    # Производственный заказ.</w:t>
+        <w:br/>
+        <w:t xml:space="preserve">    connect(c,(b["production_orders"]["x"]+b["production_orders"]["w"],b["production_orders"]["cy"]),(b["production_order_items"]["x"],b["production_order_items"]["cy"]),"1 : N")</w:t>
+        <w:br/>
+        <w:t xml:space="preserve">    connect(c,(b["products"]["x"],b["products"]["y"]+25),(b["production_order_items"]["x"]+b["production_order_items"]["w"],b["production_order_items"]["y"]+b["production_order_items"]["h"]),"1 : N",label_offset=(0,-10))</w:t>
+        <w:br/>
+        <w:br/>
+        <w:t xml:space="preserve">    # Легенда и правила ссылочной целостности.</w:t>
+        <w:br/>
+        <w:t xml:space="preserve">    note_y=282</w:t>
+        <w:br/>
+        <w:t xml:space="preserve">    c.setFillColor(NAVY); c.setFont("DejaVu-Bold",10)</w:t>
+        <w:br/>
+        <w:t xml:space="preserve">    c.drawString(26,note_y,"Связи и ограничения")</w:t>
+        <w:br/>
+        <w:t xml:space="preserve">    c.setFillColor(MUTED); c.setFont("DejaVu",8.2)</w:t>
+        <w:br/>
+        <w:t xml:space="preserve">    left_notes=[</w:t>
+        <w:br/>
+        <w:t xml:space="preserve">        "Заказчик 1:N заказов; заказ 1:N позиций; товар 1:N позиций.",</w:t>
+        <w:br/>
+        <w:t xml:space="preserve">        "Товар M:N ресурс через product_specification; количество — норма на единицу продукции.",</w:t>
+        <w:br/>
+        <w:t xml:space="preserve">        "Производственный заказ 1:N строк выпуска; строка указывает товар, количество и единицу измерения.",</w:t>
+        <w:br/>
+        <w:t xml:space="preserve">    ]</w:t>
+        <w:br/>
+        <w:t xml:space="preserve">    right_notes=[</w:t>
+        <w:br/>
+        <w:t xml:space="preserve">        "resource_type различает «Материал» и «Операция»; обе сущности тарифицируются одинаково.",</w:t>
+        <w:br/>
+        <w:t xml:space="preserve">        "В prices и discounts ровно один FK: product_id ИЛИ resource_id (CHECK в schema.sql).",</w:t>
+        <w:br/>
+        <w:t xml:space="preserve">        "Surrogate PK сохраняют строки с повторными исходными ID; пропущенные товары помечены is_placeholder=1.",</w:t>
+        <w:br/>
+        <w:t xml:space="preserve">    ]</w:t>
+        <w:br/>
+        <w:t xml:space="preserve">    for i,text in enumerate(left_notes):</w:t>
+        <w:br/>
+        <w:t xml:space="preserve">        c.drawString(26,note_y-16-i*15,"• " + text)</w:t>
+        <w:br/>
+        <w:t xml:space="preserve">    for i,text in enumerate(right_notes):</w:t>
+        <w:br/>
+        <w:t xml:space="preserve">        c.drawString(PAGE_W/2+4,note_y-16-i*15,"• " + text)</w:t>
+        <w:br/>
+        <w:t xml:space="preserve">    c.setFillColor(HexColor("#7A879A")); c.setFont("DejaVu",7)</w:t>
+        <w:br/>
+        <w:t xml:space="preserve">    c.drawString(26,27,"Файлы реализации: schema.sql и seed.py. Модель не хранит вычисляемую себестоимость — она считается запросом по нормам спецификации и ценам ресурсов.")</w:t>
+        <w:br/>
+        <w:t xml:space="preserve">    c.showPage(); c.save()</w:t>
+        <w:br/>
+        <w:t xml:space="preserve">    print(OUTPUT)</w:t>
+        <w:br/>
+        <w:br/>
+        <w:br/>
+        <w:t>if __name__ == "__main__":</w:t>
+        <w:br/>
+        <w:t xml:space="preserve">    main()</w:t>
+      </w:r>
+    </w:p>
+    <w:p>
+      <w:r>
+        <w:br w:type="page"/>
+      </w:r>
+    </w:p>
+    <w:p>
+      <w:pPr>
+        <w:pStyle w:val="Heading1"/>
+      </w:pPr>
+      <w:r>
+        <w:t>Приложение C. SQL-схема</w:t>
       </w:r>
     </w:p>
     <w:p>
@@ -3727,7 +5096,7 @@
         <w:pStyle w:val="Heading1"/>
       </w:pPr>
       <w:r>
-        <w:t>Приложение C. Загрузчик JSON/SQLite</w:t>
+        <w:t>Приложение D. Загрузчик JSON/SQLite</w:t>
       </w:r>
     </w:p>
     <w:p>
@@ -4377,7 +5746,7 @@
         <w:pStyle w:val="Heading1"/>
       </w:pPr>
       <w:r>
-        <w:t>Приложение D. SQL-запросы задания 3</w:t>
+        <w:t>Приложение E. SQL-запросы задания 3</w:t>
       </w:r>
     </w:p>
     <w:p>
@@ -4407,6 +5776,10 @@
         <w:br/>
         <w:t>-- производства не входят.</w:t>
         <w:br/>
+        <w:t>-- Если у любой строки заказа нет BOM или у любого ресурса нет цены,</w:t>
+        <w:br/>
+        <w:t>-- итог не подменяется частичной суммой: total_manufacturing_cost будет NULL.</w:t>
+        <w:br/>
         <w:br/>
         <w:t>WITH components AS (</w:t>
         <w:br/>
@@ -4416,6 +5789,8 @@
         <w:br/>
         <w:t xml:space="preserve">        oi.order_item_id,</w:t>
         <w:br/>
+        <w:t xml:space="preserve">        oi.product_id,</w:t>
+        <w:br/>
         <w:t xml:space="preserve">        oi.quantity AS ordered_quantity,</w:t>
         <w:br/>
         <w:t xml:space="preserve">        ps.specification_id,</w:t>
@@ -4450,23 +5825,17 @@
         <w:br/>
         <w:t xml:space="preserve">    WHERE o.order_id = :order_id</w:t>
         <w:br/>
-        <w:t>)</w:t>
-        <w:br/>
-        <w:t>SELECT</w:t>
-        <w:br/>
-        <w:t xml:space="preserve">    order_id,</w:t>
-        <w:br/>
-        <w:t xml:space="preserve">    CASE</w:t>
-        <w:br/>
-        <w:t xml:space="preserve">        WHEN COUNT(specification_id) = 0</w:t>
-        <w:br/>
-        <w:t xml:space="preserve">          OR COUNT(price_id) &lt;&gt; COUNT(specification_id)</w:t>
-        <w:br/>
-        <w:t xml:space="preserve">        THEN NULL</w:t>
-        <w:br/>
-        <w:t xml:space="preserve">        ELSE ROUND(SUM(ordered_quantity * quantity_per_product * unit_price), 2)</w:t>
-        <w:br/>
-        <w:t xml:space="preserve">    END AS total_manufacturing_cost,</w:t>
+        <w:t>),</w:t>
+        <w:br/>
+        <w:t>coverage AS (</w:t>
+        <w:br/>
+        <w:t xml:space="preserve">    SELECT</w:t>
+        <w:br/>
+        <w:t xml:space="preserve">        order_id,</w:t>
+        <w:br/>
+        <w:t xml:space="preserve">        COUNT(DISTINCT order_item_id) AS order_positions,</w:t>
+        <w:br/>
+        <w:t xml:space="preserve">        COUNT(DISTINCT CASE WHEN specification_id IS NOT NULL THEN order_item_id END)</w:t>
       </w:r>
     </w:p>
     <w:p>
@@ -4486,19 +5855,49 @@
           <w:color w:val="243247"/>
           <w:sz w:val="14"/>
         </w:rPr>
-        <w:t xml:space="preserve">    COUNT(specification_id) AS required_cost_positions,</w:t>
-        <w:br/>
-        <w:t xml:space="preserve">    COUNT(price_id) AS priced_positions</w:t>
-        <w:br/>
-        <w:t>FROM components</w:t>
-        <w:br/>
-        <w:t>GROUP BY order_id;</w:t>
-        <w:br/>
-        <w:br/>
-        <w:t>-- Детализация того же расчёта: норма × цена × количество продукции в заказе.</w:t>
+        <w:t xml:space="preserve">            AS positions_with_bom,</w:t>
+        <w:br/>
+        <w:t xml:space="preserve">        COUNT(specification_id) AS required_cost_positions,</w:t>
+        <w:br/>
+        <w:t xml:space="preserve">        COUNT(price_id) AS priced_positions,</w:t>
+        <w:br/>
+        <w:t xml:space="preserve">        SUM(ordered_quantity * quantity_per_product * unit_price) AS raw_total</w:t>
+        <w:br/>
+        <w:t xml:space="preserve">    FROM components</w:t>
+        <w:br/>
+        <w:t xml:space="preserve">    GROUP BY order_id</w:t>
+        <w:br/>
+        <w:t>)</w:t>
         <w:br/>
         <w:t>SELECT</w:t>
         <w:br/>
+        <w:t xml:space="preserve">    order_id,</w:t>
+        <w:br/>
+        <w:t xml:space="preserve">    CASE</w:t>
+        <w:br/>
+        <w:t xml:space="preserve">        WHEN positions_with_bom &lt;&gt; order_positions</w:t>
+        <w:br/>
+        <w:t xml:space="preserve">          OR required_cost_positions = 0</w:t>
+        <w:br/>
+        <w:t xml:space="preserve">          OR priced_positions &lt;&gt; required_cost_positions</w:t>
+        <w:br/>
+        <w:t xml:space="preserve">        THEN NULL</w:t>
+        <w:br/>
+        <w:t xml:space="preserve">        ELSE ROUND(raw_total, 2)</w:t>
+        <w:br/>
+        <w:t xml:space="preserve">    END AS total_manufacturing_cost,</w:t>
+        <w:br/>
+        <w:t xml:space="preserve">    required_cost_positions,</w:t>
+        <w:br/>
+        <w:t xml:space="preserve">    priced_positions</w:t>
+        <w:br/>
+        <w:t>FROM coverage;</w:t>
+        <w:br/>
+        <w:br/>
+        <w:t>-- Детализация того же расчёта: норма × цена × количество продукции.</w:t>
+        <w:br/>
+        <w:t>SELECT</w:t>
+        <w:br/>
         <w:t xml:space="preserve">    o.order_id,</w:t>
         <w:br/>
         <w:t xml:space="preserve">    oi.order_item_id,</w:t>
@@ -4526,7 +5925,25 @@
         <w:t>JOIN products AS p</w:t>
         <w:br/>
         <w:t xml:space="preserve">  ON p.product_id = oi.product_id</w:t>
-        <w:br/>
+      </w:r>
+    </w:p>
+    <w:p>
+      <w:r>
+        <w:br w:type="page"/>
+      </w:r>
+    </w:p>
+    <w:p>
+      <w:pPr>
+        <w:spacing w:before="20" w:after="40" w:line="164" w:lineRule="exact"/>
+        <w:ind w:left="144" w:right="144"/>
+        <w:shd w:fill="F2F5F9"/>
+      </w:pPr>
+      <w:r>
+        <w:rPr>
+          <w:rFonts w:ascii="Consolas" w:hAnsi="Consolas"/>
+          <w:color w:val="243247"/>
+          <w:sz w:val="14"/>
+        </w:rPr>
         <w:t>JOIN product_specification AS ps</w:t>
         <w:br/>
         <w:t xml:space="preserve">  ON ps.product_id = oi.product_id</w:t>
@@ -4556,7 +5973,7 @@
         <w:pStyle w:val="Heading1"/>
       </w:pPr>
       <w:r>
-        <w:t>Приложение E. Приложение заданий 4–5</w:t>
+        <w:t>Приложение F. Приложение заданий 4–5</w:t>
       </w:r>
     </w:p>
     <w:p>
@@ -6296,7 +7713,7 @@
         <w:pStyle w:val="Heading1"/>
       </w:pPr>
       <w:r>
-        <w:t>Приложение F. Автоматические тесты</w:t>
+        <w:t>Приложение G. Автоматические тесты</w:t>
       </w:r>
     </w:p>
     <w:p>
@@ -6718,7 +8135,7 @@
         <w:pStyle w:val="Heading1"/>
       </w:pPr>
       <w:r>
-        <w:t>Приложение G. Коллекция Postman</w:t>
+        <w:t>Приложение H. Коллекция Postman</w:t>
       </w:r>
     </w:p>
     <w:p>
@@ -6911,7 +8328,7 @@
         <w:pStyle w:val="Heading1"/>
       </w:pPr>
       <w:r>
-        <w:t>Приложение H. Окружение Postman</w:t>
+        <w:t>Приложение I. Окружение Postman</w:t>
       </w:r>
     </w:p>
     <w:p>
@@ -6964,7 +8381,7 @@
         <w:pStyle w:val="Heading1"/>
       </w:pPr>
       <w:r>
-        <w:t>Приложение I. Генератор документации</w:t>
+        <w:t>Приложение J. Генератор документации</w:t>
       </w:r>
     </w:p>
     <w:p>
@@ -7287,7 +8704,7 @@
         <w:pStyle w:val="Heading1"/>
       </w:pPr>
       <w:r>
-        <w:t>Приложение J. Скрипт очистки и анализа</w:t>
+        <w:t>Приложение K. Скрипт очистки и анализа</w:t>
       </w:r>
     </w:p>
     <w:p>

</xml_diff>

<commit_message>
Add local task 7 preflight checker
Co-authored-by: arena-agent <297053741+arena-agent@users.noreply.github.com>
</commit_message>
<xml_diff>
--- a/solutions/Полное_пошаговое_решение_КИМ_09.02.07-5-2027.docx
+++ b/solutions/Полное_пошаговое_решение_КИМ_09.02.07-5-2027.docx
@@ -3994,7 +3994,7 @@
     </w:p>
     <w:p>
       <w:r>
-        <w:t>В исходниках отсутствуют Analytics_autotest и точные формулировки вопросов 7.2–7.9; официальный контрольный код задания 7.1 получить можно только запуском экзаменационного приложения. SHA-256 файла не подменяет его контрольную сумму.</w:t>
+        <w:t>В исходниках отсутствуют Analytics_autotest и точные формулировки вопросов 7.2–7.9. В проект добавлен локальный preflight_check.py, который проверяет сохранность строк, нормализацию, формулы, итоги и график по явным требованиям PDF. Это полезная предварительная сверка, но не официальный тестер и не контрольный код задания 7.1; SHA-256 файла тоже не заменяет официальный код.</w:t>
       </w:r>
     </w:p>
     <w:p>
@@ -4050,7 +4050,7 @@
         <w:spacing w:after="80"/>
       </w:pPr>
       <w:r>
-        <w:t>Действие 6. Проще воспроизвести всё без ручной порчи числовых форматов командой clean_data.py. Откройте созданные clean_dataset_2026.xlsx и analysis_2026.xlsx, проверьте листы Данные, Месячная выручка, Итоги и Журнал очистки. После очистки запустите Analytics_autotest на вкладке «Очистка данных», если приложение доступно; приложение в приложенных материалах отсутствует, поэтому его контрольный код нельзя заменить SHA-256.</w:t>
+        <w:t>Действие 6. Проще воспроизвести всё без ручной порчи числовых форматов командой clean_data.py. Откройте созданные clean_dataset_2026.xlsx и analysis_2026.xlsx, проверьте листы Данные, Месячная выручка, Итоги и Журнал очистки. Затем запустите добавленную локальную предварительную проверку: она сверяет каждый критерий, который можно вывести из приложенного ТЗ. Официальный Analytics_autotest в материалах отсутствует, поэтому локальная проверка не выдаёт и не имитирует его контрольный код.</w:t>
       </w:r>
     </w:p>
     <w:p>
@@ -4120,8 +4120,34 @@
       </w:r>
     </w:p>
     <w:p>
+      <w:pPr>
+        <w:spacing w:before="40" w:after="20"/>
+      </w:pPr>
       <w:r>
-        <w:t>После выполнения: 30 строк, удалено 0, полных дубликатов 0; годовая выручка 7759680, средняя месячная 646640; максимум — ноябрь 1794540, минимум — сентябрь 127949. TXN-0001 (утюг Philips, 897270 руб./шт.) отмечен как ценовой выброс, но не заменён без правила из исходного ТЗ.</w:t>
+        <w:rPr>
+          <w:b/>
+        </w:rPr>
+        <w:t>Проверить все явные требования задания 7 локальным preflight-check (это не официальный тестер):</w:t>
+      </w:r>
+    </w:p>
+    <w:p>
+      <w:pPr>
+        <w:spacing w:before="20" w:after="40" w:line="164" w:lineRule="exact"/>
+        <w:ind w:left="144" w:right="144"/>
+        <w:shd w:fill="F2F5F9"/>
+      </w:pPr>
+      <w:r>
+        <w:rPr>
+          <w:rFonts w:ascii="Consolas" w:hAnsi="Consolas"/>
+          <w:color w:val="243247"/>
+          <w:sz w:val="14"/>
+        </w:rPr>
+        <w:t>python3 solutions/task7_analysis/preflight_check.py</w:t>
+      </w:r>
+    </w:p>
+    <w:p>
+      <w:r>
+        <w:t>После выполнения: 30 строк, удалено 0, полных дубликатов 0; годовая выручка 7759680, средняя месячная 646640; максимум — ноябрь 1794540, минимум — сентябрь 127949. TXN-0001 (утюг Philips, 897270 руб./шт.) отмечен как ценовой выброс, но не заменён без правила из исходного ТЗ. Локальный preflight-check проверяет явные требования, но не выдаёт официальный код 7.1.</w:t>
       </w:r>
     </w:p>
     <w:p>
@@ -9691,6 +9717,534 @@
         <w:t>if __name__ == "__main__":</w:t>
         <w:br/>
         <w:t xml:space="preserve">    main()</w:t>
+      </w:r>
+    </w:p>
+    <w:p>
+      <w:r>
+        <w:br w:type="page"/>
+      </w:r>
+    </w:p>
+    <w:p>
+      <w:pPr>
+        <w:pStyle w:val="Heading1"/>
+      </w:pPr>
+      <w:r>
+        <w:t>Приложение L. Локальная предварительная проверка задания 7</w:t>
+      </w:r>
+    </w:p>
+    <w:p>
+      <w:r>
+        <w:t>Файл: solutions/task7_analysis/preflight_check.py</w:t>
+      </w:r>
+    </w:p>
+    <w:p>
+      <w:pPr>
+        <w:spacing w:before="20" w:after="40" w:line="164" w:lineRule="exact"/>
+        <w:ind w:left="144" w:right="144"/>
+        <w:shd w:fill="F2F5F9"/>
+      </w:pPr>
+      <w:r>
+        <w:rPr>
+          <w:rFonts w:ascii="Consolas" w:hAnsi="Consolas"/>
+          <w:color w:val="243247"/>
+          <w:sz w:val="14"/>
+        </w:rPr>
+        <w:t>#!/usr/bin/env python3</w:t>
+        <w:br/>
+        <w:t>"""Локальная предварительная проверка файлов задания 7.</w:t>
+        <w:br/>
+        <w:br/>
+        <w:t>Это НЕ официальный Analytics_autotest и не выдаёт его контрольный код.</w:t>
+        <w:br/>
+        <w:t>Скрипт проверяет требования, которые явно перечислены в приложенном ТЗ:</w:t>
+        <w:br/>
+        <w:t>сохранность 30 строк, типы/нормализацию, расчёт выручки, помесячную сводку,</w:t>
+        <w:br/>
+        <w:t>итоги и наличие графика с серией среднего значения.</w:t>
+        <w:br/>
+        <w:br/>
+        <w:t>Запуск из корня репозитория:</w:t>
+        <w:br/>
+        <w:t xml:space="preserve">    python3 solutions/task7_analysis/preflight_check.py</w:t>
+        <w:br/>
+        <w:br/>
+        <w:t>В комплекте заданий можно запускать из этой папки без параметров, если рядом</w:t>
+        <w:br/>
+        <w:t>находится исходный dataset_2026.xlsx.</w:t>
+        <w:br/>
+        <w:t>"""</w:t>
+        <w:br/>
+        <w:t>from __future__ import annotations</w:t>
+        <w:br/>
+        <w:br/>
+        <w:t>import argparse</w:t>
+        <w:br/>
+        <w:t>import sys</w:t>
+        <w:br/>
+        <w:t>from datetime import date, datetime</w:t>
+        <w:br/>
+        <w:t>from decimal import Decimal, InvalidOperation</w:t>
+        <w:br/>
+        <w:t>from pathlib import Path</w:t>
+        <w:br/>
+        <w:t>from typing import Any</w:t>
+        <w:br/>
+        <w:br/>
+        <w:t>from openpyxl import load_workbook</w:t>
+        <w:br/>
+        <w:t>from openpyxl.chart import LineChart</w:t>
+        <w:br/>
+        <w:br/>
+        <w:t>from clean_data import infer_category, normalize_manager, normalize_product, normalize_transaction_id</w:t>
+        <w:br/>
+        <w:br/>
+        <w:t>HERE = Path(__file__).resolve().parent</w:t>
+        <w:br/>
+        <w:t>REPO_ROOT = HERE.parents[1]</w:t>
+        <w:br/>
+        <w:t>DEFAULT_SOURCE = HERE / "dataset_2026.xlsx"</w:t>
+        <w:br/>
+        <w:t>if not DEFAULT_SOURCE.is_file():</w:t>
+        <w:br/>
+        <w:t xml:space="preserve">    DEFAULT_SOURCE = REPO_ROOT / "dataset_2026.xlsx"</w:t>
+        <w:br/>
+        <w:t>DEFAULT_CLEAN = HERE / "clean_dataset_2026.xlsx"</w:t>
+        <w:br/>
+        <w:t>DEFAULT_ANALYSIS = HERE / "analysis_2026.xlsx"</w:t>
+        <w:br/>
+        <w:t>HEADERS = ["transaction_id", "date", "product", "category", "quantity", "price", "shop", "manager"]</w:t>
+      </w:r>
+    </w:p>
+    <w:p>
+      <w:r>
+        <w:br w:type="page"/>
+      </w:r>
+    </w:p>
+    <w:p>
+      <w:pPr>
+        <w:spacing w:before="20" w:after="40" w:line="164" w:lineRule="exact"/>
+        <w:ind w:left="144" w:right="144"/>
+        <w:shd w:fill="F2F5F9"/>
+      </w:pPr>
+      <w:r>
+        <w:rPr>
+          <w:rFonts w:ascii="Consolas" w:hAnsi="Consolas"/>
+          <w:color w:val="243247"/>
+          <w:sz w:val="14"/>
+        </w:rPr>
+        <w:t>MONTHS = [</w:t>
+        <w:br/>
+        <w:t xml:space="preserve">    "Январь", "Февраль", "Март", "Апрель", "Май", "Июнь",</w:t>
+        <w:br/>
+        <w:t xml:space="preserve">    "Июль", "Август", "Сентябрь", "Октябрь", "Ноябрь", "Декабрь",</w:t>
+        <w:br/>
+        <w:t>]</w:t>
+        <w:br/>
+        <w:t>EXPECTED = {</w:t>
+        <w:br/>
+        <w:t xml:space="preserve">    "Строк в исходном наборе": 30,</w:t>
+        <w:br/>
+        <w:t xml:space="preserve">    "Полных дубликатов": 0,</w:t>
+        <w:br/>
+        <w:t xml:space="preserve">    "Строк удалено": 0,</w:t>
+        <w:br/>
+        <w:t xml:space="preserve">    "Годовая выручка, руб.": 7_759_680,</w:t>
+        <w:br/>
+        <w:t xml:space="preserve">    "Средняя месячная выручка, руб.": 646_640,</w:t>
+        <w:br/>
+        <w:t xml:space="preserve">    "Месяц максимальной выручки": "Ноябрь",</w:t>
+        <w:br/>
+        <w:t xml:space="preserve">    "Максимальная месячная выручка, руб.": 1_794_540,</w:t>
+        <w:br/>
+        <w:t xml:space="preserve">    "Месяц минимальной выручки": "Сентябрь",</w:t>
+        <w:br/>
+        <w:t xml:space="preserve">    "Минимальная месячная выручка, руб.": 127_949,</w:t>
+        <w:br/>
+        <w:t xml:space="preserve">    "Размах месячной выручки, руб.": 1_666_591,</w:t>
+        <w:br/>
+        <w:t xml:space="preserve">    "Строк с зафиксированными исправлениями": 27,</w:t>
+        <w:br/>
+        <w:t xml:space="preserve">    "Количество исправлений по полям": 47,</w:t>
+        <w:br/>
+        <w:t>}</w:t>
+        <w:br/>
+        <w:br/>
+        <w:br/>
+        <w:t>def dec(value: Any) -&gt; Decimal | None:</w:t>
+        <w:br/>
+        <w:t xml:space="preserve">    if value is None or isinstance(value, bool):</w:t>
+        <w:br/>
+        <w:t xml:space="preserve">        return None</w:t>
+        <w:br/>
+        <w:t xml:space="preserve">    try:</w:t>
+        <w:br/>
+        <w:t xml:space="preserve">        result = Decimal(str(value))</w:t>
+        <w:br/>
+        <w:t xml:space="preserve">    except (InvalidOperation, ValueError, TypeError):</w:t>
+        <w:br/>
+        <w:t xml:space="preserve">        return None</w:t>
+        <w:br/>
+        <w:t xml:space="preserve">    return result if result.is_finite() else None</w:t>
+        <w:br/>
+        <w:br/>
+        <w:br/>
+        <w:t>def check(condition: bool, label: str, failures: list[str]) -&gt; None:</w:t>
+        <w:br/>
+        <w:t xml:space="preserve">    print(f"[{'OK' if condition else 'ОШИБКА'}] {label}")</w:t>
+        <w:br/>
+        <w:t xml:space="preserve">    if not condition:</w:t>
+        <w:br/>
+        <w:t xml:space="preserve">        failures.append(label)</w:t>
+        <w:br/>
+        <w:br/>
+      </w:r>
+    </w:p>
+    <w:p>
+      <w:r>
+        <w:br w:type="page"/>
+      </w:r>
+    </w:p>
+    <w:p>
+      <w:pPr>
+        <w:spacing w:before="20" w:after="40" w:line="164" w:lineRule="exact"/>
+        <w:ind w:left="144" w:right="144"/>
+        <w:shd w:fill="F2F5F9"/>
+      </w:pPr>
+      <w:r>
+        <w:rPr>
+          <w:rFonts w:ascii="Consolas" w:hAnsi="Consolas"/>
+          <w:color w:val="243247"/>
+          <w:sz w:val="14"/>
+        </w:rPr>
+        <w:t>def main() -&gt; int:</w:t>
+        <w:br/>
+        <w:t xml:space="preserve">    parser = argparse.ArgumentParser(description=__doc__)</w:t>
+        <w:br/>
+        <w:t xml:space="preserve">    parser.add_argument("--source", type=Path, default=DEFAULT_SOURCE)</w:t>
+        <w:br/>
+        <w:t xml:space="preserve">    parser.add_argument("--clean", type=Path, default=DEFAULT_CLEAN)</w:t>
+        <w:br/>
+        <w:t xml:space="preserve">    parser.add_argument("--analysis", type=Path, default=DEFAULT_ANALYSIS)</w:t>
+        <w:br/>
+        <w:t xml:space="preserve">    args = parser.parse_args()</w:t>
+        <w:br/>
+        <w:t xml:space="preserve">    failures: list[str] = []</w:t>
+        <w:br/>
+        <w:br/>
+        <w:t xml:space="preserve">    for label, path in (("Исходный набор", args.source), ("Очищенный набор", args.clean), ("Книга анализа", args.analysis)):</w:t>
+        <w:br/>
+        <w:t xml:space="preserve">        check(path.is_file(), f"{label}: файл существует ({path})", failures)</w:t>
+        <w:br/>
+        <w:t xml:space="preserve">    if failures:</w:t>
+        <w:br/>
+        <w:t xml:space="preserve">        print("Проверка остановлена: не найдены входные/выходные файлы.")</w:t>
+        <w:br/>
+        <w:t xml:space="preserve">        return 1</w:t>
+        <w:br/>
+        <w:br/>
+        <w:t xml:space="preserve">    source_wb = load_workbook(args.source, data_only=True, read_only=True)</w:t>
+        <w:br/>
+        <w:t xml:space="preserve">    clean_wb = load_workbook(args.clean, data_only=True, read_only=True)</w:t>
+        <w:br/>
+        <w:t xml:space="preserve">    analysis_wb = load_workbook(args.analysis, data_only=True, read_only=False)</w:t>
+        <w:br/>
+        <w:t xml:space="preserve">    try:</w:t>
+        <w:br/>
+        <w:t xml:space="preserve">        source_rows_all = list(source_wb.active.iter_rows(values_only=True))</w:t>
+        <w:br/>
+        <w:t xml:space="preserve">        source_headers = list(source_rows_all[0][:8]) if source_rows_all else []</w:t>
+        <w:br/>
+        <w:t xml:space="preserve">        source_rows = [tuple(row[:8]) for row in source_rows_all[1:] if any(v is not None for v in row[:8])]</w:t>
+        <w:br/>
+        <w:t xml:space="preserve">        clean_sheet = clean_wb.active</w:t>
+        <w:br/>
+        <w:t xml:space="preserve">        clean_rows_all = list(clean_sheet.iter_rows(values_only=True))</w:t>
+        <w:br/>
+        <w:t xml:space="preserve">        clean_headers = list(clean_rows_all[0][:8]) if clean_rows_all else []</w:t>
+        <w:br/>
+        <w:t xml:space="preserve">        clean_rows = [tuple(row[:8]) for row in clean_rows_all[1:] if any(v is not None for v in row[:8])]</w:t>
+        <w:br/>
+        <w:br/>
+        <w:t xml:space="preserve">        check(source_headers == HEADERS, "Исходные заголовки совпадают с заданием", failures)</w:t>
+        <w:br/>
+        <w:t xml:space="preserve">        check(clean_headers == HEADERS, "Очищенная книга сохраняет исходные 8 колонок", failures)</w:t>
+        <w:br/>
+        <w:t xml:space="preserve">        check(len(source_rows) == EXPECTED["Строк в исходном наборе"], "В источнике ровно 30 транзакций", failures)</w:t>
+        <w:br/>
+        <w:t xml:space="preserve">        check(len(clean_rows) == len(source_rows), "Число строк сохранено: ни одна транзакция не потеряна", failures)</w:t>
+        <w:br/>
+        <w:t xml:space="preserve">        duplicate_count = len(clean_rows) - len(set(clean_rows))</w:t>
+        <w:br/>
+        <w:t xml:space="preserve">        check(duplicate_count == 0, "Полных дубликатов после очистки нет", failures)</w:t>
+        <w:br/>
+        <w:br/>
+        <w:t xml:space="preserve">        ids: list[str] = []</w:t>
+        <w:br/>
+        <w:t xml:space="preserve">        dates_ok = True</w:t>
+        <w:br/>
+        <w:t xml:space="preserve">        numbers_ok = True</w:t>
+      </w:r>
+    </w:p>
+    <w:p>
+      <w:r>
+        <w:br w:type="page"/>
+      </w:r>
+    </w:p>
+    <w:p>
+      <w:pPr>
+        <w:spacing w:before="20" w:after="40" w:line="164" w:lineRule="exact"/>
+        <w:ind w:left="144" w:right="144"/>
+        <w:shd w:fill="F2F5F9"/>
+      </w:pPr>
+      <w:r>
+        <w:rPr>
+          <w:rFonts w:ascii="Consolas" w:hAnsi="Consolas"/>
+          <w:color w:val="243247"/>
+          <w:sz w:val="14"/>
+        </w:rPr>
+        <w:t xml:space="preserve">        canonical_ok = len(source_rows) == len(clean_rows)</w:t>
+        <w:br/>
+        <w:t xml:space="preserve">        for raw, row in zip(source_rows, clean_rows):</w:t>
+        <w:br/>
+        <w:t xml:space="preserve">            tx_id, tx_date, product, category, quantity, price, shop, manager = row</w:t>
+        <w:br/>
+        <w:t xml:space="preserve">            ids.append(str(tx_id))</w:t>
+        <w:br/>
+        <w:t xml:space="preserve">            dates_ok &amp;= isinstance(tx_date, (datetime, date)) and tx_date.year == 2026</w:t>
+        <w:br/>
+        <w:t xml:space="preserve">            q, p = dec(quantity), dec(price)</w:t>
+        <w:br/>
+        <w:t xml:space="preserve">            numbers_ok &amp;= q is not None and p is not None and q &gt; 0 and q == q.to_integral_value() and p &gt;= 0</w:t>
+        <w:br/>
+        <w:t xml:space="preserve">            expected_product = normalize_product(raw[2])</w:t>
+        <w:br/>
+        <w:t xml:space="preserve">            expected_manager = normalize_manager(raw[7])</w:t>
+        <w:br/>
+        <w:t xml:space="preserve">            canonical_ok &amp;= str(tx_id) == normalize_transaction_id(raw[0])</w:t>
+        <w:br/>
+        <w:t xml:space="preserve">            canonical_ok &amp;= str(product) == expected_product</w:t>
+        <w:br/>
+        <w:t xml:space="preserve">            canonical_ok &amp;= str(category) == infer_category(expected_product)</w:t>
+        <w:br/>
+        <w:t xml:space="preserve">            canonical_ok &amp;= str(shop) == " ".join(str(raw[6] or "").split())</w:t>
+        <w:br/>
+        <w:t xml:space="preserve">            canonical_ok &amp;= str(manager) == expected_manager</w:t>
+        <w:br/>
+        <w:t xml:space="preserve">        check(len(ids) == len(set(ids)) and all(len(tx_id) == 8 for tx_id in ids), "ID транзакций нормализованы и уникальны", failures)</w:t>
+        <w:br/>
+        <w:t xml:space="preserve">        check(dates_ok, "Все даты — настоящие даты 2026 года", failures)</w:t>
+        <w:br/>
+        <w:t xml:space="preserve">        check(numbers_ok, "Количество и цена — числовые; количество целое и положительное", failures)</w:t>
+        <w:br/>
+        <w:t xml:space="preserve">        check(canonical_ok, "Названия, категории, магазины и менеджеры приведены к единому виду", failures)</w:t>
+        <w:br/>
+        <w:br/>
+        <w:t xml:space="preserve">        monthly = [Decimal("0") for _ in range(12)]</w:t>
+        <w:br/>
+        <w:t xml:space="preserve">        line_revenues: list[Decimal] = []</w:t>
+        <w:br/>
+        <w:t xml:space="preserve">        for row in clean_rows:</w:t>
+        <w:br/>
+        <w:t xml:space="preserve">            tx_date, quantity, price = row[1], dec(row[4]), dec(row[5])</w:t>
+        <w:br/>
+        <w:t xml:space="preserve">            revenue = quantity * price  # type: ignore[operator]</w:t>
+        <w:br/>
+        <w:t xml:space="preserve">            line_revenues.append(revenue)</w:t>
+        <w:br/>
+        <w:t xml:space="preserve">            monthly[tx_date.month - 1] += revenue</w:t>
+        <w:br/>
+        <w:t xml:space="preserve">        total = sum(monthly, Decimal("0"))</w:t>
+        <w:br/>
+        <w:t xml:space="preserve">        average = total / Decimal(12)</w:t>
+        <w:br/>
+        <w:t xml:space="preserve">        max_index = max(range(12), key=lambda i: monthly[i])</w:t>
+        <w:br/>
+        <w:t xml:space="preserve">        min_index = min(range(12), key=lambda i: monthly[i])</w:t>
+        <w:br/>
+        <w:t xml:space="preserve">        check(total == Decimal("7759680"), f"Годовая выручка рассчитана верно: {total}", failures)</w:t>
+        <w:br/>
+        <w:br/>
+        <w:t xml:space="preserve">        required_sheets = {"Данные", "Месячная выручка", "Итоги", "Журнал очистки"}</w:t>
+        <w:br/>
+        <w:t xml:space="preserve">        check(required_sheets.issubset(set(analysis_wb.sheetnames)), "В книге анализа есть листы данных, месяцев, итогов и журнала", failures)</w:t>
+        <w:br/>
+        <w:t xml:space="preserve">        if required_sheets.issubset(set(analysis_wb.sheetnames)):</w:t>
+        <w:br/>
+        <w:t xml:space="preserve">            data_sheet = analysis_wb["Данные"]</w:t>
+      </w:r>
+    </w:p>
+    <w:p>
+      <w:r>
+        <w:br w:type="page"/>
+      </w:r>
+    </w:p>
+    <w:p>
+      <w:pPr>
+        <w:spacing w:before="20" w:after="40" w:line="164" w:lineRule="exact"/>
+        <w:ind w:left="144" w:right="144"/>
+        <w:shd w:fill="F2F5F9"/>
+      </w:pPr>
+      <w:r>
+        <w:rPr>
+          <w:rFonts w:ascii="Consolas" w:hAnsi="Consolas"/>
+          <w:color w:val="243247"/>
+          <w:sz w:val="14"/>
+        </w:rPr>
+        <w:t xml:space="preserve">            data_values = list(data_sheet.iter_rows(min_row=2, values_only=True))</w:t>
+        <w:br/>
+        <w:t xml:space="preserve">            data_ok = len(data_values) == len(clean_rows)</w:t>
+        <w:br/>
+        <w:t xml:space="preserve">            for row, clean, expected_revenue in zip(data_values, clean_rows, line_revenues):</w:t>
+        <w:br/>
+        <w:t xml:space="preserve">                data_ok &amp;= str(row[0]) == str(clean[0])</w:t>
+        <w:br/>
+        <w:t xml:space="preserve">                actual = dec(row[8]) if len(row) &gt; 8 else None</w:t>
+        <w:br/>
+        <w:t xml:space="preserve">                data_ok &amp;= actual == expected_revenue</w:t>
+        <w:br/>
+        <w:t xml:space="preserve">            check(data_ok, "Выручка каждой строки равна quantity × price", failures)</w:t>
+        <w:br/>
+        <w:br/>
+        <w:t xml:space="preserve">            month_sheet = analysis_wb["Месячная выручка"]</w:t>
+        <w:br/>
+        <w:t xml:space="preserve">            month_names = [month_sheet.cell(row, 1).value for row in range(2, 14)]</w:t>
+        <w:br/>
+        <w:t xml:space="preserve">            actual_months = [dec(month_sheet.cell(row, 2).value) for row in range(2, 14)]</w:t>
+        <w:br/>
+        <w:t xml:space="preserve">            actual_shares = [dec(month_sheet.cell(row, 3).value) for row in range(2, 14)]</w:t>
+        <w:br/>
+        <w:t xml:space="preserve">            actual_average = [dec(month_sheet.cell(row, 6).value) for row in range(2, 14)]</w:t>
+        <w:br/>
+        <w:t xml:space="preserve">            months_ok = month_names == MONTHS and actual_months == monthly</w:t>
+        <w:br/>
+        <w:t xml:space="preserve">            expected_shares = [value / total * Decimal("100") for value in monthly]</w:t>
+        <w:br/>
+        <w:t xml:space="preserve">            shares_ok = (</w:t>
+        <w:br/>
+        <w:t xml:space="preserve">                all(value is not None for value in actual_shares)</w:t>
+        <w:br/>
+        <w:t xml:space="preserve">                and all(abs(actual - expected) &lt;= Decimal("0.01") for actual, expected in zip(actual_shares, expected_shares))</w:t>
+        <w:br/>
+        <w:t xml:space="preserve">                and abs(sum(actual_shares, Decimal("0")) - Decimal("100")) &lt;= Decimal("0.02")</w:t>
+        <w:br/>
+        <w:t xml:space="preserve">            )</w:t>
+        <w:br/>
+        <w:t xml:space="preserve">            avg_ok = all(value is not None and abs(value - average) &lt; Decimal("0.01") for value in actual_average)</w:t>
+        <w:br/>
+        <w:t xml:space="preserve">            check(months_ok, "Помесячная выручка совпадает с датами и суммами транзакций", failures)</w:t>
+        <w:br/>
+        <w:t xml:space="preserve">            check(shares_ok, "Доля каждого месяца рассчитана от годовой выручки; сумма долей — 100%", failures)</w:t>
+        <w:br/>
+        <w:t xml:space="preserve">            check(avg_ok, "Среднее значение указано для всех 12 месяцев", failures)</w:t>
+        <w:br/>
+        <w:t xml:space="preserve">            charts = month_sheet._charts</w:t>
+        <w:br/>
+        <w:t xml:space="preserve">            chart_ok = False</w:t>
+        <w:br/>
+        <w:t xml:space="preserve">            if len(charts) == 1 and isinstance(charts[0], LineChart) and len(charts[0].series) == 2:</w:t>
+        <w:br/>
+        <w:t xml:space="preserve">                chart = charts[0]</w:t>
+        <w:br/>
+        <w:t xml:space="preserve">                categories = [series.cat.numRef.f if series.cat and series.cat.numRef else None for series in chart.series]</w:t>
+        <w:br/>
+        <w:t xml:space="preserve">                revenues = [series.val.numRef.f if series.val and series.val.numRef else None for series in chart.series]</w:t>
+        <w:br/>
+        <w:t xml:space="preserve">                expected_categories = "'Месячная выручка'!$A$2:$A$13"</w:t>
+        <w:br/>
+        <w:t xml:space="preserve">                chart_ok = categories == [expected_categories, expected_categories] and revenues == [</w:t>
+        <w:br/>
+        <w:t xml:space="preserve">                    "'Месячная выручка'!$B$2:$B$13",</w:t>
+        <w:br/>
+        <w:t xml:space="preserve">                    "'Месячная выручка'!$F$2:$F$13",</w:t>
+        <w:br/>
+        <w:t xml:space="preserve">                ]</w:t>
+        <w:br/>
+        <w:t xml:space="preserve">            check(chart_ok, "Линейный график использует месяцы по порядку, выручку и серию среднего", failures)</w:t>
+      </w:r>
+    </w:p>
+    <w:p>
+      <w:r>
+        <w:br w:type="page"/>
+      </w:r>
+    </w:p>
+    <w:p>
+      <w:pPr>
+        <w:spacing w:before="20" w:after="40" w:line="164" w:lineRule="exact"/>
+        <w:ind w:left="144" w:right="144"/>
+        <w:shd w:fill="F2F5F9"/>
+      </w:pPr>
+      <w:r>
+        <w:rPr>
+          <w:rFonts w:ascii="Consolas" w:hAnsi="Consolas"/>
+          <w:color w:val="243247"/>
+          <w:sz w:val="14"/>
+        </w:rPr>
+        <w:br/>
+        <w:t xml:space="preserve">            summary = analysis_wb["Итоги"]</w:t>
+        <w:br/>
+        <w:t xml:space="preserve">            metrics = {summary.cell(row, 1).value: summary.cell(row, 2).value for row in range(2, summary.max_row + 1)}</w:t>
+        <w:br/>
+        <w:t xml:space="preserve">            metrics_ok = True</w:t>
+        <w:br/>
+        <w:t xml:space="preserve">            for key, expected in EXPECTED.items():</w:t>
+        <w:br/>
+        <w:t xml:space="preserve">                actual = metrics.get(key)</w:t>
+        <w:br/>
+        <w:t xml:space="preserve">                if isinstance(expected, int):</w:t>
+        <w:br/>
+        <w:t xml:space="preserve">                    metrics_ok &amp;= dec(actual) == Decimal(expected)</w:t>
+        <w:br/>
+        <w:t xml:space="preserve">                else:</w:t>
+        <w:br/>
+        <w:t xml:space="preserve">                    metrics_ok &amp;= actual == expected</w:t>
+        <w:br/>
+        <w:t xml:space="preserve">            metrics_ok &amp;= month_names[max_index] == "Ноябрь" and monthly[max_index] == Decimal("1794540")</w:t>
+        <w:br/>
+        <w:t xml:space="preserve">            metrics_ok &amp;= month_names[min_index] == "Сентябрь" and monthly[min_index] == Decimal("127949")</w:t>
+        <w:br/>
+        <w:t xml:space="preserve">            check(metrics_ok, "Итоговые контрольные показатели и журнал совпадают с набором задания", failures)</w:t>
+        <w:br/>
+        <w:t xml:space="preserve">            log_sheet = analysis_wb["Журнал очистки"]</w:t>
+        <w:br/>
+        <w:t xml:space="preserve">            check(log_sheet.max_row == 48, "Журнал содержит заголовок и все 47 исправлений", failures)</w:t>
+        <w:br/>
+        <w:br/>
+        <w:t xml:space="preserve">        # Не корректируем данные без подтверждения первичного источника; лишь убеждаемся,</w:t>
+        <w:br/>
+        <w:t xml:space="preserve">        # что зафиксированный выброс не потерян при экспорте.</w:t>
+        <w:br/>
+        <w:t xml:space="preserve">        outlier = next((row for row in clean_rows if str(row[0]) == "TXN-0001"), None)</w:t>
+        <w:br/>
+        <w:t xml:space="preserve">        check(outlier is not None and dec(outlier[5]) == Decimal("897270"), "TXN-0001 сохранён как отмеченный выброс без выдуманной подстановки", failures)</w:t>
+        <w:br/>
+        <w:t xml:space="preserve">    finally:</w:t>
+        <w:br/>
+        <w:t xml:space="preserve">        source_wb.close()</w:t>
+        <w:br/>
+        <w:t xml:space="preserve">        clean_wb.close()</w:t>
+        <w:br/>
+        <w:t xml:space="preserve">        analysis_wb.close()</w:t>
+        <w:br/>
+        <w:br/>
+        <w:t xml:space="preserve">    print("\nЛокальная предварительная проверка завершена.")</w:t>
+        <w:br/>
+        <w:t xml:space="preserve">    print("Это не официальный Analytics_autotest и не выдаёт контрольный код 7.1.")</w:t>
+        <w:br/>
+        <w:t xml:space="preserve">    if failures:</w:t>
+        <w:br/>
+        <w:t xml:space="preserve">        print(f"Провалено проверок: {len(failures)}")</w:t>
+        <w:br/>
+        <w:t xml:space="preserve">        return 1</w:t>
+        <w:br/>
+        <w:t xml:space="preserve">    print("Все проверки, которые можно вывести из приложенного ТЗ, пройдены.")</w:t>
+        <w:br/>
+        <w:t xml:space="preserve">    return 0</w:t>
+        <w:br/>
+        <w:br/>
+        <w:br/>
+        <w:t>if __name__ == "__main__":</w:t>
+        <w:br/>
+        <w:t xml:space="preserve">    sys.exit(main())</w:t>
       </w:r>
     </w:p>
     <w:sectPr>

</xml_diff>

<commit_message>
Remove code comments from deliverables
Co-authored-by: arena-agent <297053741+arena-agent@users.noreply.github.com>
</commit_message>
<xml_diff>
--- a/solutions/Полное_пошаговое_решение_КИМ_09.02.07-5-2027.docx
+++ b/solutions/Полное_пошаговое_решение_КИМ_09.02.07-5-2027.docx
@@ -2001,13 +2001,11 @@
         <w:br/>
         <w:t>text = path.read_text(encoding='utf-8')</w:t>
         <w:br/>
-        <w:t>total_sql = text.split('-- Детализация того же расчёта:', 1)[0]</w:t>
+        <w:t>total_sql = text.split('FROM coverage;', 1)[0] + 'FROM coverage;'</w:t>
         <w:br/>
         <w:t>db = sqlite3.connect('solutions/task2_database/manufacturing.sqlite3')</w:t>
         <w:br/>
         <w:t>print(db.execute(total_sql, {'order_id': 1}).fetchone())</w:t>
-        <w:br/>
-        <w:t># Ожидается: (1, 11448.12, 8, 8)</w:t>
       </w:r>
     </w:p>
     <w:p>
@@ -2039,7 +2037,7 @@
         <w:br/>
         <w:t>text = Path('solutions/task3_query/order_cost.sql').read_text(encoding='utf-8')</w:t>
         <w:br/>
-        <w:t>detail_sql = text.split('-- Детализация того же расчёта:', 1)[1]</w:t>
+        <w:t>detail_sql = text.split('FROM coverage;', 1)[1].strip()</w:t>
         <w:br/>
         <w:t>detail_sql = detail_sql[detail_sql.index('SELECT'):]</w:t>
         <w:br/>
@@ -2048,8 +2046,6 @@
         <w:t xml:space="preserve">    for row in db.execute(detail_sql, {'order_id': 1}):</w:t>
         <w:br/>
         <w:t xml:space="preserve">        print(row)</w:t>
-        <w:br/>
-        <w:t># В каждой строке: order_id, товар, ресурс, норма, цена и сумма компонента.</w:t>
       </w:r>
     </w:p>
     <w:p>
@@ -2395,10 +2391,6 @@
           <w:sz w:val="14"/>
         </w:rPr>
         <w:t>python3 solutions/task4_auth_api/app.py</w:t>
-        <w:br/>
-        <w:t># открыть в браузере: http://127.0.0.1:8000/login</w:t>
-        <w:br/>
-        <w:t># тестовые пары: admin / Admin123!; user / User123!</w:t>
       </w:r>
     </w:p>
     <w:p>
@@ -2427,8 +2419,6 @@
         <w:t>rm -f /tmp/exam_auth_test.sqlite3</w:t>
         <w:br/>
         <w:t>EXAM_DB_PATH=/tmp/exam_auth_test.sqlite3 APP_PORT=8001 python3 solutions/task4_auth_api/app.py</w:t>
-        <w:br/>
-        <w:t># открыть http://127.0.0.1:8001/login</w:t>
       </w:r>
     </w:p>
     <w:p>
@@ -2880,8 +2870,6 @@
         <w:t>EXAM_DB_PATH=/tmp/exam_api_fault.sqlite3 \</w:t>
         <w:br/>
         <w:t>python3 solutions/task4_auth_api/app.py</w:t>
-        <w:br/>
-        <w:t># затем: curl -i 'http://127.0.0.1:8001/notes'</w:t>
       </w:r>
     </w:p>
     <w:p>
@@ -4089,8 +4077,6 @@
         <w:t>E3: =D3/B2*100</w:t>
         <w:br/>
         <w:t>F2: =СРЗНАЧ($B$2:$B$13)</w:t>
-        <w:br/>
-        <w:t># A2:A13 — даты 01.01.2026 ... 01.12.2026. Протяните формулы вниз; B14 — годовой итог.</w:t>
       </w:r>
     </w:p>
     <w:p>
@@ -4193,10 +4179,6 @@
           <w:color w:val="243247"/>
           <w:sz w:val="14"/>
         </w:rPr>
-        <w:t>%% Задание 1. Логическая ER-модель в 3НФ.</w:t>
-        <w:br/>
-        <w:t>%% Цена/скидка ссылается ровно на одну сущность: товар ИЛИ ресурс.</w:t>
-        <w:br/>
         <w:t>erDiagram</w:t>
         <w:br/>
         <w:t xml:space="preserve">    CUSTOMERS ||--o{ CUSTOMER_ORDERS : оформляет</w:t>
@@ -4260,6 +4242,10 @@
         <w:t xml:space="preserve">        int source_order_item_id</w:t>
         <w:br/>
         <w:t xml:space="preserve">        int order_id FK</w:t>
+        <w:br/>
+        <w:t xml:space="preserve">        int product_id FK</w:t>
+        <w:br/>
+        <w:t xml:space="preserve">        int quantity</w:t>
       </w:r>
     </w:p>
     <w:p>
@@ -4279,77 +4265,77 @@
           <w:color w:val="243247"/>
           <w:sz w:val="14"/>
         </w:rPr>
+        <w:t xml:space="preserve">        decimal unit_price_at_order "nullable snapshot"</w:t>
+        <w:br/>
+        <w:t xml:space="preserve">        decimal discount_per_unit</w:t>
+        <w:br/>
+        <w:t xml:space="preserve">    }</w:t>
+        <w:br/>
+        <w:t xml:space="preserve">    PRODUCTS {</w:t>
+        <w:br/>
+        <w:t xml:space="preserve">        int product_id PK</w:t>
+        <w:br/>
+        <w:t xml:space="preserve">        int source_product_id</w:t>
+        <w:br/>
+        <w:t xml:space="preserve">        string name</w:t>
+        <w:br/>
+        <w:t xml:space="preserve">        string category</w:t>
+        <w:br/>
+        <w:t xml:space="preserve">        boolean is_placeholder</w:t>
+        <w:br/>
+        <w:t xml:space="preserve">    }</w:t>
+        <w:br/>
+        <w:t xml:space="preserve">    RESOURCES {</w:t>
+        <w:br/>
+        <w:t xml:space="preserve">        int resource_id PK</w:t>
+        <w:br/>
+        <w:t xml:space="preserve">        int source_resource_id</w:t>
+        <w:br/>
+        <w:t xml:space="preserve">        string name</w:t>
+        <w:br/>
+        <w:t xml:space="preserve">        string resource_type</w:t>
+        <w:br/>
+        <w:t xml:space="preserve">    }</w:t>
+        <w:br/>
+        <w:t xml:space="preserve">    PRODUCT_SPECIFICATION {</w:t>
+        <w:br/>
+        <w:t xml:space="preserve">        int specification_id PK</w:t>
+        <w:br/>
         <w:t xml:space="preserve">        int product_id FK</w:t>
         <w:br/>
-        <w:t xml:space="preserve">        int quantity</w:t>
-        <w:br/>
-        <w:t xml:space="preserve">        decimal unit_price_at_order "nullable snapshot"</w:t>
-        <w:br/>
-        <w:t xml:space="preserve">        decimal discount_per_unit</w:t>
+        <w:t xml:space="preserve">        int resource_id FK</w:t>
+        <w:br/>
+        <w:t xml:space="preserve">        decimal quantity_per_product</w:t>
         <w:br/>
         <w:t xml:space="preserve">    }</w:t>
         <w:br/>
-        <w:t xml:space="preserve">    PRODUCTS {</w:t>
-        <w:br/>
-        <w:t xml:space="preserve">        int product_id PK</w:t>
-        <w:br/>
-        <w:t xml:space="preserve">        int source_product_id</w:t>
-        <w:br/>
-        <w:t xml:space="preserve">        string name</w:t>
-        <w:br/>
-        <w:t xml:space="preserve">        string category</w:t>
-        <w:br/>
-        <w:t xml:space="preserve">        boolean is_placeholder</w:t>
+        <w:t xml:space="preserve">    PRICES {</w:t>
+        <w:br/>
+        <w:t xml:space="preserve">        int price_id PK</w:t>
+        <w:br/>
+        <w:t xml:space="preserve">        int product_id FK "nullable"</w:t>
+        <w:br/>
+        <w:t xml:space="preserve">        int resource_id FK "nullable"</w:t>
+        <w:br/>
+        <w:t xml:space="preserve">        decimal unit_price</w:t>
         <w:br/>
         <w:t xml:space="preserve">    }</w:t>
         <w:br/>
-        <w:t xml:space="preserve">    RESOURCES {</w:t>
-        <w:br/>
-        <w:t xml:space="preserve">        int resource_id PK</w:t>
-        <w:br/>
-        <w:t xml:space="preserve">        int source_resource_id</w:t>
-        <w:br/>
-        <w:t xml:space="preserve">        string name</w:t>
-        <w:br/>
-        <w:t xml:space="preserve">        string resource_type</w:t>
+        <w:t xml:space="preserve">    DISCOUNTS {</w:t>
+        <w:br/>
+        <w:t xml:space="preserve">        int discount_id PK</w:t>
+        <w:br/>
+        <w:t xml:space="preserve">        int source_discount_id</w:t>
+        <w:br/>
+        <w:t xml:space="preserve">        int product_id FK "nullable"</w:t>
+        <w:br/>
+        <w:t xml:space="preserve">        int resource_id FK "nullable"</w:t>
+        <w:br/>
+        <w:t xml:space="preserve">        decimal discount_percent</w:t>
         <w:br/>
         <w:t xml:space="preserve">    }</w:t>
         <w:br/>
-        <w:t xml:space="preserve">    PRODUCT_SPECIFICATION {</w:t>
-        <w:br/>
-        <w:t xml:space="preserve">        int specification_id PK</w:t>
-        <w:br/>
-        <w:t xml:space="preserve">        int product_id FK</w:t>
-        <w:br/>
-        <w:t xml:space="preserve">        int resource_id FK</w:t>
-        <w:br/>
-        <w:t xml:space="preserve">        decimal quantity_per_product</w:t>
-        <w:br/>
-        <w:t xml:space="preserve">    }</w:t>
-        <w:br/>
-        <w:t xml:space="preserve">    PRICES {</w:t>
-        <w:br/>
-        <w:t xml:space="preserve">        int price_id PK</w:t>
-        <w:br/>
-        <w:t xml:space="preserve">        int product_id FK "nullable"</w:t>
-        <w:br/>
-        <w:t xml:space="preserve">        int resource_id FK "nullable"</w:t>
-        <w:br/>
-        <w:t xml:space="preserve">        decimal unit_price</w:t>
-        <w:br/>
-        <w:t xml:space="preserve">    }</w:t>
-        <w:br/>
-        <w:t xml:space="preserve">    DISCOUNTS {</w:t>
-        <w:br/>
-        <w:t xml:space="preserve">        int discount_id PK</w:t>
-        <w:br/>
-        <w:t xml:space="preserve">        int source_discount_id</w:t>
-        <w:br/>
-        <w:t xml:space="preserve">        int product_id FK "nullable"</w:t>
-        <w:br/>
-        <w:t xml:space="preserve">        int resource_id FK "nullable"</w:t>
-        <w:br/>
-        <w:t xml:space="preserve">        decimal discount_percent</w:t>
+        <w:t xml:space="preserve">    PRODUCTION_ORDERS {</w:t>
       </w:r>
     </w:p>
     <w:p>
@@ -4369,10 +4355,6 @@
           <w:color w:val="243247"/>
           <w:sz w:val="14"/>
         </w:rPr>
-        <w:t xml:space="preserve">    }</w:t>
-        <w:br/>
-        <w:t xml:space="preserve">    PRODUCTION_ORDERS {</w:t>
-        <w:br/>
         <w:t xml:space="preserve">        int production_order_id PK</w:t>
         <w:br/>
         <w:t xml:space="preserve">        string order_number</w:t>
@@ -4428,10 +4410,6 @@
           <w:color w:val="243247"/>
           <w:sz w:val="14"/>
         </w:rPr>
-        <w:t>#!/usr/bin/env python3</w:t>
-        <w:br/>
-        <w:t>"""Генератор PDF ER-диаграммы (нужен reportlab)."""</w:t>
-        <w:br/>
         <w:t>from pathlib import Path</w:t>
         <w:br/>
         <w:t>from math import hypot</w:t>
@@ -4495,6 +4473,10 @@
         <w:t xml:space="preserve">     "fields":[("PK", "product_id"), ("", "source_product_id"), ("", "name"), ("", "category"), ("", "is_placeholder")]},</w:t>
         <w:br/>
         <w:t xml:space="preserve">    {"key":"resources", "ru":"Материалы и операции", "row":0, "col":4,</w:t>
+        <w:br/>
+        <w:t xml:space="preserve">     "fields":[("PK", "resource_id"), ("", "source_resource_id"), ("", "name"), ("", "resource_type")]},</w:t>
+        <w:br/>
+        <w:t xml:space="preserve">    {"key":"production_orders", "ru":"Заказы на производство", "row":1, "col":0,</w:t>
       </w:r>
     </w:p>
     <w:p>
@@ -4514,10 +4496,6 @@
           <w:color w:val="243247"/>
           <w:sz w:val="14"/>
         </w:rPr>
-        <w:t xml:space="preserve">     "fields":[("PK", "resource_id"), ("", "source_resource_id"), ("", "name"), ("", "resource_type")]},</w:t>
-        <w:br/>
-        <w:t xml:space="preserve">    {"key":"production_orders", "ru":"Заказы на производство", "row":1, "col":0,</w:t>
-        <w:br/>
         <w:t xml:space="preserve">     "fields":[("PK", "production_order_id"), ("", "order_number"), ("", "launch_date"), ("", "department")]},</w:t>
         <w:br/>
         <w:t xml:space="preserve">    {"key":"production_order_items", "ru":"Выпускаемая продукция", "row":1, "col":1,</w:t>
@@ -4580,6 +4558,10 @@
         <w:br/>
         <w:br/>
         <w:t>def draw_card(c: canvas.Canvas, entity: dict) -&gt; dict:</w:t>
+        <w:br/>
+        <w:t xml:space="preserve">    x = MARGIN_X + entity["col"] * (CARD_W + GAP_X)</w:t>
+        <w:br/>
+        <w:t xml:space="preserve">    y = ROW_Y[entity["row"]]</w:t>
       </w:r>
     </w:p>
     <w:p>
@@ -4599,10 +4581,6 @@
           <w:color w:val="243247"/>
           <w:sz w:val="14"/>
         </w:rPr>
-        <w:t xml:space="preserve">    x = MARGIN_X + entity["col"] * (CARD_W + GAP_X)</w:t>
-        <w:br/>
-        <w:t xml:space="preserve">    y = ROW_Y[entity["row"]]</w:t>
-        <w:br/>
         <w:t xml:space="preserve">    c.setFillColor(white)</w:t>
         <w:br/>
         <w:t xml:space="preserve">    c.setStrokeColor(HexColor("#C9D3E2"))</w:t>
@@ -4668,6 +4646,10 @@
         <w:t xml:space="preserve">        c.setDash(3, 2)</w:t>
         <w:br/>
         <w:t xml:space="preserve">    c.line(x1,y1,x2,y2)</w:t>
+        <w:br/>
+        <w:t xml:space="preserve">    length = hypot(x2-x1,y2-y1) or 1</w:t>
+        <w:br/>
+        <w:t xml:space="preserve">    ux,uy=(x2-x1)/length,(y2-y1)/length</w:t>
       </w:r>
     </w:p>
     <w:p>
@@ -4687,10 +4669,6 @@
           <w:color w:val="243247"/>
           <w:sz w:val="14"/>
         </w:rPr>
-        <w:t xml:space="preserve">    length = hypot(x2-x1,y2-y1) or 1</w:t>
-        <w:br/>
-        <w:t xml:space="preserve">    ux,uy=(x2-x1)/length,(y2-y1)/length</w:t>
-        <w:br/>
         <w:t xml:space="preserve">    size=5</w:t>
         <w:br/>
         <w:t xml:space="preserve">    bx,by=x2-ux*size,y2-uy*size</w:t>
@@ -4742,7 +4720,6 @@
         <w:br/>
         <w:t xml:space="preserve">    b=boxes</w:t>
         <w:br/>
-        <w:t xml:space="preserve">    # Основной контур клиентского заказа.</w:t>
         <w:br/>
         <w:t xml:space="preserve">    connect(c,(b["customers"]["x"]+b["customers"]["w"],b["customers"]["cy"]+18),(b["customer_orders"]["x"],b["customer_orders"]["cy"]+18),"1 : N")</w:t>
         <w:br/>
@@ -4750,11 +4727,13 @@
         <w:br/>
         <w:t xml:space="preserve">    connect(c,(b["products"]["x"],b["products"]["cy"]-18),(b["order_items"]["x"]+b["order_items"]["w"],b["order_items"]["cy"]-18),"1 : N",label_offset=(0,-11))</w:t>
         <w:br/>
-        <w:t xml:space="preserve">    # Состав изделия: связь M:N через таблицу спецификации.</w:t>
         <w:br/>
         <w:t xml:space="preserve">    connect(c,(b["products"]["cx"],b["products"]["y"]),(b["product_specification"]["x"]+b["product_specification"]["w"],b["product_specification"]["y"]+b["product_specification"]["h"]),"1 : N")</w:t>
         <w:br/>
         <w:t xml:space="preserve">    connect(c,(b["resources"]["cx"],b["resources"]["y"]),(b["product_specification"]["x"]+b["product_specification"]["w"]-24,b["product_specification"]["y"]+b["product_specification"]["h"]),"1 : N",label_offset=(0,-10))</w:t>
+        <w:br/>
+        <w:br/>
+        <w:t xml:space="preserve">    connect(c,(b["products"]["cx"],b["products"]["y"]),(b["prices"]["cx"],b["prices"]["y"]+b["prices"]["h"]),"1 : 0..N",True)</w:t>
       </w:r>
     </w:p>
     <w:p>
@@ -4774,24 +4753,18 @@
           <w:color w:val="243247"/>
           <w:sz w:val="14"/>
         </w:rPr>
-        <w:t xml:space="preserve">    # Цены и скидки опционально относятся либо к товару, либо к ресурсу.</w:t>
-        <w:br/>
-        <w:t xml:space="preserve">    connect(c,(b["products"]["cx"],b["products"]["y"]),(b["prices"]["cx"],b["prices"]["y"]+b["prices"]["h"]),"1 : 0..N",True)</w:t>
-        <w:br/>
         <w:t xml:space="preserve">    connect(c,(b["resources"]["x"]+b["resources"]["w"]-22,b["resources"]["y"]),(b["prices"]["x"]+b["prices"]["w"],b["prices"]["y"]+b["prices"]["h"]-25),"1 : 0..N",True,(4,-6))</w:t>
         <w:br/>
         <w:t xml:space="preserve">    connect(c,(b["products"]["x"]+b["products"]["w"],b["products"]["y"]+20),(b["discounts"]["x"],b["discounts"]["y"]+b["discounts"]["h"]-20),"1 : 0..N",True,(0,9))</w:t>
         <w:br/>
         <w:t xml:space="preserve">    connect(c,(b["resources"]["cx"],b["resources"]["y"]),(b["discounts"]["cx"],b["discounts"]["y"]+b["discounts"]["h"]),"1 : 0..N",True,(0,-9))</w:t>
         <w:br/>
-        <w:t xml:space="preserve">    # Производственный заказ.</w:t>
         <w:br/>
         <w:t xml:space="preserve">    connect(c,(b["production_orders"]["x"]+b["production_orders"]["w"],b["production_orders"]["cy"]),(b["production_order_items"]["x"],b["production_order_items"]["cy"]),"1 : N")</w:t>
         <w:br/>
         <w:t xml:space="preserve">    connect(c,(b["products"]["x"],b["products"]["y"]+25),(b["production_order_items"]["x"]+b["production_order_items"]["w"],b["production_order_items"]["y"]+b["production_order_items"]["h"]),"1 : N",label_offset=(0,-10))</w:t>
         <w:br/>
         <w:br/>
-        <w:t xml:space="preserve">    # Легенда и правила ссылочной целостности.</w:t>
         <w:br/>
         <w:t xml:space="preserve">    note_y=282</w:t>
         <w:br/>
@@ -4874,8 +4847,6 @@
           <w:color w:val="243247"/>
           <w:sz w:val="14"/>
         </w:rPr>
-        <w:t>-- Задание 2. Схема SQLite (3НФ). Все внешние ключи включаются в seed.py.</w:t>
-        <w:br/>
         <w:t>PRAGMA foreign_keys = ON;</w:t>
         <w:br/>
         <w:br/>
@@ -4913,10 +4884,6 @@
         <w:t>CREATE INDEX IF NOT EXISTS idx_products_source_id ON products(source_product_id);</w:t>
         <w:br/>
         <w:br/>
-        <w:t>-- В исходном файле «Материалы.json» есть как материалы, так и операции.</w:t>
-        <w:br/>
-        <w:t>-- Операции хранятся в том же справочнике, различие задаёт resource_type.</w:t>
-        <w:br/>
         <w:t>CREATE TABLE IF NOT EXISTS resources (</w:t>
         <w:br/>
         <w:t xml:space="preserve">    resource_id        INTEGER PRIMARY KEY,</w:t>
@@ -4941,6 +4908,11 @@
         <w:t xml:space="preserve">    resource_id         INTEGER NOT NULL REFERENCES resources(resource_id),</w:t>
         <w:br/>
         <w:t xml:space="preserve">    quantity_per_product NUMERIC NOT NULL CHECK (quantity_per_product &gt; 0),</w:t>
+        <w:br/>
+        <w:t xml:space="preserve">    UNIQUE (product_id, resource_id)</w:t>
+        <w:br/>
+        <w:t>);</w:t>
+        <w:br/>
       </w:r>
     </w:p>
     <w:p>
@@ -4960,73 +4932,73 @@
           <w:color w:val="243247"/>
           <w:sz w:val="14"/>
         </w:rPr>
-        <w:t xml:space="preserve">    UNIQUE (product_id, resource_id)</w:t>
+        <w:t>CREATE TABLE IF NOT EXISTS customer_orders (</w:t>
+        <w:br/>
+        <w:t xml:space="preserve">    order_id    INTEGER PRIMARY KEY,</w:t>
+        <w:br/>
+        <w:t xml:space="preserve">    customer_id TEXT NOT NULL REFERENCES customers(customer_id),</w:t>
+        <w:br/>
+        <w:t xml:space="preserve">    order_date  TEXT NOT NULL,</w:t>
+        <w:br/>
+        <w:t xml:space="preserve">    status      TEXT NOT NULL</w:t>
         <w:br/>
         <w:t>);</w:t>
         <w:br/>
         <w:br/>
-        <w:t>CREATE TABLE IF NOT EXISTS customer_orders (</w:t>
-        <w:br/>
-        <w:t xml:space="preserve">    order_id    INTEGER PRIMARY KEY,</w:t>
-        <w:br/>
-        <w:t xml:space="preserve">    customer_id TEXT NOT NULL REFERENCES customers(customer_id),</w:t>
-        <w:br/>
-        <w:t xml:space="preserve">    order_date  TEXT NOT NULL,</w:t>
-        <w:br/>
-        <w:t xml:space="preserve">    status      TEXT NOT NULL</w:t>
+        <w:t>CREATE TABLE IF NOT EXISTS order_items (</w:t>
+        <w:br/>
+        <w:t xml:space="preserve">    order_item_id        INTEGER PRIMARY KEY,</w:t>
+        <w:br/>
+        <w:t xml:space="preserve">    source_order_item_id INTEGER NOT NULL,</w:t>
+        <w:br/>
+        <w:t xml:space="preserve">    order_id             INTEGER NOT NULL REFERENCES customer_orders(order_id) ON DELETE CASCADE,</w:t>
+        <w:br/>
+        <w:t xml:space="preserve">    product_id           INTEGER NOT NULL REFERENCES products(product_id),</w:t>
+        <w:br/>
+        <w:t xml:space="preserve">    quantity             INTEGER NOT NULL CHECK (quantity &gt; 0),</w:t>
+        <w:br/>
+        <w:t xml:space="preserve">    unit_price_at_order  NUMERIC CHECK (unit_price_at_order IS NULL OR unit_price_at_order &gt;= 0),</w:t>
+        <w:br/>
+        <w:t xml:space="preserve">    discount_per_unit    NUMERIC NOT NULL DEFAULT 0 CHECK (discount_per_unit &gt;= 0),</w:t>
+        <w:br/>
+        <w:t xml:space="preserve">    CHECK (unit_price_at_order IS NULL OR discount_per_unit &lt;= unit_price_at_order)</w:t>
         <w:br/>
         <w:t>);</w:t>
         <w:br/>
         <w:br/>
-        <w:t>CREATE TABLE IF NOT EXISTS order_items (</w:t>
-        <w:br/>
-        <w:t xml:space="preserve">    order_item_id        INTEGER PRIMARY KEY,</w:t>
-        <w:br/>
-        <w:t xml:space="preserve">    source_order_item_id INTEGER NOT NULL,</w:t>
-        <w:br/>
-        <w:t xml:space="preserve">    order_id             INTEGER NOT NULL REFERENCES customer_orders(order_id) ON DELETE CASCADE,</w:t>
-        <w:br/>
-        <w:t xml:space="preserve">    product_id           INTEGER NOT NULL REFERENCES products(product_id),</w:t>
-        <w:br/>
-        <w:t xml:space="preserve">    quantity             INTEGER NOT NULL CHECK (quantity &gt; 0),</w:t>
-        <w:br/>
-        <w:t xml:space="preserve">    unit_price_at_order  NUMERIC CHECK (unit_price_at_order IS NULL OR unit_price_at_order &gt;= 0),</w:t>
-        <w:br/>
-        <w:t xml:space="preserve">    discount_per_unit    NUMERIC NOT NULL DEFAULT 0 CHECK (discount_per_unit &gt;= 0),</w:t>
-        <w:br/>
-        <w:t xml:space="preserve">    CHECK (unit_price_at_order IS NULL OR discount_per_unit &lt;= unit_price_at_order)</w:t>
+        <w:t>CREATE TABLE IF NOT EXISTS production_orders (</w:t>
+        <w:br/>
+        <w:t xml:space="preserve">    production_order_id INTEGER PRIMARY KEY,</w:t>
+        <w:br/>
+        <w:t xml:space="preserve">    order_number        TEXT NOT NULL,</w:t>
+        <w:br/>
+        <w:t xml:space="preserve">    launch_date         TEXT NOT NULL,</w:t>
+        <w:br/>
+        <w:t xml:space="preserve">    department          TEXT NOT NULL DEFAULT ''</w:t>
         <w:br/>
         <w:t>);</w:t>
         <w:br/>
         <w:br/>
-        <w:t>-- В Excel-приложениях есть заказ на производство. Эти таблицы входят в модель,</w:t>
-        <w:br/>
-        <w:t>-- даже если JSON-файлы для них отдельно не приложены.</w:t>
-        <w:br/>
-        <w:t>CREATE TABLE IF NOT EXISTS production_orders (</w:t>
-        <w:br/>
-        <w:t xml:space="preserve">    production_order_id INTEGER PRIMARY KEY,</w:t>
-        <w:br/>
-        <w:t xml:space="preserve">    order_number        TEXT NOT NULL,</w:t>
-        <w:br/>
-        <w:t xml:space="preserve">    launch_date         TEXT NOT NULL,</w:t>
-        <w:br/>
-        <w:t xml:space="preserve">    department          TEXT NOT NULL DEFAULT ''</w:t>
+        <w:t>CREATE TABLE IF NOT EXISTS production_order_items (</w:t>
+        <w:br/>
+        <w:t xml:space="preserve">    production_order_item_id INTEGER PRIMARY KEY,</w:t>
+        <w:br/>
+        <w:t xml:space="preserve">    production_order_id      INTEGER NOT NULL REFERENCES production_orders(production_order_id) ON DELETE CASCADE,</w:t>
+        <w:br/>
+        <w:t xml:space="preserve">    product_id               INTEGER NOT NULL REFERENCES products(product_id),</w:t>
+        <w:br/>
+        <w:t xml:space="preserve">    quantity                 NUMERIC NOT NULL CHECK (quantity &gt; 0),</w:t>
+        <w:br/>
+        <w:t xml:space="preserve">    unit                     TEXT NOT NULL DEFAULT 'шт'</w:t>
         <w:br/>
         <w:t>);</w:t>
         <w:br/>
         <w:br/>
-        <w:t>CREATE TABLE IF NOT EXISTS production_order_items (</w:t>
-        <w:br/>
-        <w:t xml:space="preserve">    production_order_item_id INTEGER PRIMARY KEY,</w:t>
-        <w:br/>
-        <w:t xml:space="preserve">    production_order_id      INTEGER NOT NULL REFERENCES production_orders(production_order_id) ON DELETE CASCADE,</w:t>
-        <w:br/>
-        <w:t xml:space="preserve">    product_id               INTEGER NOT NULL REFERENCES products(product_id),</w:t>
-        <w:br/>
-        <w:t xml:space="preserve">    quantity                 NUMERIC NOT NULL CHECK (quantity &gt; 0),</w:t>
-        <w:br/>
-        <w:t xml:space="preserve">    unit                     TEXT NOT NULL DEFAULT 'шт'</w:t>
+        <w:t>CREATE TABLE IF NOT EXISTS prices (</w:t>
+        <w:br/>
+        <w:t xml:space="preserve">    price_id   INTEGER PRIMARY KEY,</w:t>
+        <w:br/>
+        <w:t xml:space="preserve">    product_id INTEGER REFERENCES products(product_id),</w:t>
       </w:r>
     </w:p>
     <w:p>
@@ -5046,19 +5018,6 @@
           <w:color w:val="243247"/>
           <w:sz w:val="14"/>
         </w:rPr>
-        <w:t>);</w:t>
-        <w:br/>
-        <w:br/>
-        <w:t>-- Полиморфная ссылка из JSON разложена на два nullable FK.</w:t>
-        <w:br/>
-        <w:t>-- CHECK гарантирует, что цена относится ровно к одному товару ИЛИ ресурсу.</w:t>
-        <w:br/>
-        <w:t>CREATE TABLE IF NOT EXISTS prices (</w:t>
-        <w:br/>
-        <w:t xml:space="preserve">    price_id   INTEGER PRIMARY KEY,</w:t>
-        <w:br/>
-        <w:t xml:space="preserve">    product_id INTEGER REFERENCES products(product_id),</w:t>
-        <w:br/>
         <w:t xml:space="preserve">    resource_id INTEGER REFERENCES resources(resource_id),</w:t>
         <w:br/>
         <w:t xml:space="preserve">    unit_price NUMERIC NOT NULL CHECK (unit_price &gt;= 0),</w:t>
@@ -5142,21 +5101,6 @@
           <w:color w:val="243247"/>
           <w:sz w:val="14"/>
         </w:rPr>
-        <w:t>#!/usr/bin/env python3</w:t>
-        <w:br/>
-        <w:t>"""Создаёт manufacturing.sqlite3 и загружает предоставленные JSON-данные.</w:t>
-        <w:br/>
-        <w:br/>
-        <w:t>Запуск из любой папки:</w:t>
-        <w:br/>
-        <w:t xml:space="preserve">    python3 solutions/task2_database/seed.py</w:t>
-        <w:br/>
-        <w:t>Или укажите свои пути:</w:t>
-        <w:br/>
-        <w:t xml:space="preserve">    python3 seed.py --data-dir /path/to/source --db-path ./manufacturing.sqlite3</w:t>
-        <w:br/>
-        <w:t>"""</w:t>
-        <w:br/>
         <w:t>from __future__ import annotations</w:t>
         <w:br/>
         <w:br/>
@@ -5206,6 +5150,20 @@
         <w:t xml:space="preserve">        counter[0] += 1</w:t>
         <w:br/>
         <w:t xml:space="preserve">    result = counter[0]</w:t>
+        <w:br/>
+        <w:t xml:space="preserve">    used_ids.add(result)</w:t>
+        <w:br/>
+        <w:t xml:space="preserve">    counter[0] += 1</w:t>
+        <w:br/>
+        <w:t xml:space="preserve">    return result</w:t>
+        <w:br/>
+        <w:br/>
+        <w:br/>
+        <w:t>def main() -&gt; None:</w:t>
+        <w:br/>
+        <w:t xml:space="preserve">    parser = argparse.ArgumentParser(description='Загрузка предоставленных JSON-данных в manufacturing.sqlite3.')</w:t>
+        <w:br/>
+        <w:t xml:space="preserve">    parser.add_argument("--data-dir", type=Path, default=REPO_ROOT,</w:t>
       </w:r>
     </w:p>
     <w:p>
@@ -5225,20 +5183,6 @@
           <w:color w:val="243247"/>
           <w:sz w:val="14"/>
         </w:rPr>
-        <w:t xml:space="preserve">    used_ids.add(result)</w:t>
-        <w:br/>
-        <w:t xml:space="preserve">    counter[0] += 1</w:t>
-        <w:br/>
-        <w:t xml:space="preserve">    return result</w:t>
-        <w:br/>
-        <w:br/>
-        <w:br/>
-        <w:t>def main() -&gt; None:</w:t>
-        <w:br/>
-        <w:t xml:space="preserve">    parser = argparse.ArgumentParser(description=__doc__)</w:t>
-        <w:br/>
-        <w:t xml:space="preserve">    parser.add_argument("--data-dir", type=Path, default=REPO_ROOT,</w:t>
-        <w:br/>
         <w:t xml:space="preserve">                        help="папка с исходными JSON (по умолчанию корень проекта)")</w:t>
         <w:br/>
         <w:t xml:space="preserve">    parser.add_argument("--db-path", type=Path, default=HERE / "manufacturing.sqlite3",</w:t>
@@ -5288,9 +5232,23 @@
         <w:t xml:space="preserve">    discount_rows = data["Скидки.json"]</w:t>
         <w:br/>
         <w:br/>
-        <w:t xml:space="preserve">    # Проверяем внешние ссылки до загрузки.</w:t>
         <w:br/>
         <w:t xml:space="preserve">    known_product_source_ids = {int(row["id"]) for row in products}</w:t>
+        <w:br/>
+        <w:t xml:space="preserve">    referenced_product_ids = {int(row["product_id"]) for row in order_items}</w:t>
+        <w:br/>
+        <w:t xml:space="preserve">    referenced_product_ids.update(int(row["product_id"]) for row in specification)</w:t>
+        <w:br/>
+        <w:t xml:space="preserve">    for rows in (price_rows, discount_rows):</w:t>
+        <w:br/>
+        <w:t xml:space="preserve">        referenced_product_ids.update(</w:t>
+        <w:br/>
+        <w:t xml:space="preserve">            int(row["item_id"]) for row in rows if row["item_type"] == "Товар"</w:t>
+        <w:br/>
+        <w:t xml:space="preserve">        )</w:t>
+        <w:br/>
+        <w:t xml:space="preserve">    missing_product_ids = sorted(referenced_product_ids - known_product_source_ids)</w:t>
+        <w:br/>
       </w:r>
     </w:p>
     <w:p>
@@ -5310,32 +5268,6 @@
           <w:color w:val="243247"/>
           <w:sz w:val="14"/>
         </w:rPr>
-        <w:t xml:space="preserve">    referenced_product_ids = {int(row["product_id"]) for row in order_items}</w:t>
-        <w:br/>
-        <w:t xml:space="preserve">    referenced_product_ids.update(int(row["product_id"]) for row in specification)</w:t>
-        <w:br/>
-        <w:t xml:space="preserve">    for rows in (price_rows, discount_rows):</w:t>
-        <w:br/>
-        <w:t xml:space="preserve">        referenced_product_ids.update(</w:t>
-        <w:br/>
-        <w:t xml:space="preserve">            int(row["item_id"]) for row in rows if row["item_type"] == "Товар"</w:t>
-        <w:br/>
-        <w:t xml:space="preserve">        )</w:t>
-        <w:br/>
-        <w:t xml:space="preserve">    missing_product_ids = sorted(referenced_product_ids - known_product_source_ids)</w:t>
-        <w:br/>
-        <w:br/>
-        <w:t xml:space="preserve">    # В источнике встречаются повторные ID:</w:t>
-        <w:br/>
-        <w:t xml:space="preserve">    #   products: 887; resources: 456; order items: 31 и 81; discounts: 15.</w:t>
-        <w:br/>
-        <w:t xml:space="preserve">    # Для родительских справочников используем исходный ID для первой записи,</w:t>
-        <w:br/>
-        <w:t xml:space="preserve">    # а последующим выдаём surrogate key и сохраняем source_*_id. Все внешние</w:t>
-        <w:br/>
-        <w:t xml:space="preserve">    # ссылки на повторный ID связываются с первой записью; неоднозначность ниже</w:t>
-        <w:br/>
-        <w:t xml:space="preserve">    # явно сообщается. Строки заказа и скидки получают собственные surrogate PK.</w:t>
         <w:br/>
         <w:t xml:space="preserve">    duplicate_product_ids = sorted(</w:t>
         <w:br/>
@@ -5379,6 +5311,31 @@
         <w:t xml:space="preserve">    product_values = []</w:t>
         <w:br/>
         <w:t xml:space="preserve">    for row in products:</w:t>
+        <w:br/>
+        <w:t xml:space="preserve">        source_id = int(row["id"])</w:t>
+        <w:br/>
+        <w:t xml:space="preserve">        internal_id = source_id if source_id not in used_product_ids else allocate_surrogate(used_product_ids, surrogate_counter)</w:t>
+        <w:br/>
+        <w:t xml:space="preserve">        used_product_ids.add(internal_id)</w:t>
+        <w:br/>
+        <w:t xml:space="preserve">        product_ref.setdefault(source_id, internal_id)</w:t>
+        <w:br/>
+        <w:t xml:space="preserve">        product_values.append((internal_id, source_id, row["name"], row.get("category", "") or "", 0))</w:t>
+        <w:br/>
+        <w:t xml:space="preserve">    for source_id in missing_product_ids:</w:t>
+        <w:br/>
+        <w:t xml:space="preserve">        internal_id = source_id if source_id not in used_product_ids else allocate_surrogate(used_product_ids, surrogate_counter)</w:t>
+        <w:br/>
+        <w:t xml:space="preserve">        used_product_ids.add(internal_id)</w:t>
+        <w:br/>
+        <w:t xml:space="preserve">        product_ref[source_id] = internal_id</w:t>
+        <w:br/>
+        <w:t xml:space="preserve">        product_values.append((internal_id, source_id,</w:t>
+        <w:br/>
+        <w:t xml:space="preserve">                               f"[Нет в исходном справочнике: product_id={source_id}]", "", 1))</w:t>
+        <w:br/>
+        <w:br/>
+        <w:t xml:space="preserve">    resource_ref: dict[int, int] = {}</w:t>
       </w:r>
     </w:p>
     <w:p>
@@ -5398,41 +5355,16 @@
           <w:color w:val="243247"/>
           <w:sz w:val="14"/>
         </w:rPr>
+        <w:t xml:space="preserve">    typed_resource_ref: dict[tuple[int, str], int] = {}</w:t>
+        <w:br/>
+        <w:t xml:space="preserve">    used_resource_ids: set[int] = set()</w:t>
+        <w:br/>
+        <w:t xml:space="preserve">    resource_values = []</w:t>
+        <w:br/>
+        <w:t xml:space="preserve">    for row in resources:</w:t>
+        <w:br/>
         <w:t xml:space="preserve">        source_id = int(row["id"])</w:t>
         <w:br/>
-        <w:t xml:space="preserve">        internal_id = source_id if source_id not in used_product_ids else allocate_surrogate(used_product_ids, surrogate_counter)</w:t>
-        <w:br/>
-        <w:t xml:space="preserve">        used_product_ids.add(internal_id)</w:t>
-        <w:br/>
-        <w:t xml:space="preserve">        product_ref.setdefault(source_id, internal_id)</w:t>
-        <w:br/>
-        <w:t xml:space="preserve">        product_values.append((internal_id, source_id, row["name"], row.get("category", "") or "", 0))</w:t>
-        <w:br/>
-        <w:t xml:space="preserve">    for source_id in missing_product_ids:</w:t>
-        <w:br/>
-        <w:t xml:space="preserve">        internal_id = source_id if source_id not in used_product_ids else allocate_surrogate(used_product_ids, surrogate_counter)</w:t>
-        <w:br/>
-        <w:t xml:space="preserve">        used_product_ids.add(internal_id)</w:t>
-        <w:br/>
-        <w:t xml:space="preserve">        product_ref[source_id] = internal_id</w:t>
-        <w:br/>
-        <w:t xml:space="preserve">        product_values.append((internal_id, source_id,</w:t>
-        <w:br/>
-        <w:t xml:space="preserve">                               f"[Нет в исходном справочнике: product_id={source_id}]", "", 1))</w:t>
-        <w:br/>
-        <w:br/>
-        <w:t xml:space="preserve">    resource_ref: dict[int, int] = {}</w:t>
-        <w:br/>
-        <w:t xml:space="preserve">    typed_resource_ref: dict[tuple[int, str], int] = {}</w:t>
-        <w:br/>
-        <w:t xml:space="preserve">    used_resource_ids: set[int] = set()</w:t>
-        <w:br/>
-        <w:t xml:space="preserve">    resource_values = []</w:t>
-        <w:br/>
-        <w:t xml:space="preserve">    for row in resources:</w:t>
-        <w:br/>
-        <w:t xml:space="preserve">        source_id = int(row["id"])</w:t>
-        <w:br/>
         <w:t xml:space="preserve">        resource_type = row["type"]</w:t>
         <w:br/>
         <w:t xml:space="preserve">        internal_id = source_id if source_id not in used_resource_ids else allocate_surrogate(used_resource_ids, surrogate_counter)</w:t>
@@ -5460,13 +5392,37 @@
         <w:br/>
         <w:t xml:space="preserve">        with connection:</w:t>
         <w:br/>
-        <w:t xml:space="preserve">            # Перезагрузка идемпотентна: зависимости очищаются от дочерних к родительским.</w:t>
         <w:br/>
         <w:t xml:space="preserve">            for table in (</w:t>
         <w:br/>
         <w:t xml:space="preserve">                "prices", "discounts", "order_items", "production_order_items",</w:t>
         <w:br/>
         <w:t xml:space="preserve">                "customer_orders", "product_specification", "production_orders",</w:t>
+        <w:br/>
+        <w:t xml:space="preserve">                "resources", "products", "customers",</w:t>
+        <w:br/>
+        <w:t xml:space="preserve">            ):</w:t>
+        <w:br/>
+        <w:t xml:space="preserve">                connection.execute(f"DELETE FROM {table}")</w:t>
+        <w:br/>
+        <w:br/>
+        <w:t xml:space="preserve">            connection.executemany(</w:t>
+        <w:br/>
+        <w:t xml:space="preserve">                """INSERT INTO customers</w:t>
+        <w:br/>
+        <w:t xml:space="preserve">                   (customer_id, name, inn, address, phone, party_type)</w:t>
+        <w:br/>
+        <w:t xml:space="preserve">                   VALUES (?, ?, ?, ?, ?, ?)""",</w:t>
+        <w:br/>
+        <w:t xml:space="preserve">                [(</w:t>
+        <w:br/>
+        <w:t xml:space="preserve">                    str(row["id"]), row.get("name", ""), row.get("inn", "") or "",</w:t>
+        <w:br/>
+        <w:t xml:space="preserve">                    row.get("addres", row.get("address", "")) or "",</w:t>
+        <w:br/>
+        <w:t xml:space="preserve">                    row.get("phone", "") or "", row.get("type", "Прочее"),</w:t>
+        <w:br/>
+        <w:t xml:space="preserve">                ) for row in customers],</w:t>
       </w:r>
     </w:p>
     <w:p>
@@ -5486,76 +5442,77 @@
           <w:color w:val="243247"/>
           <w:sz w:val="14"/>
         </w:rPr>
-        <w:t xml:space="preserve">                "resources", "products", "customers",</w:t>
-        <w:br/>
-        <w:t xml:space="preserve">            ):</w:t>
-        <w:br/>
-        <w:t xml:space="preserve">                connection.execute(f"DELETE FROM {table}")</w:t>
-        <w:br/>
+        <w:t xml:space="preserve">            )</w:t>
         <w:br/>
         <w:t xml:space="preserve">            connection.executemany(</w:t>
         <w:br/>
-        <w:t xml:space="preserve">                """INSERT INTO customers</w:t>
-        <w:br/>
-        <w:t xml:space="preserve">                   (customer_id, name, inn, address, phone, party_type)</w:t>
-        <w:br/>
-        <w:t xml:space="preserve">                   VALUES (?, ?, ?, ?, ?, ?)""",</w:t>
-        <w:br/>
-        <w:t xml:space="preserve">                [(</w:t>
-        <w:br/>
-        <w:t xml:space="preserve">                    str(row["id"]), row.get("name", ""), row.get("inn", "") or "",</w:t>
-        <w:br/>
-        <w:t xml:space="preserve">                    row.get("addres", row.get("address", "")) or "",</w:t>
-        <w:br/>
-        <w:t xml:space="preserve">                    row.get("phone", "") or "", row.get("type", "Прочее"),</w:t>
-        <w:br/>
-        <w:t xml:space="preserve">                ) for row in customers],</w:t>
+        <w:t xml:space="preserve">                """INSERT INTO products</w:t>
+        <w:br/>
+        <w:t xml:space="preserve">                   (product_id, source_product_id, name, category, is_placeholder)</w:t>
+        <w:br/>
+        <w:t xml:space="preserve">                   VALUES (?, ?, ?, ?, ?)""",</w:t>
+        <w:br/>
+        <w:t xml:space="preserve">                product_values,</w:t>
         <w:br/>
         <w:t xml:space="preserve">            )</w:t>
         <w:br/>
         <w:t xml:space="preserve">            connection.executemany(</w:t>
         <w:br/>
-        <w:t xml:space="preserve">                """INSERT INTO products</w:t>
-        <w:br/>
-        <w:t xml:space="preserve">                   (product_id, source_product_id, name, category, is_placeholder)</w:t>
-        <w:br/>
-        <w:t xml:space="preserve">                   VALUES (?, ?, ?, ?, ?)""",</w:t>
-        <w:br/>
-        <w:t xml:space="preserve">                product_values,</w:t>
+        <w:t xml:space="preserve">                """INSERT INTO resources</w:t>
+        <w:br/>
+        <w:t xml:space="preserve">                   (resource_id, source_resource_id, name, resource_type)</w:t>
+        <w:br/>
+        <w:t xml:space="preserve">                   VALUES (?, ?, ?, ?)""",</w:t>
+        <w:br/>
+        <w:t xml:space="preserve">                resource_values,</w:t>
         <w:br/>
         <w:t xml:space="preserve">            )</w:t>
         <w:br/>
         <w:t xml:space="preserve">            connection.executemany(</w:t>
         <w:br/>
-        <w:t xml:space="preserve">                """INSERT INTO resources</w:t>
-        <w:br/>
-        <w:t xml:space="preserve">                   (resource_id, source_resource_id, name, resource_type)</w:t>
+        <w:t xml:space="preserve">                """INSERT INTO product_specification</w:t>
+        <w:br/>
+        <w:t xml:space="preserve">                   (specification_id, product_id, resource_id, quantity_per_product)</w:t>
         <w:br/>
         <w:t xml:space="preserve">                   VALUES (?, ?, ?, ?)""",</w:t>
         <w:br/>
-        <w:t xml:space="preserve">                resource_values,</w:t>
+        <w:t xml:space="preserve">                [(int(row["id"]), product_ref[int(row["product_id"])],</w:t>
+        <w:br/>
+        <w:t xml:space="preserve">                  resource_ref[int(row["material_id"])], float(row["qty"]))</w:t>
+        <w:br/>
+        <w:t xml:space="preserve">                 for row in specification],</w:t>
         <w:br/>
         <w:t xml:space="preserve">            )</w:t>
         <w:br/>
         <w:t xml:space="preserve">            connection.executemany(</w:t>
         <w:br/>
-        <w:t xml:space="preserve">                """INSERT INTO product_specification</w:t>
-        <w:br/>
-        <w:t xml:space="preserve">                   (specification_id, product_id, resource_id, quantity_per_product)</w:t>
+        <w:t xml:space="preserve">                """INSERT INTO customer_orders(order_id, customer_id, order_date, status)</w:t>
         <w:br/>
         <w:t xml:space="preserve">                   VALUES (?, ?, ?, ?)""",</w:t>
         <w:br/>
-        <w:t xml:space="preserve">                [(int(row["id"]), product_ref[int(row["product_id"])],</w:t>
-        <w:br/>
-        <w:t xml:space="preserve">                  resource_ref[int(row["material_id"])], float(row["qty"]))</w:t>
-        <w:br/>
-        <w:t xml:space="preserve">                 for row in specification],</w:t>
+        <w:t xml:space="preserve">                [(int(row["id"]), str(row["customer_id"]), row["order_date"], row["status"])</w:t>
+        <w:br/>
+        <w:t xml:space="preserve">                 for row in orders],</w:t>
         <w:br/>
         <w:t xml:space="preserve">            )</w:t>
         <w:br/>
         <w:t xml:space="preserve">            connection.executemany(</w:t>
         <w:br/>
-        <w:t xml:space="preserve">                """INSERT INTO customer_orders(order_id, customer_id, order_date, status)</w:t>
+        <w:t xml:space="preserve">                """INSERT INTO order_items</w:t>
+        <w:br/>
+        <w:t xml:space="preserve">                   (order_item_id, source_order_item_id, order_id, product_id, quantity,</w:t>
+        <w:br/>
+        <w:t xml:space="preserve">                    unit_price_at_order, discount_per_unit)</w:t>
+        <w:br/>
+        <w:t xml:space="preserve">                   VALUES (?, ?, ?, ?, ?, ?, ?)""",</w:t>
+        <w:br/>
+        <w:t xml:space="preserve">                [(internal_id, int(row["id"]), int(row["order_id"]), product_ref[int(row["product_id"])],</w:t>
+        <w:br/>
+        <w:t xml:space="preserve">                  int(row["quantity"]), None, 0)</w:t>
+        <w:br/>
+        <w:t xml:space="preserve">                 for internal_id, row in enumerate(order_items, start=1)],</w:t>
+        <w:br/>
+        <w:t xml:space="preserve">            )</w:t>
       </w:r>
     </w:p>
     <w:p>
@@ -5575,75 +5532,74 @@
           <w:color w:val="243247"/>
           <w:sz w:val="14"/>
         </w:rPr>
-        <w:t xml:space="preserve">                   VALUES (?, ?, ?, ?)""",</w:t>
-        <w:br/>
-        <w:t xml:space="preserve">                [(int(row["id"]), str(row["customer_id"]), row["order_date"], row["status"])</w:t>
-        <w:br/>
-        <w:t xml:space="preserve">                 for row in orders],</w:t>
+        <w:br/>
+        <w:t xml:space="preserve">            price_values = []</w:t>
+        <w:br/>
+        <w:t xml:space="preserve">            for row in price_rows:</w:t>
+        <w:br/>
+        <w:t xml:space="preserve">                if row["item_type"] == "Товар":</w:t>
+        <w:br/>
+        <w:t xml:space="preserve">                    product_id, resource_id = product_ref[int(row["item_id"])], None</w:t>
+        <w:br/>
+        <w:t xml:space="preserve">                else:</w:t>
+        <w:br/>
+        <w:t xml:space="preserve">                    key = (int(row["item_id"]), row["item_type"])</w:t>
+        <w:br/>
+        <w:t xml:space="preserve">                    resource_id = typed_resource_ref.get(key, resource_ref.get(int(row["item_id"])))</w:t>
+        <w:br/>
+        <w:t xml:space="preserve">                    if resource_id is None:</w:t>
+        <w:br/>
+        <w:t xml:space="preserve">                        raise ValueError(f"Для цены не найден ресурс: {key}")</w:t>
+        <w:br/>
+        <w:t xml:space="preserve">                    product_id = None</w:t>
+        <w:br/>
+        <w:t xml:space="preserve">                price_values.append((int(row["id"]), product_id, resource_id, float(row["price"])))</w:t>
+        <w:br/>
+        <w:t xml:space="preserve">            connection.executemany(</w:t>
+        <w:br/>
+        <w:t xml:space="preserve">                "INSERT INTO prices(price_id, product_id, resource_id, unit_price) VALUES (?, ?, ?, ?)",</w:t>
+        <w:br/>
+        <w:t xml:space="preserve">                price_values,</w:t>
         <w:br/>
         <w:t xml:space="preserve">            )</w:t>
         <w:br/>
+        <w:br/>
+        <w:t xml:space="preserve">            discount_values = []</w:t>
+        <w:br/>
+        <w:t xml:space="preserve">            for row in discount_rows:</w:t>
+        <w:br/>
+        <w:t xml:space="preserve">                if row["item_type"] == "Товар":</w:t>
+        <w:br/>
+        <w:t xml:space="preserve">                    product_id, resource_id = product_ref[int(row["item_id"])], None</w:t>
+        <w:br/>
+        <w:t xml:space="preserve">                else:</w:t>
+        <w:br/>
+        <w:t xml:space="preserve">                    key = (int(row["item_id"]), row["item_type"])</w:t>
+        <w:br/>
+        <w:t xml:space="preserve">                    resource_id = typed_resource_ref.get(key, resource_ref.get(int(row["item_id"])))</w:t>
+        <w:br/>
+        <w:t xml:space="preserve">                    if resource_id is None:</w:t>
+        <w:br/>
+        <w:t xml:space="preserve">                        raise ValueError(f"Для скидки не найден ресурс: {key}")</w:t>
+        <w:br/>
+        <w:t xml:space="preserve">                    product_id = None</w:t>
+        <w:br/>
+        <w:t xml:space="preserve">                discount_values.append((len(discount_values) + 1, int(row["id"]), product_id, resource_id,</w:t>
+        <w:br/>
+        <w:t xml:space="preserve">                                        float(row["discount_percent"])))</w:t>
+        <w:br/>
         <w:t xml:space="preserve">            connection.executemany(</w:t>
         <w:br/>
-        <w:t xml:space="preserve">                """INSERT INTO order_items</w:t>
-        <w:br/>
-        <w:t xml:space="preserve">                   (order_item_id, source_order_item_id, order_id, product_id, quantity,</w:t>
-        <w:br/>
-        <w:t xml:space="preserve">                    unit_price_at_order, discount_per_unit)</w:t>
-        <w:br/>
-        <w:t xml:space="preserve">                   VALUES (?, ?, ?, ?, ?, ?, ?)""",</w:t>
-        <w:br/>
-        <w:t xml:space="preserve">                [(internal_id, int(row["id"]), int(row["order_id"]), product_ref[int(row["product_id"])],</w:t>
-        <w:br/>
-        <w:t xml:space="preserve">                  int(row["quantity"]), None, 0)</w:t>
-        <w:br/>
-        <w:t xml:space="preserve">                 for internal_id, row in enumerate(order_items, start=1)],</w:t>
+        <w:t xml:space="preserve">                """INSERT INTO discounts</w:t>
+        <w:br/>
+        <w:t xml:space="preserve">                   (discount_id, source_discount_id, product_id, resource_id, discount_percent)</w:t>
+        <w:br/>
+        <w:t xml:space="preserve">                   VALUES (?, ?, ?, ?, ?)""",</w:t>
+        <w:br/>
+        <w:t xml:space="preserve">                discount_values,</w:t>
         <w:br/>
         <w:t xml:space="preserve">            )</w:t>
         <w:br/>
-        <w:br/>
-        <w:t xml:space="preserve">            price_values = []</w:t>
-        <w:br/>
-        <w:t xml:space="preserve">            for row in price_rows:</w:t>
-        <w:br/>
-        <w:t xml:space="preserve">                if row["item_type"] == "Товар":</w:t>
-        <w:br/>
-        <w:t xml:space="preserve">                    product_id, resource_id = product_ref[int(row["item_id"])], None</w:t>
-        <w:br/>
-        <w:t xml:space="preserve">                else:</w:t>
-        <w:br/>
-        <w:t xml:space="preserve">                    key = (int(row["item_id"]), row["item_type"])</w:t>
-        <w:br/>
-        <w:t xml:space="preserve">                    resource_id = typed_resource_ref.get(key, resource_ref.get(int(row["item_id"])))</w:t>
-        <w:br/>
-        <w:t xml:space="preserve">                    if resource_id is None:</w:t>
-        <w:br/>
-        <w:t xml:space="preserve">                        raise ValueError(f"Для цены не найден ресурс: {key}")</w:t>
-        <w:br/>
-        <w:t xml:space="preserve">                    product_id = None</w:t>
-        <w:br/>
-        <w:t xml:space="preserve">                price_values.append((int(row["id"]), product_id, resource_id, float(row["price"])))</w:t>
-        <w:br/>
-        <w:t xml:space="preserve">            connection.executemany(</w:t>
-        <w:br/>
-        <w:t xml:space="preserve">                "INSERT INTO prices(price_id, product_id, resource_id, unit_price) VALUES (?, ?, ?, ?)",</w:t>
-        <w:br/>
-        <w:t xml:space="preserve">                price_values,</w:t>
-        <w:br/>
-        <w:t xml:space="preserve">            )</w:t>
-        <w:br/>
-        <w:br/>
-        <w:t xml:space="preserve">            discount_values = []</w:t>
-        <w:br/>
-        <w:t xml:space="preserve">            for row in discount_rows:</w:t>
-        <w:br/>
-        <w:t xml:space="preserve">                if row["item_type"] == "Товар":</w:t>
-        <w:br/>
-        <w:t xml:space="preserve">                    product_id, resource_id = product_ref[int(row["item_id"])], None</w:t>
-        <w:br/>
-        <w:t xml:space="preserve">                else:</w:t>
-        <w:br/>
-        <w:t xml:space="preserve">                    key = (int(row["item_id"]), row["item_type"])</w:t>
       </w:r>
     </w:p>
     <w:p>
@@ -5663,31 +5619,6 @@
           <w:color w:val="243247"/>
           <w:sz w:val="14"/>
         </w:rPr>
-        <w:t xml:space="preserve">                    resource_id = typed_resource_ref.get(key, resource_ref.get(int(row["item_id"])))</w:t>
-        <w:br/>
-        <w:t xml:space="preserve">                    if resource_id is None:</w:t>
-        <w:br/>
-        <w:t xml:space="preserve">                        raise ValueError(f"Для скидки не найден ресурс: {key}")</w:t>
-        <w:br/>
-        <w:t xml:space="preserve">                    product_id = None</w:t>
-        <w:br/>
-        <w:t xml:space="preserve">                discount_values.append((len(discount_values) + 1, int(row["id"]), product_id, resource_id,</w:t>
-        <w:br/>
-        <w:t xml:space="preserve">                                        float(row["discount_percent"])))</w:t>
-        <w:br/>
-        <w:t xml:space="preserve">            connection.executemany(</w:t>
-        <w:br/>
-        <w:t xml:space="preserve">                """INSERT INTO discounts</w:t>
-        <w:br/>
-        <w:t xml:space="preserve">                   (discount_id, source_discount_id, product_id, resource_id, discount_percent)</w:t>
-        <w:br/>
-        <w:t xml:space="preserve">                   VALUES (?, ?, ?, ?, ?)""",</w:t>
-        <w:br/>
-        <w:t xml:space="preserve">                discount_values,</w:t>
-        <w:br/>
-        <w:t xml:space="preserve">            )</w:t>
-        <w:br/>
-        <w:br/>
         <w:t xml:space="preserve">        violations = list(connection.execute("PRAGMA foreign_key_check"))</w:t>
         <w:br/>
         <w:t xml:space="preserve">        if violations:</w:t>
@@ -5732,25 +5663,7 @@
         <w:t xml:space="preserve">        print("Повторные source_order_item_id (строки сохранены с surrogate PK):", duplicate_order_item_ids)</w:t>
         <w:br/>
         <w:t xml:space="preserve">    if duplicate_discount_ids:</w:t>
-      </w:r>
-    </w:p>
-    <w:p>
-      <w:r>
-        <w:br w:type="page"/>
-      </w:r>
-    </w:p>
-    <w:p>
-      <w:pPr>
-        <w:spacing w:before="20" w:after="40" w:line="164" w:lineRule="exact"/>
-        <w:ind w:left="144" w:right="144"/>
-        <w:shd w:fill="F2F5F9"/>
-      </w:pPr>
-      <w:r>
-        <w:rPr>
-          <w:rFonts w:ascii="Consolas" w:hAnsi="Consolas"/>
-          <w:color w:val="243247"/>
-          <w:sz w:val="14"/>
-        </w:rPr>
+        <w:br/>
         <w:t xml:space="preserve">        print("Повторные source_discount_id (строки сохранены с surrogate PK):", duplicate_discount_ids)</w:t>
         <w:br/>
         <w:t xml:space="preserve">    print("Проверка PRAGMA foreign_key_check: ошибок нет.")</w:t>
@@ -5792,21 +5705,6 @@
           <w:color w:val="243247"/>
           <w:sz w:val="14"/>
         </w:rPr>
-        <w:t>-- Задание 3. Полная себестоимость клиентского заказа.</w:t>
-        <w:br/>
-        <w:t>-- Параметр :order_id — номер заказа из customer_orders.</w:t>
-        <w:br/>
-        <w:t>-- В product_specification находятся нормы расхода и материалов, и операций;</w:t>
-        <w:br/>
-        <w:t>-- prices содержит цену ресурса. Скидки и продажная цена товара в себестоимость</w:t>
-        <w:br/>
-        <w:t>-- производства не входят.</w:t>
-        <w:br/>
-        <w:t>-- Если у любой строки заказа нет BOM или у любого ресурса нет цены,</w:t>
-        <w:br/>
-        <w:t>-- итог не подменяется частичной суммой: total_manufacturing_cost будет NULL.</w:t>
-        <w:br/>
-        <w:br/>
         <w:t>WITH components AS (</w:t>
         <w:br/>
         <w:t xml:space="preserve">    SELECT</w:t>
@@ -5862,6 +5760,22 @@
         <w:t xml:space="preserve">        COUNT(DISTINCT order_item_id) AS order_positions,</w:t>
         <w:br/>
         <w:t xml:space="preserve">        COUNT(DISTINCT CASE WHEN specification_id IS NOT NULL THEN order_item_id END)</w:t>
+        <w:br/>
+        <w:t xml:space="preserve">            AS positions_with_bom,</w:t>
+        <w:br/>
+        <w:t xml:space="preserve">        COUNT(specification_id) AS required_cost_positions,</w:t>
+        <w:br/>
+        <w:t xml:space="preserve">        COUNT(price_id) AS priced_positions,</w:t>
+        <w:br/>
+        <w:t xml:space="preserve">        SUM(ordered_quantity * quantity_per_product * unit_price) AS raw_total</w:t>
+        <w:br/>
+        <w:t xml:space="preserve">    FROM components</w:t>
+        <w:br/>
+        <w:t xml:space="preserve">    GROUP BY order_id</w:t>
+        <w:br/>
+        <w:t>)</w:t>
+        <w:br/>
+        <w:t>SELECT</w:t>
       </w:r>
     </w:p>
     <w:p>
@@ -5881,49 +5795,31 @@
           <w:color w:val="243247"/>
           <w:sz w:val="14"/>
         </w:rPr>
-        <w:t xml:space="preserve">            AS positions_with_bom,</w:t>
-        <w:br/>
-        <w:t xml:space="preserve">        COUNT(specification_id) AS required_cost_positions,</w:t>
-        <w:br/>
-        <w:t xml:space="preserve">        COUNT(price_id) AS priced_positions,</w:t>
-        <w:br/>
-        <w:t xml:space="preserve">        SUM(ordered_quantity * quantity_per_product * unit_price) AS raw_total</w:t>
-        <w:br/>
-        <w:t xml:space="preserve">    FROM components</w:t>
-        <w:br/>
-        <w:t xml:space="preserve">    GROUP BY order_id</w:t>
-        <w:br/>
-        <w:t>)</w:t>
+        <w:t xml:space="preserve">    order_id,</w:t>
+        <w:br/>
+        <w:t xml:space="preserve">    CASE</w:t>
+        <w:br/>
+        <w:t xml:space="preserve">        WHEN positions_with_bom &lt;&gt; order_positions</w:t>
+        <w:br/>
+        <w:t xml:space="preserve">          OR required_cost_positions = 0</w:t>
+        <w:br/>
+        <w:t xml:space="preserve">          OR priced_positions &lt;&gt; required_cost_positions</w:t>
+        <w:br/>
+        <w:t xml:space="preserve">        THEN NULL</w:t>
+        <w:br/>
+        <w:t xml:space="preserve">        ELSE ROUND(raw_total, 2)</w:t>
+        <w:br/>
+        <w:t xml:space="preserve">    END AS total_manufacturing_cost,</w:t>
+        <w:br/>
+        <w:t xml:space="preserve">    required_cost_positions,</w:t>
+        <w:br/>
+        <w:t xml:space="preserve">    priced_positions</w:t>
+        <w:br/>
+        <w:t>FROM coverage;</w:t>
+        <w:br/>
         <w:br/>
         <w:t>SELECT</w:t>
         <w:br/>
-        <w:t xml:space="preserve">    order_id,</w:t>
-        <w:br/>
-        <w:t xml:space="preserve">    CASE</w:t>
-        <w:br/>
-        <w:t xml:space="preserve">        WHEN positions_with_bom &lt;&gt; order_positions</w:t>
-        <w:br/>
-        <w:t xml:space="preserve">          OR required_cost_positions = 0</w:t>
-        <w:br/>
-        <w:t xml:space="preserve">          OR priced_positions &lt;&gt; required_cost_positions</w:t>
-        <w:br/>
-        <w:t xml:space="preserve">        THEN NULL</w:t>
-        <w:br/>
-        <w:t xml:space="preserve">        ELSE ROUND(raw_total, 2)</w:t>
-        <w:br/>
-        <w:t xml:space="preserve">    END AS total_manufacturing_cost,</w:t>
-        <w:br/>
-        <w:t xml:space="preserve">    required_cost_positions,</w:t>
-        <w:br/>
-        <w:t xml:space="preserve">    priced_positions</w:t>
-        <w:br/>
-        <w:t>FROM coverage;</w:t>
-        <w:br/>
-        <w:br/>
-        <w:t>-- Детализация того же расчёта: норма × цена × количество продукции.</w:t>
-        <w:br/>
-        <w:t>SELECT</w:t>
-        <w:br/>
         <w:t xml:space="preserve">    o.order_id,</w:t>
         <w:br/>
         <w:t xml:space="preserve">    oi.order_item_id,</w:t>
@@ -5951,25 +5847,7 @@
         <w:t>JOIN products AS p</w:t>
         <w:br/>
         <w:t xml:space="preserve">  ON p.product_id = oi.product_id</w:t>
-      </w:r>
-    </w:p>
-    <w:p>
-      <w:r>
-        <w:br w:type="page"/>
-      </w:r>
-    </w:p>
-    <w:p>
-      <w:pPr>
-        <w:spacing w:before="20" w:after="40" w:line="164" w:lineRule="exact"/>
-        <w:ind w:left="144" w:right="144"/>
-        <w:shd w:fill="F2F5F9"/>
-      </w:pPr>
-      <w:r>
-        <w:rPr>
-          <w:rFonts w:ascii="Consolas" w:hAnsi="Consolas"/>
-          <w:color w:val="243247"/>
-          <w:sz w:val="14"/>
-        </w:rPr>
+        <w:br/>
         <w:t>JOIN product_specification AS ps</w:t>
         <w:br/>
         <w:t xml:space="preserve">  ON ps.product_id = oi.product_id</w:t>
@@ -6019,19 +5897,6 @@
           <w:color w:val="243247"/>
           <w:sz w:val="14"/>
         </w:rPr>
-        <w:t>#!/usr/bin/env python3</w:t>
-        <w:br/>
-        <w:t>"""Демо-модуль задания 4 и API задания 5 (только стандартная библиотека Python).</w:t>
-        <w:br/>
-        <w:br/>
-        <w:t>Запуск: python3 app.py  -&gt;  http://127.0.0.1:8000</w:t>
-        <w:br/>
-        <w:t>Демо-учётные записи: admin / Admin123! и user / User123!</w:t>
-        <w:br/>
-        <w:t>Пароли хранятся только в виде PBKDF2-хеша. Замените демо-пароли для реального использования.</w:t>
-        <w:br/>
-        <w:t>"""</w:t>
-        <w:br/>
         <w:t>from __future__ import annotations</w:t>
         <w:br/>
         <w:br/>
@@ -6086,6 +5951,19 @@
         <w:br/>
         <w:t>CAPTCHA_SIZE = 9</w:t>
         <w:br/>
+        <w:br/>
+        <w:br/>
+        <w:t>FORCE_DB_ERROR = (</w:t>
+        <w:br/>
+        <w:t xml:space="preserve">    os.environ.get("EXAM_TEST_MODE") == "1"</w:t>
+        <w:br/>
+        <w:t xml:space="preserve">    and os.environ.get("EXAM_FORCE_DB_ERROR") == "1"</w:t>
+        <w:br/>
+        <w:t>)</w:t>
+        <w:br/>
+        <w:t>_sessions: dict[str, dict[str, Any]] = {}</w:t>
+        <w:br/>
+        <w:t>_captcha_challenges: dict[str, float] = {}</w:t>
       </w:r>
     </w:p>
     <w:p>
@@ -6105,20 +5983,6 @@
           <w:color w:val="243247"/>
           <w:sz w:val="14"/>
         </w:rPr>
-        <w:t># Только для отдельного тестового процесса задания 5. В обычном режиме выключено.</w:t>
-        <w:br/>
-        <w:t>FORCE_DB_ERROR = (</w:t>
-        <w:br/>
-        <w:t xml:space="preserve">    os.environ.get("EXAM_TEST_MODE") == "1"</w:t>
-        <w:br/>
-        <w:t xml:space="preserve">    and os.environ.get("EXAM_FORCE_DB_ERROR") == "1"</w:t>
-        <w:br/>
-        <w:t>)</w:t>
-        <w:br/>
-        <w:t>_sessions: dict[str, dict[str, Any]] = {}</w:t>
-        <w:br/>
-        <w:t>_captcha_challenges: dict[str, float] = {}</w:t>
-        <w:br/>
         <w:t>_state_lock = threading.Lock()</w:t>
         <w:br/>
         <w:br/>
@@ -6172,6 +6036,18 @@
         <w:t xml:space="preserve">    DB_PATH.parent.mkdir(parents=True, exist_ok=True)</w:t>
         <w:br/>
         <w:t xml:space="preserve">    connection = sqlite3.connect(str(DB_PATH), timeout=5)</w:t>
+        <w:br/>
+        <w:t xml:space="preserve">    connection.row_factory = sqlite3.Row</w:t>
+        <w:br/>
+        <w:t xml:space="preserve">    connection.execute("PRAGMA foreign_keys = ON")</w:t>
+        <w:br/>
+        <w:t xml:space="preserve">    connection.execute("PRAGMA busy_timeout = 5000")</w:t>
+        <w:br/>
+        <w:t xml:space="preserve">    return connection</w:t>
+        <w:br/>
+        <w:br/>
+        <w:br/>
+        <w:t>def make_password_hash(password: str, salt_hex: str | None = None) -&gt; tuple[str, str]:</w:t>
       </w:r>
     </w:p>
     <w:p>
@@ -6191,18 +6067,6 @@
           <w:color w:val="243247"/>
           <w:sz w:val="14"/>
         </w:rPr>
-        <w:t xml:space="preserve">    connection.row_factory = sqlite3.Row</w:t>
-        <w:br/>
-        <w:t xml:space="preserve">    connection.execute("PRAGMA foreign_keys = ON")</w:t>
-        <w:br/>
-        <w:t xml:space="preserve">    connection.execute("PRAGMA busy_timeout = 5000")</w:t>
-        <w:br/>
-        <w:t xml:space="preserve">    return connection</w:t>
-        <w:br/>
-        <w:br/>
-        <w:br/>
-        <w:t>def make_password_hash(password: str, salt_hex: str | None = None) -&gt; tuple[str, str]:</w:t>
-        <w:br/>
         <w:t xml:space="preserve">    salt_hex = salt_hex or secrets.token_hex(16)</w:t>
         <w:br/>
         <w:t xml:space="preserve">    digest = hashlib.pbkdf2_hmac(</w:t>
@@ -6225,7 +6089,6 @@
         <w:br/>
         <w:t>def initialize_database() -&gt; None:</w:t>
         <w:br/>
-        <w:t xml:space="preserve">    """Создаёт схему и только при первом запуске добавляет тестовые записи."""</w:t>
         <w:br/>
         <w:t xml:space="preserve">    connection = db_connect()</w:t>
         <w:br/>
@@ -6256,6 +6119,20 @@
         <w:t xml:space="preserve">                           VALUES (?, ?, ?, ?)""",</w:t>
         <w:br/>
         <w:t xml:space="preserve">                        (login, salt, digest, role),</w:t>
+        <w:br/>
+        <w:t xml:space="preserve">                    )</w:t>
+        <w:br/>
+        <w:t xml:space="preserve">            if connection.execute("SELECT COUNT(*) FROM notes").fetchone()[0] == 0:</w:t>
+        <w:br/>
+        <w:t xml:space="preserve">                users = {row["login"]: row["id"] for row in connection.execute(</w:t>
+        <w:br/>
+        <w:t xml:space="preserve">                    "SELECT id, login FROM users WHERE login IN ('admin', 'user')"</w:t>
+        <w:br/>
+        <w:t xml:space="preserve">                )}</w:t>
+        <w:br/>
+        <w:t xml:space="preserve">                demo_notes = [</w:t>
+        <w:br/>
+        <w:t xml:space="preserve">                    ("Планирование", "Согласовать сроки подготовки проекта.", "admin", "2026-10-01"),</w:t>
       </w:r>
     </w:p>
     <w:p>
@@ -6275,20 +6152,6 @@
           <w:color w:val="243247"/>
           <w:sz w:val="14"/>
         </w:rPr>
-        <w:t xml:space="preserve">                    )</w:t>
-        <w:br/>
-        <w:t xml:space="preserve">            if connection.execute("SELECT COUNT(*) FROM notes").fetchone()[0] == 0:</w:t>
-        <w:br/>
-        <w:t xml:space="preserve">                users = {row["login"]: row["id"] for row in connection.execute(</w:t>
-        <w:br/>
-        <w:t xml:space="preserve">                    "SELECT id, login FROM users WHERE login IN ('admin', 'user')"</w:t>
-        <w:br/>
-        <w:t xml:space="preserve">                )}</w:t>
-        <w:br/>
-        <w:t xml:space="preserve">                demo_notes = [</w:t>
-        <w:br/>
-        <w:t xml:space="preserve">                    ("Планирование", "Согласовать сроки подготовки проекта.", "admin", "2026-10-01"),</w:t>
-        <w:br/>
         <w:t xml:space="preserve">                    ("Встреча", "Подготовить повестку и материалы к встрече.", "user", "2026-10-02"),</w:t>
         <w:br/>
         <w:t xml:space="preserve">                    ("Заметки по API", "Проверить формат JSON и коды ответов.", "admin", "2026-10-03"),</w:t>
@@ -6337,11 +6200,24 @@
         <w:br/>
         <w:t>def _record_failed_attempt(login: str) -&gt; bool:</w:t>
         <w:br/>
-        <w:t xml:space="preserve">    """Увеличивает серию неудач; возвращает True, если запись заблокирована."""</w:t>
         <w:br/>
         <w:t xml:space="preserve">    if not login:</w:t>
         <w:br/>
         <w:t xml:space="preserve">        return False</w:t>
+        <w:br/>
+        <w:t xml:space="preserve">    connection = db_connect()</w:t>
+        <w:br/>
+        <w:t xml:space="preserve">    try:</w:t>
+        <w:br/>
+        <w:t xml:space="preserve">        with connection:</w:t>
+        <w:br/>
+        <w:t xml:space="preserve">            connection.execute(</w:t>
+        <w:br/>
+        <w:t xml:space="preserve">                """UPDATE users</w:t>
+        <w:br/>
+        <w:t xml:space="preserve">                   SET failed_attempts = failed_attempts + 1,</w:t>
+        <w:br/>
+        <w:t xml:space="preserve">                       is_blocked = CASE WHEN failed_attempts + 1 &gt;= 3 THEN 1 ELSE 0 END</w:t>
       </w:r>
     </w:p>
     <w:p>
@@ -6361,6 +6237,28 @@
           <w:color w:val="243247"/>
           <w:sz w:val="14"/>
         </w:rPr>
+        <w:t xml:space="preserve">                   WHERE login = ? COLLATE NOCASE AND is_blocked = 0""",</w:t>
+        <w:br/>
+        <w:t xml:space="preserve">                (login,),</w:t>
+        <w:br/>
+        <w:t xml:space="preserve">            )</w:t>
+        <w:br/>
+        <w:t xml:space="preserve">            row = connection.execute(</w:t>
+        <w:br/>
+        <w:t xml:space="preserve">                "SELECT is_blocked FROM users WHERE login = ? COLLATE NOCASE", (login,)</w:t>
+        <w:br/>
+        <w:t xml:space="preserve">            ).fetchone()</w:t>
+        <w:br/>
+        <w:t xml:space="preserve">            return bool(row and row["is_blocked"])</w:t>
+        <w:br/>
+        <w:t xml:space="preserve">    finally:</w:t>
+        <w:br/>
+        <w:t xml:space="preserve">        connection.close()</w:t>
+        <w:br/>
+        <w:br/>
+        <w:br/>
+        <w:t>def _reset_failed_attempts(user_id: int) -&gt; None:</w:t>
+        <w:br/>
         <w:t xml:space="preserve">    connection = db_connect()</w:t>
         <w:br/>
         <w:t xml:space="preserve">    try:</w:t>
@@ -6369,65 +6267,41 @@
         <w:br/>
         <w:t xml:space="preserve">            connection.execute(</w:t>
         <w:br/>
-        <w:t xml:space="preserve">                """UPDATE users</w:t>
-        <w:br/>
-        <w:t xml:space="preserve">                   SET failed_attempts = failed_attempts + 1,</w:t>
-        <w:br/>
-        <w:t xml:space="preserve">                       is_blocked = CASE WHEN failed_attempts + 1 &gt;= 3 THEN 1 ELSE 0 END</w:t>
-        <w:br/>
-        <w:t xml:space="preserve">                   WHERE login = ? COLLATE NOCASE AND is_blocked = 0""",</w:t>
-        <w:br/>
-        <w:t xml:space="preserve">                (login,),</w:t>
+        <w:t xml:space="preserve">                "UPDATE users SET failed_attempts = 0 WHERE id = ?", (user_id,)</w:t>
         <w:br/>
         <w:t xml:space="preserve">            )</w:t>
         <w:br/>
-        <w:t xml:space="preserve">            row = connection.execute(</w:t>
-        <w:br/>
-        <w:t xml:space="preserve">                "SELECT is_blocked FROM users WHERE login = ? COLLATE NOCASE", (login,)</w:t>
-        <w:br/>
-        <w:t xml:space="preserve">            ).fetchone()</w:t>
-        <w:br/>
-        <w:t xml:space="preserve">            return bool(row and row["is_blocked"])</w:t>
-        <w:br/>
         <w:t xml:space="preserve">    finally:</w:t>
         <w:br/>
         <w:t xml:space="preserve">        connection.close()</w:t>
         <w:br/>
         <w:br/>
         <w:br/>
-        <w:t>def _reset_failed_attempts(user_id: int) -&gt; None:</w:t>
-        <w:br/>
-        <w:t xml:space="preserve">    connection = db_connect()</w:t>
+        <w:t>def _read_form(handler: BaseHTTPRequestHandler) -&gt; dict[str, str]:</w:t>
         <w:br/>
         <w:t xml:space="preserve">    try:</w:t>
         <w:br/>
-        <w:t xml:space="preserve">        with connection:</w:t>
-        <w:br/>
-        <w:t xml:space="preserve">            connection.execute(</w:t>
-        <w:br/>
-        <w:t xml:space="preserve">                "UPDATE users SET failed_attempts = 0 WHERE id = ?", (user_id,)</w:t>
-        <w:br/>
-        <w:t xml:space="preserve">            )</w:t>
-        <w:br/>
-        <w:t xml:space="preserve">    finally:</w:t>
-        <w:br/>
-        <w:t xml:space="preserve">        connection.close()</w:t>
-        <w:br/>
-        <w:br/>
-        <w:br/>
-        <w:t>def _read_form(handler: BaseHTTPRequestHandler) -&gt; dict[str, str]:</w:t>
+        <w:t xml:space="preserve">        length = int(handler.headers.get("Content-Length", "0"))</w:t>
+        <w:br/>
+        <w:t xml:space="preserve">    except ValueError:</w:t>
+        <w:br/>
+        <w:t xml:space="preserve">        return {}</w:t>
+        <w:br/>
+        <w:t xml:space="preserve">    if length &lt; 0 or length &gt; MAX_FORM_BYTES:</w:t>
+        <w:br/>
+        <w:t xml:space="preserve">        return {}</w:t>
+        <w:br/>
+        <w:t xml:space="preserve">    raw = handler.rfile.read(length).decode("utf-8", errors="replace")</w:t>
+        <w:br/>
+        <w:t xml:space="preserve">    return {key: values[-1] for key, values in parse_qs(raw, keep_blank_values=True).items()}</w:t>
+        <w:br/>
+        <w:br/>
+        <w:br/>
+        <w:t>def _parse_captcha_order(value: str) -&gt; list[int] | None:</w:t>
         <w:br/>
         <w:t xml:space="preserve">    try:</w:t>
         <w:br/>
-        <w:t xml:space="preserve">        length = int(handler.headers.get("Content-Length", "0"))</w:t>
-        <w:br/>
-        <w:t xml:space="preserve">    except ValueError:</w:t>
-        <w:br/>
-        <w:t xml:space="preserve">        return {}</w:t>
-        <w:br/>
-        <w:t xml:space="preserve">    if length &lt; 0 or length &gt; MAX_FORM_BYTES:</w:t>
-        <w:br/>
-        <w:t xml:space="preserve">        return {}</w:t>
+        <w:t xml:space="preserve">        parsed = json.loads(value)</w:t>
       </w:r>
     </w:p>
     <w:p>
@@ -6447,18 +6321,6 @@
           <w:color w:val="243247"/>
           <w:sz w:val="14"/>
         </w:rPr>
-        <w:t xml:space="preserve">    raw = handler.rfile.read(length).decode("utf-8", errors="replace")</w:t>
-        <w:br/>
-        <w:t xml:space="preserve">    return {key: values[-1] for key, values in parse_qs(raw, keep_blank_values=True).items()}</w:t>
-        <w:br/>
-        <w:br/>
-        <w:br/>
-        <w:t>def _parse_captcha_order(value: str) -&gt; list[int] | None:</w:t>
-        <w:br/>
-        <w:t xml:space="preserve">    try:</w:t>
-        <w:br/>
-        <w:t xml:space="preserve">        parsed = json.loads(value)</w:t>
-        <w:br/>
         <w:t xml:space="preserve">        if not isinstance(parsed, list) or len(parsed) != CAPTCHA_SIZE:</w:t>
         <w:br/>
         <w:t xml:space="preserve">            return None</w:t>
@@ -6502,7 +6364,6 @@
         <w:br/>
         <w:t xml:space="preserve">    def log_message(self, fmt: str, *args: Any) -&gt; None:</w:t>
         <w:br/>
-        <w:t xml:space="preserve">        # Не выводим введённые пользователем пароли в журнал.</w:t>
         <w:br/>
         <w:t xml:space="preserve">        super().log_message(fmt, *args)</w:t>
         <w:br/>
@@ -6510,6 +6371,19 @@
         <w:t xml:space="preserve">    def _common_headers(self) -&gt; None:</w:t>
         <w:br/>
         <w:t xml:space="preserve">        self.send_header("X-Content-Type-Options", "nosniff")</w:t>
+        <w:br/>
+        <w:t xml:space="preserve">        self.send_header("X-Frame-Options", "DENY")</w:t>
+        <w:br/>
+        <w:t xml:space="preserve">        self.send_header("Referrer-Policy", "no-referrer")</w:t>
+        <w:br/>
+        <w:t xml:space="preserve">        self.send_header("Cache-Control", "no-store")</w:t>
+        <w:br/>
+        <w:br/>
+        <w:t xml:space="preserve">    def _send_html(self, body: str, status: int = 200, extra_headers: list[tuple[str, str]] | None = None) -&gt; None:</w:t>
+        <w:br/>
+        <w:t xml:space="preserve">        encoded = body.encode("utf-8")</w:t>
+        <w:br/>
+        <w:t xml:space="preserve">        self.send_response(status)</w:t>
       </w:r>
     </w:p>
     <w:p>
@@ -6529,20 +6403,28 @@
           <w:color w:val="243247"/>
           <w:sz w:val="14"/>
         </w:rPr>
-        <w:t xml:space="preserve">        self.send_header("X-Frame-Options", "DENY")</w:t>
-        <w:br/>
-        <w:t xml:space="preserve">        self.send_header("Referrer-Policy", "no-referrer")</w:t>
-        <w:br/>
-        <w:t xml:space="preserve">        self.send_header("Cache-Control", "no-store")</w:t>
-        <w:br/>
-        <w:br/>
-        <w:t xml:space="preserve">    def _send_html(self, body: str, status: int = 200, extra_headers: list[tuple[str, str]] | None = None) -&gt; None:</w:t>
-        <w:br/>
-        <w:t xml:space="preserve">        encoded = body.encode("utf-8")</w:t>
+        <w:t xml:space="preserve">        self.send_header("Content-Type", "text/html; charset=utf-8")</w:t>
+        <w:br/>
+        <w:t xml:space="preserve">        self.send_header("Content-Length", str(len(encoded)))</w:t>
+        <w:br/>
+        <w:t xml:space="preserve">        self._common_headers()</w:t>
+        <w:br/>
+        <w:t xml:space="preserve">        for key, value in extra_headers or []:</w:t>
+        <w:br/>
+        <w:t xml:space="preserve">            self.send_header(key, value)</w:t>
+        <w:br/>
+        <w:t xml:space="preserve">        self.end_headers()</w:t>
+        <w:br/>
+        <w:t xml:space="preserve">        self.wfile.write(encoded)</w:t>
+        <w:br/>
+        <w:br/>
+        <w:t xml:space="preserve">    def _send_json(self, payload: Any, status: int = 200, extra_headers: list[tuple[str, str]] | None = None) -&gt; None:</w:t>
+        <w:br/>
+        <w:t xml:space="preserve">        encoded = json.dumps(payload, ensure_ascii=False, separators=(",", ":")).encode("utf-8")</w:t>
         <w:br/>
         <w:t xml:space="preserve">        self.send_response(status)</w:t>
         <w:br/>
-        <w:t xml:space="preserve">        self.send_header("Content-Type", "text/html; charset=utf-8")</w:t>
+        <w:t xml:space="preserve">        self.send_header("Content-Type", "application/json; charset=utf-8")</w:t>
         <w:br/>
         <w:t xml:space="preserve">        self.send_header("Content-Length", str(len(encoded)))</w:t>
         <w:br/>
@@ -6557,45 +6439,38 @@
         <w:t xml:space="preserve">        self.wfile.write(encoded)</w:t>
         <w:br/>
         <w:br/>
-        <w:t xml:space="preserve">    def _send_json(self, payload: Any, status: int = 200, extra_headers: list[tuple[str, str]] | None = None) -&gt; None:</w:t>
-        <w:br/>
-        <w:t xml:space="preserve">        encoded = json.dumps(payload, ensure_ascii=False, separators=(",", ":")).encode("utf-8")</w:t>
-        <w:br/>
-        <w:t xml:space="preserve">        self.send_response(status)</w:t>
-        <w:br/>
-        <w:t xml:space="preserve">        self.send_header("Content-Type", "application/json; charset=utf-8")</w:t>
-        <w:br/>
-        <w:t xml:space="preserve">        self.send_header("Content-Length", str(len(encoded)))</w:t>
+        <w:t xml:space="preserve">    def _redirect(self, location: str, cookie: str | None = None) -&gt; None:</w:t>
+        <w:br/>
+        <w:t xml:space="preserve">        self.send_response(HTTPStatus.SEE_OTHER)</w:t>
+        <w:br/>
+        <w:t xml:space="preserve">        self.send_header("Location", location)</w:t>
+        <w:br/>
+        <w:t xml:space="preserve">        self.send_header("Content-Length", "0")</w:t>
         <w:br/>
         <w:t xml:space="preserve">        self._common_headers()</w:t>
         <w:br/>
-        <w:t xml:space="preserve">        for key, value in extra_headers or []:</w:t>
-        <w:br/>
-        <w:t xml:space="preserve">            self.send_header(key, value)</w:t>
+        <w:t xml:space="preserve">        if cookie:</w:t>
+        <w:br/>
+        <w:t xml:space="preserve">            self.send_header("Set-Cookie", cookie)</w:t>
         <w:br/>
         <w:t xml:space="preserve">        self.end_headers()</w:t>
         <w:br/>
-        <w:t xml:space="preserve">        self.wfile.write(encoded)</w:t>
-        <w:br/>
-        <w:br/>
-        <w:t xml:space="preserve">    def _redirect(self, location: str, cookie: str | None = None) -&gt; None:</w:t>
-        <w:br/>
-        <w:t xml:space="preserve">        self.send_response(HTTPStatus.SEE_OTHER)</w:t>
-        <w:br/>
-        <w:t xml:space="preserve">        self.send_header("Location", location)</w:t>
-        <w:br/>
-        <w:t xml:space="preserve">        self.send_header("Content-Length", "0")</w:t>
-        <w:br/>
-        <w:t xml:space="preserve">        self._common_headers()</w:t>
-        <w:br/>
-        <w:t xml:space="preserve">        if cookie:</w:t>
-        <w:br/>
-        <w:t xml:space="preserve">            self.send_header("Set-Cookie", cookie)</w:t>
-        <w:br/>
-        <w:t xml:space="preserve">        self.end_headers()</w:t>
-        <w:br/>
         <w:br/>
         <w:t xml:space="preserve">    def _current_user(self) -&gt; sqlite3.Row | None:</w:t>
+        <w:br/>
+        <w:t xml:space="preserve">        _clean_expired_state()</w:t>
+        <w:br/>
+        <w:t xml:space="preserve">        cookie = SimpleCookie()</w:t>
+        <w:br/>
+        <w:t xml:space="preserve">        try:</w:t>
+        <w:br/>
+        <w:t xml:space="preserve">            cookie.load(self.headers.get("Cookie", ""))</w:t>
+        <w:br/>
+        <w:t xml:space="preserve">        except Exception:</w:t>
+        <w:br/>
+        <w:t xml:space="preserve">            return None</w:t>
+        <w:br/>
+        <w:t xml:space="preserve">        morsel = cookie.get("sid")</w:t>
       </w:r>
     </w:p>
     <w:p>
@@ -6615,36 +6490,22 @@
           <w:color w:val="243247"/>
           <w:sz w:val="14"/>
         </w:rPr>
-        <w:t xml:space="preserve">        _clean_expired_state()</w:t>
-        <w:br/>
-        <w:t xml:space="preserve">        cookie = SimpleCookie()</w:t>
-        <w:br/>
-        <w:t xml:space="preserve">        try:</w:t>
-        <w:br/>
-        <w:t xml:space="preserve">            cookie.load(self.headers.get("Cookie", ""))</w:t>
-        <w:br/>
-        <w:t xml:space="preserve">        except Exception:</w:t>
+        <w:t xml:space="preserve">        if not morsel:</w:t>
         <w:br/>
         <w:t xml:space="preserve">            return None</w:t>
         <w:br/>
-        <w:t xml:space="preserve">        morsel = cookie.get("sid")</w:t>
-        <w:br/>
-        <w:t xml:space="preserve">        if not morsel:</w:t>
+        <w:t xml:space="preserve">        with _state_lock:</w:t>
+        <w:br/>
+        <w:t xml:space="preserve">            session = _sessions.get(morsel.value)</w:t>
+        <w:br/>
+        <w:t xml:space="preserve">        if not session or session["expires"] &lt; time.time():</w:t>
         <w:br/>
         <w:t xml:space="preserve">            return None</w:t>
         <w:br/>
-        <w:t xml:space="preserve">        with _state_lock:</w:t>
-        <w:br/>
-        <w:t xml:space="preserve">            session = _sessions.get(morsel.value)</w:t>
-        <w:br/>
-        <w:t xml:space="preserve">        if not session or session["expires"] &lt; time.time():</w:t>
-        <w:br/>
-        <w:t xml:space="preserve">            return None</w:t>
-        <w:br/>
         <w:t xml:space="preserve">        return _fetch_user_by_id(session["user_id"])</w:t>
         <w:br/>
         <w:br/>
-        <w:t xml:space="preserve">    def do_GET(self) -&gt; None:  # noqa: N802 - имя задано BaseHTTPRequestHandler</w:t>
+        <w:t xml:space="preserve">    def do_GET(self) -&gt; None:</w:t>
         <w:br/>
         <w:t xml:space="preserve">        parsed = urlsplit(self.path)</w:t>
         <w:br/>
@@ -6685,6 +6546,20 @@
         <w:t xml:space="preserve">            return</w:t>
         <w:br/>
         <w:t xml:space="preserve">        if path in ("/", "/login"):</w:t>
+        <w:br/>
+        <w:t xml:space="preserve">            user = self._current_user()</w:t>
+        <w:br/>
+        <w:t xml:space="preserve">            if user:</w:t>
+        <w:br/>
+        <w:t xml:space="preserve">                self._redirect("/dashboard")</w:t>
+        <w:br/>
+        <w:t xml:space="preserve">            else:</w:t>
+        <w:br/>
+        <w:t xml:space="preserve">                self._login_page()</w:t>
+        <w:br/>
+        <w:t xml:space="preserve">            return</w:t>
+        <w:br/>
+        <w:t xml:space="preserve">        if path == "/dashboard":</w:t>
       </w:r>
     </w:p>
     <w:p>
@@ -6706,17 +6581,19 @@
         </w:rPr>
         <w:t xml:space="preserve">            user = self._current_user()</w:t>
         <w:br/>
-        <w:t xml:space="preserve">            if user:</w:t>
-        <w:br/>
-        <w:t xml:space="preserve">                self._redirect("/dashboard")</w:t>
+        <w:t xml:space="preserve">            if not user:</w:t>
+        <w:br/>
+        <w:t xml:space="preserve">                self._redirect("/login")</w:t>
         <w:br/>
         <w:t xml:space="preserve">            else:</w:t>
         <w:br/>
-        <w:t xml:space="preserve">                self._login_page()</w:t>
+        <w:t xml:space="preserve">                welcome = parse_qs(parsed.query).get("welcome", [""])[0] == "1"</w:t>
+        <w:br/>
+        <w:t xml:space="preserve">                self._dashboard(user, welcome=welcome)</w:t>
         <w:br/>
         <w:t xml:space="preserve">            return</w:t>
         <w:br/>
-        <w:t xml:space="preserve">        if path == "/dashboard":</w:t>
+        <w:t xml:space="preserve">        if path == "/admin/users":</w:t>
         <w:br/>
         <w:t xml:space="preserve">            user = self._current_user()</w:t>
         <w:br/>
@@ -6724,56 +6601,54 @@
         <w:br/>
         <w:t xml:space="preserve">                self._redirect("/login")</w:t>
         <w:br/>
+        <w:t xml:space="preserve">            elif user["role"] != "Администратор":</w:t>
+        <w:br/>
+        <w:t xml:space="preserve">                self._send_html(_page("Доступ запрещён", "Эта страница доступна только администратору."), 403)</w:t>
+        <w:br/>
         <w:t xml:space="preserve">            else:</w:t>
         <w:br/>
-        <w:t xml:space="preserve">                welcome = parse_qs(parsed.query).get("welcome", [""])[0] == "1"</w:t>
-        <w:br/>
-        <w:t xml:space="preserve">                self._dashboard(user, welcome=welcome)</w:t>
+        <w:t xml:space="preserve">                self._admin_page(user)</w:t>
         <w:br/>
         <w:t xml:space="preserve">            return</w:t>
         <w:br/>
-        <w:t xml:space="preserve">        if path == "/admin/users":</w:t>
-        <w:br/>
-        <w:t xml:space="preserve">            user = self._current_user()</w:t>
-        <w:br/>
-        <w:t xml:space="preserve">            if not user:</w:t>
-        <w:br/>
-        <w:t xml:space="preserve">                self._redirect("/login")</w:t>
-        <w:br/>
-        <w:t xml:space="preserve">            elif user["role"] != "Администратор":</w:t>
-        <w:br/>
-        <w:t xml:space="preserve">                self._send_html(_page("Доступ запрещён", "Эта страница доступна только администратору."), 403)</w:t>
-        <w:br/>
-        <w:t xml:space="preserve">            else:</w:t>
-        <w:br/>
-        <w:t xml:space="preserve">                self._admin_page(user)</w:t>
+        <w:t xml:space="preserve">        self._send_html(_page("Не найдено", "Страница не найдена."), 404)</w:t>
+        <w:br/>
+        <w:br/>
+        <w:t xml:space="preserve">    def do_POST(self) -&gt; None:</w:t>
+        <w:br/>
+        <w:t xml:space="preserve">        path = urlsplit(self.path).path</w:t>
+        <w:br/>
+        <w:t xml:space="preserve">        if path in ("/notes", "/api/notes"):</w:t>
+        <w:br/>
+        <w:t xml:space="preserve">            self._send_json({"error": "Метод не поддерживается. Используйте GET."}, 405,</w:t>
+        <w:br/>
+        <w:t xml:space="preserve">                            [("Allow", "GET")])</w:t>
         <w:br/>
         <w:t xml:space="preserve">            return</w:t>
         <w:br/>
-        <w:t xml:space="preserve">        self._send_html(_page("Не найдено", "Страница не найдена."), 404)</w:t>
-        <w:br/>
-        <w:br/>
-        <w:t xml:space="preserve">    def do_POST(self) -&gt; None:  # noqa: N802</w:t>
-        <w:br/>
-        <w:t xml:space="preserve">        path = urlsplit(self.path).path</w:t>
-        <w:br/>
-        <w:t xml:space="preserve">        if path in ("/notes", "/api/notes"):</w:t>
-        <w:br/>
-        <w:t xml:space="preserve">            self._send_json({"error": "Метод не поддерживается. Используйте GET."}, 405,</w:t>
-        <w:br/>
-        <w:t xml:space="preserve">                            [("Allow", "GET")])</w:t>
+        <w:t xml:space="preserve">        if path == "/login":</w:t>
+        <w:br/>
+        <w:t xml:space="preserve">            self._login(_read_form(self))</w:t>
         <w:br/>
         <w:t xml:space="preserve">            return</w:t>
         <w:br/>
-        <w:t xml:space="preserve">        if path == "/login":</w:t>
-        <w:br/>
-        <w:t xml:space="preserve">            self._login(_read_form(self))</w:t>
+        <w:t xml:space="preserve">        if path == "/logout":</w:t>
+        <w:br/>
+        <w:t xml:space="preserve">            self._logout()</w:t>
         <w:br/>
         <w:t xml:space="preserve">            return</w:t>
         <w:br/>
-        <w:t xml:space="preserve">        if path == "/logout":</w:t>
-        <w:br/>
-        <w:t xml:space="preserve">            self._logout()</w:t>
+        <w:t xml:space="preserve">        if path == "/admin/users/create":</w:t>
+        <w:br/>
+        <w:t xml:space="preserve">            self._admin_create_user(_read_form(self))</w:t>
+        <w:br/>
+        <w:t xml:space="preserve">            return</w:t>
+        <w:br/>
+        <w:t xml:space="preserve">        if path == "/admin/users/update":</w:t>
+        <w:br/>
+        <w:t xml:space="preserve">            self._admin_update_user(_read_form(self))</w:t>
+        <w:br/>
+        <w:t xml:space="preserve">            return</w:t>
       </w:r>
     </w:p>
     <w:p>
@@ -6793,75 +6668,73 @@
           <w:color w:val="243247"/>
           <w:sz w:val="14"/>
         </w:rPr>
+        <w:t xml:space="preserve">        self._send_html(_page("Не найдено", "Страница не найдена."), 404)</w:t>
+        <w:br/>
+        <w:br/>
+        <w:t xml:space="preserve">    def _get_notes(self, raw_query: str) -&gt; None:</w:t>
+        <w:br/>
+        <w:br/>
+        <w:t xml:space="preserve">        query = parse_qs(raw_query, keep_blank_values=True)</w:t>
+        <w:br/>
+        <w:t xml:space="preserve">        allowed = {"limit", "user_id"}</w:t>
+        <w:br/>
+        <w:t xml:space="preserve">        unknown = sorted(set(query) - allowed)</w:t>
+        <w:br/>
+        <w:t xml:space="preserve">        if unknown:</w:t>
+        <w:br/>
+        <w:t xml:space="preserve">            self._send_json({"error": "Неизвестный параметр: " + ", ".join(unknown)}, 400)</w:t>
+        <w:br/>
         <w:t xml:space="preserve">            return</w:t>
         <w:br/>
-        <w:t xml:space="preserve">        if path == "/admin/users/create":</w:t>
-        <w:br/>
-        <w:t xml:space="preserve">            self._admin_create_user(_read_form(self))</w:t>
+        <w:t xml:space="preserve">        if any(len(values) != 1 for values in query.values()):</w:t>
+        <w:br/>
+        <w:t xml:space="preserve">            self._send_json({"error": "Каждый параметр можно передать только один раз."}, 400)</w:t>
         <w:br/>
         <w:t xml:space="preserve">            return</w:t>
         <w:br/>
-        <w:t xml:space="preserve">        if path == "/admin/users/update":</w:t>
-        <w:br/>
-        <w:t xml:space="preserve">            self._admin_update_user(_read_form(self))</w:t>
+        <w:br/>
+        <w:t xml:space="preserve">        limit: int | None = None</w:t>
+        <w:br/>
+        <w:t xml:space="preserve">        user_id: int | None = None</w:t>
+        <w:br/>
+        <w:t xml:space="preserve">        try:</w:t>
+        <w:br/>
+        <w:t xml:space="preserve">            if "limit" in query:</w:t>
+        <w:br/>
+        <w:t xml:space="preserve">                limit = int(query["limit"][0])</w:t>
+        <w:br/>
+        <w:t xml:space="preserve">                if not 1 &lt;= limit &lt;= 1000:</w:t>
+        <w:br/>
+        <w:t xml:space="preserve">                    raise ValueError</w:t>
+        <w:br/>
+        <w:t xml:space="preserve">            if "user_id" in query:</w:t>
+        <w:br/>
+        <w:t xml:space="preserve">                user_id = int(query["user_id"][0])</w:t>
+        <w:br/>
+        <w:t xml:space="preserve">                if user_id &lt;= 0:</w:t>
+        <w:br/>
+        <w:t xml:space="preserve">                    raise ValueError</w:t>
+        <w:br/>
+        <w:t xml:space="preserve">        except ValueError:</w:t>
+        <w:br/>
+        <w:t xml:space="preserve">            self._send_json(</w:t>
+        <w:br/>
+        <w:t xml:space="preserve">                {"error": "Параметры limit и user_id должны быть положительными целыми числами; limit — от 1 до 1000."},</w:t>
+        <w:br/>
+        <w:t xml:space="preserve">                400,</w:t>
+        <w:br/>
+        <w:t xml:space="preserve">            )</w:t>
         <w:br/>
         <w:t xml:space="preserve">            return</w:t>
         <w:br/>
-        <w:t xml:space="preserve">        self._send_html(_page("Не найдено", "Страница не найдена."), 404)</w:t>
-        <w:br/>
-        <w:br/>
-        <w:t xml:space="preserve">    def _get_notes(self, raw_query: str) -&gt; None:</w:t>
-        <w:br/>
-        <w:t xml:space="preserve">        """GET /notes. Все ошибки данного маршрута всегда возвращаются как JSON."""</w:t>
-        <w:br/>
-        <w:t xml:space="preserve">        query = parse_qs(raw_query, keep_blank_values=True)</w:t>
-        <w:br/>
-        <w:t xml:space="preserve">        allowed = {"limit", "user_id"}</w:t>
-        <w:br/>
-        <w:t xml:space="preserve">        unknown = sorted(set(query) - allowed)</w:t>
-        <w:br/>
-        <w:t xml:space="preserve">        if unknown:</w:t>
-        <w:br/>
-        <w:t xml:space="preserve">            self._send_json({"error": "Неизвестный параметр: " + ", ".join(unknown)}, 400)</w:t>
-        <w:br/>
-        <w:t xml:space="preserve">            return</w:t>
-        <w:br/>
-        <w:t xml:space="preserve">        if any(len(values) != 1 for values in query.values()):</w:t>
-        <w:br/>
-        <w:t xml:space="preserve">            self._send_json({"error": "Каждый параметр можно передать только один раз."}, 400)</w:t>
-        <w:br/>
-        <w:t xml:space="preserve">            return</w:t>
-        <w:br/>
-        <w:br/>
-        <w:t xml:space="preserve">        limit: int | None = None</w:t>
-        <w:br/>
-        <w:t xml:space="preserve">        user_id: int | None = None</w:t>
+        <w:br/>
+        <w:t xml:space="preserve">        connection: sqlite3.Connection | None = None</w:t>
         <w:br/>
         <w:t xml:space="preserve">        try:</w:t>
         <w:br/>
-        <w:t xml:space="preserve">            if "limit" in query:</w:t>
-        <w:br/>
-        <w:t xml:space="preserve">                limit = int(query["limit"][0])</w:t>
-        <w:br/>
-        <w:t xml:space="preserve">                if not 1 &lt;= limit &lt;= 1000:</w:t>
-        <w:br/>
-        <w:t xml:space="preserve">                    raise ValueError</w:t>
-        <w:br/>
-        <w:t xml:space="preserve">            if "user_id" in query:</w:t>
-        <w:br/>
-        <w:t xml:space="preserve">                user_id = int(query["user_id"][0])</w:t>
-        <w:br/>
-        <w:t xml:space="preserve">                if user_id &lt;= 0:</w:t>
-        <w:br/>
-        <w:t xml:space="preserve">                    raise ValueError</w:t>
-        <w:br/>
-        <w:t xml:space="preserve">        except ValueError:</w:t>
-        <w:br/>
-        <w:t xml:space="preserve">            self._send_json(</w:t>
-        <w:br/>
-        <w:t xml:space="preserve">                {"error": "Параметры limit и user_id должны быть положительными целыми числами; limit — от 1 до 1000."},</w:t>
-        <w:br/>
-        <w:t xml:space="preserve">                400,</w:t>
+        <w:t xml:space="preserve">            if FORCE_DB_ERROR:</w:t>
+        <w:br/>
+        <w:t xml:space="preserve">                raise sqlite3.OperationalError("Тестовая имитация сбоя подключения к БД")</w:t>
       </w:r>
     </w:p>
     <w:p>
@@ -6881,19 +6754,6 @@
           <w:color w:val="243247"/>
           <w:sz w:val="14"/>
         </w:rPr>
-        <w:t xml:space="preserve">            )</w:t>
-        <w:br/>
-        <w:t xml:space="preserve">            return</w:t>
-        <w:br/>
-        <w:br/>
-        <w:t xml:space="preserve">        connection: sqlite3.Connection | None = None</w:t>
-        <w:br/>
-        <w:t xml:space="preserve">        try:</w:t>
-        <w:br/>
-        <w:t xml:space="preserve">            if FORCE_DB_ERROR:</w:t>
-        <w:br/>
-        <w:t xml:space="preserve">                raise sqlite3.OperationalError("Тестовая имитация сбоя подключения к БД")</w:t>
-        <w:br/>
         <w:t xml:space="preserve">            connection = db_connect()</w:t>
         <w:br/>
         <w:t xml:space="preserve">            sql = """SELECT n.id, n.title, n.content, n.created_at, u.login</w:t>
@@ -6946,11 +6806,23 @@
         <w:br/>
         <w:t xml:space="preserve">        except Exception as error:</w:t>
         <w:br/>
-        <w:t xml:space="preserve">            # Деталь исключения остаётся в серверном журнале, клиент получает безопасное JSON-сообщение.</w:t>
         <w:br/>
         <w:t xml:space="preserve">            print(f"Ошибка GET /notes: {type(error).__name__}: {error}", flush=True)</w:t>
         <w:br/>
         <w:t xml:space="preserve">            self._send_json({"error": "Ошибка подключения к базе данных"}, 500)</w:t>
+        <w:br/>
+        <w:t xml:space="preserve">        finally:</w:t>
+        <w:br/>
+        <w:t xml:space="preserve">            if connection is not None:</w:t>
+        <w:br/>
+        <w:t xml:space="preserve">                connection.close()</w:t>
+        <w:br/>
+        <w:br/>
+        <w:t xml:space="preserve">    def _login_page(self, message: str = "", login_value: str = "", success: bool = False) -&gt; None:</w:t>
+        <w:br/>
+        <w:t xml:space="preserve">        _clean_expired_state()</w:t>
+        <w:br/>
+        <w:t xml:space="preserve">        challenge_id = secrets.token_urlsafe(18)</w:t>
       </w:r>
     </w:p>
     <w:p>
@@ -6970,22 +6842,8 @@
           <w:color w:val="243247"/>
           <w:sz w:val="14"/>
         </w:rPr>
-        <w:t xml:space="preserve">        finally:</w:t>
-        <w:br/>
-        <w:t xml:space="preserve">            if connection is not None:</w:t>
-        <w:br/>
-        <w:t xml:space="preserve">                connection.close()</w:t>
-        <w:br/>
-        <w:br/>
-        <w:t xml:space="preserve">    def _login_page(self, message: str = "", login_value: str = "", success: bool = False) -&gt; None:</w:t>
-        <w:br/>
-        <w:t xml:space="preserve">        _clean_expired_state()</w:t>
-        <w:br/>
-        <w:t xml:space="preserve">        challenge_id = secrets.token_urlsafe(18)</w:t>
-        <w:br/>
         <w:t xml:space="preserve">        initial_order = list(range(CAPTCHA_SIZE))</w:t>
         <w:br/>
-        <w:t xml:space="preserve">        # Случайно перемешиваем стартовое расположение; решение проверяется сервером.</w:t>
         <w:br/>
         <w:t xml:space="preserve">        import random</w:t>
         <w:br/>
@@ -7040,6 +6898,20 @@
         <w:t xml:space="preserve">        body = f"""&lt;!doctype html&gt;</w:t>
         <w:br/>
         <w:t>&lt;html lang="ru"&gt;&lt;head&gt;&lt;meta charset="utf-8"&gt;&lt;meta name="viewport" content="width=device-width,initial-scale=1"&gt;</w:t>
+        <w:br/>
+        <w:t>&lt;title&gt;Авторизация&lt;/title&gt;&lt;style&gt;</w:t>
+        <w:br/>
+        <w:t>:root{{--ink:#172033;--blue:#4058d6;--muted:#67718a;--line:#dce2ee;--paper:#fff;--bg:#f3f6fb}}</w:t>
+        <w:br/>
+        <w:t>*{{box-sizing:border-box}}body{{margin:0;background:linear-gradient(140deg,#edf2ff,#f8fbff 52%,#eef8f6);font:16px/1.45 system-ui,-apple-system,"Segoe UI",sans-serif;color:var(--ink);min-height:100vh;display:grid;place-items:center;padding:22px}}</w:t>
+        <w:br/>
+        <w:t>.card{{width:min(100%,510px);background:var(--paper);border:1px solid #e5e9f2;border-radius:22px;box-shadow:0 20px 60px #25366618;padding:30px}}</w:t>
+        <w:br/>
+        <w:t>.kicker{{color:var(--blue);font-size:12px;font-weight:800;letter-spacing:.12em;text-transform:uppercase}}</w:t>
+        <w:br/>
+        <w:t>h1{{font-size:28px;margin:7px 0 4px}}.muted{{color:var(--muted);margin:0 0 22px}}label{{display:block;font-weight:650;margin:14px 0 6px}}</w:t>
+        <w:br/>
+        <w:t>input[type=text],input[type=password]{{width:100%;border:1px solid var(--line);border-radius:11px;padding:12px 13px;font:inherit;outline:none}}</w:t>
       </w:r>
     </w:p>
     <w:p>
@@ -7059,20 +6931,6 @@
           <w:color w:val="243247"/>
           <w:sz w:val="14"/>
         </w:rPr>
-        <w:t>&lt;title&gt;Авторизация&lt;/title&gt;&lt;style&gt;</w:t>
-        <w:br/>
-        <w:t>:root{{--ink:#172033;--blue:#4058d6;--muted:#67718a;--line:#dce2ee;--paper:#fff;--bg:#f3f6fb}}</w:t>
-        <w:br/>
-        <w:t>*{{box-sizing:border-box}}body{{margin:0;background:linear-gradient(140deg,#edf2ff,#f8fbff 52%,#eef8f6);font:16px/1.45 system-ui,-apple-system,"Segoe UI",sans-serif;color:var(--ink);min-height:100vh;display:grid;place-items:center;padding:22px}}</w:t>
-        <w:br/>
-        <w:t>.card{{width:min(100%,510px);background:var(--paper);border:1px solid #e5e9f2;border-radius:22px;box-shadow:0 20px 60px #25366618;padding:30px}}</w:t>
-        <w:br/>
-        <w:t>.kicker{{color:var(--blue);font-size:12px;font-weight:800;letter-spacing:.12em;text-transform:uppercase}}</w:t>
-        <w:br/>
-        <w:t>h1{{font-size:28px;margin:7px 0 4px}}.muted{{color:var(--muted);margin:0 0 22px}}label{{display:block;font-weight:650;margin:14px 0 6px}}</w:t>
-        <w:br/>
-        <w:t>input[type=text],input[type=password]{{width:100%;border:1px solid var(--line);border-radius:11px;padding:12px 13px;font:inherit;outline:none}}</w:t>
-        <w:br/>
         <w:t>input:focus{{border-color:var(--blue);box-shadow:0 0 0 3px #4058d61c}}.notice{{padding:11px 13px;border-radius:10px;margin:12px 0}}.error{{background:#fff0ee;color:#a1251b}}.success{{background:#e9f8ee;color:#166534}}</w:t>
         <w:br/>
         <w:t>.puzzle-wrap{{margin:10px 0 15px;padding:14px;background:#f5f7fc;border:1px solid var(--line);border-radius:14px}}</w:t>
@@ -7129,6 +6987,20 @@
         <w:br/>
         <w:t xml:space="preserve">        self._send_html(body)</w:t>
         <w:br/>
+        <w:br/>
+        <w:t xml:space="preserve">    def _login(self, form: dict[str, str]) -&gt; None:</w:t>
+        <w:br/>
+        <w:t xml:space="preserve">        login = form.get("login", "").strip().casefold()</w:t>
+        <w:br/>
+        <w:t xml:space="preserve">        password = form.get("password", "")</w:t>
+        <w:br/>
+        <w:t xml:space="preserve">        user = _fetch_user(login) if login else None</w:t>
+        <w:br/>
+        <w:t xml:space="preserve">        if user and user["is_blocked"]:</w:t>
+        <w:br/>
+        <w:t xml:space="preserve">            self._login_page("Вы заблокированы. Обратитесь к администратору", login)</w:t>
+        <w:br/>
+        <w:t xml:space="preserve">            return</w:t>
       </w:r>
     </w:p>
     <w:p>
@@ -7148,74 +7020,73 @@
           <w:color w:val="243247"/>
           <w:sz w:val="14"/>
         </w:rPr>
-        <w:t xml:space="preserve">    def _login(self, form: dict[str, str]) -&gt; None:</w:t>
-        <w:br/>
-        <w:t xml:space="preserve">        login = form.get("login", "").strip().casefold()</w:t>
-        <w:br/>
-        <w:t xml:space="preserve">        password = form.get("password", "")</w:t>
-        <w:br/>
-        <w:t xml:space="preserve">        user = _fetch_user(login) if login else None</w:t>
-        <w:br/>
-        <w:t xml:space="preserve">        if user and user["is_blocked"]:</w:t>
-        <w:br/>
-        <w:t xml:space="preserve">            self._login_page("Вы заблокированы. Обратитесь к администратору", login)</w:t>
+        <w:br/>
+        <w:t xml:space="preserve">        challenge_id = form.get("captcha_id", "")</w:t>
+        <w:br/>
+        <w:t xml:space="preserve">        with _state_lock:</w:t>
+        <w:br/>
+        <w:t xml:space="preserve">            expires = _captcha_challenges.pop(challenge_id, None)</w:t>
+        <w:br/>
+        <w:t xml:space="preserve">        captcha_order = _parse_captcha_order(form.get("captcha_order", ""))</w:t>
+        <w:br/>
+        <w:t xml:space="preserve">        captcha_valid = expires is not None and expires &gt;= time.time() and captcha_order == list(range(CAPTCHA_SIZE))</w:t>
+        <w:br/>
+        <w:t xml:space="preserve">        if not captcha_valid:</w:t>
+        <w:br/>
+        <w:t xml:space="preserve">            locked = _record_failed_attempt(login)</w:t>
+        <w:br/>
+        <w:t xml:space="preserve">            message = (</w:t>
+        <w:br/>
+        <w:t xml:space="preserve">                "Вы заблокированы. Обратитесь к администратору"</w:t>
+        <w:br/>
+        <w:t xml:space="preserve">                if locked else "Капча собрана неверно или время её действия истекло. Переставьте фрагменты и попробуйте снова."</w:t>
+        <w:br/>
+        <w:t xml:space="preserve">            )</w:t>
+        <w:br/>
+        <w:t xml:space="preserve">            self._login_page(message, login)</w:t>
         <w:br/>
         <w:t xml:space="preserve">            return</w:t>
         <w:br/>
         <w:br/>
-        <w:t xml:space="preserve">        challenge_id = form.get("captcha_id", "")</w:t>
+        <w:t xml:space="preserve">        correct_password = bool(</w:t>
+        <w:br/>
+        <w:t xml:space="preserve">            user and password_matches(password, user["password_salt"], user["password_hash"])</w:t>
+        <w:br/>
+        <w:t xml:space="preserve">        )</w:t>
+        <w:br/>
+        <w:t xml:space="preserve">        if not user or not correct_password:</w:t>
+        <w:br/>
+        <w:t xml:space="preserve">            locked = _record_failed_attempt(login)</w:t>
+        <w:br/>
+        <w:t xml:space="preserve">            message = (</w:t>
+        <w:br/>
+        <w:t xml:space="preserve">                "Вы заблокированы. Обратитесь к администратору"</w:t>
+        <w:br/>
+        <w:t xml:space="preserve">                if locked else "Вы ввели неверный логин или пароль. Пожалуйста проверьте ещё раз введенные данные"</w:t>
+        <w:br/>
+        <w:t xml:space="preserve">            )</w:t>
+        <w:br/>
+        <w:t xml:space="preserve">            self._login_page(message, login)</w:t>
+        <w:br/>
+        <w:t xml:space="preserve">            return</w:t>
+        <w:br/>
+        <w:br/>
+        <w:t xml:space="preserve">        _reset_failed_attempts(int(user["id"]))</w:t>
+        <w:br/>
+        <w:t xml:space="preserve">        session_id = secrets.token_urlsafe(32)</w:t>
         <w:br/>
         <w:t xml:space="preserve">        with _state_lock:</w:t>
         <w:br/>
-        <w:t xml:space="preserve">            expires = _captcha_challenges.pop(challenge_id, None)</w:t>
-        <w:br/>
-        <w:t xml:space="preserve">        captcha_order = _parse_captcha_order(form.get("captcha_order", ""))</w:t>
-        <w:br/>
-        <w:t xml:space="preserve">        captcha_valid = expires is not None and expires &gt;= time.time() and captcha_order == list(range(CAPTCHA_SIZE))</w:t>
-        <w:br/>
-        <w:t xml:space="preserve">        if not captcha_valid:</w:t>
-        <w:br/>
-        <w:t xml:space="preserve">            locked = _record_failed_attempt(login)</w:t>
-        <w:br/>
-        <w:t xml:space="preserve">            message = (</w:t>
-        <w:br/>
-        <w:t xml:space="preserve">                "Вы заблокированы. Обратитесь к администратору"</w:t>
-        <w:br/>
-        <w:t xml:space="preserve">                if locked else "Капча собрана неверно или время её действия истекло. Переставьте фрагменты и попробуйте снова."</w:t>
-        <w:br/>
-        <w:t xml:space="preserve">            )</w:t>
-        <w:br/>
-        <w:t xml:space="preserve">            self._login_page(message, login)</w:t>
-        <w:br/>
-        <w:t xml:space="preserve">            return</w:t>
-        <w:br/>
-        <w:br/>
-        <w:t xml:space="preserve">        correct_password = bool(</w:t>
-        <w:br/>
-        <w:t xml:space="preserve">            user and password_matches(password, user["password_salt"], user["password_hash"])</w:t>
-        <w:br/>
-        <w:t xml:space="preserve">        )</w:t>
-        <w:br/>
-        <w:t xml:space="preserve">        if not user or not correct_password:</w:t>
-        <w:br/>
-        <w:t xml:space="preserve">            locked = _record_failed_attempt(login)</w:t>
-        <w:br/>
-        <w:t xml:space="preserve">            message = (</w:t>
-        <w:br/>
-        <w:t xml:space="preserve">                "Вы заблокированы. Обратитесь к администратору"</w:t>
-        <w:br/>
-        <w:t xml:space="preserve">                if locked else "Вы ввели неверный логин или пароль. Пожалуйста проверьте ещё раз введенные данные"</w:t>
-        <w:br/>
-        <w:t xml:space="preserve">            )</w:t>
-        <w:br/>
-        <w:t xml:space="preserve">            self._login_page(message, login)</w:t>
-        <w:br/>
-        <w:t xml:space="preserve">            return</w:t>
-        <w:br/>
-        <w:br/>
-        <w:t xml:space="preserve">        _reset_failed_attempts(int(user["id"]))</w:t>
-        <w:br/>
-        <w:t xml:space="preserve">        session_id = secrets.token_urlsafe(32)</w:t>
+        <w:t xml:space="preserve">            _sessions[session_id] = {</w:t>
+        <w:br/>
+        <w:t xml:space="preserve">                "user_id": int(user["id"]),</w:t>
+        <w:br/>
+        <w:t xml:space="preserve">                "expires": time.time() + SESSION_TTL_SECONDS,</w:t>
+        <w:br/>
+        <w:t xml:space="preserve">            }</w:t>
+        <w:br/>
+        <w:t xml:space="preserve">        cookie = f"sid={session_id}; Path=/; HttpOnly; SameSite=Lax; Max-Age={SESSION_TTL_SECONDS}"</w:t>
+        <w:br/>
       </w:r>
     </w:p>
     <w:p>
@@ -7235,20 +7106,6 @@
           <w:color w:val="243247"/>
           <w:sz w:val="14"/>
         </w:rPr>
-        <w:t xml:space="preserve">        with _state_lock:</w:t>
-        <w:br/>
-        <w:t xml:space="preserve">            _sessions[session_id] = {</w:t>
-        <w:br/>
-        <w:t xml:space="preserve">                "user_id": int(user["id"]),</w:t>
-        <w:br/>
-        <w:t xml:space="preserve">                "expires": time.time() + SESSION_TTL_SECONDS,</w:t>
-        <w:br/>
-        <w:t xml:space="preserve">            }</w:t>
-        <w:br/>
-        <w:t xml:space="preserve">        cookie = f"sid={session_id}; Path=/; HttpOnly; SameSite=Lax; Max-Age={SESSION_TTL_SECONDS}"</w:t>
-        <w:br/>
-        <w:t xml:space="preserve">        # Успешная авторизация подтверждается точным текстом из задания.</w:t>
-        <w:br/>
         <w:t xml:space="preserve">        self._redirect("/dashboard?welcome=1", cookie)</w:t>
         <w:br/>
         <w:br/>
@@ -7303,6 +7160,20 @@
         <w:t xml:space="preserve">            users = connection.execute(</w:t>
         <w:br/>
         <w:t xml:space="preserve">                "SELECT id, login, role, is_blocked, failed_attempts FROM users ORDER BY id"</w:t>
+        <w:br/>
+        <w:t xml:space="preserve">            ).fetchall()</w:t>
+        <w:br/>
+        <w:t xml:space="preserve">        finally:</w:t>
+        <w:br/>
+        <w:t xml:space="preserve">            connection.close()</w:t>
+        <w:br/>
+        <w:t xml:space="preserve">        banner = ""</w:t>
+        <w:br/>
+        <w:t xml:space="preserve">        if message:</w:t>
+        <w:br/>
+        <w:t xml:space="preserve">            cls = "notice error" if is_error else "notice success"</w:t>
+        <w:br/>
+        <w:t xml:space="preserve">            title = "⚠ Ошибка" if is_error else "✓ Информация"</w:t>
       </w:r>
     </w:p>
     <w:p>
@@ -7322,20 +7193,6 @@
           <w:color w:val="243247"/>
           <w:sz w:val="14"/>
         </w:rPr>
-        <w:t xml:space="preserve">            ).fetchall()</w:t>
-        <w:br/>
-        <w:t xml:space="preserve">        finally:</w:t>
-        <w:br/>
-        <w:t xml:space="preserve">            connection.close()</w:t>
-        <w:br/>
-        <w:t xml:space="preserve">        banner = ""</w:t>
-        <w:br/>
-        <w:t xml:space="preserve">        if message:</w:t>
-        <w:br/>
-        <w:t xml:space="preserve">            cls = "notice error" if is_error else "notice success"</w:t>
-        <w:br/>
-        <w:t xml:space="preserve">            title = "⚠ Ошибка" if is_error else "✓ Информация"</w:t>
-        <w:br/>
         <w:t xml:space="preserve">            banner = f'&lt;div class="{cls}" role="status"&gt;&lt;strong&gt;{title}&lt;/strong&gt;&lt;br&gt;{html.escape(message)}&lt;/div&gt;'</w:t>
         <w:br/>
         <w:t xml:space="preserve">        rows = []</w:t>
@@ -7392,6 +7249,19 @@
         <w:t xml:space="preserve">        user = self._current_user()</w:t>
         <w:br/>
         <w:t xml:space="preserve">        if not user or user["role"] != "Администратор":</w:t>
+        <w:br/>
+        <w:t xml:space="preserve">            return None</w:t>
+        <w:br/>
+        <w:t xml:space="preserve">        return user</w:t>
+        <w:br/>
+        <w:br/>
+        <w:t xml:space="preserve">    def _admin_create_user(self, form: dict[str, str]) -&gt; None:</w:t>
+        <w:br/>
+        <w:t xml:space="preserve">        admin = self._authorized_admin()</w:t>
+        <w:br/>
+        <w:t xml:space="preserve">        if not admin:</w:t>
+        <w:br/>
+        <w:t xml:space="preserve">            self._send_html(_page("Доступ запрещён", "Войдите под учётной записью администратора."), 403)</w:t>
       </w:r>
     </w:p>
     <w:p>
@@ -7411,12 +7281,60 @@
           <w:color w:val="243247"/>
           <w:sz w:val="14"/>
         </w:rPr>
-        <w:t xml:space="preserve">            return None</w:t>
-        <w:br/>
-        <w:t xml:space="preserve">        return user</w:t>
-        <w:br/>
-        <w:br/>
-        <w:t xml:space="preserve">    def _admin_create_user(self, form: dict[str, str]) -&gt; None:</w:t>
+        <w:t xml:space="preserve">            return</w:t>
+        <w:br/>
+        <w:t xml:space="preserve">        login = form.get("login", "").strip().casefold()</w:t>
+        <w:br/>
+        <w:t xml:space="preserve">        password = form.get("password", "")</w:t>
+        <w:br/>
+        <w:t xml:space="preserve">        role = form.get("role", "")</w:t>
+        <w:br/>
+        <w:t xml:space="preserve">        if not re.fullmatch(r"[A-Za-zА-Яа-яЁё0-9._-]{1,32}", login):</w:t>
+        <w:br/>
+        <w:t xml:space="preserve">            self._admin_page(admin, "Логин: 1–32 буквы, цифры, точка, дефис или подчёркивание.", True)</w:t>
+        <w:br/>
+        <w:t xml:space="preserve">            return</w:t>
+        <w:br/>
+        <w:t xml:space="preserve">        if len(password) &lt; 8:</w:t>
+        <w:br/>
+        <w:t xml:space="preserve">            self._admin_page(admin, "Пароль должен содержать не менее 8 символов.", True)</w:t>
+        <w:br/>
+        <w:t xml:space="preserve">            return</w:t>
+        <w:br/>
+        <w:t xml:space="preserve">        if role not in ("Пользователь", "Администратор"):</w:t>
+        <w:br/>
+        <w:t xml:space="preserve">            self._admin_page(admin, "Выберите допустимую роль.", True)</w:t>
+        <w:br/>
+        <w:t xml:space="preserve">            return</w:t>
+        <w:br/>
+        <w:t xml:space="preserve">        salt, digest = make_password_hash(password)</w:t>
+        <w:br/>
+        <w:t xml:space="preserve">        connection = db_connect()</w:t>
+        <w:br/>
+        <w:t xml:space="preserve">        try:</w:t>
+        <w:br/>
+        <w:t xml:space="preserve">            with connection:</w:t>
+        <w:br/>
+        <w:t xml:space="preserve">                connection.execute(</w:t>
+        <w:br/>
+        <w:t xml:space="preserve">                    "INSERT INTO users(login, password_salt, password_hash, role) VALUES (?, ?, ?, ?)",</w:t>
+        <w:br/>
+        <w:t xml:space="preserve">                    (login, salt, digest, role),</w:t>
+        <w:br/>
+        <w:t xml:space="preserve">                )</w:t>
+        <w:br/>
+        <w:t xml:space="preserve">            self._admin_page(admin, f"Пользователь «{login}» добавлен.")</w:t>
+        <w:br/>
+        <w:t xml:space="preserve">        except sqlite3.IntegrityError:</w:t>
+        <w:br/>
+        <w:t xml:space="preserve">            self._admin_page(admin, "Пользователь с указанным логином уже существует. Выберите другой логин.", True)</w:t>
+        <w:br/>
+        <w:t xml:space="preserve">        finally:</w:t>
+        <w:br/>
+        <w:t xml:space="preserve">            connection.close()</w:t>
+        <w:br/>
+        <w:br/>
+        <w:t xml:space="preserve">    def _admin_update_user(self, form: dict[str, str]) -&gt; None:</w:t>
         <w:br/>
         <w:t xml:space="preserve">        admin = self._authorized_admin()</w:t>
         <w:br/>
@@ -7426,60 +7344,13 @@
         <w:br/>
         <w:t xml:space="preserve">            return</w:t>
         <w:br/>
-        <w:t xml:space="preserve">        login = form.get("login", "").strip().casefold()</w:t>
-        <w:br/>
-        <w:t xml:space="preserve">        password = form.get("password", "")</w:t>
-        <w:br/>
-        <w:t xml:space="preserve">        role = form.get("role", "")</w:t>
-        <w:br/>
-        <w:t xml:space="preserve">        if not re.fullmatch(r"[A-Za-zА-Яа-яЁё0-9._-]{1,32}", login):</w:t>
-        <w:br/>
-        <w:t xml:space="preserve">            self._admin_page(admin, "Логин: 1–32 буквы, цифры, точка, дефис или подчёркивание.", True)</w:t>
-        <w:br/>
-        <w:t xml:space="preserve">            return</w:t>
-        <w:br/>
-        <w:t xml:space="preserve">        if len(password) &lt; 8:</w:t>
-        <w:br/>
-        <w:t xml:space="preserve">            self._admin_page(admin, "Пароль должен содержать не менее 8 символов.", True)</w:t>
-        <w:br/>
-        <w:t xml:space="preserve">            return</w:t>
-        <w:br/>
-        <w:t xml:space="preserve">        if role not in ("Пользователь", "Администратор"):</w:t>
-        <w:br/>
-        <w:t xml:space="preserve">            self._admin_page(admin, "Выберите допустимую роль.", True)</w:t>
-        <w:br/>
-        <w:t xml:space="preserve">            return</w:t>
-        <w:br/>
-        <w:t xml:space="preserve">        salt, digest = make_password_hash(password)</w:t>
-        <w:br/>
-        <w:t xml:space="preserve">        connection = db_connect()</w:t>
-        <w:br/>
         <w:t xml:space="preserve">        try:</w:t>
         <w:br/>
-        <w:t xml:space="preserve">            with connection:</w:t>
-        <w:br/>
-        <w:t xml:space="preserve">                connection.execute(</w:t>
-        <w:br/>
-        <w:t xml:space="preserve">                    "INSERT INTO users(login, password_salt, password_hash, role) VALUES (?, ?, ?, ?)",</w:t>
-        <w:br/>
-        <w:t xml:space="preserve">                    (login, salt, digest, role),</w:t>
-        <w:br/>
-        <w:t xml:space="preserve">                )</w:t>
-        <w:br/>
-        <w:t xml:space="preserve">            self._admin_page(admin, f"Пользователь «{login}» добавлен.")</w:t>
-        <w:br/>
-        <w:t xml:space="preserve">        except sqlite3.IntegrityError:</w:t>
-        <w:br/>
-        <w:t xml:space="preserve">            self._admin_page(admin, "Пользователь с указанным логином уже существует. Выберите другой логин.", True)</w:t>
-        <w:br/>
-        <w:t xml:space="preserve">        finally:</w:t>
-        <w:br/>
-        <w:t xml:space="preserve">            connection.close()</w:t>
-        <w:br/>
-        <w:br/>
-        <w:t xml:space="preserve">    def _admin_update_user(self, form: dict[str, str]) -&gt; None:</w:t>
-        <w:br/>
-        <w:t xml:space="preserve">        admin = self._authorized_admin()</w:t>
+        <w:t xml:space="preserve">            user_id = int(form.get("user_id", ""))</w:t>
+        <w:br/>
+        <w:t xml:space="preserve">            blocked = int(form.get("is_blocked", ""))</w:t>
+        <w:br/>
+        <w:t xml:space="preserve">        except ValueError:</w:t>
       </w:r>
     </w:p>
     <w:p>
@@ -7499,59 +7370,45 @@
           <w:color w:val="243247"/>
           <w:sz w:val="14"/>
         </w:rPr>
-        <w:t xml:space="preserve">        if not admin:</w:t>
-        <w:br/>
-        <w:t xml:space="preserve">            self._send_html(_page("Доступ запрещён", "Войдите под учётной записью администратора."), 403)</w:t>
+        <w:t xml:space="preserve">            self._admin_page(admin, "Некорректный идентификатор или статус блокировки.", True)</w:t>
         <w:br/>
         <w:t xml:space="preserve">            return</w:t>
         <w:br/>
+        <w:t xml:space="preserve">        login = form.get("login", "").strip().casefold()</w:t>
+        <w:br/>
+        <w:t xml:space="preserve">        role = form.get("role", "")</w:t>
+        <w:br/>
+        <w:t xml:space="preserve">        new_password = form.get("new_password", "")</w:t>
+        <w:br/>
+        <w:t xml:space="preserve">        if not re.fullmatch(r"[A-Za-zА-Яа-яЁё0-9._-]{1,32}", login):</w:t>
+        <w:br/>
+        <w:t xml:space="preserve">            self._admin_page(admin, "Логин: 1–32 буквы, цифры, точка, дефис или подчёркивание.", True)</w:t>
+        <w:br/>
+        <w:t xml:space="preserve">            return</w:t>
+        <w:br/>
+        <w:t xml:space="preserve">        if user_id &lt;= 0 or blocked not in (0, 1) or role not in ("Пользователь", "Администратор"):</w:t>
+        <w:br/>
+        <w:t xml:space="preserve">            self._admin_page(admin, "Проверьте ID, логин, роль и статус блокировки.", True)</w:t>
+        <w:br/>
+        <w:t xml:space="preserve">            return</w:t>
+        <w:br/>
+        <w:t xml:space="preserve">        if new_password and len(new_password) &lt; 8:</w:t>
+        <w:br/>
+        <w:t xml:space="preserve">            self._admin_page(admin, "Новый пароль должен содержать не менее 8 символов.", True)</w:t>
+        <w:br/>
+        <w:t xml:space="preserve">            return</w:t>
+        <w:br/>
+        <w:t xml:space="preserve">        if user_id == int(admin["id"]) and (blocked or role != "Администратор"):</w:t>
+        <w:br/>
+        <w:t xml:space="preserve">            self._admin_page(admin, "Нельзя заблокировать или лишить роли текущую учётную запись администратора.", True)</w:t>
+        <w:br/>
+        <w:t xml:space="preserve">            return</w:t>
+        <w:br/>
+        <w:br/>
+        <w:t xml:space="preserve">        connection = db_connect()</w:t>
+        <w:br/>
         <w:t xml:space="preserve">        try:</w:t>
         <w:br/>
-        <w:t xml:space="preserve">            user_id = int(form.get("user_id", ""))</w:t>
-        <w:br/>
-        <w:t xml:space="preserve">            blocked = int(form.get("is_blocked", ""))</w:t>
-        <w:br/>
-        <w:t xml:space="preserve">        except ValueError:</w:t>
-        <w:br/>
-        <w:t xml:space="preserve">            self._admin_page(admin, "Некорректный идентификатор или статус блокировки.", True)</w:t>
-        <w:br/>
-        <w:t xml:space="preserve">            return</w:t>
-        <w:br/>
-        <w:t xml:space="preserve">        login = form.get("login", "").strip().casefold()</w:t>
-        <w:br/>
-        <w:t xml:space="preserve">        role = form.get("role", "")</w:t>
-        <w:br/>
-        <w:t xml:space="preserve">        new_password = form.get("new_password", "")</w:t>
-        <w:br/>
-        <w:t xml:space="preserve">        if not re.fullmatch(r"[A-Za-zА-Яа-яЁё0-9._-]{1,32}", login):</w:t>
-        <w:br/>
-        <w:t xml:space="preserve">            self._admin_page(admin, "Логин: 1–32 буквы, цифры, точка, дефис или подчёркивание.", True)</w:t>
-        <w:br/>
-        <w:t xml:space="preserve">            return</w:t>
-        <w:br/>
-        <w:t xml:space="preserve">        if user_id &lt;= 0 or blocked not in (0, 1) or role not in ("Пользователь", "Администратор"):</w:t>
-        <w:br/>
-        <w:t xml:space="preserve">            self._admin_page(admin, "Проверьте ID, логин, роль и статус блокировки.", True)</w:t>
-        <w:br/>
-        <w:t xml:space="preserve">            return</w:t>
-        <w:br/>
-        <w:t xml:space="preserve">        if new_password and len(new_password) &lt; 8:</w:t>
-        <w:br/>
-        <w:t xml:space="preserve">            self._admin_page(admin, "Новый пароль должен содержать не менее 8 символов.", True)</w:t>
-        <w:br/>
-        <w:t xml:space="preserve">            return</w:t>
-        <w:br/>
-        <w:t xml:space="preserve">        if user_id == int(admin["id"]) and (blocked or role != "Администратор"):</w:t>
-        <w:br/>
-        <w:t xml:space="preserve">            self._admin_page(admin, "Нельзя заблокировать или лишить роли текущую учётную запись администратора.", True)</w:t>
-        <w:br/>
-        <w:t xml:space="preserve">            return</w:t>
-        <w:br/>
-        <w:br/>
-        <w:t xml:space="preserve">        connection = db_connect()</w:t>
-        <w:br/>
-        <w:t xml:space="preserve">        try:</w:t>
-        <w:br/>
         <w:t xml:space="preserve">            target = connection.execute("SELECT id, login FROM users WHERE id = ?", (user_id,)).fetchone()</w:t>
         <w:br/>
         <w:t xml:space="preserve">            if not target:</w:t>
@@ -7569,6 +7426,20 @@
         <w:t xml:space="preserve">                    connection.execute(</w:t>
         <w:br/>
         <w:t xml:space="preserve">                        """UPDATE users SET login = ?, role = ?, is_blocked = ?, failed_attempts = 0,</w:t>
+        <w:br/>
+        <w:t xml:space="preserve">                           password_salt = ?, password_hash = ? WHERE id = ?""",</w:t>
+        <w:br/>
+        <w:t xml:space="preserve">                        (login, role, blocked, salt, digest, user_id),</w:t>
+        <w:br/>
+        <w:t xml:space="preserve">                    )</w:t>
+        <w:br/>
+        <w:t xml:space="preserve">                else:</w:t>
+        <w:br/>
+        <w:t xml:space="preserve">                    connection.execute(</w:t>
+        <w:br/>
+        <w:t xml:space="preserve">                        """UPDATE users SET login = ?, role = ?, is_blocked = ?,</w:t>
+        <w:br/>
+        <w:t xml:space="preserve">                           failed_attempts = CASE WHEN ? = 0 THEN 0 ELSE failed_attempts END</w:t>
       </w:r>
     </w:p>
     <w:p>
@@ -7588,26 +7459,12 @@
           <w:color w:val="243247"/>
           <w:sz w:val="14"/>
         </w:rPr>
-        <w:t xml:space="preserve">                           password_salt = ?, password_hash = ? WHERE id = ?""",</w:t>
-        <w:br/>
-        <w:t xml:space="preserve">                        (login, role, blocked, salt, digest, user_id),</w:t>
+        <w:t xml:space="preserve">                           WHERE id = ?""",</w:t>
+        <w:br/>
+        <w:t xml:space="preserve">                        (login, role, blocked, blocked, user_id),</w:t>
         <w:br/>
         <w:t xml:space="preserve">                    )</w:t>
         <w:br/>
-        <w:t xml:space="preserve">                else:</w:t>
-        <w:br/>
-        <w:t xml:space="preserve">                    connection.execute(</w:t>
-        <w:br/>
-        <w:t xml:space="preserve">                        """UPDATE users SET login = ?, role = ?, is_blocked = ?,</w:t>
-        <w:br/>
-        <w:t xml:space="preserve">                           failed_attempts = CASE WHEN ? = 0 THEN 0 ELSE failed_attempts END</w:t>
-        <w:br/>
-        <w:t xml:space="preserve">                           WHERE id = ?""",</w:t>
-        <w:br/>
-        <w:t xml:space="preserve">                        (login, role, blocked, blocked, user_id),</w:t>
-        <w:br/>
-        <w:t xml:space="preserve">                    )</w:t>
-        <w:br/>
         <w:t xml:space="preserve">            self._admin_page(admin, f"Данные пользователя «{login}» обновлены.")</w:t>
         <w:br/>
         <w:t xml:space="preserve">        except sqlite3.IntegrityError:</w:t>
@@ -7655,6 +7512,20 @@
         <w:t>a{color:var(--blue)}.button{display:inline-block;border:0;border-radius:9px;padding:10px 15px;background:var(--blue);color:#fff;text-decoration:none;font:inherit;font-weight:700;cursor:pointer}</w:t>
         <w:br/>
         <w:t>.button.secondary{background:#e9edff;color:#3046bd}.button.small{padding:8px 11px;font-size:13px}.notice{padding:11px 13px;border-radius:10px;margin:12px 0}.success{background:#e9f8ee;color:#166534}.error{background:#fff0ee;color:#a1251b}</w:t>
+        <w:br/>
+        <w:t>.panel{background:#fff;border:1px solid var(--line);border-radius:14px;padding:18px;margin:16px 0}.create{display:flex;gap:12px;align-items:end;flex-wrap:wrap}.create label{display:grid;gap:5px;font-weight:650}.create input,.create select,.edit input,.edit select{border:1px solid var(--line);border-radius:8px;padding:8px 10px;font:inherit}</w:t>
+        <w:br/>
+        <w:t>.table-scroll{overflow:auto}table{width:100%;border-collapse:collapse;min-width:760px}th,td{text-align:left;padding:10px;border-bottom:1px solid var(--line);vertical-align:middle}th{font-size:13px;color:var(--muted)}.edit{display:flex;gap:8px;align-items:center;flex-wrap:wrap}</w:t>
+        <w:br/>
+        <w:t>&lt;/style&gt;""" if admin else """</w:t>
+        <w:br/>
+        <w:t>&lt;style&gt;</w:t>
+        <w:br/>
+        <w:t>:root{--ink:#172033;--blue:#4058d6;--bg:#f3f6fb}*{box-sizing:border-box}body{margin:0;background:var(--bg);font:16px/1.5 system-ui,-apple-system,"Segoe UI",sans-serif;color:var(--ink);padding:22px}</w:t>
+        <w:br/>
+        <w:t>.card{max-width:620px;margin:9vh auto;background:white;border:1px solid #e5e9f2;border-radius:20px;padding:30px;box-shadow:0 16px 50px #25366614}.kicker{color:var(--blue);font-size:12px;font-weight:800;letter-spacing:.12em;text-transform:uppercase}h1{margin:7px 0 20px;font-size:28px}</w:t>
+        <w:br/>
+        <w:t>a{color:var(--blue)}.button{display:inline-block;border:0;border-radius:9px;padding:10px 15px;background:var(--blue);color:#fff;text-decoration:none;font:inherit;font-weight:700;cursor:pointer}.button.secondary{background:#e9edff;color:#3046bd}.notice{padding:11px 13px;border-radius:10px;margin:12px 0}.success{background:#e9f8ee;color:#166534}</w:t>
       </w:r>
     </w:p>
     <w:p>
@@ -7674,20 +7545,6 @@
           <w:color w:val="243247"/>
           <w:sz w:val="14"/>
         </w:rPr>
-        <w:t>.panel{background:#fff;border:1px solid var(--line);border-radius:14px;padding:18px;margin:16px 0}.create{display:flex;gap:12px;align-items:end;flex-wrap:wrap}.create label{display:grid;gap:5px;font-weight:650}.create input,.create select,.edit input,.edit select{border:1px solid var(--line);border-radius:8px;padding:8px 10px;font:inherit}</w:t>
-        <w:br/>
-        <w:t>.table-scroll{overflow:auto}table{width:100%;border-collapse:collapse;min-width:760px}th,td{text-align:left;padding:10px;border-bottom:1px solid var(--line);vertical-align:middle}th{font-size:13px;color:var(--muted)}.edit{display:flex;gap:8px;align-items:center;flex-wrap:wrap}</w:t>
-        <w:br/>
-        <w:t>&lt;/style&gt;""" if admin else """</w:t>
-        <w:br/>
-        <w:t>&lt;style&gt;</w:t>
-        <w:br/>
-        <w:t>:root{--ink:#172033;--blue:#4058d6;--bg:#f3f6fb}*{box-sizing:border-box}body{margin:0;background:var(--bg);font:16px/1.5 system-ui,-apple-system,"Segoe UI",sans-serif;color:var(--ink);padding:22px}</w:t>
-        <w:br/>
-        <w:t>.card{max-width:620px;margin:9vh auto;background:white;border:1px solid #e5e9f2;border-radius:20px;padding:30px;box-shadow:0 16px 50px #25366614}.kicker{color:var(--blue);font-size:12px;font-weight:800;letter-spacing:.12em;text-transform:uppercase}h1{margin:7px 0 20px;font-size:28px}</w:t>
-        <w:br/>
-        <w:t>a{color:var(--blue)}.button{display:inline-block;border:0;border-radius:9px;padding:10px 15px;background:var(--blue);color:#fff;text-decoration:none;font:inherit;font-weight:700;cursor:pointer}.button.secondary{background:#e9edff;color:#3046bd}.notice{padding:11px 13px;border-radius:10px;margin:12px 0}.success{background:#e9f8ee;color:#166534}</w:t>
-        <w:br/>
         <w:t>&lt;/style&gt;"""</w:t>
         <w:br/>
         <w:t xml:space="preserve">    return f"&lt;!doctype html&gt;&lt;html lang='ru'&gt;&lt;head&gt;&lt;meta charset='utf-8'&gt;&lt;meta name='viewport' content='width=device-width,initial-scale=1'&gt;&lt;title&gt;{html.escape(title)}&lt;/title&gt;{extra}&lt;/head&gt;&lt;body&gt;{body}&lt;/body&gt;&lt;/html&gt;"</w:t>
@@ -7786,7 +7643,7 @@
         <w:br/>
         <w:t>sys.path.insert(0, str(Path(__file__).resolve().parents[1]))</w:t>
         <w:br/>
-        <w:t>import app  # noqa: E402</w:t>
+        <w:t>import app</w:t>
         <w:br/>
         <w:br/>
         <w:br/>
@@ -8427,10 +8284,6 @@
           <w:color w:val="243247"/>
           <w:sz w:val="14"/>
         </w:rPr>
-        <w:t>#!/usr/bin/env python3</w:t>
-        <w:br/>
-        <w:t>"""Заполняет приложенный шаблон документации API."""</w:t>
-        <w:br/>
         <w:t>from pathlib import Path</w:t>
         <w:br/>
         <w:t>from docx import Document</w:t>
@@ -8491,6 +8344,10 @@
         <w:br/>
         <w:br/>
         <w:t>def main() -&gt; None:</w:t>
+        <w:br/>
+        <w:t xml:space="preserve">    doc = Document(TEMPLATE)</w:t>
+        <w:br/>
+        <w:t xml:space="preserve">    doc.core_properties.title = "Документация API заметок"</w:t>
       </w:r>
     </w:p>
     <w:p>
@@ -8510,10 +8367,6 @@
           <w:color w:val="243247"/>
           <w:sz w:val="14"/>
         </w:rPr>
-        <w:t xml:space="preserve">    doc = Document(TEMPLATE)</w:t>
-        <w:br/>
-        <w:t xml:space="preserve">    doc.core_properties.title = "Документация API заметок"</w:t>
-        <w:br/>
         <w:t xml:space="preserve">    doc.core_properties.subject = "Задание 6 — описание разработанного API"</w:t>
         <w:br/>
         <w:t xml:space="preserve">    doc.core_properties.author = "Участник демонстрационного экзамена"</w:t>
@@ -8579,6 +8432,9 @@
         <w:t xml:space="preserve">    set_cell(extra[0], "405 Method Not Allowed")</w:t>
         <w:br/>
         <w:t xml:space="preserve">    set_cell(extra[1], "Метод, отличный от GET, не поддерживается; заголовок Allow: GET, тело ошибки — JSON.")</w:t>
+        <w:br/>
+        <w:br/>
+        <w:t xml:space="preserve">    heading = doc.add_paragraph()</w:t>
       </w:r>
     </w:p>
     <w:p>
@@ -8598,9 +8454,6 @@
           <w:color w:val="243247"/>
           <w:sz w:val="14"/>
         </w:rPr>
-        <w:br/>
-        <w:t xml:space="preserve">    heading = doc.add_paragraph()</w:t>
-        <w:br/>
         <w:t xml:space="preserve">    heading.paragraph_format.space_before = Pt(10)</w:t>
         <w:br/>
         <w:t xml:space="preserve">    run = heading.add_run("Примеры запросов и ответов")</w:t>
@@ -8663,6 +8516,10 @@
         <w:t xml:space="preserve">    doc.add_paragraph("3. Внутренняя ошибка базы данных (например, база недоступна):")</w:t>
         <w:br/>
         <w:t xml:space="preserve">    add_code(doc, "GET http://localhost:8000/notes")</w:t>
+        <w:br/>
+        <w:t xml:space="preserve">    add_code(doc, """HTTP/1.1 500 Internal Server Error</w:t>
+        <w:br/>
+        <w:t>Content-Type: application/json; charset=utf-8</w:t>
       </w:r>
     </w:p>
     <w:p>
@@ -8682,10 +8539,6 @@
           <w:color w:val="243247"/>
           <w:sz w:val="14"/>
         </w:rPr>
-        <w:t xml:space="preserve">    add_code(doc, """HTTP/1.1 500 Internal Server Error</w:t>
-        <w:br/>
-        <w:t>Content-Type: application/json; charset=utf-8</w:t>
-        <w:br/>
         <w:br/>
         <w:t>{"error":"Ошибка подключения к базе данных"}""")</w:t>
         <w:br/>
@@ -8750,17 +8603,6 @@
           <w:color w:val="243247"/>
           <w:sz w:val="14"/>
         </w:rPr>
-        <w:t>#!/usr/bin/env python3</w:t>
-        <w:br/>
-        <w:t>"""Очистка исходного dataset_2026.xlsx и создание двух итоговых книг.</w:t>
-        <w:br/>
-        <w:br/>
-        <w:t>Требуется openpyxl (requirements.txt). Скрипт сохраняет все исходные строки,</w:t>
-        <w:br/>
-        <w:t>исправляет типы/написания и строит лист с месячной выручкой и линейным графиком.</w:t>
-        <w:br/>
-        <w:t>"""</w:t>
-        <w:br/>
         <w:t>from __future__ import annotations</w:t>
         <w:br/>
         <w:br/>
@@ -8814,9 +8656,21 @@
         <w:br/>
         <w:t xml:space="preserve">    "пылесос dyson": "Пылесос Dyson",</w:t>
         <w:br/>
-        <w:t xml:space="preserve">    "пылесос dison": "Пылесос Dyson",  # очевидная опечатка, есть совпадающие записи Dyson</w:t>
+        <w:t xml:space="preserve">    "пылесос dison": "Пылесос Dyson",</w:t>
         <w:br/>
         <w:t xml:space="preserve">    "стиральная машина bosch": "Стиральная машина Bosch",</w:t>
+        <w:br/>
+        <w:t xml:space="preserve">    "телевизор samsung": "Телевизор Samsung",</w:t>
+        <w:br/>
+        <w:t xml:space="preserve">    "телевизор samsung 4k": "Телевизор Samsung 4K",</w:t>
+        <w:br/>
+        <w:t xml:space="preserve">    "холодильник lg": "Холодильник LG",</w:t>
+        <w:br/>
+        <w:t>}</w:t>
+        <w:br/>
+        <w:t>MANAGERS = {</w:t>
+        <w:br/>
+        <w:t xml:space="preserve">    "иванов и.и.": "Иванов И.И.",</w:t>
       </w:r>
     </w:p>
     <w:p>
@@ -8836,26 +8690,14 @@
           <w:color w:val="243247"/>
           <w:sz w:val="14"/>
         </w:rPr>
-        <w:t xml:space="preserve">    "телевизор samsung": "Телевизор Samsung",</w:t>
-        <w:br/>
-        <w:t xml:space="preserve">    "телевизор samsung 4k": "Телевизор Samsung 4K",</w:t>
-        <w:br/>
-        <w:t xml:space="preserve">    "холодильник lg": "Холодильник LG",</w:t>
+        <w:t xml:space="preserve">    "смирнова е.в.": "Смирнова Е.В.",</w:t>
+        <w:br/>
+        <w:t xml:space="preserve">    "сидоров в.к.": "Сидоров В.К.",</w:t>
+        <w:br/>
+        <w:t xml:space="preserve">    "петрова а.с.": "Петрова А.С.",</w:t>
         <w:br/>
         <w:t>}</w:t>
         <w:br/>
-        <w:t>MANAGERS = {</w:t>
-        <w:br/>
-        <w:t xml:space="preserve">    "иванов и.и.": "Иванов И.И.",</w:t>
-        <w:br/>
-        <w:t xml:space="preserve">    "смирнова е.в.": "Смирнова Е.В.",</w:t>
-        <w:br/>
-        <w:t xml:space="preserve">    "сидоров в.к.": "Сидоров В.К.",</w:t>
-        <w:br/>
-        <w:t xml:space="preserve">    "петрова а.с.": "Петрова А.С.",</w:t>
-        <w:br/>
-        <w:t>}</w:t>
-        <w:br/>
         <w:br/>
         <w:br/>
         <w:t>def parse_numeric(value: Any, field_name: str) -&gt; Decimal:</w:t>
@@ -8878,15 +8720,12 @@
         <w:br/>
         <w:t xml:space="preserve">        text = str(value).replace("\u00a0", " ").strip()</w:t>
         <w:br/>
-        <w:t xml:space="preserve">        # Удаляем валюту/единицы измерения, оставляя цифры, знак и разделитель.</w:t>
         <w:br/>
         <w:t xml:space="preserve">        text = re.sub(r"[^0-9,.-]", "", text)</w:t>
         <w:br/>
         <w:t xml:space="preserve">        if "," in text and "." in text:</w:t>
         <w:br/>
-        <w:t xml:space="preserve">            # В исходном наборе десятичная запятая не соседствует с разделителем тысяч;</w:t>
-        <w:br/>
-        <w:t xml:space="preserve">            # при необходимости принимаем формат 1.234,56.</w:t>
+        <w:br/>
         <w:br/>
         <w:t xml:space="preserve">            text = text.replace(".", "").replace(",", ".")</w:t>
         <w:br/>
@@ -8905,6 +8744,16 @@
         <w:t xml:space="preserve">    if not parsed.is_finite():</w:t>
         <w:br/>
         <w:t xml:space="preserve">        raise ValueError(f"Не конечное число в поле {field_name}: {value!r}")</w:t>
+        <w:br/>
+        <w:t xml:space="preserve">    return parsed</w:t>
+        <w:br/>
+        <w:br/>
+        <w:br/>
+        <w:t>def normalize_transaction_id(value: Any) -&gt; str:</w:t>
+        <w:br/>
+        <w:t xml:space="preserve">    text = str(value).strip().upper()</w:t>
+        <w:br/>
+        <w:t xml:space="preserve">    match = re.fullmatch(r"TXN-?(\d+)", text)</w:t>
       </w:r>
     </w:p>
     <w:p>
@@ -8924,16 +8773,6 @@
           <w:color w:val="243247"/>
           <w:sz w:val="14"/>
         </w:rPr>
-        <w:t xml:space="preserve">    return parsed</w:t>
-        <w:br/>
-        <w:br/>
-        <w:br/>
-        <w:t>def normalize_transaction_id(value: Any) -&gt; str:</w:t>
-        <w:br/>
-        <w:t xml:space="preserve">    text = str(value).strip().upper()</w:t>
-        <w:br/>
-        <w:t xml:space="preserve">    match = re.fullmatch(r"TXN-?(\d+)", text)</w:t>
-        <w:br/>
         <w:t xml:space="preserve">    if not match:</w:t>
         <w:br/>
         <w:t xml:space="preserve">        raise ValueError(f"Неизвестный формат transaction_id: {value!r}")</w:t>
@@ -8987,6 +8826,16 @@
         <w:t xml:space="preserve">    raise ValueError(f"Для товара не настроена категория: {product}")</w:t>
         <w:br/>
         <w:br/>
+        <w:br/>
+        <w:t>def normalize_manager(value: Any) -&gt; str:</w:t>
+        <w:br/>
+        <w:t xml:space="preserve">    text = " ".join(str(value or "").split())</w:t>
+        <w:br/>
+        <w:t xml:space="preserve">    return MANAGERS.get(text.casefold(), text)</w:t>
+        <w:br/>
+        <w:br/>
+        <w:br/>
+        <w:t>def as_excel_number(value: Decimal) -&gt; int | float:</w:t>
       </w:r>
     </w:p>
     <w:p>
@@ -9006,16 +8855,6 @@
           <w:color w:val="243247"/>
           <w:sz w:val="14"/>
         </w:rPr>
-        <w:t>def normalize_manager(value: Any) -&gt; str:</w:t>
-        <w:br/>
-        <w:t xml:space="preserve">    text = " ".join(str(value or "").split())</w:t>
-        <w:br/>
-        <w:t xml:space="preserve">    return MANAGERS.get(text.casefold(), text)</w:t>
-        <w:br/>
-        <w:br/>
-        <w:br/>
-        <w:t>def as_excel_number(value: Decimal) -&gt; int | float:</w:t>
-        <w:br/>
         <w:t xml:space="preserve">    return int(value) if value == value.to_integral_value() else float(value)</w:t>
         <w:br/>
         <w:br/>
@@ -9043,7 +8882,6 @@
         <w:br/>
         <w:t xml:space="preserve">    for row in all_rows[1:]:</w:t>
         <w:br/>
-        <w:t xml:space="preserve">        # Лишние полностью пустые колонки (в исходной книге их три) игнорируются.</w:t>
         <w:br/>
         <w:t xml:space="preserve">        first_eight = tuple(row[:8])</w:t>
         <w:br/>
@@ -9071,6 +8909,18 @@
         <w:t xml:space="preserve">        tx_id = normalize_transaction_id(old["transaction_id"])</w:t>
         <w:br/>
         <w:t xml:space="preserve">        raw_date = old["date"]</w:t>
+        <w:br/>
+        <w:t xml:space="preserve">        if isinstance(raw_date, datetime):</w:t>
+        <w:br/>
+        <w:t xml:space="preserve">            trans_date = raw_date</w:t>
+        <w:br/>
+        <w:t xml:space="preserve">        elif isinstance(raw_date, date):</w:t>
+        <w:br/>
+        <w:t xml:space="preserve">            trans_date = datetime.combine(raw_date, datetime.min.time())</w:t>
+        <w:br/>
+        <w:t xml:space="preserve">        else:</w:t>
+        <w:br/>
+        <w:t xml:space="preserve">            trans_date = datetime.fromisoformat(str(raw_date).strip())</w:t>
       </w:r>
     </w:p>
     <w:p>
@@ -9090,18 +8940,6 @@
           <w:color w:val="243247"/>
           <w:sz w:val="14"/>
         </w:rPr>
-        <w:t xml:space="preserve">        if isinstance(raw_date, datetime):</w:t>
-        <w:br/>
-        <w:t xml:space="preserve">            trans_date = raw_date</w:t>
-        <w:br/>
-        <w:t xml:space="preserve">        elif isinstance(raw_date, date):</w:t>
-        <w:br/>
-        <w:t xml:space="preserve">            trans_date = datetime.combine(raw_date, datetime.min.time())</w:t>
-        <w:br/>
-        <w:t xml:space="preserve">        else:</w:t>
-        <w:br/>
-        <w:t xml:space="preserve">            trans_date = datetime.fromisoformat(str(raw_date).strip())</w:t>
-        <w:br/>
         <w:t xml:space="preserve">        if trans_date.year != 2026:</w:t>
         <w:br/>
         <w:t xml:space="preserve">            raise ValueError(f"Ожидалась дата 2026 года, строка {excel_row}: {trans_date}")</w:t>
@@ -9159,6 +8997,16 @@
         <w:t xml:space="preserve">            if field == "date" and isinstance(previous, (datetime, date)):</w:t>
         <w:br/>
         <w:t xml:space="preserve">                unchanged = previous.date() == current.date() if isinstance(previous, datetime) else previous == current.date()</w:t>
+        <w:br/>
+        <w:t xml:space="preserve">            elif field in ("quantity", "price"):</w:t>
+        <w:br/>
+        <w:br/>
+        <w:br/>
+        <w:t xml:space="preserve">                unchanged = isinstance(previous, (int, float, Decimal)) and not isinstance(previous, bool) \</w:t>
+        <w:br/>
+        <w:t xml:space="preserve">                    and Decimal(str(previous)) == Decimal(str(current))</w:t>
+        <w:br/>
+        <w:t xml:space="preserve">            else:</w:t>
       </w:r>
     </w:p>
     <w:p>
@@ -9178,18 +9026,6 @@
           <w:color w:val="243247"/>
           <w:sz w:val="14"/>
         </w:rPr>
-        <w:t xml:space="preserve">            elif field in ("quantity", "price"):</w:t>
-        <w:br/>
-        <w:t xml:space="preserve">                # Текст вида «3 шт.»/«294980 руб.» нужно отметить даже тогда,</w:t>
-        <w:br/>
-        <w:t xml:space="preserve">                # когда извлечённое число совпало с итоговым числом.</w:t>
-        <w:br/>
-        <w:t xml:space="preserve">                unchanged = isinstance(previous, (int, float, Decimal)) and not isinstance(previous, bool) \</w:t>
-        <w:br/>
-        <w:t xml:space="preserve">                    and Decimal(str(previous)) == Decimal(str(current))</w:t>
-        <w:br/>
-        <w:t xml:space="preserve">            else:</w:t>
-        <w:br/>
         <w:t xml:space="preserve">                unchanged = previous == current</w:t>
         <w:br/>
         <w:t xml:space="preserve">            if not unchanged:</w:t>
@@ -9244,6 +9080,18 @@
         <w:br/>
         <w:br/>
         <w:t>def add_excel_table(sheet, name: str, ref: str) -&gt; None:</w:t>
+        <w:br/>
+        <w:t xml:space="preserve">    table = Table(displayName=name, ref=ref)</w:t>
+        <w:br/>
+        <w:t xml:space="preserve">    table.tableStyleInfo = TableStyleInfo(</w:t>
+        <w:br/>
+        <w:t xml:space="preserve">        name="TableStyleMedium2", showFirstColumn=False,</w:t>
+        <w:br/>
+        <w:t xml:space="preserve">        showLastColumn=False, showRowStripes=True, showColumnStripes=False,</w:t>
+        <w:br/>
+        <w:t xml:space="preserve">    )</w:t>
+        <w:br/>
+        <w:t xml:space="preserve">    sheet.add_table(table)</w:t>
       </w:r>
     </w:p>
     <w:p>
@@ -9263,18 +9111,6 @@
           <w:color w:val="243247"/>
           <w:sz w:val="14"/>
         </w:rPr>
-        <w:t xml:space="preserve">    table = Table(displayName=name, ref=ref)</w:t>
-        <w:br/>
-        <w:t xml:space="preserve">    table.tableStyleInfo = TableStyleInfo(</w:t>
-        <w:br/>
-        <w:t xml:space="preserve">        name="TableStyleMedium2", showFirstColumn=False,</w:t>
-        <w:br/>
-        <w:t xml:space="preserve">        showLastColumn=False, showRowStripes=True, showColumnStripes=False,</w:t>
-        <w:br/>
-        <w:t xml:space="preserve">    )</w:t>
-        <w:br/>
-        <w:t xml:space="preserve">    sheet.add_table(table)</w:t>
-        <w:br/>
         <w:br/>
         <w:br/>
         <w:t>def write_clean_workbook(output: Path, cleaned: list[dict[str, Any]]) -&gt; None:</w:t>
@@ -9283,7 +9119,7 @@
         <w:br/>
         <w:t xml:space="preserve">    sheet = workbook.active</w:t>
         <w:br/>
-        <w:t xml:space="preserve">    sheet.title = "Sheet1"  # оставляем короткое стандартное имя листа для автопроверки</w:t>
+        <w:t xml:space="preserve">    sheet.title = "Sheet1"</w:t>
         <w:br/>
         <w:t xml:space="preserve">    sheet.append(HEADERS)</w:t>
         <w:br/>
@@ -9330,6 +9166,18 @@
         <w:t xml:space="preserve">    change_log: list[dict[str, Any]],</w:t>
         <w:br/>
         <w:t xml:space="preserve">    exact_duplicates: int,</w:t>
+        <w:br/>
+        <w:t>) -&gt; dict[str, Any]:</w:t>
+        <w:br/>
+        <w:t xml:space="preserve">    monthly = defaultdict(Decimal)</w:t>
+        <w:br/>
+        <w:t xml:space="preserve">    data_revenues: list[Decimal] = []</w:t>
+        <w:br/>
+        <w:t xml:space="preserve">    for row in cleaned:</w:t>
+        <w:br/>
+        <w:t xml:space="preserve">        revenue = Decimal(str(row["quantity"])) * Decimal(str(row["price"]))</w:t>
+        <w:br/>
+        <w:t xml:space="preserve">        data_revenues.append(revenue)</w:t>
       </w:r>
     </w:p>
     <w:p>
@@ -9349,18 +9197,6 @@
           <w:color w:val="243247"/>
           <w:sz w:val="14"/>
         </w:rPr>
-        <w:t>) -&gt; dict[str, Any]:</w:t>
-        <w:br/>
-        <w:t xml:space="preserve">    monthly = defaultdict(Decimal)</w:t>
-        <w:br/>
-        <w:t xml:space="preserve">    data_revenues: list[Decimal] = []</w:t>
-        <w:br/>
-        <w:t xml:space="preserve">    for row in cleaned:</w:t>
-        <w:br/>
-        <w:t xml:space="preserve">        revenue = Decimal(str(row["quantity"])) * Decimal(str(row["price"]))</w:t>
-        <w:br/>
-        <w:t xml:space="preserve">        data_revenues.append(revenue)</w:t>
-        <w:br/>
         <w:t xml:space="preserve">        monthly[row["date"].month] += revenue</w:t>
         <w:br/>
         <w:t xml:space="preserve">    total = sum(monthly.values(), Decimal("0"))</w:t>
@@ -9418,6 +9254,18 @@
         <w:t xml:space="preserve">    for month in range(1, 13):</w:t>
         <w:br/>
         <w:t xml:space="preserve">        value = monthly[month]</w:t>
+        <w:br/>
+        <w:t xml:space="preserve">        previous = monthly[month - 1] if month &gt; 1 else None</w:t>
+        <w:br/>
+        <w:t xml:space="preserve">        change = value - previous if previous is not None else None</w:t>
+        <w:br/>
+        <w:t xml:space="preserve">        change_pct = (change / previous * 100) if previous not in (None, Decimal("0")) else None</w:t>
+        <w:br/>
+        <w:t xml:space="preserve">        month_sheet.append([</w:t>
+        <w:br/>
+        <w:t xml:space="preserve">            MONTHS_RU[month - 1],</w:t>
+        <w:br/>
+        <w:t xml:space="preserve">            as_excel_number(value),</w:t>
       </w:r>
     </w:p>
     <w:p>
@@ -9437,18 +9285,6 @@
           <w:color w:val="243247"/>
           <w:sz w:val="14"/>
         </w:rPr>
-        <w:t xml:space="preserve">        previous = monthly[month - 1] if month &gt; 1 else None</w:t>
-        <w:br/>
-        <w:t xml:space="preserve">        change = value - previous if previous is not None else None</w:t>
-        <w:br/>
-        <w:t xml:space="preserve">        change_pct = (change / previous * 100) if previous not in (None, Decimal("0")) else None</w:t>
-        <w:br/>
-        <w:t xml:space="preserve">        month_sheet.append([</w:t>
-        <w:br/>
-        <w:t xml:space="preserve">            MONTHS_RU[month - 1],</w:t>
-        <w:br/>
-        <w:t xml:space="preserve">            as_excel_number(value),</w:t>
-        <w:br/>
         <w:t xml:space="preserve">            float(value / total * 100) if total else 0,</w:t>
         <w:br/>
         <w:t xml:space="preserve">            as_excel_number(change) if change is not None else None,</w:t>
@@ -9507,6 +9343,18 @@
         <w:t xml:space="preserve">    chart.add_data(average_data, titles_from_data=True)</w:t>
         <w:br/>
         <w:t xml:space="preserve">    chart.set_categories(categories)</w:t>
+        <w:br/>
+        <w:t xml:space="preserve">    chart.series[0].graphicalProperties.line.solidFill = "4058D6"</w:t>
+        <w:br/>
+        <w:t xml:space="preserve">    chart.series[0].graphicalProperties.line.width = 28575</w:t>
+        <w:br/>
+        <w:t xml:space="preserve">    chart.series[1].graphicalProperties.line.solidFill = "E0565B"</w:t>
+        <w:br/>
+        <w:t xml:space="preserve">    chart.series[1].graphicalProperties.line.width = 19050</w:t>
+        <w:br/>
+        <w:t xml:space="preserve">    chart.series[1].graphicalProperties.line.prstDash = "dash"</w:t>
+        <w:br/>
+        <w:t xml:space="preserve">    month_sheet.add_chart(chart, "H2")</w:t>
       </w:r>
     </w:p>
     <w:p>
@@ -9526,18 +9374,6 @@
           <w:color w:val="243247"/>
           <w:sz w:val="14"/>
         </w:rPr>
-        <w:t xml:space="preserve">    chart.series[0].graphicalProperties.line.solidFill = "4058D6"</w:t>
-        <w:br/>
-        <w:t xml:space="preserve">    chart.series[0].graphicalProperties.line.width = 28575</w:t>
-        <w:br/>
-        <w:t xml:space="preserve">    chart.series[1].graphicalProperties.line.solidFill = "E0565B"</w:t>
-        <w:br/>
-        <w:t xml:space="preserve">    chart.series[1].graphicalProperties.line.width = 19050</w:t>
-        <w:br/>
-        <w:t xml:space="preserve">    chart.series[1].graphicalProperties.line.prstDash = "dash"</w:t>
-        <w:br/>
-        <w:t xml:space="preserve">    month_sheet.add_chart(chart, "H2")</w:t>
-        <w:br/>
         <w:t xml:space="preserve">    month_sheet.freeze_panes = "A2"</w:t>
         <w:br/>
         <w:br/>
@@ -9595,6 +9431,18 @@
         <w:t xml:space="preserve">    log_headers = ["Строка Excel", "transaction_id", "Поле", "Исходное значение", "Очищенное значение"]</w:t>
         <w:br/>
         <w:t xml:space="preserve">    log_sheet.append(log_headers)</w:t>
+        <w:br/>
+        <w:t xml:space="preserve">    for item in change_log:</w:t>
+        <w:br/>
+        <w:t xml:space="preserve">        log_sheet.append([item["excel_row"], item["transaction_id"], item["field"], item["old_value"], item["new_value"]])</w:t>
+        <w:br/>
+        <w:t xml:space="preserve">    style_table(log_sheet)</w:t>
+        <w:br/>
+        <w:t xml:space="preserve">    for col, width in {"A": 15, "B": 18, "C": 18, "D": 38, "E": 38}.items():</w:t>
+        <w:br/>
+        <w:t xml:space="preserve">        log_sheet.column_dimensions[col].width = width</w:t>
+        <w:br/>
+        <w:t xml:space="preserve">    if change_log:</w:t>
       </w:r>
     </w:p>
     <w:p>
@@ -9614,18 +9462,6 @@
           <w:color w:val="243247"/>
           <w:sz w:val="14"/>
         </w:rPr>
-        <w:t xml:space="preserve">    for item in change_log:</w:t>
-        <w:br/>
-        <w:t xml:space="preserve">        log_sheet.append([item["excel_row"], item["transaction_id"], item["field"], item["old_value"], item["new_value"]])</w:t>
-        <w:br/>
-        <w:t xml:space="preserve">    style_table(log_sheet)</w:t>
-        <w:br/>
-        <w:t xml:space="preserve">    for col, width in {"A": 15, "B": 18, "C": 18, "D": 38, "E": 38}.items():</w:t>
-        <w:br/>
-        <w:t xml:space="preserve">        log_sheet.column_dimensions[col].width = width</w:t>
-        <w:br/>
-        <w:t xml:space="preserve">    if change_log:</w:t>
-        <w:br/>
         <w:t xml:space="preserve">        add_excel_table(log_sheet, "CleaningLog", f"A1:E{log_sheet.max_row}")</w:t>
         <w:br/>
         <w:br/>
@@ -9659,7 +9495,7 @@
         <w:br/>
         <w:t>def main() -&gt; None:</w:t>
         <w:br/>
-        <w:t xml:space="preserve">    parser = argparse.ArgumentParser(description=__doc__)</w:t>
+        <w:t xml:space="preserve">    parser = argparse.ArgumentParser(description='Очистка транзакций 2026 года и формирование итоговых книг.')</w:t>
         <w:br/>
         <w:t xml:space="preserve">    parser.add_argument("--input", type=Path, default=REPO_ROOT / "dataset_2026.xlsx")</w:t>
         <w:br/>
@@ -9681,6 +9517,18 @@
         <w:t xml:space="preserve">    print(f"Строк в очищенном файле: {len(cleaned)}; удалено: 0; полных дубликатов: {duplicate_count}")</w:t>
         <w:br/>
         <w:t xml:space="preserve">    print(f"Исправлений в журнале: {len(change_log)}; затронуто строк: {len({item['excel_row'] for item in change_log})}")</w:t>
+        <w:br/>
+        <w:t xml:space="preserve">    print(f"Годовая выручка: {result['total']}; средняя за месяц: {result['average']}")</w:t>
+        <w:br/>
+        <w:t xml:space="preserve">    print(f"Максимум: {MONTHS_RU[result['max_month'] - 1]} — {result['monthly'][result['max_month']]}")</w:t>
+        <w:br/>
+        <w:t xml:space="preserve">    print(f"Минимум: {MONTHS_RU[result['min_month'] - 1]} — {result['monthly'][result['min_month']]}")</w:t>
+        <w:br/>
+        <w:t xml:space="preserve">    print(f"SHA-256 файла очистки (фингерпринт, не контрольный код приложения): {digest}")</w:t>
+        <w:br/>
+        <w:t xml:space="preserve">    print(f"Очищенный набор: {args.clean_output}")</w:t>
+        <w:br/>
+        <w:t xml:space="preserve">    print(f"Расчёты и график: {args.analysis_output}")</w:t>
       </w:r>
     </w:p>
     <w:p>
@@ -9700,18 +9548,6 @@
           <w:color w:val="243247"/>
           <w:sz w:val="14"/>
         </w:rPr>
-        <w:t xml:space="preserve">    print(f"Годовая выручка: {result['total']}; средняя за месяц: {result['average']}")</w:t>
-        <w:br/>
-        <w:t xml:space="preserve">    print(f"Максимум: {MONTHS_RU[result['max_month'] - 1]} — {result['monthly'][result['max_month']]}")</w:t>
-        <w:br/>
-        <w:t xml:space="preserve">    print(f"Минимум: {MONTHS_RU[result['min_month'] - 1]} — {result['monthly'][result['min_month']]}")</w:t>
-        <w:br/>
-        <w:t xml:space="preserve">    print(f"SHA-256 файла очистки (фингерпринт, не контрольный код приложения): {digest}")</w:t>
-        <w:br/>
-        <w:t xml:space="preserve">    print(f"Очищенный набор: {args.clean_output}")</w:t>
-        <w:br/>
-        <w:t xml:space="preserve">    print(f"Расчёты и график: {args.analysis_output}")</w:t>
-        <w:br/>
         <w:br/>
         <w:br/>
         <w:t>if __name__ == "__main__":</w:t>
@@ -9749,31 +9585,6 @@
           <w:color w:val="243247"/>
           <w:sz w:val="14"/>
         </w:rPr>
-        <w:t>#!/usr/bin/env python3</w:t>
-        <w:br/>
-        <w:t>"""Локальная предварительная проверка файлов задания 7.</w:t>
-        <w:br/>
-        <w:br/>
-        <w:t>Это НЕ официальный Analytics_autotest и не выдаёт его контрольный код.</w:t>
-        <w:br/>
-        <w:t>Скрипт проверяет требования, которые явно перечислены в приложенном ТЗ:</w:t>
-        <w:br/>
-        <w:t>сохранность 30 строк, типы/нормализацию, расчёт выручки, помесячную сводку,</w:t>
-        <w:br/>
-        <w:t>итоги и наличие графика с серией среднего значения.</w:t>
-        <w:br/>
-        <w:br/>
-        <w:t>Запуск из корня репозитория:</w:t>
-        <w:br/>
-        <w:t xml:space="preserve">    python3 solutions/task7_analysis/preflight_check.py</w:t>
-        <w:br/>
-        <w:br/>
-        <w:t>В комплекте заданий можно запускать из этой папки без параметров, если рядом</w:t>
-        <w:br/>
-        <w:t>находится исходный dataset_2026.xlsx.</w:t>
-        <w:br/>
-        <w:t>"""</w:t>
-        <w:br/>
         <w:t>from __future__ import annotations</w:t>
         <w:br/>
         <w:br/>
@@ -9813,6 +9624,34 @@
         <w:t>DEFAULT_ANALYSIS = HERE / "analysis_2026.xlsx"</w:t>
         <w:br/>
         <w:t>HEADERS = ["transaction_id", "date", "product", "category", "quantity", "price", "shop", "manager"]</w:t>
+        <w:br/>
+        <w:t>MONTHS = [</w:t>
+        <w:br/>
+        <w:t xml:space="preserve">    "Январь", "Февраль", "Март", "Апрель", "Май", "Июнь",</w:t>
+        <w:br/>
+        <w:t xml:space="preserve">    "Июль", "Август", "Сентябрь", "Октябрь", "Ноябрь", "Декабрь",</w:t>
+        <w:br/>
+        <w:t>]</w:t>
+        <w:br/>
+        <w:t>EXPECTED = {</w:t>
+        <w:br/>
+        <w:t xml:space="preserve">    "Строк в исходном наборе": 30,</w:t>
+        <w:br/>
+        <w:t xml:space="preserve">    "Полных дубликатов": 0,</w:t>
+        <w:br/>
+        <w:t xml:space="preserve">    "Строк удалено": 0,</w:t>
+        <w:br/>
+        <w:t xml:space="preserve">    "Годовая выручка, руб.": 7_759_680,</w:t>
+        <w:br/>
+        <w:t xml:space="preserve">    "Средняя месячная выручка, руб.": 646_640,</w:t>
+        <w:br/>
+        <w:t xml:space="preserve">    "Месяц максимальной выручки": "Ноябрь",</w:t>
+        <w:br/>
+        <w:t xml:space="preserve">    "Максимальная месячная выручка, руб.": 1_794_540,</w:t>
+        <w:br/>
+        <w:t xml:space="preserve">    "Месяц минимальной выручки": "Сентябрь",</w:t>
+        <w:br/>
+        <w:t xml:space="preserve">    "Минимальная месячная выручка, руб.": 127_949,</w:t>
       </w:r>
     </w:p>
     <w:p>
@@ -9832,34 +9671,6 @@
           <w:color w:val="243247"/>
           <w:sz w:val="14"/>
         </w:rPr>
-        <w:t>MONTHS = [</w:t>
-        <w:br/>
-        <w:t xml:space="preserve">    "Январь", "Февраль", "Март", "Апрель", "Май", "Июнь",</w:t>
-        <w:br/>
-        <w:t xml:space="preserve">    "Июль", "Август", "Сентябрь", "Октябрь", "Ноябрь", "Декабрь",</w:t>
-        <w:br/>
-        <w:t>]</w:t>
-        <w:br/>
-        <w:t>EXPECTED = {</w:t>
-        <w:br/>
-        <w:t xml:space="preserve">    "Строк в исходном наборе": 30,</w:t>
-        <w:br/>
-        <w:t xml:space="preserve">    "Полных дубликатов": 0,</w:t>
-        <w:br/>
-        <w:t xml:space="preserve">    "Строк удалено": 0,</w:t>
-        <w:br/>
-        <w:t xml:space="preserve">    "Годовая выручка, руб.": 7_759_680,</w:t>
-        <w:br/>
-        <w:t xml:space="preserve">    "Средняя месячная выручка, руб.": 646_640,</w:t>
-        <w:br/>
-        <w:t xml:space="preserve">    "Месяц максимальной выручки": "Ноябрь",</w:t>
-        <w:br/>
-        <w:t xml:space="preserve">    "Максимальная месячная выручка, руб.": 1_794_540,</w:t>
-        <w:br/>
-        <w:t xml:space="preserve">    "Месяц минимальной выручки": "Сентябрь",</w:t>
-        <w:br/>
-        <w:t xml:space="preserve">    "Минимальная месячная выручка, руб.": 127_949,</w:t>
-        <w:br/>
         <w:t xml:space="preserve">    "Размах месячной выручки, руб.": 1_666_591,</w:t>
         <w:br/>
         <w:t xml:space="preserve">    "Строк с зафиксированными исправлениями": 27,</w:t>
@@ -9896,6 +9707,32 @@
         <w:br/>
         <w:t xml:space="preserve">        failures.append(label)</w:t>
         <w:br/>
+        <w:br/>
+        <w:br/>
+        <w:t>def main() -&gt; int:</w:t>
+        <w:br/>
+        <w:t xml:space="preserve">    parser = argparse.ArgumentParser(description='Локальная предварительная проверка файлов задания 7.')</w:t>
+        <w:br/>
+        <w:t xml:space="preserve">    parser.add_argument("--source", type=Path, default=DEFAULT_SOURCE)</w:t>
+        <w:br/>
+        <w:t xml:space="preserve">    parser.add_argument("--clean", type=Path, default=DEFAULT_CLEAN)</w:t>
+        <w:br/>
+        <w:t xml:space="preserve">    parser.add_argument("--analysis", type=Path, default=DEFAULT_ANALYSIS)</w:t>
+        <w:br/>
+        <w:t xml:space="preserve">    args = parser.parse_args()</w:t>
+        <w:br/>
+        <w:t xml:space="preserve">    failures: list[str] = []</w:t>
+        <w:br/>
+        <w:br/>
+        <w:t xml:space="preserve">    for label, path in (("Исходный набор", args.source), ("Очищенный набор", args.clean), ("Книга анализа", args.analysis)):</w:t>
+        <w:br/>
+        <w:t xml:space="preserve">        check(path.is_file(), f"{label}: файл существует ({path})", failures)</w:t>
+        <w:br/>
+        <w:t xml:space="preserve">    if failures:</w:t>
+        <w:br/>
+        <w:t xml:space="preserve">        print("Проверка остановлена: не найдены входные/выходные файлы.")</w:t>
+        <w:br/>
+        <w:t xml:space="preserve">        return 1</w:t>
         <w:br/>
       </w:r>
     </w:p>
@@ -9916,32 +9753,6 @@
           <w:color w:val="243247"/>
           <w:sz w:val="14"/>
         </w:rPr>
-        <w:t>def main() -&gt; int:</w:t>
-        <w:br/>
-        <w:t xml:space="preserve">    parser = argparse.ArgumentParser(description=__doc__)</w:t>
-        <w:br/>
-        <w:t xml:space="preserve">    parser.add_argument("--source", type=Path, default=DEFAULT_SOURCE)</w:t>
-        <w:br/>
-        <w:t xml:space="preserve">    parser.add_argument("--clean", type=Path, default=DEFAULT_CLEAN)</w:t>
-        <w:br/>
-        <w:t xml:space="preserve">    parser.add_argument("--analysis", type=Path, default=DEFAULT_ANALYSIS)</w:t>
-        <w:br/>
-        <w:t xml:space="preserve">    args = parser.parse_args()</w:t>
-        <w:br/>
-        <w:t xml:space="preserve">    failures: list[str] = []</w:t>
-        <w:br/>
-        <w:br/>
-        <w:t xml:space="preserve">    for label, path in (("Исходный набор", args.source), ("Очищенный набор", args.clean), ("Книга анализа", args.analysis)):</w:t>
-        <w:br/>
-        <w:t xml:space="preserve">        check(path.is_file(), f"{label}: файл существует ({path})", failures)</w:t>
-        <w:br/>
-        <w:t xml:space="preserve">    if failures:</w:t>
-        <w:br/>
-        <w:t xml:space="preserve">        print("Проверка остановлена: не найдены входные/выходные файлы.")</w:t>
-        <w:br/>
-        <w:t xml:space="preserve">        return 1</w:t>
-        <w:br/>
-        <w:br/>
         <w:t xml:space="preserve">    source_wb = load_workbook(args.source, data_only=True, read_only=True)</w:t>
         <w:br/>
         <w:t xml:space="preserve">    clean_wb = load_workbook(args.clean, data_only=True, read_only=True)</w:t>
@@ -9983,6 +9794,34 @@
         <w:t xml:space="preserve">        dates_ok = True</w:t>
         <w:br/>
         <w:t xml:space="preserve">        numbers_ok = True</w:t>
+        <w:br/>
+        <w:t xml:space="preserve">        canonical_ok = len(source_rows) == len(clean_rows)</w:t>
+        <w:br/>
+        <w:t xml:space="preserve">        for raw, row in zip(source_rows, clean_rows):</w:t>
+        <w:br/>
+        <w:t xml:space="preserve">            tx_id, tx_date, product, category, quantity, price, shop, manager = row</w:t>
+        <w:br/>
+        <w:t xml:space="preserve">            ids.append(str(tx_id))</w:t>
+        <w:br/>
+        <w:t xml:space="preserve">            dates_ok &amp;= isinstance(tx_date, (datetime, date)) and tx_date.year == 2026</w:t>
+        <w:br/>
+        <w:t xml:space="preserve">            q, p = dec(quantity), dec(price)</w:t>
+        <w:br/>
+        <w:t xml:space="preserve">            numbers_ok &amp;= q is not None and p is not None and q &gt; 0 and q == q.to_integral_value() and p &gt;= 0</w:t>
+        <w:br/>
+        <w:t xml:space="preserve">            expected_product = normalize_product(raw[2])</w:t>
+        <w:br/>
+        <w:t xml:space="preserve">            expected_manager = normalize_manager(raw[7])</w:t>
+        <w:br/>
+        <w:t xml:space="preserve">            canonical_ok &amp;= str(tx_id) == normalize_transaction_id(raw[0])</w:t>
+        <w:br/>
+        <w:t xml:space="preserve">            canonical_ok &amp;= str(product) == expected_product</w:t>
+        <w:br/>
+        <w:t xml:space="preserve">            canonical_ok &amp;= str(category) == infer_category(expected_product)</w:t>
+        <w:br/>
+        <w:t xml:space="preserve">            canonical_ok &amp;= str(shop) == " ".join(str(raw[6] or "").split())</w:t>
+        <w:br/>
+        <w:t xml:space="preserve">            canonical_ok &amp;= str(manager) == expected_manager</w:t>
       </w:r>
     </w:p>
     <w:p>
@@ -10002,34 +9841,6 @@
           <w:color w:val="243247"/>
           <w:sz w:val="14"/>
         </w:rPr>
-        <w:t xml:space="preserve">        canonical_ok = len(source_rows) == len(clean_rows)</w:t>
-        <w:br/>
-        <w:t xml:space="preserve">        for raw, row in zip(source_rows, clean_rows):</w:t>
-        <w:br/>
-        <w:t xml:space="preserve">            tx_id, tx_date, product, category, quantity, price, shop, manager = row</w:t>
-        <w:br/>
-        <w:t xml:space="preserve">            ids.append(str(tx_id))</w:t>
-        <w:br/>
-        <w:t xml:space="preserve">            dates_ok &amp;= isinstance(tx_date, (datetime, date)) and tx_date.year == 2026</w:t>
-        <w:br/>
-        <w:t xml:space="preserve">            q, p = dec(quantity), dec(price)</w:t>
-        <w:br/>
-        <w:t xml:space="preserve">            numbers_ok &amp;= q is not None and p is not None and q &gt; 0 and q == q.to_integral_value() and p &gt;= 0</w:t>
-        <w:br/>
-        <w:t xml:space="preserve">            expected_product = normalize_product(raw[2])</w:t>
-        <w:br/>
-        <w:t xml:space="preserve">            expected_manager = normalize_manager(raw[7])</w:t>
-        <w:br/>
-        <w:t xml:space="preserve">            canonical_ok &amp;= str(tx_id) == normalize_transaction_id(raw[0])</w:t>
-        <w:br/>
-        <w:t xml:space="preserve">            canonical_ok &amp;= str(product) == expected_product</w:t>
-        <w:br/>
-        <w:t xml:space="preserve">            canonical_ok &amp;= str(category) == infer_category(expected_product)</w:t>
-        <w:br/>
-        <w:t xml:space="preserve">            canonical_ok &amp;= str(shop) == " ".join(str(raw[6] or "").split())</w:t>
-        <w:br/>
-        <w:t xml:space="preserve">            canonical_ok &amp;= str(manager) == expected_manager</w:t>
-        <w:br/>
         <w:t xml:space="preserve">        check(len(ids) == len(set(ids)) and all(len(tx_id) == 8 for tx_id in ids), "ID транзакций нормализованы и уникальны", failures)</w:t>
         <w:br/>
         <w:t xml:space="preserve">        check(dates_ok, "Все даты — настоящие даты 2026 года", failures)</w:t>
@@ -10047,7 +9858,7 @@
         <w:br/>
         <w:t xml:space="preserve">            tx_date, quantity, price = row[1], dec(row[4]), dec(row[5])</w:t>
         <w:br/>
-        <w:t xml:space="preserve">            revenue = quantity * price  # type: ignore[operator]</w:t>
+        <w:t xml:space="preserve">            revenue = quantity * price</w:t>
         <w:br/>
         <w:t xml:space="preserve">            line_revenues.append(revenue)</w:t>
         <w:br/>
@@ -10071,6 +9882,33 @@
         <w:t xml:space="preserve">        if required_sheets.issubset(set(analysis_wb.sheetnames)):</w:t>
         <w:br/>
         <w:t xml:space="preserve">            data_sheet = analysis_wb["Данные"]</w:t>
+        <w:br/>
+        <w:t xml:space="preserve">            data_values = list(data_sheet.iter_rows(min_row=2, values_only=True))</w:t>
+        <w:br/>
+        <w:t xml:space="preserve">            data_ok = len(data_values) == len(clean_rows)</w:t>
+        <w:br/>
+        <w:t xml:space="preserve">            for row, clean, expected_revenue in zip(data_values, clean_rows, line_revenues):</w:t>
+        <w:br/>
+        <w:t xml:space="preserve">                data_ok &amp;= str(row[0]) == str(clean[0])</w:t>
+        <w:br/>
+        <w:t xml:space="preserve">                actual = dec(row[8]) if len(row) &gt; 8 else None</w:t>
+        <w:br/>
+        <w:t xml:space="preserve">                data_ok &amp;= actual == expected_revenue</w:t>
+        <w:br/>
+        <w:t xml:space="preserve">            check(data_ok, "Выручка каждой строки равна quantity × price", failures)</w:t>
+        <w:br/>
+        <w:br/>
+        <w:t xml:space="preserve">            month_sheet = analysis_wb["Месячная выручка"]</w:t>
+        <w:br/>
+        <w:t xml:space="preserve">            month_names = [month_sheet.cell(row, 1).value for row in range(2, 14)]</w:t>
+        <w:br/>
+        <w:t xml:space="preserve">            actual_months = [dec(month_sheet.cell(row, 2).value) for row in range(2, 14)]</w:t>
+        <w:br/>
+        <w:t xml:space="preserve">            actual_shares = [dec(month_sheet.cell(row, 3).value) for row in range(2, 14)]</w:t>
+        <w:br/>
+        <w:t xml:space="preserve">            actual_average = [dec(month_sheet.cell(row, 6).value) for row in range(2, 14)]</w:t>
+        <w:br/>
+        <w:t xml:space="preserve">            months_ok = month_names == MONTHS and actual_months == monthly</w:t>
       </w:r>
     </w:p>
     <w:p>
@@ -10090,33 +9928,6 @@
           <w:color w:val="243247"/>
           <w:sz w:val="14"/>
         </w:rPr>
-        <w:t xml:space="preserve">            data_values = list(data_sheet.iter_rows(min_row=2, values_only=True))</w:t>
-        <w:br/>
-        <w:t xml:space="preserve">            data_ok = len(data_values) == len(clean_rows)</w:t>
-        <w:br/>
-        <w:t xml:space="preserve">            for row, clean, expected_revenue in zip(data_values, clean_rows, line_revenues):</w:t>
-        <w:br/>
-        <w:t xml:space="preserve">                data_ok &amp;= str(row[0]) == str(clean[0])</w:t>
-        <w:br/>
-        <w:t xml:space="preserve">                actual = dec(row[8]) if len(row) &gt; 8 else None</w:t>
-        <w:br/>
-        <w:t xml:space="preserve">                data_ok &amp;= actual == expected_revenue</w:t>
-        <w:br/>
-        <w:t xml:space="preserve">            check(data_ok, "Выручка каждой строки равна quantity × price", failures)</w:t>
-        <w:br/>
-        <w:br/>
-        <w:t xml:space="preserve">            month_sheet = analysis_wb["Месячная выручка"]</w:t>
-        <w:br/>
-        <w:t xml:space="preserve">            month_names = [month_sheet.cell(row, 1).value for row in range(2, 14)]</w:t>
-        <w:br/>
-        <w:t xml:space="preserve">            actual_months = [dec(month_sheet.cell(row, 2).value) for row in range(2, 14)]</w:t>
-        <w:br/>
-        <w:t xml:space="preserve">            actual_shares = [dec(month_sheet.cell(row, 3).value) for row in range(2, 14)]</w:t>
-        <w:br/>
-        <w:t xml:space="preserve">            actual_average = [dec(month_sheet.cell(row, 6).value) for row in range(2, 14)]</w:t>
-        <w:br/>
-        <w:t xml:space="preserve">            months_ok = month_names == MONTHS and actual_months == monthly</w:t>
-        <w:br/>
         <w:t xml:space="preserve">            expected_shares = [value / total * Decimal("100") for value in monthly]</w:t>
         <w:br/>
         <w:t xml:space="preserve">            shares_ok = (</w:t>
@@ -10160,6 +9971,33 @@
         <w:t xml:space="preserve">                ]</w:t>
         <w:br/>
         <w:t xml:space="preserve">            check(chart_ok, "Линейный график использует месяцы по порядку, выручку и серию среднего", failures)</w:t>
+        <w:br/>
+        <w:br/>
+        <w:t xml:space="preserve">            summary = analysis_wb["Итоги"]</w:t>
+        <w:br/>
+        <w:t xml:space="preserve">            metrics = {summary.cell(row, 1).value: summary.cell(row, 2).value for row in range(2, summary.max_row + 1)}</w:t>
+        <w:br/>
+        <w:t xml:space="preserve">            metrics_ok = True</w:t>
+        <w:br/>
+        <w:t xml:space="preserve">            for key, expected in EXPECTED.items():</w:t>
+        <w:br/>
+        <w:t xml:space="preserve">                actual = metrics.get(key)</w:t>
+        <w:br/>
+        <w:t xml:space="preserve">                if isinstance(expected, int):</w:t>
+        <w:br/>
+        <w:t xml:space="preserve">                    metrics_ok &amp;= dec(actual) == Decimal(expected)</w:t>
+        <w:br/>
+        <w:t xml:space="preserve">                else:</w:t>
+        <w:br/>
+        <w:t xml:space="preserve">                    metrics_ok &amp;= actual == expected</w:t>
+        <w:br/>
+        <w:t xml:space="preserve">            metrics_ok &amp;= month_names[max_index] == "Ноябрь" and monthly[max_index] == Decimal("1794540")</w:t>
+        <w:br/>
+        <w:t xml:space="preserve">            metrics_ok &amp;= month_names[min_index] == "Сентябрь" and monthly[min_index] == Decimal("127949")</w:t>
+        <w:br/>
+        <w:t xml:space="preserve">            check(metrics_ok, "Итоговые контрольные показатели и журнал совпадают с набором задания", failures)</w:t>
+        <w:br/>
+        <w:t xml:space="preserve">            log_sheet = analysis_wb["Журнал очистки"]</w:t>
       </w:r>
     </w:p>
     <w:p>
@@ -10179,39 +10017,9 @@
           <w:color w:val="243247"/>
           <w:sz w:val="14"/>
         </w:rPr>
-        <w:br/>
-        <w:t xml:space="preserve">            summary = analysis_wb["Итоги"]</w:t>
-        <w:br/>
-        <w:t xml:space="preserve">            metrics = {summary.cell(row, 1).value: summary.cell(row, 2).value for row in range(2, summary.max_row + 1)}</w:t>
-        <w:br/>
-        <w:t xml:space="preserve">            metrics_ok = True</w:t>
-        <w:br/>
-        <w:t xml:space="preserve">            for key, expected in EXPECTED.items():</w:t>
-        <w:br/>
-        <w:t xml:space="preserve">                actual = metrics.get(key)</w:t>
-        <w:br/>
-        <w:t xml:space="preserve">                if isinstance(expected, int):</w:t>
-        <w:br/>
-        <w:t xml:space="preserve">                    metrics_ok &amp;= dec(actual) == Decimal(expected)</w:t>
-        <w:br/>
-        <w:t xml:space="preserve">                else:</w:t>
-        <w:br/>
-        <w:t xml:space="preserve">                    metrics_ok &amp;= actual == expected</w:t>
-        <w:br/>
-        <w:t xml:space="preserve">            metrics_ok &amp;= month_names[max_index] == "Ноябрь" and monthly[max_index] == Decimal("1794540")</w:t>
-        <w:br/>
-        <w:t xml:space="preserve">            metrics_ok &amp;= month_names[min_index] == "Сентябрь" and monthly[min_index] == Decimal("127949")</w:t>
-        <w:br/>
-        <w:t xml:space="preserve">            check(metrics_ok, "Итоговые контрольные показатели и журнал совпадают с набором задания", failures)</w:t>
-        <w:br/>
-        <w:t xml:space="preserve">            log_sheet = analysis_wb["Журнал очистки"]</w:t>
-        <w:br/>
         <w:t xml:space="preserve">            check(log_sheet.max_row == 48, "Журнал содержит заголовок и все 47 исправлений", failures)</w:t>
         <w:br/>
         <w:br/>
-        <w:t xml:space="preserve">        # Не корректируем данные без подтверждения первичного источника; лишь убеждаемся,</w:t>
-        <w:br/>
-        <w:t xml:space="preserve">        # что зафиксированный выброс не потерян при экспорте.</w:t>
         <w:br/>
         <w:t xml:space="preserve">        outlier = next((row for row in clean_rows if str(row[0]) == "TXN-0001"), None)</w:t>
         <w:br/>

</xml_diff>

<commit_message>
Harden captcha puzzle submission flow
Co-authored-by: arena-agent <297053741+arena-agent@users.noreply.github.com>
</commit_message>
<xml_diff>
--- a/solutions/Полное_пошаговое_решение_КИМ_09.02.07-5-2027.docx
+++ b/solutions/Полное_пошаговое_решение_КИМ_09.02.07-5-2027.docx
@@ -2340,7 +2340,7 @@
         <w:spacing w:after="80"/>
       </w:pPr>
       <w:r>
-        <w:t>Действие 2. На странице заполните оба обязательных поля и соберите изображение: элементы 3×3 переставляются перетаскиванием или кликами по двум фрагментам. Затем войдите как admin / Admin123! либо user / User123!. Капча имеет случайное начальное расположение и одноразовый серверный challenge; готовый порядок из браузера принимается только если совпал с 0…8.</w:t>
+        <w:t>Действие 2. На странице заполните оба обязательных поля и соберите изображение: элементы 3×3 переставляются перетаскиванием или кликами по двум фрагментам. Индикатор под сеткой должен показать 9 из 9; форма дополнительно сверяет порядок в момент отправки и не отправляет неразобранную капчу. Challenge действует 15 минут. Затем войдите как admin / Admin123! либо user / User123!. Капча имеет случайное начальное расположение и одноразовый серверный challenge; готовый порядок из браузера принимается только если совпал с 0…8.</w:t>
       </w:r>
     </w:p>
     <w:p>
@@ -6851,7 +6851,7 @@
         <w:br/>
         <w:t xml:space="preserve">        with _state_lock:</w:t>
         <w:br/>
-        <w:t xml:space="preserve">            _captcha_challenges[challenge_id] = time.time() + 5 * 60</w:t>
+        <w:t xml:space="preserve">            _captcha_challenges[challenge_id] = time.time() + 15 * 60</w:t>
         <w:br/>
         <w:t xml:space="preserve">        tiles = []</w:t>
         <w:br/>
@@ -6935,7 +6935,7 @@
         <w:br/>
         <w:t>.puzzle-wrap{{margin:10px 0 15px;padding:14px;background:#f5f7fc;border:1px solid var(--line);border-radius:14px}}</w:t>
         <w:br/>
-        <w:t>.puzzle-instruction{{margin:0 0 11px;font-size:13px;color:var(--muted)}}.puzzle{{display:grid;grid-template-columns:repeat(3,76px);gap:4px;justify-content:center;touch-action:manipulation}}</w:t>
+        <w:t>.puzzle-instruction{{margin:0 0 11px;font-size:13px;color:var(--muted)}}.puzzle{{display:grid;grid-template-columns:repeat(3,76px);gap:4px;justify-content:center;touch-action:manipulation}}.puzzle-status{{min-height:18px;margin:10px 0 0;text-align:center;font-size:13px;color:var(--muted)}}.puzzle-status.complete{{color:#166534;font-weight:700}}</w:t>
         <w:br/>
         <w:t>.puzzle-piece{{width:76px;height:76px;border:1px solid #8091b7;border-radius:6px;background-color:#edf4ff;background-image:url('/static/captcha_full.png');background-size:300% 300%;cursor:grab;padding:0;transition:transform .12s,border-color .12s}}</w:t>
         <w:br/>
@@ -6959,7 +6959,9 @@
         <w:br/>
         <w:t>&lt;div class="puzzle-wrap"&gt;&lt;p class="puzzle-instruction"&gt;Нажмите на два фрагмента, чтобы поменять их местами, или перетащите фрагмент. Соберите исходную картинку.&lt;/p&gt;</w:t>
         <w:br/>
-        <w:t>&lt;div class="puzzle" id="puzzle" aria-label="Интерактивная капча"&gt;{''.join(tiles)}&lt;/div&gt;&lt;/div&gt;</w:t>
+        <w:t>&lt;div class="puzzle" id="puzzle" aria-label="Интерактивная капча"&gt;{''.join(tiles)}&lt;/div&gt;</w:t>
+        <w:br/>
+        <w:t>&lt;p class="puzzle-status" id="puzzle-status" role="status" aria-live="polite" tabindex="-1"&gt;Соберите изображение перед входом.&lt;/p&gt;&lt;/div&gt;</w:t>
         <w:br/>
         <w:t>&lt;input type="hidden" name="captcha_id" value="{challenge_id}"&gt;</w:t>
         <w:br/>
@@ -6971,36 +6973,35 @@
         <w:br/>
         <w:t>&lt;/main&gt;&lt;script&gt;</w:t>
         <w:br/>
-        <w:t>(()=&gt;{{const board=document.getElementById('puzzle'),out=document.getElementById('captcha_order');let selected=null,dragged=null;</w:t>
-        <w:br/>
-        <w:t>function save(){{out.value=JSON.stringify([...board.children].map(tile=&gt;Number(tile.dataset.piece)))}}</w:t>
-        <w:br/>
-        <w:t>function swap(a,b){{if(!a||!b||a===b)return;const marker=document.createElement('span');board.insertBefore(marker,a);board.insertBefore(a,b);board.insertBefore(b,marker);marker.remove();a.classList.remove('selected');b.classList.remove('selected');selected=null;save()}}</w:t>
-        <w:br/>
-        <w:t>board.querySelectorAll('.puzzle-piece').forEach(tile=&gt;{{tile.addEventListener('click',()=&gt;{{if(!selected){{selected=tile;tile.classList.add('selected')}}else if(selected===tile){{tile.classList.remove('selected');selected=null}}else swap(selected,tile)}});</w:t>
-        <w:br/>
-        <w:t>tile.addEventListener('dragstart',e=&gt;{{dragged=tile;e.dataTransfer.effectAllowed='move';e.dataTransfer.setData('text/plain',tile.dataset.piece)}});</w:t>
-        <w:br/>
-        <w:t>tile.addEventListener('dragover',e=&gt;e.preventDefault());tile.addEventListener('drop',e=&gt;{{e.preventDefault();const source=[...board.children].find(x=&gt;x.dataset.piece===e.dataTransfer.getData('text/plain'));swap(source,tile)}})}});save()}})();</w:t>
-        <w:br/>
-        <w:t>&lt;/script&gt;&lt;/body&gt;&lt;/html&gt;"""</w:t>
-        <w:br/>
-        <w:t xml:space="preserve">        self._send_html(body)</w:t>
-        <w:br/>
-        <w:br/>
-        <w:t xml:space="preserve">    def _login(self, form: dict[str, str]) -&gt; None:</w:t>
-        <w:br/>
-        <w:t xml:space="preserve">        login = form.get("login", "").strip().casefold()</w:t>
-        <w:br/>
-        <w:t xml:space="preserve">        password = form.get("password", "")</w:t>
-        <w:br/>
-        <w:t xml:space="preserve">        user = _fetch_user(login) if login else None</w:t>
-        <w:br/>
-        <w:t xml:space="preserve">        if user and user["is_blocked"]:</w:t>
-        <w:br/>
-        <w:t xml:space="preserve">            self._login_page("Вы заблокированы. Обратитесь к администратору", login)</w:t>
-        <w:br/>
-        <w:t xml:space="preserve">            return</w:t>
+        <w:t>(()=&gt;{{</w:t>
+        <w:br/>
+        <w:t>const board=document.getElementById('puzzle');</w:t>
+        <w:br/>
+        <w:t>const out=document.getElementById('captcha_order');</w:t>
+        <w:br/>
+        <w:t>const status=document.getElementById('puzzle-status');</w:t>
+        <w:br/>
+        <w:t>const form=board.closest('form');</w:t>
+        <w:br/>
+        <w:t>let selected=null;</w:t>
+        <w:br/>
+        <w:t>function save(){{</w:t>
+        <w:br/>
+        <w:t xml:space="preserve"> const order=[...board.querySelectorAll('.puzzle-piece')].map(tile=&gt;Number(tile.dataset.piece));</w:t>
+        <w:br/>
+        <w:t xml:space="preserve"> out.value=JSON.stringify(order);</w:t>
+        <w:br/>
+        <w:t xml:space="preserve"> const correct=order.reduce((total,piece,index)=&gt;total+(piece===index?1:0),0);</w:t>
+        <w:br/>
+        <w:t xml:space="preserve"> const solved=correct===9;</w:t>
+        <w:br/>
+        <w:t xml:space="preserve"> status.textContent=solved?'Все 9 фрагментов собраны правильно. Можно войти.':'Правильно стоят: '+correct+' из 9.';</w:t>
+        <w:br/>
+        <w:t xml:space="preserve"> status.classList.toggle('complete',solved);</w:t>
+        <w:br/>
+        <w:t xml:space="preserve"> return solved;</w:t>
+        <w:br/>
+        <w:t>}}</w:t>
       </w:r>
     </w:p>
     <w:p>
@@ -7020,73 +7021,75 @@
           <w:color w:val="243247"/>
           <w:sz w:val="14"/>
         </w:rPr>
+        <w:t>function swap(a,b){{</w:t>
+        <w:br/>
+        <w:t xml:space="preserve"> if(!a||!b||a===b)return;</w:t>
+        <w:br/>
+        <w:t xml:space="preserve"> const tiles=[...board.querySelectorAll('.puzzle-piece')];</w:t>
+        <w:br/>
+        <w:t xml:space="preserve"> const aIndex=tiles.indexOf(a),bIndex=tiles.indexOf(b);</w:t>
+        <w:br/>
+        <w:t xml:space="preserve"> [tiles[aIndex],tiles[bIndex]]=[tiles[bIndex],tiles[aIndex]];</w:t>
+        <w:br/>
+        <w:t xml:space="preserve"> tiles.forEach(tile=&gt;board.appendChild(tile));</w:t>
+        <w:br/>
+        <w:t xml:space="preserve"> a.classList.remove('selected');b.classList.remove('selected');selected=null;save();</w:t>
+        <w:br/>
+        <w:t>}}</w:t>
+        <w:br/>
+        <w:t>board.querySelectorAll('.puzzle-piece').forEach(tile=&gt;{{</w:t>
+        <w:br/>
+        <w:t xml:space="preserve"> tile.addEventListener('click',()=&gt;{{</w:t>
+        <w:br/>
+        <w:t xml:space="preserve">  if(!selected){{selected=tile;tile.classList.add('selected')}}</w:t>
+        <w:br/>
+        <w:t xml:space="preserve">  else if(selected===tile){{tile.classList.remove('selected');selected=null}}</w:t>
+        <w:br/>
+        <w:t xml:space="preserve">  else swap(selected,tile);</w:t>
+        <w:br/>
+        <w:t xml:space="preserve"> }});</w:t>
+        <w:br/>
+        <w:t xml:space="preserve"> tile.addEventListener('dragstart',e=&gt;{{e.dataTransfer.effectAllowed='move';e.dataTransfer.setData('text/plain',tile.dataset.piece)}});</w:t>
+        <w:br/>
+        <w:t xml:space="preserve"> tile.addEventListener('dragover',e=&gt;e.preventDefault());</w:t>
+        <w:br/>
+        <w:t xml:space="preserve"> tile.addEventListener('drop',e=&gt;{{e.preventDefault();const source=[...board.querySelectorAll('.puzzle-piece')].find(x=&gt;x.dataset.piece===e.dataTransfer.getData('text/plain'));swap(source,tile)}});</w:t>
+        <w:br/>
+        <w:t>}});</w:t>
+        <w:br/>
+        <w:t>form.addEventListener('submit',event=&gt;{{</w:t>
+        <w:br/>
+        <w:t xml:space="preserve"> if(!save()){{event.preventDefault();status.focus()}}</w:t>
+        <w:br/>
+        <w:t>}});</w:t>
+        <w:br/>
+        <w:t>save();</w:t>
+        <w:br/>
+        <w:t>}})();</w:t>
+        <w:br/>
+        <w:t>&lt;/script&gt;&lt;/body&gt;&lt;/html&gt;"""</w:t>
+        <w:br/>
+        <w:t xml:space="preserve">        self._send_html(body)</w:t>
+        <w:br/>
+        <w:br/>
+        <w:t xml:space="preserve">    def _login(self, form: dict[str, str]) -&gt; None:</w:t>
+        <w:br/>
+        <w:t xml:space="preserve">        login = form.get("login", "").strip().casefold()</w:t>
+        <w:br/>
+        <w:t xml:space="preserve">        password = form.get("password", "")</w:t>
+        <w:br/>
+        <w:t xml:space="preserve">        user = _fetch_user(login) if login else None</w:t>
+        <w:br/>
+        <w:t xml:space="preserve">        if user and user["is_blocked"]:</w:t>
+        <w:br/>
+        <w:t xml:space="preserve">            self._login_page("Вы заблокированы. Обратитесь к администратору", login)</w:t>
+        <w:br/>
+        <w:t xml:space="preserve">            return</w:t>
+        <w:br/>
         <w:br/>
         <w:t xml:space="preserve">        challenge_id = form.get("captcha_id", "")</w:t>
         <w:br/>
         <w:t xml:space="preserve">        with _state_lock:</w:t>
-        <w:br/>
-        <w:t xml:space="preserve">            expires = _captcha_challenges.pop(challenge_id, None)</w:t>
-        <w:br/>
-        <w:t xml:space="preserve">        captcha_order = _parse_captcha_order(form.get("captcha_order", ""))</w:t>
-        <w:br/>
-        <w:t xml:space="preserve">        captcha_valid = expires is not None and expires &gt;= time.time() and captcha_order == list(range(CAPTCHA_SIZE))</w:t>
-        <w:br/>
-        <w:t xml:space="preserve">        if not captcha_valid:</w:t>
-        <w:br/>
-        <w:t xml:space="preserve">            locked = _record_failed_attempt(login)</w:t>
-        <w:br/>
-        <w:t xml:space="preserve">            message = (</w:t>
-        <w:br/>
-        <w:t xml:space="preserve">                "Вы заблокированы. Обратитесь к администратору"</w:t>
-        <w:br/>
-        <w:t xml:space="preserve">                if locked else "Капча собрана неверно или время её действия истекло. Переставьте фрагменты и попробуйте снова."</w:t>
-        <w:br/>
-        <w:t xml:space="preserve">            )</w:t>
-        <w:br/>
-        <w:t xml:space="preserve">            self._login_page(message, login)</w:t>
-        <w:br/>
-        <w:t xml:space="preserve">            return</w:t>
-        <w:br/>
-        <w:br/>
-        <w:t xml:space="preserve">        correct_password = bool(</w:t>
-        <w:br/>
-        <w:t xml:space="preserve">            user and password_matches(password, user["password_salt"], user["password_hash"])</w:t>
-        <w:br/>
-        <w:t xml:space="preserve">        )</w:t>
-        <w:br/>
-        <w:t xml:space="preserve">        if not user or not correct_password:</w:t>
-        <w:br/>
-        <w:t xml:space="preserve">            locked = _record_failed_attempt(login)</w:t>
-        <w:br/>
-        <w:t xml:space="preserve">            message = (</w:t>
-        <w:br/>
-        <w:t xml:space="preserve">                "Вы заблокированы. Обратитесь к администратору"</w:t>
-        <w:br/>
-        <w:t xml:space="preserve">                if locked else "Вы ввели неверный логин или пароль. Пожалуйста проверьте ещё раз введенные данные"</w:t>
-        <w:br/>
-        <w:t xml:space="preserve">            )</w:t>
-        <w:br/>
-        <w:t xml:space="preserve">            self._login_page(message, login)</w:t>
-        <w:br/>
-        <w:t xml:space="preserve">            return</w:t>
-        <w:br/>
-        <w:br/>
-        <w:t xml:space="preserve">        _reset_failed_attempts(int(user["id"]))</w:t>
-        <w:br/>
-        <w:t xml:space="preserve">        session_id = secrets.token_urlsafe(32)</w:t>
-        <w:br/>
-        <w:t xml:space="preserve">        with _state_lock:</w:t>
-        <w:br/>
-        <w:t xml:space="preserve">            _sessions[session_id] = {</w:t>
-        <w:br/>
-        <w:t xml:space="preserve">                "user_id": int(user["id"]),</w:t>
-        <w:br/>
-        <w:t xml:space="preserve">                "expires": time.time() + SESSION_TTL_SECONDS,</w:t>
-        <w:br/>
-        <w:t xml:space="preserve">            }</w:t>
-        <w:br/>
-        <w:t xml:space="preserve">        cookie = f"sid={session_id}; Path=/; HttpOnly; SameSite=Lax; Max-Age={SESSION_TTL_SECONDS}"</w:t>
-        <w:br/>
       </w:r>
     </w:p>
     <w:p>
@@ -7106,74 +7109,73 @@
           <w:color w:val="243247"/>
           <w:sz w:val="14"/>
         </w:rPr>
+        <w:t xml:space="preserve">            expires = _captcha_challenges.pop(challenge_id, None)</w:t>
+        <w:br/>
+        <w:t xml:space="preserve">        captcha_order = _parse_captcha_order(form.get("captcha_order", ""))</w:t>
+        <w:br/>
+        <w:t xml:space="preserve">        captcha_valid = expires is not None and expires &gt;= time.time() and captcha_order == list(range(CAPTCHA_SIZE))</w:t>
+        <w:br/>
+        <w:t xml:space="preserve">        if not captcha_valid:</w:t>
+        <w:br/>
+        <w:t xml:space="preserve">            locked = _record_failed_attempt(login)</w:t>
+        <w:br/>
+        <w:t xml:space="preserve">            message = (</w:t>
+        <w:br/>
+        <w:t xml:space="preserve">                "Вы заблокированы. Обратитесь к администратору"</w:t>
+        <w:br/>
+        <w:t xml:space="preserve">                if locked else "Капча собрана неверно или время её действия истекло. Переставьте фрагменты и попробуйте снова."</w:t>
+        <w:br/>
+        <w:t xml:space="preserve">            )</w:t>
+        <w:br/>
+        <w:t xml:space="preserve">            self._login_page(message, login)</w:t>
+        <w:br/>
+        <w:t xml:space="preserve">            return</w:t>
+        <w:br/>
+        <w:br/>
+        <w:t xml:space="preserve">        correct_password = bool(</w:t>
+        <w:br/>
+        <w:t xml:space="preserve">            user and password_matches(password, user["password_salt"], user["password_hash"])</w:t>
+        <w:br/>
+        <w:t xml:space="preserve">        )</w:t>
+        <w:br/>
+        <w:t xml:space="preserve">        if not user or not correct_password:</w:t>
+        <w:br/>
+        <w:t xml:space="preserve">            locked = _record_failed_attempt(login)</w:t>
+        <w:br/>
+        <w:t xml:space="preserve">            message = (</w:t>
+        <w:br/>
+        <w:t xml:space="preserve">                "Вы заблокированы. Обратитесь к администратору"</w:t>
+        <w:br/>
+        <w:t xml:space="preserve">                if locked else "Вы ввели неверный логин или пароль. Пожалуйста проверьте ещё раз введенные данные"</w:t>
+        <w:br/>
+        <w:t xml:space="preserve">            )</w:t>
+        <w:br/>
+        <w:t xml:space="preserve">            self._login_page(message, login)</w:t>
+        <w:br/>
+        <w:t xml:space="preserve">            return</w:t>
+        <w:br/>
+        <w:br/>
+        <w:t xml:space="preserve">        _reset_failed_attempts(int(user["id"]))</w:t>
+        <w:br/>
+        <w:t xml:space="preserve">        session_id = secrets.token_urlsafe(32)</w:t>
+        <w:br/>
+        <w:t xml:space="preserve">        with _state_lock:</w:t>
+        <w:br/>
+        <w:t xml:space="preserve">            _sessions[session_id] = {</w:t>
+        <w:br/>
+        <w:t xml:space="preserve">                "user_id": int(user["id"]),</w:t>
+        <w:br/>
+        <w:t xml:space="preserve">                "expires": time.time() + SESSION_TTL_SECONDS,</w:t>
+        <w:br/>
+        <w:t xml:space="preserve">            }</w:t>
+        <w:br/>
+        <w:t xml:space="preserve">        cookie = f"sid={session_id}; Path=/; HttpOnly; SameSite=Lax; Max-Age={SESSION_TTL_SECONDS}"</w:t>
+        <w:br/>
+        <w:br/>
         <w:t xml:space="preserve">        self._redirect("/dashboard?welcome=1", cookie)</w:t>
         <w:br/>
         <w:br/>
         <w:t xml:space="preserve">    def _dashboard(self, user: sqlite3.Row, welcome: bool = False) -&gt; None:</w:t>
-        <w:br/>
-        <w:t xml:space="preserve">        login = html.escape(user["login"])</w:t>
-        <w:br/>
-        <w:t xml:space="preserve">        role = html.escape(user["role"])</w:t>
-        <w:br/>
-        <w:t xml:space="preserve">        banner = '&lt;div class="notice success"&gt;Вы успешно авторизовались&lt;/div&gt;' if welcome else ""</w:t>
-        <w:br/>
-        <w:t xml:space="preserve">        admin_link = '&lt;p&gt;&lt;a class="button secondary" href="/admin/users"&gt;Управление пользователями&lt;/a&gt;&lt;/p&gt;' if user["role"] == "Администратор" else ""</w:t>
-        <w:br/>
-        <w:t xml:space="preserve">        body = f"""&lt;main class="card"&gt;&lt;div class="kicker"&gt;Рабочий стол&lt;/div&gt;&lt;h1&gt;Здравствуйте, {login}&lt;/h1&gt;{banner}</w:t>
-        <w:br/>
-        <w:t>&lt;p&gt;Роль: &lt;strong&gt;{role}&lt;/strong&gt;&lt;/p&gt;&lt;p&gt;API заметок: &lt;a href="/notes"&gt;GET /notes&lt;/a&gt;&lt;/p&gt;{admin_link}</w:t>
-        <w:br/>
-        <w:t>&lt;form method="post" action="/logout"&gt;&lt;button class="button" type="submit"&gt;Выйти&lt;/button&gt;&lt;/form&gt;&lt;/main&gt;"""</w:t>
-        <w:br/>
-        <w:t xml:space="preserve">        self._send_html(_page("Рабочий стол", body, styled=True))</w:t>
-        <w:br/>
-        <w:br/>
-        <w:t xml:space="preserve">    def _logout(self) -&gt; None:</w:t>
-        <w:br/>
-        <w:t xml:space="preserve">        cookie = SimpleCookie()</w:t>
-        <w:br/>
-        <w:t xml:space="preserve">        try:</w:t>
-        <w:br/>
-        <w:t xml:space="preserve">            cookie.load(self.headers.get("Cookie", ""))</w:t>
-        <w:br/>
-        <w:t xml:space="preserve">        except Exception:</w:t>
-        <w:br/>
-        <w:t xml:space="preserve">            cookie = SimpleCookie()</w:t>
-        <w:br/>
-        <w:t xml:space="preserve">        morsel = cookie.get("sid")</w:t>
-        <w:br/>
-        <w:t xml:space="preserve">        if morsel:</w:t>
-        <w:br/>
-        <w:t xml:space="preserve">            with _state_lock:</w:t>
-        <w:br/>
-        <w:t xml:space="preserve">                _sessions.pop(morsel.value, None)</w:t>
-        <w:br/>
-        <w:t xml:space="preserve">        self._redirect("/login", "sid=; Path=/; HttpOnly; SameSite=Lax; Max-Age=0")</w:t>
-        <w:br/>
-        <w:br/>
-        <w:t xml:space="preserve">    def _admin_page(self, current_user: sqlite3.Row, message: str = "", is_error: bool = False) -&gt; None:</w:t>
-        <w:br/>
-        <w:t xml:space="preserve">        connection = db_connect()</w:t>
-        <w:br/>
-        <w:t xml:space="preserve">        try:</w:t>
-        <w:br/>
-        <w:t xml:space="preserve">            users = connection.execute(</w:t>
-        <w:br/>
-        <w:t xml:space="preserve">                "SELECT id, login, role, is_blocked, failed_attempts FROM users ORDER BY id"</w:t>
-        <w:br/>
-        <w:t xml:space="preserve">            ).fetchall()</w:t>
-        <w:br/>
-        <w:t xml:space="preserve">        finally:</w:t>
-        <w:br/>
-        <w:t xml:space="preserve">            connection.close()</w:t>
-        <w:br/>
-        <w:t xml:space="preserve">        banner = ""</w:t>
-        <w:br/>
-        <w:t xml:space="preserve">        if message:</w:t>
-        <w:br/>
-        <w:t xml:space="preserve">            cls = "notice error" if is_error else "notice success"</w:t>
-        <w:br/>
-        <w:t xml:space="preserve">            title = "⚠ Ошибка" if is_error else "✓ Информация"</w:t>
       </w:r>
     </w:p>
     <w:p>
@@ -7193,75 +7195,75 @@
           <w:color w:val="243247"/>
           <w:sz w:val="14"/>
         </w:rPr>
+        <w:t xml:space="preserve">        login = html.escape(user["login"])</w:t>
+        <w:br/>
+        <w:t xml:space="preserve">        role = html.escape(user["role"])</w:t>
+        <w:br/>
+        <w:t xml:space="preserve">        banner = '&lt;div class="notice success"&gt;Вы успешно авторизовались&lt;/div&gt;' if welcome else ""</w:t>
+        <w:br/>
+        <w:t xml:space="preserve">        admin_link = '&lt;p&gt;&lt;a class="button secondary" href="/admin/users"&gt;Управление пользователями&lt;/a&gt;&lt;/p&gt;' if user["role"] == "Администратор" else ""</w:t>
+        <w:br/>
+        <w:t xml:space="preserve">        body = f"""&lt;main class="card"&gt;&lt;div class="kicker"&gt;Рабочий стол&lt;/div&gt;&lt;h1&gt;Здравствуйте, {login}&lt;/h1&gt;{banner}</w:t>
+        <w:br/>
+        <w:t>&lt;p&gt;Роль: &lt;strong&gt;{role}&lt;/strong&gt;&lt;/p&gt;&lt;p&gt;API заметок: &lt;a href="/notes"&gt;GET /notes&lt;/a&gt;&lt;/p&gt;{admin_link}</w:t>
+        <w:br/>
+        <w:t>&lt;form method="post" action="/logout"&gt;&lt;button class="button" type="submit"&gt;Выйти&lt;/button&gt;&lt;/form&gt;&lt;/main&gt;"""</w:t>
+        <w:br/>
+        <w:t xml:space="preserve">        self._send_html(_page("Рабочий стол", body, styled=True))</w:t>
+        <w:br/>
+        <w:br/>
+        <w:t xml:space="preserve">    def _logout(self) -&gt; None:</w:t>
+        <w:br/>
+        <w:t xml:space="preserve">        cookie = SimpleCookie()</w:t>
+        <w:br/>
+        <w:t xml:space="preserve">        try:</w:t>
+        <w:br/>
+        <w:t xml:space="preserve">            cookie.load(self.headers.get("Cookie", ""))</w:t>
+        <w:br/>
+        <w:t xml:space="preserve">        except Exception:</w:t>
+        <w:br/>
+        <w:t xml:space="preserve">            cookie = SimpleCookie()</w:t>
+        <w:br/>
+        <w:t xml:space="preserve">        morsel = cookie.get("sid")</w:t>
+        <w:br/>
+        <w:t xml:space="preserve">        if morsel:</w:t>
+        <w:br/>
+        <w:t xml:space="preserve">            with _state_lock:</w:t>
+        <w:br/>
+        <w:t xml:space="preserve">                _sessions.pop(morsel.value, None)</w:t>
+        <w:br/>
+        <w:t xml:space="preserve">        self._redirect("/login", "sid=; Path=/; HttpOnly; SameSite=Lax; Max-Age=0")</w:t>
+        <w:br/>
+        <w:br/>
+        <w:t xml:space="preserve">    def _admin_page(self, current_user: sqlite3.Row, message: str = "", is_error: bool = False) -&gt; None:</w:t>
+        <w:br/>
+        <w:t xml:space="preserve">        connection = db_connect()</w:t>
+        <w:br/>
+        <w:t xml:space="preserve">        try:</w:t>
+        <w:br/>
+        <w:t xml:space="preserve">            users = connection.execute(</w:t>
+        <w:br/>
+        <w:t xml:space="preserve">                "SELECT id, login, role, is_blocked, failed_attempts FROM users ORDER BY id"</w:t>
+        <w:br/>
+        <w:t xml:space="preserve">            ).fetchall()</w:t>
+        <w:br/>
+        <w:t xml:space="preserve">        finally:</w:t>
+        <w:br/>
+        <w:t xml:space="preserve">            connection.close()</w:t>
+        <w:br/>
+        <w:t xml:space="preserve">        banner = ""</w:t>
+        <w:br/>
+        <w:t xml:space="preserve">        if message:</w:t>
+        <w:br/>
+        <w:t xml:space="preserve">            cls = "notice error" if is_error else "notice success"</w:t>
+        <w:br/>
+        <w:t xml:space="preserve">            title = "⚠ Ошибка" if is_error else "✓ Информация"</w:t>
+        <w:br/>
         <w:t xml:space="preserve">            banner = f'&lt;div class="{cls}" role="status"&gt;&lt;strong&gt;{title}&lt;/strong&gt;&lt;br&gt;{html.escape(message)}&lt;/div&gt;'</w:t>
         <w:br/>
         <w:t xml:space="preserve">        rows = []</w:t>
         <w:br/>
         <w:t xml:space="preserve">        for user in users:</w:t>
-        <w:br/>
-        <w:t xml:space="preserve">            role_options = "".join(</w:t>
-        <w:br/>
-        <w:t xml:space="preserve">                f'&lt;option value="{role}"{" selected" if user["role"] == role else ""}&gt;{role}&lt;/option&gt;'</w:t>
-        <w:br/>
-        <w:t xml:space="preserve">                for role in ("Пользователь", "Администратор")</w:t>
-        <w:br/>
-        <w:t xml:space="preserve">            )</w:t>
-        <w:br/>
-        <w:t xml:space="preserve">            blocked_options = (</w:t>
-        <w:br/>
-        <w:t xml:space="preserve">                f'&lt;option value="0"{" selected" if not user["is_blocked"] else ""}&gt;Активна&lt;/option&gt;'</w:t>
-        <w:br/>
-        <w:t xml:space="preserve">                f'&lt;option value="1"{" selected" if user["is_blocked"] else ""}&gt;Заблокирована&lt;/option&gt;'</w:t>
-        <w:br/>
-        <w:t xml:space="preserve">            )</w:t>
-        <w:br/>
-        <w:t xml:space="preserve">            rows.append(f"""&lt;tr&gt;&lt;td&gt;{int(user['id'])}&lt;/td&gt;&lt;td&gt;{html.escape(user['login'])}&lt;/td&gt;</w:t>
-        <w:br/>
-        <w:t>&lt;td&gt;{int(user['failed_attempts'])}&lt;/td&gt;&lt;td&gt;&lt;form class="edit" method="post" action="/admin/users/update"&gt;</w:t>
-        <w:br/>
-        <w:t>&lt;input type="hidden" name="user_id" value="{int(user['id'])}"&gt;&lt;input name="login" value="{html.escape(user['login'], quote=True)}" required minlength="1" maxlength="32" pattern="[A-Za-zА-Яа-яЁё0-9._-]+" aria-label="Логин"&gt;</w:t>
-        <w:br/>
-        <w:t>&lt;select name="role"&gt;{role_options}&lt;/select&gt;&lt;select name="is_blocked"&gt;{blocked_options}&lt;/select&gt;</w:t>
-        <w:br/>
-        <w:t>&lt;input name="new_password" type="password" minlength="8" placeholder="Новый пароль (необязательно)"&gt;</w:t>
-        <w:br/>
-        <w:t>&lt;button class="button small" type="submit"&gt;Сохранить&lt;/button&gt;&lt;/form&gt;&lt;/td&gt;&lt;/tr&gt;""")</w:t>
-        <w:br/>
-        <w:t xml:space="preserve">        table_rows = "".join(rows)</w:t>
-        <w:br/>
-        <w:t xml:space="preserve">        body = f"""&lt;main class="wrap"&gt;&lt;a href="/dashboard"&gt;← Рабочий стол&lt;/a&gt;&lt;div class="kicker"&gt;Администрирование&lt;/div&gt;</w:t>
-        <w:br/>
-        <w:t>&lt;h1&gt;Пользователи&lt;/h1&gt;{banner}&lt;section class="panel"&gt;&lt;h2&gt;Добавить пользователя&lt;/h2&gt;</w:t>
-        <w:br/>
-        <w:t>&lt;form class="create" method="post" action="/admin/users/create"&gt;&lt;label&gt;Логин&lt;input name="login" required minlength="1" maxlength="32" pattern="[A-Za-zА-Яа-яЁё0-9._-]+"&gt;&lt;/label&gt;</w:t>
-        <w:br/>
-        <w:t>&lt;label&gt;Пароль&lt;input name="password" type="password" required minlength="8"&gt;&lt;/label&gt;&lt;label&gt;Роль&lt;select name="role"&gt;&lt;option&gt;Пользователь&lt;/option&gt;&lt;option&gt;Администратор&lt;/option&gt;&lt;/select&gt;&lt;/label&gt;</w:t>
-        <w:br/>
-        <w:t>&lt;button class="button" type="submit"&gt;Добавить&lt;/button&gt;&lt;/form&gt;&lt;/section&gt;</w:t>
-        <w:br/>
-        <w:t>&lt;section class="panel"&gt;&lt;h2&gt;Текущие учётные записи&lt;/h2&gt;&lt;div class="table-scroll"&gt;&lt;table&gt;&lt;thead&gt;&lt;tr&gt;&lt;th&gt;ID&lt;/th&gt;&lt;th&gt;Логин&lt;/th&gt;&lt;th&gt;Ошибки&lt;/th&gt;&lt;th&gt;Роль / блокировка / пароль&lt;/th&gt;&lt;/tr&gt;&lt;/thead&gt;&lt;tbody&gt;{table_rows}&lt;/tbody&gt;&lt;/table&gt;&lt;/div&gt;&lt;/section&gt;&lt;/main&gt;"""</w:t>
-        <w:br/>
-        <w:t xml:space="preserve">        self._send_html(_page("Управление пользователями", body, styled=True, admin=True))</w:t>
-        <w:br/>
-        <w:br/>
-        <w:t xml:space="preserve">    def _authorized_admin(self) -&gt; sqlite3.Row | None:</w:t>
-        <w:br/>
-        <w:t xml:space="preserve">        user = self._current_user()</w:t>
-        <w:br/>
-        <w:t xml:space="preserve">        if not user or user["role"] != "Администратор":</w:t>
-        <w:br/>
-        <w:t xml:space="preserve">            return None</w:t>
-        <w:br/>
-        <w:t xml:space="preserve">        return user</w:t>
-        <w:br/>
-        <w:br/>
-        <w:t xml:space="preserve">    def _admin_create_user(self, form: dict[str, str]) -&gt; None:</w:t>
-        <w:br/>
-        <w:t xml:space="preserve">        admin = self._authorized_admin()</w:t>
-        <w:br/>
-        <w:t xml:space="preserve">        if not admin:</w:t>
-        <w:br/>
-        <w:t xml:space="preserve">            self._send_html(_page("Доступ запрещён", "Войдите под учётной записью администратора."), 403)</w:t>
       </w:r>
     </w:p>
     <w:p>
@@ -7281,76 +7283,75 @@
           <w:color w:val="243247"/>
           <w:sz w:val="14"/>
         </w:rPr>
+        <w:t xml:space="preserve">            role_options = "".join(</w:t>
+        <w:br/>
+        <w:t xml:space="preserve">                f'&lt;option value="{role}"{" selected" if user["role"] == role else ""}&gt;{role}&lt;/option&gt;'</w:t>
+        <w:br/>
+        <w:t xml:space="preserve">                for role in ("Пользователь", "Администратор")</w:t>
+        <w:br/>
+        <w:t xml:space="preserve">            )</w:t>
+        <w:br/>
+        <w:t xml:space="preserve">            blocked_options = (</w:t>
+        <w:br/>
+        <w:t xml:space="preserve">                f'&lt;option value="0"{" selected" if not user["is_blocked"] else ""}&gt;Активна&lt;/option&gt;'</w:t>
+        <w:br/>
+        <w:t xml:space="preserve">                f'&lt;option value="1"{" selected" if user["is_blocked"] else ""}&gt;Заблокирована&lt;/option&gt;'</w:t>
+        <w:br/>
+        <w:t xml:space="preserve">            )</w:t>
+        <w:br/>
+        <w:t xml:space="preserve">            rows.append(f"""&lt;tr&gt;&lt;td&gt;{int(user['id'])}&lt;/td&gt;&lt;td&gt;{html.escape(user['login'])}&lt;/td&gt;</w:t>
+        <w:br/>
+        <w:t>&lt;td&gt;{int(user['failed_attempts'])}&lt;/td&gt;&lt;td&gt;&lt;form class="edit" method="post" action="/admin/users/update"&gt;</w:t>
+        <w:br/>
+        <w:t>&lt;input type="hidden" name="user_id" value="{int(user['id'])}"&gt;&lt;input name="login" value="{html.escape(user['login'], quote=True)}" required minlength="1" maxlength="32" pattern="[A-Za-zА-Яа-яЁё0-9._-]+" aria-label="Логин"&gt;</w:t>
+        <w:br/>
+        <w:t>&lt;select name="role"&gt;{role_options}&lt;/select&gt;&lt;select name="is_blocked"&gt;{blocked_options}&lt;/select&gt;</w:t>
+        <w:br/>
+        <w:t>&lt;input name="new_password" type="password" minlength="8" placeholder="Новый пароль (необязательно)"&gt;</w:t>
+        <w:br/>
+        <w:t>&lt;button class="button small" type="submit"&gt;Сохранить&lt;/button&gt;&lt;/form&gt;&lt;/td&gt;&lt;/tr&gt;""")</w:t>
+        <w:br/>
+        <w:t xml:space="preserve">        table_rows = "".join(rows)</w:t>
+        <w:br/>
+        <w:t xml:space="preserve">        body = f"""&lt;main class="wrap"&gt;&lt;a href="/dashboard"&gt;← Рабочий стол&lt;/a&gt;&lt;div class="kicker"&gt;Администрирование&lt;/div&gt;</w:t>
+        <w:br/>
+        <w:t>&lt;h1&gt;Пользователи&lt;/h1&gt;{banner}&lt;section class="panel"&gt;&lt;h2&gt;Добавить пользователя&lt;/h2&gt;</w:t>
+        <w:br/>
+        <w:t>&lt;form class="create" method="post" action="/admin/users/create"&gt;&lt;label&gt;Логин&lt;input name="login" required minlength="1" maxlength="32" pattern="[A-Za-zА-Яа-яЁё0-9._-]+"&gt;&lt;/label&gt;</w:t>
+        <w:br/>
+        <w:t>&lt;label&gt;Пароль&lt;input name="password" type="password" required minlength="8"&gt;&lt;/label&gt;&lt;label&gt;Роль&lt;select name="role"&gt;&lt;option&gt;Пользователь&lt;/option&gt;&lt;option&gt;Администратор&lt;/option&gt;&lt;/select&gt;&lt;/label&gt;</w:t>
+        <w:br/>
+        <w:t>&lt;button class="button" type="submit"&gt;Добавить&lt;/button&gt;&lt;/form&gt;&lt;/section&gt;</w:t>
+        <w:br/>
+        <w:t>&lt;section class="panel"&gt;&lt;h2&gt;Текущие учётные записи&lt;/h2&gt;&lt;div class="table-scroll"&gt;&lt;table&gt;&lt;thead&gt;&lt;tr&gt;&lt;th&gt;ID&lt;/th&gt;&lt;th&gt;Логин&lt;/th&gt;&lt;th&gt;Ошибки&lt;/th&gt;&lt;th&gt;Роль / блокировка / пароль&lt;/th&gt;&lt;/tr&gt;&lt;/thead&gt;&lt;tbody&gt;{table_rows}&lt;/tbody&gt;&lt;/table&gt;&lt;/div&gt;&lt;/section&gt;&lt;/main&gt;"""</w:t>
+        <w:br/>
+        <w:t xml:space="preserve">        self._send_html(_page("Управление пользователями", body, styled=True, admin=True))</w:t>
+        <w:br/>
+        <w:br/>
+        <w:t xml:space="preserve">    def _authorized_admin(self) -&gt; sqlite3.Row | None:</w:t>
+        <w:br/>
+        <w:t xml:space="preserve">        user = self._current_user()</w:t>
+        <w:br/>
+        <w:t xml:space="preserve">        if not user or user["role"] != "Администратор":</w:t>
+        <w:br/>
+        <w:t xml:space="preserve">            return None</w:t>
+        <w:br/>
+        <w:t xml:space="preserve">        return user</w:t>
+        <w:br/>
+        <w:br/>
+        <w:t xml:space="preserve">    def _admin_create_user(self, form: dict[str, str]) -&gt; None:</w:t>
+        <w:br/>
+        <w:t xml:space="preserve">        admin = self._authorized_admin()</w:t>
+        <w:br/>
+        <w:t xml:space="preserve">        if not admin:</w:t>
+        <w:br/>
+        <w:t xml:space="preserve">            self._send_html(_page("Доступ запрещён", "Войдите под учётной записью администратора."), 403)</w:t>
+        <w:br/>
         <w:t xml:space="preserve">            return</w:t>
         <w:br/>
         <w:t xml:space="preserve">        login = form.get("login", "").strip().casefold()</w:t>
         <w:br/>
         <w:t xml:space="preserve">        password = form.get("password", "")</w:t>
-        <w:br/>
-        <w:t xml:space="preserve">        role = form.get("role", "")</w:t>
-        <w:br/>
-        <w:t xml:space="preserve">        if not re.fullmatch(r"[A-Za-zА-Яа-яЁё0-9._-]{1,32}", login):</w:t>
-        <w:br/>
-        <w:t xml:space="preserve">            self._admin_page(admin, "Логин: 1–32 буквы, цифры, точка, дефис или подчёркивание.", True)</w:t>
-        <w:br/>
-        <w:t xml:space="preserve">            return</w:t>
-        <w:br/>
-        <w:t xml:space="preserve">        if len(password) &lt; 8:</w:t>
-        <w:br/>
-        <w:t xml:space="preserve">            self._admin_page(admin, "Пароль должен содержать не менее 8 символов.", True)</w:t>
-        <w:br/>
-        <w:t xml:space="preserve">            return</w:t>
-        <w:br/>
-        <w:t xml:space="preserve">        if role not in ("Пользователь", "Администратор"):</w:t>
-        <w:br/>
-        <w:t xml:space="preserve">            self._admin_page(admin, "Выберите допустимую роль.", True)</w:t>
-        <w:br/>
-        <w:t xml:space="preserve">            return</w:t>
-        <w:br/>
-        <w:t xml:space="preserve">        salt, digest = make_password_hash(password)</w:t>
-        <w:br/>
-        <w:t xml:space="preserve">        connection = db_connect()</w:t>
-        <w:br/>
-        <w:t xml:space="preserve">        try:</w:t>
-        <w:br/>
-        <w:t xml:space="preserve">            with connection:</w:t>
-        <w:br/>
-        <w:t xml:space="preserve">                connection.execute(</w:t>
-        <w:br/>
-        <w:t xml:space="preserve">                    "INSERT INTO users(login, password_salt, password_hash, role) VALUES (?, ?, ?, ?)",</w:t>
-        <w:br/>
-        <w:t xml:space="preserve">                    (login, salt, digest, role),</w:t>
-        <w:br/>
-        <w:t xml:space="preserve">                )</w:t>
-        <w:br/>
-        <w:t xml:space="preserve">            self._admin_page(admin, f"Пользователь «{login}» добавлен.")</w:t>
-        <w:br/>
-        <w:t xml:space="preserve">        except sqlite3.IntegrityError:</w:t>
-        <w:br/>
-        <w:t xml:space="preserve">            self._admin_page(admin, "Пользователь с указанным логином уже существует. Выберите другой логин.", True)</w:t>
-        <w:br/>
-        <w:t xml:space="preserve">        finally:</w:t>
-        <w:br/>
-        <w:t xml:space="preserve">            connection.close()</w:t>
-        <w:br/>
-        <w:br/>
-        <w:t xml:space="preserve">    def _admin_update_user(self, form: dict[str, str]) -&gt; None:</w:t>
-        <w:br/>
-        <w:t xml:space="preserve">        admin = self._authorized_admin()</w:t>
-        <w:br/>
-        <w:t xml:space="preserve">        if not admin:</w:t>
-        <w:br/>
-        <w:t xml:space="preserve">            self._send_html(_page("Доступ запрещён", "Войдите под учётной записью администратора."), 403)</w:t>
-        <w:br/>
-        <w:t xml:space="preserve">            return</w:t>
-        <w:br/>
-        <w:t xml:space="preserve">        try:</w:t>
-        <w:br/>
-        <w:t xml:space="preserve">            user_id = int(form.get("user_id", ""))</w:t>
-        <w:br/>
-        <w:t xml:space="preserve">            blocked = int(form.get("is_blocked", ""))</w:t>
-        <w:br/>
-        <w:t xml:space="preserve">        except ValueError:</w:t>
       </w:r>
     </w:p>
     <w:p>
@@ -7370,76 +7371,76 @@
           <w:color w:val="243247"/>
           <w:sz w:val="14"/>
         </w:rPr>
+        <w:t xml:space="preserve">        role = form.get("role", "")</w:t>
+        <w:br/>
+        <w:t xml:space="preserve">        if not re.fullmatch(r"[A-Za-zА-Яа-яЁё0-9._-]{1,32}", login):</w:t>
+        <w:br/>
+        <w:t xml:space="preserve">            self._admin_page(admin, "Логин: 1–32 буквы, цифры, точка, дефис или подчёркивание.", True)</w:t>
+        <w:br/>
+        <w:t xml:space="preserve">            return</w:t>
+        <w:br/>
+        <w:t xml:space="preserve">        if len(password) &lt; 8:</w:t>
+        <w:br/>
+        <w:t xml:space="preserve">            self._admin_page(admin, "Пароль должен содержать не менее 8 символов.", True)</w:t>
+        <w:br/>
+        <w:t xml:space="preserve">            return</w:t>
+        <w:br/>
+        <w:t xml:space="preserve">        if role not in ("Пользователь", "Администратор"):</w:t>
+        <w:br/>
+        <w:t xml:space="preserve">            self._admin_page(admin, "Выберите допустимую роль.", True)</w:t>
+        <w:br/>
+        <w:t xml:space="preserve">            return</w:t>
+        <w:br/>
+        <w:t xml:space="preserve">        salt, digest = make_password_hash(password)</w:t>
+        <w:br/>
+        <w:t xml:space="preserve">        connection = db_connect()</w:t>
+        <w:br/>
+        <w:t xml:space="preserve">        try:</w:t>
+        <w:br/>
+        <w:t xml:space="preserve">            with connection:</w:t>
+        <w:br/>
+        <w:t xml:space="preserve">                connection.execute(</w:t>
+        <w:br/>
+        <w:t xml:space="preserve">                    "INSERT INTO users(login, password_salt, password_hash, role) VALUES (?, ?, ?, ?)",</w:t>
+        <w:br/>
+        <w:t xml:space="preserve">                    (login, salt, digest, role),</w:t>
+        <w:br/>
+        <w:t xml:space="preserve">                )</w:t>
+        <w:br/>
+        <w:t xml:space="preserve">            self._admin_page(admin, f"Пользователь «{login}» добавлен.")</w:t>
+        <w:br/>
+        <w:t xml:space="preserve">        except sqlite3.IntegrityError:</w:t>
+        <w:br/>
+        <w:t xml:space="preserve">            self._admin_page(admin, "Пользователь с указанным логином уже существует. Выберите другой логин.", True)</w:t>
+        <w:br/>
+        <w:t xml:space="preserve">        finally:</w:t>
+        <w:br/>
+        <w:t xml:space="preserve">            connection.close()</w:t>
+        <w:br/>
+        <w:br/>
+        <w:t xml:space="preserve">    def _admin_update_user(self, form: dict[str, str]) -&gt; None:</w:t>
+        <w:br/>
+        <w:t xml:space="preserve">        admin = self._authorized_admin()</w:t>
+        <w:br/>
+        <w:t xml:space="preserve">        if not admin:</w:t>
+        <w:br/>
+        <w:t xml:space="preserve">            self._send_html(_page("Доступ запрещён", "Войдите под учётной записью администратора."), 403)</w:t>
+        <w:br/>
+        <w:t xml:space="preserve">            return</w:t>
+        <w:br/>
+        <w:t xml:space="preserve">        try:</w:t>
+        <w:br/>
+        <w:t xml:space="preserve">            user_id = int(form.get("user_id", ""))</w:t>
+        <w:br/>
+        <w:t xml:space="preserve">            blocked = int(form.get("is_blocked", ""))</w:t>
+        <w:br/>
+        <w:t xml:space="preserve">        except ValueError:</w:t>
+        <w:br/>
         <w:t xml:space="preserve">            self._admin_page(admin, "Некорректный идентификатор или статус блокировки.", True)</w:t>
         <w:br/>
         <w:t xml:space="preserve">            return</w:t>
         <w:br/>
         <w:t xml:space="preserve">        login = form.get("login", "").strip().casefold()</w:t>
-        <w:br/>
-        <w:t xml:space="preserve">        role = form.get("role", "")</w:t>
-        <w:br/>
-        <w:t xml:space="preserve">        new_password = form.get("new_password", "")</w:t>
-        <w:br/>
-        <w:t xml:space="preserve">        if not re.fullmatch(r"[A-Za-zА-Яа-яЁё0-9._-]{1,32}", login):</w:t>
-        <w:br/>
-        <w:t xml:space="preserve">            self._admin_page(admin, "Логин: 1–32 буквы, цифры, точка, дефис или подчёркивание.", True)</w:t>
-        <w:br/>
-        <w:t xml:space="preserve">            return</w:t>
-        <w:br/>
-        <w:t xml:space="preserve">        if user_id &lt;= 0 or blocked not in (0, 1) or role not in ("Пользователь", "Администратор"):</w:t>
-        <w:br/>
-        <w:t xml:space="preserve">            self._admin_page(admin, "Проверьте ID, логин, роль и статус блокировки.", True)</w:t>
-        <w:br/>
-        <w:t xml:space="preserve">            return</w:t>
-        <w:br/>
-        <w:t xml:space="preserve">        if new_password and len(new_password) &lt; 8:</w:t>
-        <w:br/>
-        <w:t xml:space="preserve">            self._admin_page(admin, "Новый пароль должен содержать не менее 8 символов.", True)</w:t>
-        <w:br/>
-        <w:t xml:space="preserve">            return</w:t>
-        <w:br/>
-        <w:t xml:space="preserve">        if user_id == int(admin["id"]) and (blocked or role != "Администратор"):</w:t>
-        <w:br/>
-        <w:t xml:space="preserve">            self._admin_page(admin, "Нельзя заблокировать или лишить роли текущую учётную запись администратора.", True)</w:t>
-        <w:br/>
-        <w:t xml:space="preserve">            return</w:t>
-        <w:br/>
-        <w:br/>
-        <w:t xml:space="preserve">        connection = db_connect()</w:t>
-        <w:br/>
-        <w:t xml:space="preserve">        try:</w:t>
-        <w:br/>
-        <w:t xml:space="preserve">            target = connection.execute("SELECT id, login FROM users WHERE id = ?", (user_id,)).fetchone()</w:t>
-        <w:br/>
-        <w:t xml:space="preserve">            if not target:</w:t>
-        <w:br/>
-        <w:t xml:space="preserve">                self._admin_page(admin, "Пользователь не найден. Обновите страницу и повторите действие.", True)</w:t>
-        <w:br/>
-        <w:t xml:space="preserve">                return</w:t>
-        <w:br/>
-        <w:t xml:space="preserve">            with connection:</w:t>
-        <w:br/>
-        <w:t xml:space="preserve">                if new_password:</w:t>
-        <w:br/>
-        <w:t xml:space="preserve">                    salt, digest = make_password_hash(new_password)</w:t>
-        <w:br/>
-        <w:t xml:space="preserve">                    connection.execute(</w:t>
-        <w:br/>
-        <w:t xml:space="preserve">                        """UPDATE users SET login = ?, role = ?, is_blocked = ?, failed_attempts = 0,</w:t>
-        <w:br/>
-        <w:t xml:space="preserve">                           password_salt = ?, password_hash = ? WHERE id = ?""",</w:t>
-        <w:br/>
-        <w:t xml:space="preserve">                        (login, role, blocked, salt, digest, user_id),</w:t>
-        <w:br/>
-        <w:t xml:space="preserve">                    )</w:t>
-        <w:br/>
-        <w:t xml:space="preserve">                else:</w:t>
-        <w:br/>
-        <w:t xml:space="preserve">                    connection.execute(</w:t>
-        <w:br/>
-        <w:t xml:space="preserve">                        """UPDATE users SET login = ?, role = ?, is_blocked = ?,</w:t>
-        <w:br/>
-        <w:t xml:space="preserve">                           failed_attempts = CASE WHEN ? = 0 THEN 0 ELSE failed_attempts END</w:t>
       </w:r>
     </w:p>
     <w:p>
@@ -7459,73 +7460,76 @@
           <w:color w:val="243247"/>
           <w:sz w:val="14"/>
         </w:rPr>
+        <w:t xml:space="preserve">        role = form.get("role", "")</w:t>
+        <w:br/>
+        <w:t xml:space="preserve">        new_password = form.get("new_password", "")</w:t>
+        <w:br/>
+        <w:t xml:space="preserve">        if not re.fullmatch(r"[A-Za-zА-Яа-яЁё0-9._-]{1,32}", login):</w:t>
+        <w:br/>
+        <w:t xml:space="preserve">            self._admin_page(admin, "Логин: 1–32 буквы, цифры, точка, дефис или подчёркивание.", True)</w:t>
+        <w:br/>
+        <w:t xml:space="preserve">            return</w:t>
+        <w:br/>
+        <w:t xml:space="preserve">        if user_id &lt;= 0 or blocked not in (0, 1) or role not in ("Пользователь", "Администратор"):</w:t>
+        <w:br/>
+        <w:t xml:space="preserve">            self._admin_page(admin, "Проверьте ID, логин, роль и статус блокировки.", True)</w:t>
+        <w:br/>
+        <w:t xml:space="preserve">            return</w:t>
+        <w:br/>
+        <w:t xml:space="preserve">        if new_password and len(new_password) &lt; 8:</w:t>
+        <w:br/>
+        <w:t xml:space="preserve">            self._admin_page(admin, "Новый пароль должен содержать не менее 8 символов.", True)</w:t>
+        <w:br/>
+        <w:t xml:space="preserve">            return</w:t>
+        <w:br/>
+        <w:t xml:space="preserve">        if user_id == int(admin["id"]) and (blocked or role != "Администратор"):</w:t>
+        <w:br/>
+        <w:t xml:space="preserve">            self._admin_page(admin, "Нельзя заблокировать или лишить роли текущую учётную запись администратора.", True)</w:t>
+        <w:br/>
+        <w:t xml:space="preserve">            return</w:t>
+        <w:br/>
+        <w:br/>
+        <w:t xml:space="preserve">        connection = db_connect()</w:t>
+        <w:br/>
+        <w:t xml:space="preserve">        try:</w:t>
+        <w:br/>
+        <w:t xml:space="preserve">            target = connection.execute("SELECT id, login FROM users WHERE id = ?", (user_id,)).fetchone()</w:t>
+        <w:br/>
+        <w:t xml:space="preserve">            if not target:</w:t>
+        <w:br/>
+        <w:t xml:space="preserve">                self._admin_page(admin, "Пользователь не найден. Обновите страницу и повторите действие.", True)</w:t>
+        <w:br/>
+        <w:t xml:space="preserve">                return</w:t>
+        <w:br/>
+        <w:t xml:space="preserve">            with connection:</w:t>
+        <w:br/>
+        <w:t xml:space="preserve">                if new_password:</w:t>
+        <w:br/>
+        <w:t xml:space="preserve">                    salt, digest = make_password_hash(new_password)</w:t>
+        <w:br/>
+        <w:t xml:space="preserve">                    connection.execute(</w:t>
+        <w:br/>
+        <w:t xml:space="preserve">                        """UPDATE users SET login = ?, role = ?, is_blocked = ?, failed_attempts = 0,</w:t>
+        <w:br/>
+        <w:t xml:space="preserve">                           password_salt = ?, password_hash = ? WHERE id = ?""",</w:t>
+        <w:br/>
+        <w:t xml:space="preserve">                        (login, role, blocked, salt, digest, user_id),</w:t>
+        <w:br/>
+        <w:t xml:space="preserve">                    )</w:t>
+        <w:br/>
+        <w:t xml:space="preserve">                else:</w:t>
+        <w:br/>
+        <w:t xml:space="preserve">                    connection.execute(</w:t>
+        <w:br/>
+        <w:t xml:space="preserve">                        """UPDATE users SET login = ?, role = ?, is_blocked = ?,</w:t>
+        <w:br/>
+        <w:t xml:space="preserve">                           failed_attempts = CASE WHEN ? = 0 THEN 0 ELSE failed_attempts END</w:t>
+        <w:br/>
         <w:t xml:space="preserve">                           WHERE id = ?""",</w:t>
         <w:br/>
         <w:t xml:space="preserve">                        (login, role, blocked, blocked, user_id),</w:t>
         <w:br/>
         <w:t xml:space="preserve">                    )</w:t>
-        <w:br/>
-        <w:t xml:space="preserve">            self._admin_page(admin, f"Данные пользователя «{login}» обновлены.")</w:t>
-        <w:br/>
-        <w:t xml:space="preserve">        except sqlite3.IntegrityError:</w:t>
-        <w:br/>
-        <w:t xml:space="preserve">            self._admin_page(admin, "Пользователь с указанным логином уже существует. Укажите уникальный логин.", True)</w:t>
-        <w:br/>
-        <w:t xml:space="preserve">        finally:</w:t>
-        <w:br/>
-        <w:t xml:space="preserve">            connection.close()</w:t>
-        <w:br/>
-        <w:br/>
-        <w:br/>
-        <w:t>def _fetch_user_by_id(user_id: int) -&gt; sqlite3.Row | None:</w:t>
-        <w:br/>
-        <w:t xml:space="preserve">    connection = db_connect()</w:t>
-        <w:br/>
-        <w:t xml:space="preserve">    try:</w:t>
-        <w:br/>
-        <w:t xml:space="preserve">        return connection.execute("SELECT * FROM users WHERE id = ?", (user_id,)).fetchone()</w:t>
-        <w:br/>
-        <w:t xml:space="preserve">    finally:</w:t>
-        <w:br/>
-        <w:t xml:space="preserve">        connection.close()</w:t>
-        <w:br/>
-        <w:br/>
-        <w:br/>
-        <w:t>def _page(title: str, body: str, styled: bool = False, admin: bool = False) -&gt; str:</w:t>
-        <w:br/>
-        <w:t xml:space="preserve">    if not styled:</w:t>
-        <w:br/>
-        <w:t xml:space="preserve">        return f"""&lt;!doctype html&gt;&lt;html lang="ru"&gt;&lt;head&gt;&lt;meta charset="utf-8"&gt;&lt;meta name="viewport" content="width=device-width,initial-scale=1"&gt;&lt;title&gt;{html.escape(title)}&lt;/title&gt;&lt;/head&gt;&lt;body&gt;&lt;h1&gt;{html.escape(title)}&lt;/h1&gt;{body}&lt;/body&gt;&lt;/html&gt;"""</w:t>
-        <w:br/>
-        <w:t xml:space="preserve">    extra = """</w:t>
-        <w:br/>
-        <w:t>&lt;style&gt;</w:t>
-        <w:br/>
-        <w:t>:root{--ink:#172033;--blue:#4058d6;--muted:#67718a;--line:#dce2ee;--paper:#fff;--bg:#f3f6fb}</w:t>
-        <w:br/>
-        <w:t>*{box-sizing:border-box}body{margin:0;background:var(--bg);font:15px/1.5 system-ui,-apple-system,"Segoe UI",sans-serif;color:var(--ink);padding:28px}</w:t>
-        <w:br/>
-        <w:t>.card,.wrap{max-width:900px;margin:5vh auto;background:white;border:1px solid #e5e9f2;border-radius:20px;padding:28px;box-shadow:0 16px 50px #25366614}</w:t>
-        <w:br/>
-        <w:t>.wrap{max-width:1150px;margin:0 auto}.kicker{color:var(--blue);font-size:12px;font-weight:800;letter-spacing:.12em;text-transform:uppercase}h1{margin:7px 0 20px;font-size:28px}h2{font-size:18px;margin:0 0 12px}</w:t>
-        <w:br/>
-        <w:t>a{color:var(--blue)}.button{display:inline-block;border:0;border-radius:9px;padding:10px 15px;background:var(--blue);color:#fff;text-decoration:none;font:inherit;font-weight:700;cursor:pointer}</w:t>
-        <w:br/>
-        <w:t>.button.secondary{background:#e9edff;color:#3046bd}.button.small{padding:8px 11px;font-size:13px}.notice{padding:11px 13px;border-radius:10px;margin:12px 0}.success{background:#e9f8ee;color:#166534}.error{background:#fff0ee;color:#a1251b}</w:t>
-        <w:br/>
-        <w:t>.panel{background:#fff;border:1px solid var(--line);border-radius:14px;padding:18px;margin:16px 0}.create{display:flex;gap:12px;align-items:end;flex-wrap:wrap}.create label{display:grid;gap:5px;font-weight:650}.create input,.create select,.edit input,.edit select{border:1px solid var(--line);border-radius:8px;padding:8px 10px;font:inherit}</w:t>
-        <w:br/>
-        <w:t>.table-scroll{overflow:auto}table{width:100%;border-collapse:collapse;min-width:760px}th,td{text-align:left;padding:10px;border-bottom:1px solid var(--line);vertical-align:middle}th{font-size:13px;color:var(--muted)}.edit{display:flex;gap:8px;align-items:center;flex-wrap:wrap}</w:t>
-        <w:br/>
-        <w:t>&lt;/style&gt;""" if admin else """</w:t>
-        <w:br/>
-        <w:t>&lt;style&gt;</w:t>
-        <w:br/>
-        <w:t>:root{--ink:#172033;--blue:#4058d6;--bg:#f3f6fb}*{box-sizing:border-box}body{margin:0;background:var(--bg);font:16px/1.5 system-ui,-apple-system,"Segoe UI",sans-serif;color:var(--ink);padding:22px}</w:t>
-        <w:br/>
-        <w:t>.card{max-width:620px;margin:9vh auto;background:white;border:1px solid #e5e9f2;border-radius:20px;padding:30px;box-shadow:0 16px 50px #25366614}.kicker{color:var(--blue);font-size:12px;font-weight:800;letter-spacing:.12em;text-transform:uppercase}h1{margin:7px 0 20px;font-size:28px}</w:t>
-        <w:br/>
-        <w:t>a{color:var(--blue)}.button{display:inline-block;border:0;border-radius:9px;padding:10px 15px;background:var(--blue);color:#fff;text-decoration:none;font:inherit;font-weight:700;cursor:pointer}.button.secondary{background:#e9edff;color:#3046bd}.notice{padding:11px 13px;border-radius:10px;margin:12px 0}.success{background:#e9f8ee;color:#166534}</w:t>
       </w:r>
     </w:p>
     <w:p>
@@ -7545,11 +7549,91 @@
           <w:color w:val="243247"/>
           <w:sz w:val="14"/>
         </w:rPr>
+        <w:t xml:space="preserve">            self._admin_page(admin, f"Данные пользователя «{login}» обновлены.")</w:t>
+        <w:br/>
+        <w:t xml:space="preserve">        except sqlite3.IntegrityError:</w:t>
+        <w:br/>
+        <w:t xml:space="preserve">            self._admin_page(admin, "Пользователь с указанным логином уже существует. Укажите уникальный логин.", True)</w:t>
+        <w:br/>
+        <w:t xml:space="preserve">        finally:</w:t>
+        <w:br/>
+        <w:t xml:space="preserve">            connection.close()</w:t>
+        <w:br/>
+        <w:br/>
+        <w:br/>
+        <w:t>def _fetch_user_by_id(user_id: int) -&gt; sqlite3.Row | None:</w:t>
+        <w:br/>
+        <w:t xml:space="preserve">    connection = db_connect()</w:t>
+        <w:br/>
+        <w:t xml:space="preserve">    try:</w:t>
+        <w:br/>
+        <w:t xml:space="preserve">        return connection.execute("SELECT * FROM users WHERE id = ?", (user_id,)).fetchone()</w:t>
+        <w:br/>
+        <w:t xml:space="preserve">    finally:</w:t>
+        <w:br/>
+        <w:t xml:space="preserve">        connection.close()</w:t>
+        <w:br/>
+        <w:br/>
+        <w:br/>
+        <w:t>def _page(title: str, body: str, styled: bool = False, admin: bool = False) -&gt; str:</w:t>
+        <w:br/>
+        <w:t xml:space="preserve">    if not styled:</w:t>
+        <w:br/>
+        <w:t xml:space="preserve">        return f"""&lt;!doctype html&gt;&lt;html lang="ru"&gt;&lt;head&gt;&lt;meta charset="utf-8"&gt;&lt;meta name="viewport" content="width=device-width,initial-scale=1"&gt;&lt;title&gt;{html.escape(title)}&lt;/title&gt;&lt;/head&gt;&lt;body&gt;&lt;h1&gt;{html.escape(title)}&lt;/h1&gt;{body}&lt;/body&gt;&lt;/html&gt;"""</w:t>
+        <w:br/>
+        <w:t xml:space="preserve">    extra = """</w:t>
+        <w:br/>
+        <w:t>&lt;style&gt;</w:t>
+        <w:br/>
+        <w:t>:root{--ink:#172033;--blue:#4058d6;--muted:#67718a;--line:#dce2ee;--paper:#fff;--bg:#f3f6fb}</w:t>
+        <w:br/>
+        <w:t>*{box-sizing:border-box}body{margin:0;background:var(--bg);font:15px/1.5 system-ui,-apple-system,"Segoe UI",sans-serif;color:var(--ink);padding:28px}</w:t>
+        <w:br/>
+        <w:t>.card,.wrap{max-width:900px;margin:5vh auto;background:white;border:1px solid #e5e9f2;border-radius:20px;padding:28px;box-shadow:0 16px 50px #25366614}</w:t>
+        <w:br/>
+        <w:t>.wrap{max-width:1150px;margin:0 auto}.kicker{color:var(--blue);font-size:12px;font-weight:800;letter-spacing:.12em;text-transform:uppercase}h1{margin:7px 0 20px;font-size:28px}h2{font-size:18px;margin:0 0 12px}</w:t>
+        <w:br/>
+        <w:t>a{color:var(--blue)}.button{display:inline-block;border:0;border-radius:9px;padding:10px 15px;background:var(--blue);color:#fff;text-decoration:none;font:inherit;font-weight:700;cursor:pointer}</w:t>
+        <w:br/>
+        <w:t>.button.secondary{background:#e9edff;color:#3046bd}.button.small{padding:8px 11px;font-size:13px}.notice{padding:11px 13px;border-radius:10px;margin:12px 0}.success{background:#e9f8ee;color:#166534}.error{background:#fff0ee;color:#a1251b}</w:t>
+        <w:br/>
+        <w:t>.panel{background:#fff;border:1px solid var(--line);border-radius:14px;padding:18px;margin:16px 0}.create{display:flex;gap:12px;align-items:end;flex-wrap:wrap}.create label{display:grid;gap:5px;font-weight:650}.create input,.create select,.edit input,.edit select{border:1px solid var(--line);border-radius:8px;padding:8px 10px;font:inherit}</w:t>
+        <w:br/>
+        <w:t>.table-scroll{overflow:auto}table{width:100%;border-collapse:collapse;min-width:760px}th,td{text-align:left;padding:10px;border-bottom:1px solid var(--line);vertical-align:middle}th{font-size:13px;color:var(--muted)}.edit{display:flex;gap:8px;align-items:center;flex-wrap:wrap}</w:t>
+        <w:br/>
+        <w:t>&lt;/style&gt;""" if admin else """</w:t>
+        <w:br/>
+        <w:t>&lt;style&gt;</w:t>
+        <w:br/>
+        <w:t>:root{--ink:#172033;--blue:#4058d6;--bg:#f3f6fb}*{box-sizing:border-box}body{margin:0;background:var(--bg);font:16px/1.5 system-ui,-apple-system,"Segoe UI",sans-serif;color:var(--ink);padding:22px}</w:t>
+        <w:br/>
+        <w:t>.card{max-width:620px;margin:9vh auto;background:white;border:1px solid #e5e9f2;border-radius:20px;padding:30px;box-shadow:0 16px 50px #25366614}.kicker{color:var(--blue);font-size:12px;font-weight:800;letter-spacing:.12em;text-transform:uppercase}h1{margin:7px 0 20px;font-size:28px}</w:t>
+        <w:br/>
+        <w:t>a{color:var(--blue)}.button{display:inline-block;border:0;border-radius:9px;padding:10px 15px;background:var(--blue);color:#fff;text-decoration:none;font:inherit;font-weight:700;cursor:pointer}.button.secondary{background:#e9edff;color:#3046bd}.notice{padding:11px 13px;border-radius:10px;margin:12px 0}.success{background:#e9f8ee;color:#166534}</w:t>
+        <w:br/>
         <w:t>&lt;/style&gt;"""</w:t>
         <w:br/>
         <w:t xml:space="preserve">    return f"&lt;!doctype html&gt;&lt;html lang='ru'&gt;&lt;head&gt;&lt;meta charset='utf-8'&gt;&lt;meta name='viewport' content='width=device-width,initial-scale=1'&gt;&lt;title&gt;{html.escape(title)}&lt;/title&gt;{extra}&lt;/head&gt;&lt;body&gt;{body}&lt;/body&gt;&lt;/html&gt;"</w:t>
         <w:br/>
-        <w:br/>
+      </w:r>
+    </w:p>
+    <w:p>
+      <w:r>
+        <w:br w:type="page"/>
+      </w:r>
+    </w:p>
+    <w:p>
+      <w:pPr>
+        <w:spacing w:before="20" w:after="40" w:line="164" w:lineRule="exact"/>
+        <w:ind w:left="144" w:right="144"/>
+        <w:shd w:fill="F2F5F9"/>
+      </w:pPr>
+      <w:r>
+        <w:rPr>
+          <w:rFonts w:ascii="Consolas" w:hAnsi="Consolas"/>
+          <w:color w:val="243247"/>
+          <w:sz w:val="14"/>
+        </w:rPr>
         <w:br/>
         <w:t>def make_server(host: str = "127.0.0.1", port: int = APP_PORT) -&gt; ThreadingHTTPServer:</w:t>
         <w:br/>
@@ -7735,40 +7819,40 @@
         <w:t xml:space="preserve">        self.assertIn(" - ", payload[0]["title_user"])</w:t>
         <w:br/>
         <w:br/>
-        <w:t xml:space="preserve">    def test_empty_notes_is_successful_empty_array(self):</w:t>
-        <w:br/>
-        <w:t xml:space="preserve">        connection = app.db_connect()</w:t>
-        <w:br/>
-        <w:t xml:space="preserve">        try:</w:t>
-        <w:br/>
-        <w:t xml:space="preserve">            with connection:</w:t>
-        <w:br/>
-        <w:t xml:space="preserve">                connection.execute("DELETE FROM notes")</w:t>
-        <w:br/>
-        <w:t xml:space="preserve">        finally:</w:t>
-        <w:br/>
-        <w:t xml:space="preserve">            connection.close()</w:t>
-        <w:br/>
-        <w:t xml:space="preserve">        status, headers, body = self.fetch("/notes")</w:t>
+        <w:t xml:space="preserve">    def test_login_page_has_captcha_progress_and_submit_guard(self):</w:t>
+        <w:br/>
+        <w:t xml:space="preserve">        status, headers, body = self.fetch("/login")</w:t>
+        <w:br/>
+        <w:t xml:space="preserve">        page = body.decode("utf-8")</w:t>
         <w:br/>
         <w:t xml:space="preserve">        self.assertEqual(status, 200)</w:t>
         <w:br/>
-        <w:t xml:space="preserve">        self.assertEqual(json.loads(body.decode("utf-8")), [])</w:t>
-        <w:br/>
-        <w:t xml:space="preserve">        self.assertIn("application/json", headers.get("Content-Type", ""))</w:t>
-        <w:br/>
-        <w:br/>
-        <w:t xml:space="preserve">    def test_invalid_limit_returns_400_json(self):</w:t>
-        <w:br/>
-        <w:t xml:space="preserve">        with self.assertRaises(HTTPError) as caught:</w:t>
-        <w:br/>
-        <w:t xml:space="preserve">            urlopen(self.base + "/notes?limit=abc", timeout=5)</w:t>
-        <w:br/>
-        <w:t xml:space="preserve">        self.assertEqual(caught.exception.code, 400)</w:t>
-        <w:br/>
-        <w:t xml:space="preserve">        self.assertIn("application/json", caught.exception.headers.get("Content-Type", ""))</w:t>
-        <w:br/>
-        <w:t xml:space="preserve">        self.assertIn("error", json.loads(caught.exception.read().decode("utf-8")))</w:t>
+        <w:t xml:space="preserve">        self.assertIn("id=\"puzzle-status\"", page)</w:t>
+        <w:br/>
+        <w:t xml:space="preserve">        self.assertIn("form.addEventListener('submit'", page)</w:t>
+        <w:br/>
+        <w:t xml:space="preserve">        self.assertIn("Правильно стоят:", page)</w:t>
+        <w:br/>
+        <w:t xml:space="preserve">        self.assertIn("Все 9 фрагментов собраны правильно.", page)</w:t>
+        <w:br/>
+        <w:br/>
+        <w:t xml:space="preserve">    def test_wrong_captcha_counts_as_failed_attempt(self):</w:t>
+        <w:br/>
+        <w:t xml:space="preserve">        with urlopen(self.base + "/login", timeout=5) as response:</w:t>
+        <w:br/>
+        <w:t xml:space="preserve">            page = response.read().decode("utf-8")</w:t>
+        <w:br/>
+        <w:t xml:space="preserve">        challenge = re.search(r'name="captcha_id" value="([^"]+)"', page).group(1)</w:t>
+        <w:br/>
+        <w:t xml:space="preserve">        form = urlencode({</w:t>
+        <w:br/>
+        <w:t xml:space="preserve">            "login": "user",</w:t>
+        <w:br/>
+        <w:t xml:space="preserve">            "password": "User123!",</w:t>
+        <w:br/>
+        <w:t xml:space="preserve">            "captcha_id": challenge,</w:t>
+        <w:br/>
+        <w:t xml:space="preserve">            "captcha_order": json.dumps([1, 0, 2, 3, 4, 5, 6, 7, 8]),</w:t>
       </w:r>
     </w:p>
     <w:p>
@@ -7788,74 +7872,74 @@
           <w:color w:val="243247"/>
           <w:sz w:val="14"/>
         </w:rPr>
+        <w:t xml:space="preserve">        }).encode("utf-8")</w:t>
+        <w:br/>
+        <w:t xml:space="preserve">        request = Request(self.base + "/login", data=form,</w:t>
+        <w:br/>
+        <w:t xml:space="preserve">                          headers={"Content-Type": "application/x-www-form-urlencoded"})</w:t>
+        <w:br/>
+        <w:t xml:space="preserve">        with urlopen(request, timeout=10) as response:</w:t>
+        <w:br/>
+        <w:t xml:space="preserve">            body = response.read().decode("utf-8")</w:t>
+        <w:br/>
+        <w:t xml:space="preserve">        self.assertIn("Капча собрана неверно", body)</w:t>
+        <w:br/>
+        <w:t xml:space="preserve">        connection = app.db_connect()</w:t>
+        <w:br/>
+        <w:t xml:space="preserve">        try:</w:t>
+        <w:br/>
+        <w:t xml:space="preserve">            row = connection.execute(</w:t>
+        <w:br/>
+        <w:t xml:space="preserve">                "SELECT is_blocked, failed_attempts FROM users WHERE login='user'"</w:t>
+        <w:br/>
+        <w:t xml:space="preserve">            ).fetchone()</w:t>
+        <w:br/>
+        <w:t xml:space="preserve">            self.assertEqual((row["is_blocked"], row["failed_attempts"]), (0, 1))</w:t>
+        <w:br/>
+        <w:t xml:space="preserve">        finally:</w:t>
+        <w:br/>
+        <w:t xml:space="preserve">            connection.close()</w:t>
+        <w:br/>
+        <w:br/>
+        <w:t xml:space="preserve">    def test_empty_notes_is_successful_empty_array(self):</w:t>
+        <w:br/>
+        <w:t xml:space="preserve">        connection = app.db_connect()</w:t>
+        <w:br/>
+        <w:t xml:space="preserve">        try:</w:t>
+        <w:br/>
+        <w:t xml:space="preserve">            with connection:</w:t>
+        <w:br/>
+        <w:t xml:space="preserve">                connection.execute("DELETE FROM notes")</w:t>
+        <w:br/>
+        <w:t xml:space="preserve">        finally:</w:t>
+        <w:br/>
+        <w:t xml:space="preserve">            connection.close()</w:t>
+        <w:br/>
+        <w:t xml:space="preserve">        status, headers, body = self.fetch("/notes")</w:t>
+        <w:br/>
+        <w:t xml:space="preserve">        self.assertEqual(status, 200)</w:t>
+        <w:br/>
+        <w:t xml:space="preserve">        self.assertEqual(json.loads(body.decode("utf-8")), [])</w:t>
+        <w:br/>
+        <w:t xml:space="preserve">        self.assertIn("application/json", headers.get("Content-Type", ""))</w:t>
+        <w:br/>
+        <w:br/>
+        <w:t xml:space="preserve">    def test_invalid_limit_returns_400_json(self):</w:t>
+        <w:br/>
+        <w:t xml:space="preserve">        with self.assertRaises(HTTPError) as caught:</w:t>
+        <w:br/>
+        <w:t xml:space="preserve">            urlopen(self.base + "/notes?limit=abc", timeout=5)</w:t>
+        <w:br/>
+        <w:t xml:space="preserve">        self.assertEqual(caught.exception.code, 400)</w:t>
+        <w:br/>
+        <w:t xml:space="preserve">        self.assertIn("application/json", caught.exception.headers.get("Content-Type", ""))</w:t>
+        <w:br/>
+        <w:t xml:space="preserve">        self.assertIn("error", json.loads(caught.exception.read().decode("utf-8")))</w:t>
+        <w:br/>
         <w:br/>
         <w:t xml:space="preserve">    def test_database_failure_returns_500_json(self):</w:t>
         <w:br/>
         <w:t xml:space="preserve">        app.FORCE_DB_ERROR = True</w:t>
-        <w:br/>
-        <w:t xml:space="preserve">        with self.assertRaises(HTTPError) as caught:</w:t>
-        <w:br/>
-        <w:t xml:space="preserve">            urlopen(self.base + "/notes", timeout=5)</w:t>
-        <w:br/>
-        <w:t xml:space="preserve">        self.assertEqual(caught.exception.code, 500)</w:t>
-        <w:br/>
-        <w:t xml:space="preserve">        payload = json.loads(caught.exception.read().decode("utf-8"))</w:t>
-        <w:br/>
-        <w:t xml:space="preserve">        self.assertEqual(payload["error"], "Ошибка подключения к базе данных")</w:t>
-        <w:br/>
-        <w:t xml:space="preserve">        self.assertIn("application/json", caught.exception.headers.get("Content-Type", ""))</w:t>
-        <w:br/>
-        <w:br/>
-        <w:t xml:space="preserve">    def test_three_consecutive_bad_passwords_block_user(self):</w:t>
-        <w:br/>
-        <w:t xml:space="preserve">        last_body = ""</w:t>
-        <w:br/>
-        <w:t xml:space="preserve">        for _ in range(3):</w:t>
-        <w:br/>
-        <w:t xml:space="preserve">            with urlopen(self.base + "/login", timeout=5) as response:</w:t>
-        <w:br/>
-        <w:t xml:space="preserve">                page = response.read().decode("utf-8")</w:t>
-        <w:br/>
-        <w:t xml:space="preserve">            challenge = re.search(r'name="captcha_id" value="([^"]+)"', page).group(1)</w:t>
-        <w:br/>
-        <w:t xml:space="preserve">            form = urlencode({</w:t>
-        <w:br/>
-        <w:t xml:space="preserve">                "login": "user",</w:t>
-        <w:br/>
-        <w:t xml:space="preserve">                "password": "definitely-wrong",</w:t>
-        <w:br/>
-        <w:t xml:space="preserve">                "captcha_id": challenge,</w:t>
-        <w:br/>
-        <w:t xml:space="preserve">                "captcha_order": json.dumps(list(range(9))),</w:t>
-        <w:br/>
-        <w:t xml:space="preserve">            }).encode("utf-8")</w:t>
-        <w:br/>
-        <w:t xml:space="preserve">            request = Request(self.base + "/login", data=form,</w:t>
-        <w:br/>
-        <w:t xml:space="preserve">                              headers={"Content-Type": "application/x-www-form-urlencoded"})</w:t>
-        <w:br/>
-        <w:t xml:space="preserve">            with urlopen(request, timeout=10) as response:</w:t>
-        <w:br/>
-        <w:t xml:space="preserve">                last_body = response.read().decode("utf-8")</w:t>
-        <w:br/>
-        <w:t xml:space="preserve">        self.assertIn("Вы заблокированы. Обратитесь к администратору", last_body)</w:t>
-        <w:br/>
-        <w:t xml:space="preserve">        connection = app.db_connect()</w:t>
-        <w:br/>
-        <w:t xml:space="preserve">        try:</w:t>
-        <w:br/>
-        <w:t xml:space="preserve">            row = connection.execute("SELECT is_blocked, failed_attempts FROM users WHERE login='user'").fetchone()</w:t>
-        <w:br/>
-        <w:t xml:space="preserve">            self.assertEqual((row["is_blocked"], row["failed_attempts"]), (1, 3))</w:t>
-        <w:br/>
-        <w:t xml:space="preserve">        finally:</w:t>
-        <w:br/>
-        <w:t xml:space="preserve">            connection.close()</w:t>
-        <w:br/>
-        <w:br/>
-        <w:t xml:space="preserve">    def test_non_get_api_method_returns_405(self):</w:t>
-        <w:br/>
-        <w:t xml:space="preserve">        request = Request(self.base + "/notes", data=b"", method="POST")</w:t>
       </w:r>
     </w:p>
     <w:p>
@@ -7877,72 +7961,73 @@
         </w:rPr>
         <w:t xml:space="preserve">        with self.assertRaises(HTTPError) as caught:</w:t>
         <w:br/>
+        <w:t xml:space="preserve">            urlopen(self.base + "/notes", timeout=5)</w:t>
+        <w:br/>
+        <w:t xml:space="preserve">        self.assertEqual(caught.exception.code, 500)</w:t>
+        <w:br/>
+        <w:t xml:space="preserve">        payload = json.loads(caught.exception.read().decode("utf-8"))</w:t>
+        <w:br/>
+        <w:t xml:space="preserve">        self.assertEqual(payload["error"], "Ошибка подключения к базе данных")</w:t>
+        <w:br/>
+        <w:t xml:space="preserve">        self.assertIn("application/json", caught.exception.headers.get("Content-Type", ""))</w:t>
+        <w:br/>
+        <w:br/>
+        <w:t xml:space="preserve">    def test_three_consecutive_bad_passwords_block_user(self):</w:t>
+        <w:br/>
+        <w:t xml:space="preserve">        last_body = ""</w:t>
+        <w:br/>
+        <w:t xml:space="preserve">        for _ in range(3):</w:t>
+        <w:br/>
+        <w:t xml:space="preserve">            with urlopen(self.base + "/login", timeout=5) as response:</w:t>
+        <w:br/>
+        <w:t xml:space="preserve">                page = response.read().decode("utf-8")</w:t>
+        <w:br/>
+        <w:t xml:space="preserve">            challenge = re.search(r'name="captcha_id" value="([^"]+)"', page).group(1)</w:t>
+        <w:br/>
+        <w:t xml:space="preserve">            form = urlencode({</w:t>
+        <w:br/>
+        <w:t xml:space="preserve">                "login": "user",</w:t>
+        <w:br/>
+        <w:t xml:space="preserve">                "password": "definitely-wrong",</w:t>
+        <w:br/>
+        <w:t xml:space="preserve">                "captcha_id": challenge,</w:t>
+        <w:br/>
+        <w:t xml:space="preserve">                "captcha_order": json.dumps(list(range(9))),</w:t>
+        <w:br/>
+        <w:t xml:space="preserve">            }).encode("utf-8")</w:t>
+        <w:br/>
+        <w:t xml:space="preserve">            request = Request(self.base + "/login", data=form,</w:t>
+        <w:br/>
+        <w:t xml:space="preserve">                              headers={"Content-Type": "application/x-www-form-urlencoded"})</w:t>
+        <w:br/>
+        <w:t xml:space="preserve">            with urlopen(request, timeout=10) as response:</w:t>
+        <w:br/>
+        <w:t xml:space="preserve">                last_body = response.read().decode("utf-8")</w:t>
+        <w:br/>
+        <w:t xml:space="preserve">        self.assertIn("Вы заблокированы. Обратитесь к администратору", last_body)</w:t>
+        <w:br/>
+        <w:t xml:space="preserve">        connection = app.db_connect()</w:t>
+        <w:br/>
+        <w:t xml:space="preserve">        try:</w:t>
+        <w:br/>
+        <w:t xml:space="preserve">            row = connection.execute("SELECT is_blocked, failed_attempts FROM users WHERE login='user'").fetchone()</w:t>
+        <w:br/>
+        <w:t xml:space="preserve">            self.assertEqual((row["is_blocked"], row["failed_attempts"]), (1, 3))</w:t>
+        <w:br/>
+        <w:t xml:space="preserve">        finally:</w:t>
+        <w:br/>
+        <w:t xml:space="preserve">            connection.close()</w:t>
+        <w:br/>
+        <w:br/>
+        <w:t xml:space="preserve">    def test_non_get_api_method_returns_405(self):</w:t>
+        <w:br/>
+        <w:t xml:space="preserve">        request = Request(self.base + "/notes", data=b"", method="POST")</w:t>
+        <w:br/>
+        <w:t xml:space="preserve">        with self.assertRaises(HTTPError) as caught:</w:t>
+        <w:br/>
         <w:t xml:space="preserve">            urlopen(request, timeout=5)</w:t>
         <w:br/>
         <w:t xml:space="preserve">        self.assertEqual(caught.exception.code, 405)</w:t>
-        <w:br/>
-        <w:t xml:space="preserve">        self.assertEqual(caught.exception.headers.get("Allow"), "GET")</w:t>
-        <w:br/>
-        <w:t xml:space="preserve">        self.assertIn("application/json", caught.exception.headers.get("Content-Type", ""))</w:t>
-        <w:br/>
-        <w:br/>
-        <w:t xml:space="preserve">    def test_admin_can_add_edit_and_unlock_users(self):</w:t>
-        <w:br/>
-        <w:t xml:space="preserve">        opener = build_opener(HTTPCookieProcessor(CookieJar()))</w:t>
-        <w:br/>
-        <w:t xml:space="preserve">        page = opener.open(self.base + "/login", timeout=5).read().decode("utf-8")</w:t>
-        <w:br/>
-        <w:t xml:space="preserve">        challenge = re.search(r'name="captcha_id" value="([^"]+)"', page).group(1)</w:t>
-        <w:br/>
-        <w:t xml:space="preserve">        login_form = urlencode({</w:t>
-        <w:br/>
-        <w:t xml:space="preserve">            "login": "admin",</w:t>
-        <w:br/>
-        <w:t xml:space="preserve">            "password": "Admin123!",</w:t>
-        <w:br/>
-        <w:t xml:space="preserve">            "captcha_id": challenge,</w:t>
-        <w:br/>
-        <w:t xml:space="preserve">            "captcha_order": json.dumps(list(range(9))),</w:t>
-        <w:br/>
-        <w:t xml:space="preserve">        }).encode("utf-8")</w:t>
-        <w:br/>
-        <w:t xml:space="preserve">        request = Request(self.base + "/login", data=login_form,</w:t>
-        <w:br/>
-        <w:t xml:space="preserve">                          headers={"Content-Type": "application/x-www-form-urlencoded"})</w:t>
-        <w:br/>
-        <w:t xml:space="preserve">        dashboard = opener.open(request, timeout=10).read().decode("utf-8")</w:t>
-        <w:br/>
-        <w:t xml:space="preserve">        self.assertIn("Вы успешно авторизовались", dashboard)</w:t>
-        <w:br/>
-        <w:br/>
-        <w:t xml:space="preserve">        create_form = urlencode({"login": "alice", "password": "Alice123!", "role": "Пользователь"}).encode("utf-8")</w:t>
-        <w:br/>
-        <w:t xml:space="preserve">        create_request = Request(self.base + "/admin/users/create", data=create_form,</w:t>
-        <w:br/>
-        <w:t xml:space="preserve">                                 headers={"Content-Type": "application/x-www-form-urlencoded"})</w:t>
-        <w:br/>
-        <w:t xml:space="preserve">        created = opener.open(create_request, timeout=10).read().decode("utf-8")</w:t>
-        <w:br/>
-        <w:t xml:space="preserve">        self.assertIn("Пользователь «alice» добавлен", created)</w:t>
-        <w:br/>
-        <w:br/>
-        <w:t xml:space="preserve">        connection = app.db_connect()</w:t>
-        <w:br/>
-        <w:t xml:space="preserve">        try:</w:t>
-        <w:br/>
-        <w:t xml:space="preserve">            user_id = connection.execute("SELECT id FROM users WHERE login='user'").fetchone()["id"]</w:t>
-        <w:br/>
-        <w:t xml:space="preserve">        finally:</w:t>
-        <w:br/>
-        <w:t xml:space="preserve">            connection.close()</w:t>
-        <w:br/>
-        <w:t xml:space="preserve">        edit_form = urlencode({"user_id": user_id, "login": "user-renamed", "role": "Пользователь",</w:t>
-        <w:br/>
-        <w:t xml:space="preserve">                               "is_blocked": 1, "new_password": ""}).encode("utf-8")</w:t>
-        <w:br/>
-        <w:t xml:space="preserve">        edit_request = Request(self.base + "/admin/users/update", data=edit_form,</w:t>
-        <w:br/>
-        <w:t xml:space="preserve">                               headers={"Content-Type": "application/x-www-form-urlencoded"})</w:t>
       </w:r>
     </w:p>
     <w:p>
@@ -7962,12 +8047,93 @@
           <w:color w:val="243247"/>
           <w:sz w:val="14"/>
         </w:rPr>
+        <w:t xml:space="preserve">        self.assertEqual(caught.exception.headers.get("Allow"), "GET")</w:t>
+        <w:br/>
+        <w:t xml:space="preserve">        self.assertIn("application/json", caught.exception.headers.get("Content-Type", ""))</w:t>
+        <w:br/>
+        <w:br/>
+        <w:t xml:space="preserve">    def test_admin_can_add_edit_and_unlock_users(self):</w:t>
+        <w:br/>
+        <w:t xml:space="preserve">        opener = build_opener(HTTPCookieProcessor(CookieJar()))</w:t>
+        <w:br/>
+        <w:t xml:space="preserve">        page = opener.open(self.base + "/login", timeout=5).read().decode("utf-8")</w:t>
+        <w:br/>
+        <w:t xml:space="preserve">        challenge = re.search(r'name="captcha_id" value="([^"]+)"', page).group(1)</w:t>
+        <w:br/>
+        <w:t xml:space="preserve">        login_form = urlencode({</w:t>
+        <w:br/>
+        <w:t xml:space="preserve">            "login": "admin",</w:t>
+        <w:br/>
+        <w:t xml:space="preserve">            "password": "Admin123!",</w:t>
+        <w:br/>
+        <w:t xml:space="preserve">            "captcha_id": challenge,</w:t>
+        <w:br/>
+        <w:t xml:space="preserve">            "captcha_order": json.dumps(list(range(9))),</w:t>
+        <w:br/>
+        <w:t xml:space="preserve">        }).encode("utf-8")</w:t>
+        <w:br/>
+        <w:t xml:space="preserve">        request = Request(self.base + "/login", data=login_form,</w:t>
+        <w:br/>
+        <w:t xml:space="preserve">                          headers={"Content-Type": "application/x-www-form-urlencoded"})</w:t>
+        <w:br/>
+        <w:t xml:space="preserve">        dashboard = opener.open(request, timeout=10).read().decode("utf-8")</w:t>
+        <w:br/>
+        <w:t xml:space="preserve">        self.assertIn("Вы успешно авторизовались", dashboard)</w:t>
+        <w:br/>
+        <w:br/>
+        <w:t xml:space="preserve">        create_form = urlencode({"login": "alice", "password": "Alice123!", "role": "Пользователь"}).encode("utf-8")</w:t>
+        <w:br/>
+        <w:t xml:space="preserve">        create_request = Request(self.base + "/admin/users/create", data=create_form,</w:t>
+        <w:br/>
+        <w:t xml:space="preserve">                                 headers={"Content-Type": "application/x-www-form-urlencoded"})</w:t>
+        <w:br/>
+        <w:t xml:space="preserve">        created = opener.open(create_request, timeout=10).read().decode("utf-8")</w:t>
+        <w:br/>
+        <w:t xml:space="preserve">        self.assertIn("Пользователь «alice» добавлен", created)</w:t>
+        <w:br/>
+        <w:br/>
+        <w:t xml:space="preserve">        connection = app.db_connect()</w:t>
+        <w:br/>
+        <w:t xml:space="preserve">        try:</w:t>
+        <w:br/>
+        <w:t xml:space="preserve">            user_id = connection.execute("SELECT id FROM users WHERE login='user'").fetchone()["id"]</w:t>
+        <w:br/>
+        <w:t xml:space="preserve">        finally:</w:t>
+        <w:br/>
+        <w:t xml:space="preserve">            connection.close()</w:t>
+        <w:br/>
+        <w:t xml:space="preserve">        edit_form = urlencode({"user_id": user_id, "login": "user-renamed", "role": "Пользователь",</w:t>
+        <w:br/>
+        <w:t xml:space="preserve">                               "is_blocked": 1, "new_password": ""}).encode("utf-8")</w:t>
+        <w:br/>
+        <w:t xml:space="preserve">        edit_request = Request(self.base + "/admin/users/update", data=edit_form,</w:t>
+        <w:br/>
+        <w:t xml:space="preserve">                               headers={"Content-Type": "application/x-www-form-urlencoded"})</w:t>
+        <w:br/>
         <w:t xml:space="preserve">        edited = opener.open(edit_request, timeout=10).read().decode("utf-8")</w:t>
         <w:br/>
         <w:t xml:space="preserve">        self.assertIn("Данные пользователя «user-renamed» обновлены", edited)</w:t>
         <w:br/>
         <w:t xml:space="preserve">        connection = app.db_connect()</w:t>
-        <w:br/>
+      </w:r>
+    </w:p>
+    <w:p>
+      <w:r>
+        <w:br w:type="page"/>
+      </w:r>
+    </w:p>
+    <w:p>
+      <w:pPr>
+        <w:spacing w:before="20" w:after="40" w:line="164" w:lineRule="exact"/>
+        <w:ind w:left="144" w:right="144"/>
+        <w:shd w:fill="F2F5F9"/>
+      </w:pPr>
+      <w:r>
+        <w:rPr>
+          <w:rFonts w:ascii="Consolas" w:hAnsi="Consolas"/>
+          <w:color w:val="243247"/>
+          <w:sz w:val="14"/>
+        </w:rPr>
         <w:t xml:space="preserve">        try:</w:t>
         <w:br/>
         <w:t xml:space="preserve">            row = connection.execute("SELECT is_blocked FROM users WHERE login='user-renamed'").fetchone()</w:t>

</xml_diff>